<commit_message>
Let instructors browse students in their own school
Previously GET /students/school/{schoolId} was ADMIN-only, forcing
instructors to type a raw student profile ID by hand on the
booking-creation and lesson-note forms instead of picking from a list.
Instructors can now list their own school's students (same-school check
mirrors AuthServiceImpl's existing create-account restriction); another
school's ID is rejected with 400. Also fixes a stale frontend-doc claim
that GET /schools/{id} was open to any authenticated user - it's actually
ADMIN-only via SecurityConfig's filter chain.
</commit_message>
<xml_diff>
--- a/project-with-changes/docs/Frontend_API_Guide.docx
+++ b/project-with-changes/docs/Frontend_API_Guide.docx
@@ -4508,7 +4508,27 @@
         <w:t xml:space="preserve">Access: </w:t>
       </w:r>
       <w:r>
-        <w:t xml:space="preserve">Any authenticated user</w:t>
+        <w:t xml:space="preserve">ADMIN only</w:t>
+      </w:r>
+    </w:p>
+    <w:p>
+      <w:r>
+        <w:rPr>
+          <w:b/>
+        </w:rPr>
+        <w:t xml:space="preserve">Notes:</w:t>
+      </w:r>
+    </w:p>
+    <w:p>
+      <w:pPr>
+        <w:pStyle w:val="ListParagraph"/>
+        <w:numPr>
+          <w:ilvl w:val="0"/>
+          <w:numId w:val="1"/>
+        </w:numPr>
+      </w:pPr>
+      <w:r>
+        <w:t xml:space="preserve">Despite having no role check in the controller itself, every path under /schools/** other than the exact GET /schools list endpoint below is restricted to ADMIN at the security-filter level — a non-admin caller gets 403. Don't build a school-detail view for instructors/students against this endpoint; GET /auth/me already returns the caller's own schoolId/schoolName.</w:t>
       </w:r>
     </w:p>
     <w:p/>
@@ -6371,7 +6391,7 @@
         <w:rPr>
           <w:i/>
         </w:rPr>
-        <w:t xml:space="preserve">Admin: list students in a school.</w:t>
+        <w:t xml:space="preserve">List students in a school.</w:t>
       </w:r>
     </w:p>
     <w:p>
@@ -6382,7 +6402,39 @@
         <w:t xml:space="preserve">Access: </w:t>
       </w:r>
       <w:r>
-        <w:t xml:space="preserve">ADMIN only</w:t>
+        <w:t xml:space="preserve">ADMIN (any school), or an INSTRUCTOR listing their OWN school only</w:t>
+      </w:r>
+    </w:p>
+    <w:p>
+      <w:r>
+        <w:rPr>
+          <w:b/>
+        </w:rPr>
+        <w:t xml:space="preserve">Notes:</w:t>
+      </w:r>
+    </w:p>
+    <w:p>
+      <w:pPr>
+        <w:pStyle w:val="ListParagraph"/>
+        <w:numPr>
+          <w:ilvl w:val="0"/>
+          <w:numId w:val="1"/>
+        </w:numPr>
+      </w:pPr>
+      <w:r>
+        <w:t xml:space="preserve">An INSTRUCTOR passing a DIFFERENT school's ID than their own (from GET /auth/me's schoolId) gets 400, not the data.</w:t>
+      </w:r>
+    </w:p>
+    <w:p>
+      <w:pPr>
+        <w:pStyle w:val="ListParagraph"/>
+        <w:numPr>
+          <w:ilvl w:val="0"/>
+          <w:numId w:val="1"/>
+        </w:numPr>
+      </w:pPr>
+      <w:r>
+        <w:t xml:space="preserve">This is the endpoint for a student picker on the instructor's "book a lesson" and "add lesson note" forms — use it instead of asking the instructor to type a raw numeric student ID.</w:t>
       </w:r>
     </w:p>
     <w:p/>
@@ -22279,7 +22331,7 @@
         </w:numPr>
       </w:pPr>
       <w:r>
-        <w:t xml:space="preserve">"Instructor books a lesson": needs the student's StudentProfile.id (from an earlier student-list call) and the instructor's own InstructorProfile.id (from /auth/me), plus optionally a vehicle ID from a vehicle-list call. There's no single "book by student email" convenience endpoint.</w:t>
+        <w:t xml:space="preserve">"Instructor books a lesson": needs the student's StudentProfile.id (populate the picker from GET /students/school/{schoolId} using the instructor's own schoolId — no need to make the instructor type a raw student ID) and the instructor's own InstructorProfile.id (from /auth/me), plus optionally a vehicle ID from a vehicle-list call. There's no single "book by student email" convenience endpoint.</w:t>
       </w:r>
     </w:p>
     <w:p>

</xml_diff>

<commit_message>
Document messaging and announcements in the frontend API guide
New "Messaging & Announcements" section covering every conversation and
announcement endpoint (idempotent open, newest-first pagination with the
mine flag, mark-as-read, one-way announcements delivered in-app + email),
and that clients poll since there's no realtime channel. The lesson
questions section now tells the frontend to always send
assignedInstructorId, picked from GET /conversations/contacts - an
unassigned question reaches no instructor. Adds a "Messaging screens"
item to the frontend checklist. Frontend_API_Guide.docx regenerated.
</commit_message>
<xml_diff>
--- a/project-with-changes/docs/Frontend_API_Guide.docx
+++ b/project-with-changes/docs/Frontend_API_Guide.docx
@@ -17597,7 +17597,12 @@
     </w:p>
     <w:p>
       <w:r>
-        <w:t xml:space="preserve">A student asks a question (optionally targeted at a specific instructor); an instructor responds; status moves through a small workflow with a full audit history.</w:t>
+        <w:t xml:space="preserve">A student asks a question (optionally targeted at a specific instructor); an instructor responds; status moves through a small workflow with a full audit history. For back-and-forth conversation, use Messaging (below) instead.</w:t>
+      </w:r>
+    </w:p>
+    <w:p>
+      <w:r>
+        <w:t xml:space="preserve">Always send assignedInstructorId - pick it from GET /conversations/contacts. An unassigned question notifies no instructor and appears in no instructor's assigned/pending inbox; it only surfaces in GET /lesson-questions/status/{status}.</w:t>
       </w:r>
     </w:p>
     <w:p>
@@ -22018,12 +22023,25 @@
         <w:pStyle w:val="Heading1"/>
       </w:pPr>
       <w:r>
-        <w:t xml:space="preserve">Notifications</w:t>
-      </w:r>
-    </w:p>
-    <w:p>
-      <w:r>
-        <w:t xml:space="preserve">Two things happen here: the system automatically sends notifications for certain events, and admins/instructors can manually send an arbitrary notification via POST /send. Automatic IN_APP notifications currently fire on: a booking being created, a booking being cancelled, a quiz being submitted (pass or fail), a new lesson note being added, and a driving assessment being recorded. All of these are fire-and-forget from the frontend's perspective — nothing needs to be called to trigger them, they're side effects of the endpoints above.</w:t>
+        <w:t xml:space="preserve">Messaging &amp; Announcements</w:t>
+      </w:r>
+    </w:p>
+    <w:p>
+      <w:r>
+        <w:t xml:space="preserve">Private one-to-one conversations between a student and an instructor of the SAME school, plus one-way announcements from an instructor to every student of their school. Admins don't take part in conversations and can't read them.</w:t>
+      </w:r>
+    </w:p>
+    <w:p>
+      <w:r>
+        <w:t xml:space="preserve">There is no push/realtime channel: poll GET /conversations (and GET /notifications/me) while the messaging screen is open, e.g. every 10-30 seconds, and refresh the open thread when its unreadCount or lastMessageAt changes. Each new message also creates an IN_APP notification for the recipient ("New message from &lt;name&gt;").</w:t>
+      </w:r>
+    </w:p>
+    <w:p>
+      <w:pPr>
+        <w:pStyle w:val="Heading2"/>
+      </w:pPr>
+      <w:r>
+        <w:t xml:space="preserve">Conversations</w:t>
       </w:r>
     </w:p>
     <w:p>
@@ -22034,6 +22052,184 @@
           <w:sz w:val="18"/>
           <w:szCs w:val="18"/>
         </w:rPr>
+        <w:t xml:space="preserve">GET  </w:t>
+      </w:r>
+      <w:r>
+        <w:rPr>
+          <w:rFonts w:ascii="Consolas" w:hAnsi="Consolas" w:cs="Consolas"/>
+          <w:sz w:val="18"/>
+          <w:szCs w:val="18"/>
+        </w:rPr>
+        <w:t xml:space="preserve">/conversations/contacts</w:t>
+      </w:r>
+    </w:p>
+    <w:p>
+      <w:r>
+        <w:rPr>
+          <w:i/>
+        </w:rPr>
+        <w:t xml:space="preserve">Who I can message.</w:t>
+      </w:r>
+    </w:p>
+    <w:p>
+      <w:r>
+        <w:rPr>
+          <w:b/>
+        </w:rPr>
+        <w:t xml:space="preserve">Access: </w:t>
+      </w:r>
+      <w:r>
+        <w:t xml:space="preserve">STUDENT or INSTRUCTOR</w:t>
+      </w:r>
+    </w:p>
+    <w:p>
+      <w:r>
+        <w:rPr>
+          <w:b/>
+        </w:rPr>
+        <w:t xml:space="preserve">Response (key fields):</w:t>
+      </w:r>
+    </w:p>
+    <w:tbl>
+      <w:tblPr>
+        <w:tblStyle w:val="TableGrid"/>
+        <w:tblW w:w="0" w:type="auto"/>
+        <w:tblBorders>
+          <w:top w:val="single" w:sz="4" w:color="BFBFBF"/>
+          <w:left w:val="single" w:sz="4" w:color="BFBFBF"/>
+          <w:bottom w:val="single" w:sz="4" w:color="BFBFBF"/>
+          <w:right w:val="single" w:sz="4" w:color="BFBFBF"/>
+          <w:insideH w:val="single" w:sz="4" w:color="BFBFBF"/>
+          <w:insideV w:val="single" w:sz="4" w:color="BFBFBF"/>
+        </w:tblBorders>
+      </w:tblPr>
+      <w:tblGrid>
+        <w:gridCol w:w="3000"/>
+        <w:gridCol w:w="3000"/>
+        <w:gridCol w:w="3000"/>
+      </w:tblGrid>
+      <w:tr>
+        <w:tc>
+          <w:tcPr>
+            <w:shd w:val="clear" w:fill="2F5496"/>
+            <w:vAlign w:val="center"/>
+          </w:tcPr>
+          <w:p>
+            <w:pPr>
+              <w:shd w:val="clear" w:fill="2F5496"/>
+            </w:pPr>
+            <w:r>
+              <w:rPr>
+                <w:b/>
+                <w:color w:val="FFFFFF"/>
+              </w:rPr>
+              <w:t xml:space="preserve">Field</w:t>
+            </w:r>
+          </w:p>
+        </w:tc>
+        <w:tc>
+          <w:tcPr>
+            <w:shd w:val="clear" w:fill="2F5496"/>
+            <w:vAlign w:val="center"/>
+          </w:tcPr>
+          <w:p>
+            <w:pPr>
+              <w:shd w:val="clear" w:fill="2F5496"/>
+            </w:pPr>
+            <w:r>
+              <w:rPr>
+                <w:b/>
+                <w:color w:val="FFFFFF"/>
+              </w:rPr>
+              <w:t xml:space="preserve">Type</w:t>
+            </w:r>
+          </w:p>
+        </w:tc>
+        <w:tc>
+          <w:tcPr>
+            <w:shd w:val="clear" w:fill="2F5496"/>
+            <w:vAlign w:val="center"/>
+          </w:tcPr>
+          <w:p>
+            <w:pPr>
+              <w:shd w:val="clear" w:fill="2F5496"/>
+            </w:pPr>
+            <w:r>
+              <w:rPr>
+                <w:b/>
+                <w:color w:val="FFFFFF"/>
+              </w:rPr>
+              <w:t xml:space="preserve">Notes</w:t>
+            </w:r>
+          </w:p>
+        </w:tc>
+      </w:tr>
+      <w:tr>
+        <w:tc>
+          <w:tcPr>
+            <w:vAlign w:val="center"/>
+          </w:tcPr>
+          <w:p>
+            <w:pPr/>
+            <w:r>
+              <w:t xml:space="preserve">profileId / firstName / lastName</w:t>
+            </w:r>
+          </w:p>
+        </w:tc>
+        <w:tc>
+          <w:tcPr>
+            <w:vAlign w:val="center"/>
+          </w:tcPr>
+          <w:p>
+            <w:pPr/>
+            <w:r>
+              <w:t xml:space="preserve"/>
+            </w:r>
+          </w:p>
+        </w:tc>
+        <w:tc>
+          <w:tcPr>
+            <w:vAlign w:val="center"/>
+          </w:tcPr>
+          <w:p>
+            <w:pPr/>
+            <w:r>
+              <w:t xml:space="preserve">a student gets their school's ACTIVE instructors; an instructor gets their school's students</w:t>
+            </w:r>
+          </w:p>
+        </w:tc>
+      </w:tr>
+    </w:tbl>
+    <w:p/>
+    <w:p>
+      <w:r>
+        <w:rPr>
+          <w:b/>
+        </w:rPr>
+        <w:t xml:space="preserve">Notes:</w:t>
+      </w:r>
+    </w:p>
+    <w:p>
+      <w:pPr>
+        <w:pStyle w:val="ListParagraph"/>
+        <w:numPr>
+          <w:ilvl w:val="0"/>
+          <w:numId w:val="1"/>
+        </w:numPr>
+      </w:pPr>
+      <w:r>
+        <w:t xml:space="preserve">This is also the instructor picker for POST /lesson-questions' assignedInstructorId - students previously had no way to list their instructors.</w:t>
+      </w:r>
+    </w:p>
+    <w:p/>
+    <w:p>
+      <w:r>
+        <w:rPr>
+          <w:b/>
+          <w:rFonts w:ascii="Consolas" w:hAnsi="Consolas" w:cs="Consolas"/>
+          <w:sz w:val="18"/>
+          <w:szCs w:val="18"/>
+        </w:rPr>
         <w:t xml:space="preserve">POST  </w:t>
       </w:r>
       <w:r>
@@ -22042,7 +22238,7 @@
           <w:sz w:val="18"/>
           <w:szCs w:val="18"/>
         </w:rPr>
-        <w:t xml:space="preserve">/notifications/send</w:t>
+        <w:t xml:space="preserve">/conversations</w:t>
       </w:r>
     </w:p>
     <w:p>
@@ -22050,7 +22246,7 @@
         <w:rPr>
           <w:i/>
         </w:rPr>
-        <w:t xml:space="preserve">Send a notification to a user.</w:t>
+        <w:t xml:space="preserve">Open my conversation with someone (or get the existing one).</w:t>
       </w:r>
     </w:p>
     <w:p>
@@ -22061,7 +22257,7 @@
         <w:t xml:space="preserve">Access: </w:t>
       </w:r>
       <w:r>
-        <w:t xml:space="preserve">ADMIN or INSTRUCTOR</w:t>
+        <w:t xml:space="preserve">STUDENT or INSTRUCTOR</w:t>
       </w:r>
     </w:p>
     <w:p>
@@ -22173,7 +22369,7 @@
           <w:p>
             <w:pPr/>
             <w:r>
-              <w:t xml:space="preserve">userId</w:t>
+              <w:t xml:space="preserve">participantProfileId</w:t>
             </w:r>
           </w:p>
         </w:tc>
@@ -22206,191 +22402,7 @@
           <w:p>
             <w:pPr/>
             <w:r>
-              <w:t xml:space="preserve">the raw User.id (not a profile id) of the recipient - must be in the caller's own school (bootstrap admin: anyone)</w:t>
-            </w:r>
-          </w:p>
-        </w:tc>
-      </w:tr>
-      <w:tr>
-        <w:tc>
-          <w:tcPr>
-            <w:vAlign w:val="center"/>
-          </w:tcPr>
-          <w:p>
-            <w:pPr/>
-            <w:r>
-              <w:t xml:space="preserve">subject</w:t>
-            </w:r>
-          </w:p>
-        </w:tc>
-        <w:tc>
-          <w:tcPr>
-            <w:vAlign w:val="center"/>
-          </w:tcPr>
-          <w:p>
-            <w:pPr/>
-            <w:r>
-              <w:t xml:space="preserve">string</w:t>
-            </w:r>
-          </w:p>
-        </w:tc>
-        <w:tc>
-          <w:tcPr>
-            <w:vAlign w:val="center"/>
-          </w:tcPr>
-          <w:p>
-            <w:pPr/>
-            <w:r>
-              <w:t xml:space="preserve">yes</w:t>
-            </w:r>
-          </w:p>
-        </w:tc>
-        <w:tc>
-          <w:tcPr>
-            <w:vAlign w:val="center"/>
-          </w:tcPr>
-          <w:p>
-            <w:pPr/>
-            <w:r>
-              <w:t xml:space="preserve">max 200 chars</w:t>
-            </w:r>
-          </w:p>
-        </w:tc>
-      </w:tr>
-      <w:tr>
-        <w:tc>
-          <w:tcPr>
-            <w:vAlign w:val="center"/>
-          </w:tcPr>
-          <w:p>
-            <w:pPr/>
-            <w:r>
-              <w:t xml:space="preserve">body</w:t>
-            </w:r>
-          </w:p>
-        </w:tc>
-        <w:tc>
-          <w:tcPr>
-            <w:vAlign w:val="center"/>
-          </w:tcPr>
-          <w:p>
-            <w:pPr/>
-            <w:r>
-              <w:t xml:space="preserve">string</w:t>
-            </w:r>
-          </w:p>
-        </w:tc>
-        <w:tc>
-          <w:tcPr>
-            <w:vAlign w:val="center"/>
-          </w:tcPr>
-          <w:p>
-            <w:pPr/>
-            <w:r>
-              <w:t xml:space="preserve">yes</w:t>
-            </w:r>
-          </w:p>
-        </w:tc>
-        <w:tc>
-          <w:tcPr>
-            <w:vAlign w:val="center"/>
-          </w:tcPr>
-          <w:p>
-            <w:pPr/>
-            <w:r>
-              <w:t xml:space="preserve"/>
-            </w:r>
-          </w:p>
-        </w:tc>
-      </w:tr>
-      <w:tr>
-        <w:tc>
-          <w:tcPr>
-            <w:vAlign w:val="center"/>
-          </w:tcPr>
-          <w:p>
-            <w:pPr/>
-            <w:r>
-              <w:t xml:space="preserve">channel</w:t>
-            </w:r>
-          </w:p>
-        </w:tc>
-        <w:tc>
-          <w:tcPr>
-            <w:vAlign w:val="center"/>
-          </w:tcPr>
-          <w:p>
-            <w:pPr/>
-            <w:r>
-              <w:t xml:space="preserve">enum</w:t>
-            </w:r>
-          </w:p>
-        </w:tc>
-        <w:tc>
-          <w:tcPr>
-            <w:vAlign w:val="center"/>
-          </w:tcPr>
-          <w:p>
-            <w:pPr/>
-            <w:r>
-              <w:t xml:space="preserve">yes</w:t>
-            </w:r>
-          </w:p>
-        </w:tc>
-        <w:tc>
-          <w:tcPr>
-            <w:vAlign w:val="center"/>
-          </w:tcPr>
-          <w:p>
-            <w:pPr/>
-            <w:r>
-              <w:t xml:space="preserve">EMAIL, SMS, PUSH, IN_APP</w:t>
-            </w:r>
-          </w:p>
-        </w:tc>
-      </w:tr>
-      <w:tr>
-        <w:tc>
-          <w:tcPr>
-            <w:vAlign w:val="center"/>
-          </w:tcPr>
-          <w:p>
-            <w:pPr/>
-            <w:r>
-              <w:t xml:space="preserve">recipientAddress</w:t>
-            </w:r>
-          </w:p>
-        </w:tc>
-        <w:tc>
-          <w:tcPr>
-            <w:vAlign w:val="center"/>
-          </w:tcPr>
-          <w:p>
-            <w:pPr/>
-            <w:r>
-              <w:t xml:space="preserve">string</w:t>
-            </w:r>
-          </w:p>
-        </w:tc>
-        <w:tc>
-          <w:tcPr>
-            <w:vAlign w:val="center"/>
-          </w:tcPr>
-          <w:p>
-            <w:pPr/>
-            <w:r>
-              <w:t xml:space="preserve">no</w:t>
-            </w:r>
-          </w:p>
-        </w:tc>
-        <w:tc>
-          <w:tcPr>
-            <w:vAlign w:val="center"/>
-          </w:tcPr>
-          <w:p>
-            <w:pPr/>
-            <w:r>
-              <w:t xml:space="preserve">overrides the default recipient address (the user's own email) — rarely needed</w:t>
+              <w:t xml:space="preserve">the OTHER person's profile id: an InstructorProfile.id for a student caller, a StudentProfile.id for an instructor caller</w:t>
             </w:r>
           </w:p>
         </w:tc>
@@ -22487,29 +22499,99 @@
           <w:p>
             <w:pPr/>
             <w:r>
-              <w:t xml:space="preserve">status</w:t>
-            </w:r>
-          </w:p>
-        </w:tc>
-        <w:tc>
-          <w:tcPr>
-            <w:vAlign w:val="center"/>
-          </w:tcPr>
-          <w:p>
-            <w:pPr/>
-            <w:r>
-              <w:t xml:space="preserve">enum</w:t>
-            </w:r>
-          </w:p>
-        </w:tc>
-        <w:tc>
-          <w:tcPr>
-            <w:vAlign w:val="center"/>
-          </w:tcPr>
-          <w:p>
-            <w:pPr/>
-            <w:r>
-              <w:t xml:space="preserve">PENDING, SENT, or FAILED — see the important note below</w:t>
+              <w:t xml:space="preserve">id</w:t>
+            </w:r>
+          </w:p>
+        </w:tc>
+        <w:tc>
+          <w:tcPr>
+            <w:vAlign w:val="center"/>
+          </w:tcPr>
+          <w:p>
+            <w:pPr/>
+            <w:r>
+              <w:t xml:space="preserve">number</w:t>
+            </w:r>
+          </w:p>
+        </w:tc>
+        <w:tc>
+          <w:tcPr>
+            <w:vAlign w:val="center"/>
+          </w:tcPr>
+          <w:p>
+            <w:pPr/>
+            <w:r>
+              <w:t xml:space="preserve">the conversation id used by every endpoint below</w:t>
+            </w:r>
+          </w:p>
+        </w:tc>
+      </w:tr>
+      <w:tr>
+        <w:tc>
+          <w:tcPr>
+            <w:vAlign w:val="center"/>
+          </w:tcPr>
+          <w:p>
+            <w:pPr/>
+            <w:r>
+              <w:t xml:space="preserve">counterpartName / counterpartRole</w:t>
+            </w:r>
+          </w:p>
+        </w:tc>
+        <w:tc>
+          <w:tcPr>
+            <w:vAlign w:val="center"/>
+          </w:tcPr>
+          <w:p>
+            <w:pPr/>
+            <w:r>
+              <w:t xml:space="preserve"/>
+            </w:r>
+          </w:p>
+        </w:tc>
+        <w:tc>
+          <w:tcPr>
+            <w:vAlign w:val="center"/>
+          </w:tcPr>
+          <w:p>
+            <w:pPr/>
+            <w:r>
+              <w:t xml:space="preserve">the other participant</w:t>
+            </w:r>
+          </w:p>
+        </w:tc>
+      </w:tr>
+      <w:tr>
+        <w:tc>
+          <w:tcPr>
+            <w:vAlign w:val="center"/>
+          </w:tcPr>
+          <w:p>
+            <w:pPr/>
+            <w:r>
+              <w:t xml:space="preserve">unreadCount / lastMessagePreview / lastMessageAt</w:t>
+            </w:r>
+          </w:p>
+        </w:tc>
+        <w:tc>
+          <w:tcPr>
+            <w:vAlign w:val="center"/>
+          </w:tcPr>
+          <w:p>
+            <w:pPr/>
+            <w:r>
+              <w:t xml:space="preserve"/>
+            </w:r>
+          </w:p>
+        </w:tc>
+        <w:tc>
+          <w:tcPr>
+            <w:vAlign w:val="center"/>
+          </w:tcPr>
+          <w:p>
+            <w:pPr/>
+            <w:r>
+              <w:t xml:space="preserve"/>
             </w:r>
           </w:p>
         </w:tc>
@@ -22533,7 +22615,7 @@
         </w:numPr>
       </w:pPr>
       <w:r>
-        <w:t xml:space="preserve">IMPORTANT — EMAIL and SMS are asynchronous: the response comes back with status PENDING immediately (the actual send happens moments later on a background thread, so the caller isn't stuck waiting on a slow mail server). If you display delivery status in a UI, don't treat PENDING as final — either poll GET /notifications/me afterward, or simply don't surface real-time delivery status for EMAIL at all (the common choice).</w:t>
+        <w:t xml:space="preserve">Idempotent: there is exactly one conversation per student-instructor pair, so calling this again returns the same one (200 both times).</w:t>
       </w:r>
     </w:p>
     <w:p>
@@ -22545,19 +22627,7 @@
         </w:numPr>
       </w:pPr>
       <w:r>
-        <w:t xml:space="preserve">IN_APP is synchronous and settles to SENT immediately in the same response.</w:t>
-      </w:r>
-    </w:p>
-    <w:p>
-      <w:pPr>
-        <w:pStyle w:val="ListParagraph"/>
-        <w:numPr>
-          <w:ilvl w:val="0"/>
-          <w:numId w:val="1"/>
-        </w:numPr>
-      </w:pPr>
-      <w:r>
-        <w:t xml:space="preserve">SMS sends through Twilio only once the server's TWILIO_ACCOUNT_SID / TWILIO_AUTH_TOKEN / TWILIO_FROM_NUMBER are set, and only to a recipient with a phone number on their profile - otherwise it settles to FAILED. PUSH is not wired to a real provider yet and always comes back FAILED - don't offer it as a user-facing channel choice.</w:t>
+        <w:t xml:space="preserve">400 if the other person is at a different school, is an inactive instructor, or their account has been deleted.</w:t>
       </w:r>
     </w:p>
     <w:p/>
@@ -22577,7 +22647,7 @@
           <w:sz w:val="18"/>
           <w:szCs w:val="18"/>
         </w:rPr>
-        <w:t xml:space="preserve">/notifications/me</w:t>
+        <w:t xml:space="preserve">/conversations</w:t>
       </w:r>
     </w:p>
     <w:p>
@@ -22585,7 +22655,7 @@
         <w:rPr>
           <w:i/>
         </w:rPr>
-        <w:t xml:space="preserve">My own notifications, most recent first.</w:t>
+        <w:t xml:space="preserve">My inbox, most recent activity first.</w:t>
       </w:r>
     </w:p>
     <w:p>
@@ -22596,88 +22666,15 @@
         <w:t xml:space="preserve">Access: </w:t>
       </w:r>
       <w:r>
-        <w:t xml:space="preserve">Any authenticated user</w:t>
-      </w:r>
-    </w:p>
-    <w:p>
-      <w:r>
-        <w:rPr>
-          <w:b/>
-        </w:rPr>
-        <w:t xml:space="preserve">Notes:</w:t>
-      </w:r>
-    </w:p>
-    <w:p>
-      <w:pPr>
-        <w:pStyle w:val="ListParagraph"/>
-        <w:numPr>
-          <w:ilvl w:val="0"/>
-          <w:numId w:val="1"/>
-        </w:numPr>
-      </w:pPr>
-      <w:r>
-        <w:t xml:space="preserve">This is the endpoint for a bell-icon notification list / inbox.</w:t>
-      </w:r>
-    </w:p>
-    <w:p/>
-    <w:p>
-      <w:r>
-        <w:rPr>
-          <w:b/>
-          <w:rFonts w:ascii="Consolas" w:hAnsi="Consolas" w:cs="Consolas"/>
-          <w:sz w:val="18"/>
-          <w:szCs w:val="18"/>
-        </w:rPr>
-        <w:t xml:space="preserve">PATCH  </w:t>
-      </w:r>
-      <w:r>
-        <w:rPr>
-          <w:rFonts w:ascii="Consolas" w:hAnsi="Consolas" w:cs="Consolas"/>
-          <w:sz w:val="18"/>
-          <w:szCs w:val="18"/>
-        </w:rPr>
-        <w:t xml:space="preserve">/notifications/{id}/read</w:t>
-      </w:r>
-    </w:p>
-    <w:p>
-      <w:r>
-        <w:rPr>
-          <w:i/>
-        </w:rPr>
-        <w:t xml:space="preserve">Mark a notification as read.</w:t>
-      </w:r>
-    </w:p>
-    <w:p>
-      <w:r>
-        <w:rPr>
-          <w:b/>
-        </w:rPr>
-        <w:t xml:space="preserve">Access: </w:t>
-      </w:r>
-      <w:r>
-        <w:t xml:space="preserve">Any authenticated user (their own notification only)</w:t>
-      </w:r>
-    </w:p>
-    <w:p/>
-    <w:p>
-      <w:pPr>
-        <w:pStyle w:val="Heading1"/>
-      </w:pPr>
-      <w:r>
-        <w:t xml:space="preserve">Gamification</w:t>
-      </w:r>
-    </w:p>
-    <w:p>
-      <w:r>
-        <w:t xml:space="preserve">Student-only (instructors have no gamification data of their own). Points, a weekly lesson streak, and a fixed set of named badges, plus a school-wide leaderboard. Nothing here is ever called directly to "award" anything — it's entirely a side effect of normal actions elsewhere in the API (completing a booking, passing a quiz, passing a driving assessment). These endpoints are read-only from the frontend's perspective.</w:t>
-      </w:r>
-    </w:p>
-    <w:p>
-      <w:pPr>
-        <w:pStyle w:val="Heading2"/>
-      </w:pPr>
-      <w:r>
-        <w:t xml:space="preserve">How points are earned</w:t>
+        <w:t xml:space="preserve">STUDENT or INSTRUCTOR</w:t>
+      </w:r>
+    </w:p>
+    <w:p>
+      <w:r>
+        <w:rPr>
+          <w:b/>
+        </w:rPr>
+        <w:t xml:space="preserve">Response (key fields):</w:t>
       </w:r>
     </w:p>
     <w:tbl>
@@ -22713,25 +22710,25 @@
                 <w:b/>
                 <w:color w:val="FFFFFF"/>
               </w:rPr>
-              <w:t xml:space="preserve">Trigger</w:t>
-            </w:r>
-          </w:p>
-        </w:tc>
-        <w:tc>
-          <w:tcPr>
-            <w:shd w:val="clear" w:fill="2F5496"/>
-            <w:vAlign w:val="center"/>
-          </w:tcPr>
-          <w:p>
-            <w:pPr>
-              <w:shd w:val="clear" w:fill="2F5496"/>
-            </w:pPr>
-            <w:r>
-              <w:rPr>
-                <w:b/>
-                <w:color w:val="FFFFFF"/>
-              </w:rPr>
-              <w:t xml:space="preserve">Points</w:t>
+              <w:t xml:space="preserve">Field</w:t>
+            </w:r>
+          </w:p>
+        </w:tc>
+        <w:tc>
+          <w:tcPr>
+            <w:shd w:val="clear" w:fill="2F5496"/>
+            <w:vAlign w:val="center"/>
+          </w:tcPr>
+          <w:p>
+            <w:pPr>
+              <w:shd w:val="clear" w:fill="2F5496"/>
+            </w:pPr>
+            <w:r>
+              <w:rPr>
+                <w:b/>
+                <w:color w:val="FFFFFF"/>
+              </w:rPr>
+              <w:t xml:space="preserve">Type</w:t>
             </w:r>
           </w:p>
         </w:tc>
@@ -22762,355 +22759,35 @@
           <w:p>
             <w:pPr/>
             <w:r>
-              <w:t xml:space="preserve">Booking marked COMPLETED</w:t>
-            </w:r>
-          </w:p>
-        </w:tc>
-        <w:tc>
-          <w:tcPr>
-            <w:vAlign w:val="center"/>
-          </w:tcPr>
-          <w:p>
-            <w:pPr/>
-            <w:r>
-              <w:t xml:space="preserve">10</w:t>
-            </w:r>
-          </w:p>
-        </w:tc>
-        <w:tc>
-          <w:tcPr>
-            <w:vAlign w:val="center"/>
-          </w:tcPr>
-          <w:p>
-            <w:pPr/>
-            <w:r>
-              <w:t xml:space="preserve">awarded once per booking</w:t>
-            </w:r>
-          </w:p>
-        </w:tc>
-      </w:tr>
-      <w:tr>
-        <w:tc>
-          <w:tcPr>
-            <w:vAlign w:val="center"/>
-          </w:tcPr>
-          <w:p>
-            <w:pPr/>
-            <w:r>
-              <w:t xml:space="preserve">Quiz submission passed</w:t>
-            </w:r>
-          </w:p>
-        </w:tc>
-        <w:tc>
-          <w:tcPr>
-            <w:vAlign w:val="center"/>
-          </w:tcPr>
-          <w:p>
-            <w:pPr/>
-            <w:r>
-              <w:t xml:space="preserve">20</w:t>
-            </w:r>
-          </w:p>
-        </w:tc>
-        <w:tc>
-          <w:tcPr>
-            <w:vAlign w:val="center"/>
-          </w:tcPr>
-          <w:p>
-            <w:pPr/>
-            <w:r>
-              <w:t xml:space="preserve">awarded once per quiz per student — retaking an already-passed quiz does not award points again</w:t>
-            </w:r>
-          </w:p>
-        </w:tc>
-      </w:tr>
-      <w:tr>
-        <w:tc>
-          <w:tcPr>
-            <w:vAlign w:val="center"/>
-          </w:tcPr>
-          <w:p>
-            <w:pPr/>
-            <w:r>
-              <w:t xml:space="preserve">Driving assessment result = PASSED</w:t>
-            </w:r>
-          </w:p>
-        </w:tc>
-        <w:tc>
-          <w:tcPr>
-            <w:vAlign w:val="center"/>
-          </w:tcPr>
-          <w:p>
-            <w:pPr/>
-            <w:r>
-              <w:t xml:space="preserve">30</w:t>
-            </w:r>
-          </w:p>
-        </w:tc>
-        <w:tc>
-          <w:tcPr>
-            <w:vAlign w:val="center"/>
-          </w:tcPr>
-          <w:p>
-            <w:pPr/>
-            <w:r>
-              <w:t xml:space="preserve">awarded once per student (the first passed assessment); later passed assessments don't award again</w:t>
+              <w:t xml:space="preserve">[] of the same shape as POST /conversations</w:t>
+            </w:r>
+          </w:p>
+        </w:tc>
+        <w:tc>
+          <w:tcPr>
+            <w:vAlign w:val="center"/>
+          </w:tcPr>
+          <w:p>
+            <w:pPr/>
+            <w:r>
+              <w:t xml:space="preserve"/>
+            </w:r>
+          </w:p>
+        </w:tc>
+        <w:tc>
+          <w:tcPr>
+            <w:vAlign w:val="center"/>
+          </w:tcPr>
+          <w:p>
+            <w:pPr/>
+            <w:r>
+              <w:t xml:space="preserve">unreadCount counts messages the OTHER person sent that I haven't read</w:t>
             </w:r>
           </w:p>
         </w:tc>
       </w:tr>
     </w:tbl>
     <w:p/>
-    <w:p>
-      <w:pPr>
-        <w:pStyle w:val="Heading2"/>
-      </w:pPr>
-      <w:r>
-        <w:t xml:space="preserve">Weekly streak</w:t>
-      </w:r>
-    </w:p>
-    <w:p>
-      <w:r>
-        <w:t xml:space="preserve">Counts consecutive calendar weeks (Monday-start) in which the student had at least one completed booking. Completing a second lesson in the same week doesn't increase the streak further; missing a week resets it back to 1 on the next completed lesson (it does not silently decay to 0 while the student is simply inactive — nothing changes until their next completed lesson).</w:t>
-      </w:r>
-    </w:p>
-    <w:p>
-      <w:pPr>
-        <w:pStyle w:val="Heading2"/>
-      </w:pPr>
-      <w:r>
-        <w:t xml:space="preserve">Badges</w:t>
-      </w:r>
-    </w:p>
-    <w:p>
-      <w:r>
-        <w:t xml:space="preserve">A fixed catalog, not admin-configurable. Each is awarded at most once per student:</w:t>
-      </w:r>
-    </w:p>
-    <w:tbl>
-      <w:tblPr>
-        <w:tblStyle w:val="TableGrid"/>
-        <w:tblW w:w="0" w:type="auto"/>
-        <w:tblBorders>
-          <w:top w:val="single" w:sz="4" w:color="BFBFBF"/>
-          <w:left w:val="single" w:sz="4" w:color="BFBFBF"/>
-          <w:bottom w:val="single" w:sz="4" w:color="BFBFBF"/>
-          <w:right w:val="single" w:sz="4" w:color="BFBFBF"/>
-          <w:insideH w:val="single" w:sz="4" w:color="BFBFBF"/>
-          <w:insideV w:val="single" w:sz="4" w:color="BFBFBF"/>
-        </w:tblBorders>
-      </w:tblPr>
-      <w:tblGrid>
-        <w:gridCol w:w="4500"/>
-        <w:gridCol w:w="4500"/>
-      </w:tblGrid>
-      <w:tr>
-        <w:tc>
-          <w:tcPr>
-            <w:shd w:val="clear" w:fill="2F5496"/>
-            <w:vAlign w:val="center"/>
-          </w:tcPr>
-          <w:p>
-            <w:pPr>
-              <w:shd w:val="clear" w:fill="2F5496"/>
-            </w:pPr>
-            <w:r>
-              <w:rPr>
-                <w:b/>
-                <w:color w:val="FFFFFF"/>
-              </w:rPr>
-              <w:t xml:space="preserve">Badge</w:t>
-            </w:r>
-          </w:p>
-        </w:tc>
-        <w:tc>
-          <w:tcPr>
-            <w:shd w:val="clear" w:fill="2F5496"/>
-            <w:vAlign w:val="center"/>
-          </w:tcPr>
-          <w:p>
-            <w:pPr>
-              <w:shd w:val="clear" w:fill="2F5496"/>
-            </w:pPr>
-            <w:r>
-              <w:rPr>
-                <w:b/>
-                <w:color w:val="FFFFFF"/>
-              </w:rPr>
-              <w:t xml:space="preserve">Awarded when</w:t>
-            </w:r>
-          </w:p>
-        </w:tc>
-      </w:tr>
-      <w:tr>
-        <w:tc>
-          <w:tcPr>
-            <w:vAlign w:val="center"/>
-          </w:tcPr>
-          <w:p>
-            <w:pPr/>
-            <w:r>
-              <w:t xml:space="preserve">First Lesson</w:t>
-            </w:r>
-          </w:p>
-        </w:tc>
-        <w:tc>
-          <w:tcPr>
-            <w:vAlign w:val="center"/>
-          </w:tcPr>
-          <w:p>
-            <w:pPr/>
-            <w:r>
-              <w:t xml:space="preserve">First booking ever marked completed</w:t>
-            </w:r>
-          </w:p>
-        </w:tc>
-      </w:tr>
-      <w:tr>
-        <w:tc>
-          <w:tcPr>
-            <w:vAlign w:val="center"/>
-          </w:tcPr>
-          <w:p>
-            <w:pPr/>
-            <w:r>
-              <w:t xml:space="preserve">Quiz Master</w:t>
-            </w:r>
-          </w:p>
-        </w:tc>
-        <w:tc>
-          <w:tcPr>
-            <w:vAlign w:val="center"/>
-          </w:tcPr>
-          <w:p>
-            <w:pPr/>
-            <w:r>
-              <w:t xml:space="preserve">First quiz ever passed</w:t>
-            </w:r>
-          </w:p>
-        </w:tc>
-      </w:tr>
-      <w:tr>
-        <w:tc>
-          <w:tcPr>
-            <w:vAlign w:val="center"/>
-          </w:tcPr>
-          <w:p>
-            <w:pPr/>
-            <w:r>
-              <w:t xml:space="preserve">Road Ready</w:t>
-            </w:r>
-          </w:p>
-        </w:tc>
-        <w:tc>
-          <w:tcPr>
-            <w:vAlign w:val="center"/>
-          </w:tcPr>
-          <w:p>
-            <w:pPr/>
-            <w:r>
-              <w:t xml:space="preserve">First driving assessment ever passed</w:t>
-            </w:r>
-          </w:p>
-        </w:tc>
-      </w:tr>
-      <w:tr>
-        <w:tc>
-          <w:tcPr>
-            <w:vAlign w:val="center"/>
-          </w:tcPr>
-          <w:p>
-            <w:pPr/>
-            <w:r>
-              <w:t xml:space="preserve">5-Week Streak</w:t>
-            </w:r>
-          </w:p>
-        </w:tc>
-        <w:tc>
-          <w:tcPr>
-            <w:vAlign w:val="center"/>
-          </w:tcPr>
-          <w:p>
-            <w:pPr/>
-            <w:r>
-              <w:t xml:space="preserve">Weekly streak reaches 5</w:t>
-            </w:r>
-          </w:p>
-        </w:tc>
-      </w:tr>
-      <w:tr>
-        <w:tc>
-          <w:tcPr>
-            <w:vAlign w:val="center"/>
-          </w:tcPr>
-          <w:p>
-            <w:pPr/>
-            <w:r>
-              <w:t xml:space="preserve">10-Week Streak</w:t>
-            </w:r>
-          </w:p>
-        </w:tc>
-        <w:tc>
-          <w:tcPr>
-            <w:vAlign w:val="center"/>
-          </w:tcPr>
-          <w:p>
-            <w:pPr/>
-            <w:r>
-              <w:t xml:space="preserve">Weekly streak reaches 10</w:t>
-            </w:r>
-          </w:p>
-        </w:tc>
-      </w:tr>
-      <w:tr>
-        <w:tc>
-          <w:tcPr>
-            <w:vAlign w:val="center"/>
-          </w:tcPr>
-          <w:p>
-            <w:pPr/>
-            <w:r>
-              <w:t xml:space="preserve">Century Club</w:t>
-            </w:r>
-          </w:p>
-        </w:tc>
-        <w:tc>
-          <w:tcPr>
-            <w:vAlign w:val="center"/>
-          </w:tcPr>
-          <w:p>
-            <w:pPr/>
-            <w:r>
-              <w:t xml:space="preserve">Total points reach 100</w:t>
-            </w:r>
-          </w:p>
-        </w:tc>
-      </w:tr>
-      <w:tr>
-        <w:tc>
-          <w:tcPr>
-            <w:vAlign w:val="center"/>
-          </w:tcPr>
-          <w:p>
-            <w:pPr/>
-            <w:r>
-              <w:t xml:space="preserve">High Achiever</w:t>
-            </w:r>
-          </w:p>
-        </w:tc>
-        <w:tc>
-          <w:tcPr>
-            <w:vAlign w:val="center"/>
-          </w:tcPr>
-          <w:p>
-            <w:pPr/>
-            <w:r>
-              <w:t xml:space="preserve">Total points reach 500</w:t>
-            </w:r>
-          </w:p>
-        </w:tc>
-      </w:tr>
-    </w:tbl>
     <w:p/>
     <w:p>
       <w:r>
@@ -23128,7 +22805,7 @@
           <w:sz w:val="18"/>
           <w:szCs w:val="18"/>
         </w:rPr>
-        <w:t xml:space="preserve">/gamification/me</w:t>
+        <w:t xml:space="preserve">/conversations/{id}/messages</w:t>
       </w:r>
     </w:p>
     <w:p>
@@ -23136,7 +22813,7 @@
         <w:rPr>
           <w:i/>
         </w:rPr>
-        <w:t xml:space="preserve">The current student's own gamification summary.</w:t>
+        <w:t xml:space="preserve">A conversation's messages, NEWEST first (paginated, 50 per page by default).</w:t>
       </w:r>
     </w:p>
     <w:p>
@@ -23147,7 +22824,7 @@
         <w:t xml:space="preserve">Access: </w:t>
       </w:r>
       <w:r>
-        <w:t xml:space="preserve">STUDENT only</w:t>
+        <w:t xml:space="preserve">Participants only</w:t>
       </w:r>
     </w:p>
     <w:p>
@@ -23240,7 +22917,7 @@
           <w:p>
             <w:pPr/>
             <w:r>
-              <w:t xml:space="preserve">studentId / studentName</w:t>
+              <w:t xml:space="preserve">content[].body / sentAt / readAt</w:t>
             </w:r>
           </w:p>
         </w:tc>
@@ -23275,308 +22952,35 @@
           <w:p>
             <w:pPr/>
             <w:r>
-              <w:t xml:space="preserve">totalPoints / currentStreakWeeks / longestStreakWeeks</w:t>
-            </w:r>
-          </w:p>
-        </w:tc>
-        <w:tc>
-          <w:tcPr>
-            <w:vAlign w:val="center"/>
-          </w:tcPr>
-          <w:p>
-            <w:pPr/>
-            <w:r>
-              <w:t xml:space="preserve">number</w:t>
-            </w:r>
-          </w:p>
-        </w:tc>
-        <w:tc>
-          <w:tcPr>
-            <w:vAlign w:val="center"/>
-          </w:tcPr>
-          <w:p>
-            <w:pPr/>
-            <w:r>
-              <w:t xml:space="preserve"/>
-            </w:r>
-          </w:p>
-        </w:tc>
-      </w:tr>
-      <w:tr>
-        <w:tc>
-          <w:tcPr>
-            <w:vAlign w:val="center"/>
-          </w:tcPr>
-          <w:p>
-            <w:pPr/>
-            <w:r>
-              <w:t xml:space="preserve">schoolRank</w:t>
-            </w:r>
-          </w:p>
-        </w:tc>
-        <w:tc>
-          <w:tcPr>
-            <w:vAlign w:val="center"/>
-          </w:tcPr>
-          <w:p>
-            <w:pPr/>
-            <w:r>
-              <w:t xml:space="preserve">number</w:t>
-            </w:r>
-          </w:p>
-        </w:tc>
-        <w:tc>
-          <w:tcPr>
-            <w:vAlign w:val="center"/>
-          </w:tcPr>
-          <w:p>
-            <w:pPr/>
-            <w:r>
-              <w:t xml:space="preserve">1-based rank by totalPoints within the student's own school</w:t>
-            </w:r>
-          </w:p>
-        </w:tc>
-      </w:tr>
-      <w:tr>
-        <w:tc>
-          <w:tcPr>
-            <w:vAlign w:val="center"/>
-          </w:tcPr>
-          <w:p>
-            <w:pPr/>
-            <w:r>
-              <w:t xml:space="preserve">badges</w:t>
-            </w:r>
-          </w:p>
-        </w:tc>
-        <w:tc>
-          <w:tcPr>
-            <w:vAlign w:val="center"/>
-          </w:tcPr>
-          <w:p>
-            <w:pPr/>
-            <w:r>
-              <w:t xml:space="preserve">array</w:t>
-            </w:r>
-          </w:p>
-        </w:tc>
-        <w:tc>
-          <w:tcPr>
-            <w:vAlign w:val="center"/>
-          </w:tcPr>
-          <w:p>
-            <w:pPr/>
-            <w:r>
-              <w:t xml:space="preserve">each item: badge (enum), displayName, description, awardedAt</w:t>
+              <w:t xml:space="preserve">content[].mine</w:t>
+            </w:r>
+          </w:p>
+        </w:tc>
+        <w:tc>
+          <w:tcPr>
+            <w:vAlign w:val="center"/>
+          </w:tcPr>
+          <w:p>
+            <w:pPr/>
+            <w:r>
+              <w:t xml:space="preserve">boolean</w:t>
+            </w:r>
+          </w:p>
+        </w:tc>
+        <w:tc>
+          <w:tcPr>
+            <w:vAlign w:val="center"/>
+          </w:tcPr>
+          <w:p>
+            <w:pPr/>
+            <w:r>
+              <w:t xml:space="preserve">true for messages the caller sent - use it to align chat bubbles</w:t>
             </w:r>
           </w:p>
         </w:tc>
       </w:tr>
     </w:tbl>
     <w:p/>
-    <w:p>
-      <w:r>
-        <w:rPr>
-          <w:b/>
-        </w:rPr>
-        <w:t xml:space="preserve">Example response:</w:t>
-      </w:r>
-    </w:p>
-    <w:p>
-      <w:pPr>
-        <w:pStyle w:val="Code"/>
-        <w:shd w:val="clear" w:fill="F3F3F3"/>
-      </w:pPr>
-      <w:r>
-        <w:rPr>
-          <w:rFonts w:ascii="Consolas" w:hAnsi="Consolas"/>
-          <w:sz w:val="18"/>
-        </w:rPr>
-        <w:t xml:space="preserve">{</w:t>
-      </w:r>
-    </w:p>
-    <w:p>
-      <w:pPr>
-        <w:pStyle w:val="Code"/>
-        <w:shd w:val="clear" w:fill="F3F3F3"/>
-      </w:pPr>
-      <w:r>
-        <w:rPr>
-          <w:rFonts w:ascii="Consolas" w:hAnsi="Consolas"/>
-          <w:sz w:val="18"/>
-        </w:rPr>
-        <w:t xml:space="preserve">  "success": true,</w:t>
-      </w:r>
-    </w:p>
-    <w:p>
-      <w:pPr>
-        <w:pStyle w:val="Code"/>
-        <w:shd w:val="clear" w:fill="F3F3F3"/>
-      </w:pPr>
-      <w:r>
-        <w:rPr>
-          <w:rFonts w:ascii="Consolas" w:hAnsi="Consolas"/>
-          <w:sz w:val="18"/>
-        </w:rPr>
-        <w:t xml:space="preserve">  "message": "Operation successful",</w:t>
-      </w:r>
-    </w:p>
-    <w:p>
-      <w:pPr>
-        <w:pStyle w:val="Code"/>
-        <w:shd w:val="clear" w:fill="F3F3F3"/>
-      </w:pPr>
-      <w:r>
-        <w:rPr>
-          <w:rFonts w:ascii="Consolas" w:hAnsi="Consolas"/>
-          <w:sz w:val="18"/>
-        </w:rPr>
-        <w:t xml:space="preserve">  "data": {</w:t>
-      </w:r>
-    </w:p>
-    <w:p>
-      <w:pPr>
-        <w:pStyle w:val="Code"/>
-        <w:shd w:val="clear" w:fill="F3F3F3"/>
-      </w:pPr>
-      <w:r>
-        <w:rPr>
-          <w:rFonts w:ascii="Consolas" w:hAnsi="Consolas"/>
-          <w:sz w:val="18"/>
-        </w:rPr>
-        <w:t xml:space="preserve">    "studentId": 15,</w:t>
-      </w:r>
-    </w:p>
-    <w:p>
-      <w:pPr>
-        <w:pStyle w:val="Code"/>
-        <w:shd w:val="clear" w:fill="F3F3F3"/>
-      </w:pPr>
-      <w:r>
-        <w:rPr>
-          <w:rFonts w:ascii="Consolas" w:hAnsi="Consolas"/>
-          <w:sz w:val="18"/>
-        </w:rPr>
-        <w:t xml:space="preserve">    "studentName": "Jamie Jones",</w:t>
-      </w:r>
-    </w:p>
-    <w:p>
-      <w:pPr>
-        <w:pStyle w:val="Code"/>
-        <w:shd w:val="clear" w:fill="F3F3F3"/>
-      </w:pPr>
-      <w:r>
-        <w:rPr>
-          <w:rFonts w:ascii="Consolas" w:hAnsi="Consolas"/>
-          <w:sz w:val="18"/>
-        </w:rPr>
-        <w:t xml:space="preserve">    "totalPoints": 60,</w:t>
-      </w:r>
-    </w:p>
-    <w:p>
-      <w:pPr>
-        <w:pStyle w:val="Code"/>
-        <w:shd w:val="clear" w:fill="F3F3F3"/>
-      </w:pPr>
-      <w:r>
-        <w:rPr>
-          <w:rFonts w:ascii="Consolas" w:hAnsi="Consolas"/>
-          <w:sz w:val="18"/>
-        </w:rPr>
-        <w:t xml:space="preserve">    "currentStreakWeeks": 3,</w:t>
-      </w:r>
-    </w:p>
-    <w:p>
-      <w:pPr>
-        <w:pStyle w:val="Code"/>
-        <w:shd w:val="clear" w:fill="F3F3F3"/>
-      </w:pPr>
-      <w:r>
-        <w:rPr>
-          <w:rFonts w:ascii="Consolas" w:hAnsi="Consolas"/>
-          <w:sz w:val="18"/>
-        </w:rPr>
-        <w:t xml:space="preserve">    "longestStreakWeeks": 3,</w:t>
-      </w:r>
-    </w:p>
-    <w:p>
-      <w:pPr>
-        <w:pStyle w:val="Code"/>
-        <w:shd w:val="clear" w:fill="F3F3F3"/>
-      </w:pPr>
-      <w:r>
-        <w:rPr>
-          <w:rFonts w:ascii="Consolas" w:hAnsi="Consolas"/>
-          <w:sz w:val="18"/>
-        </w:rPr>
-        <w:t xml:space="preserve">    "schoolRank": 4,</w:t>
-      </w:r>
-    </w:p>
-    <w:p>
-      <w:pPr>
-        <w:pStyle w:val="Code"/>
-        <w:shd w:val="clear" w:fill="F3F3F3"/>
-      </w:pPr>
-      <w:r>
-        <w:rPr>
-          <w:rFonts w:ascii="Consolas" w:hAnsi="Consolas"/>
-          <w:sz w:val="18"/>
-        </w:rPr>
-        <w:t xml:space="preserve">    "badges": [</w:t>
-      </w:r>
-    </w:p>
-    <w:p>
-      <w:pPr>
-        <w:pStyle w:val="Code"/>
-        <w:shd w:val="clear" w:fill="F3F3F3"/>
-      </w:pPr>
-      <w:r>
-        <w:rPr>
-          <w:rFonts w:ascii="Consolas" w:hAnsi="Consolas"/>
-          <w:sz w:val="18"/>
-        </w:rPr>
-        <w:t xml:space="preserve">      {"badge": "FIRST_LESSON", "displayName": "First Lesson", "description": "Completed your first practical lesson", "awardedAt": "2026-07-02T10:15:00"}</w:t>
-      </w:r>
-    </w:p>
-    <w:p>
-      <w:pPr>
-        <w:pStyle w:val="Code"/>
-        <w:shd w:val="clear" w:fill="F3F3F3"/>
-      </w:pPr>
-      <w:r>
-        <w:rPr>
-          <w:rFonts w:ascii="Consolas" w:hAnsi="Consolas"/>
-          <w:sz w:val="18"/>
-        </w:rPr>
-        <w:t xml:space="preserve">    ]</w:t>
-      </w:r>
-    </w:p>
-    <w:p>
-      <w:pPr>
-        <w:pStyle w:val="Code"/>
-        <w:shd w:val="clear" w:fill="F3F3F3"/>
-      </w:pPr>
-      <w:r>
-        <w:rPr>
-          <w:rFonts w:ascii="Consolas" w:hAnsi="Consolas"/>
-          <w:sz w:val="18"/>
-        </w:rPr>
-        <w:t xml:space="preserve">  }</w:t>
-      </w:r>
-    </w:p>
-    <w:p>
-      <w:pPr>
-        <w:pStyle w:val="Code"/>
-        <w:shd w:val="clear" w:fill="F3F3F3"/>
-      </w:pPr>
-      <w:r>
-        <w:rPr>
-          <w:rFonts w:ascii="Consolas" w:hAnsi="Consolas"/>
-          <w:sz w:val="18"/>
-        </w:rPr>
-        <w:t xml:space="preserve">}</w:t>
-      </w:r>
-    </w:p>
     <w:p>
       <w:r>
         <w:rPr>
@@ -23594,54 +22998,7 @@
         </w:numPr>
       </w:pPr>
       <w:r>
-        <w:t xml:space="preserve">This is the endpoint for a student's own "my progress" / points-and-badges widget.</w:t>
-      </w:r>
-    </w:p>
-    <w:p/>
-    <w:p>
-      <w:r>
-        <w:rPr>
-          <w:b/>
-          <w:rFonts w:ascii="Consolas" w:hAnsi="Consolas" w:cs="Consolas"/>
-          <w:sz w:val="18"/>
-          <w:szCs w:val="18"/>
-        </w:rPr>
-        <w:t xml:space="preserve">GET  </w:t>
-      </w:r>
-      <w:r>
-        <w:rPr>
-          <w:rFonts w:ascii="Consolas" w:hAnsi="Consolas" w:cs="Consolas"/>
-          <w:sz w:val="18"/>
-          <w:szCs w:val="18"/>
-        </w:rPr>
-        <w:t xml:space="preserve">/gamification/students/{studentId}</w:t>
-      </w:r>
-    </w:p>
-    <w:p>
-      <w:r>
-        <w:rPr>
-          <w:i/>
-        </w:rPr>
-        <w:t xml:space="preserve">Another student's gamification summary.</w:t>
-      </w:r>
-    </w:p>
-    <w:p>
-      <w:r>
-        <w:rPr>
-          <w:b/>
-        </w:rPr>
-        <w:t xml:space="preserve">Access: </w:t>
-      </w:r>
-      <w:r>
-        <w:t xml:space="preserve">ADMIN, an INSTRUCTOR in the same school, or the STUDENT themselves</w:t>
-      </w:r>
-    </w:p>
-    <w:p>
-      <w:r>
-        <w:rPr>
-          <w:b/>
-        </w:rPr>
-        <w:t xml:space="preserve">Notes:</w:t>
+        <w:t xml:space="preserve">Reverse the page for a top-to-bottom chat view; load page=1, 2, ... to scroll back in history.</w:t>
       </w:r>
     </w:p>
     <w:p>
@@ -23653,7 +23010,7 @@
         </w:numPr>
       </w:pPr>
       <w:r>
-        <w:t xml:space="preserve">Same response shape as /gamification/me. Use this for an instructor-facing student detail screen, not for a student's own widget (use /me for that, it resolves the caller's own profile automatically).</w:t>
+        <w:t xml:space="preserve">Anyone who isn't one of the two participants gets 400.</w:t>
       </w:r>
     </w:p>
     <w:p/>
@@ -23665,7 +23022,7 @@
           <w:sz w:val="18"/>
           <w:szCs w:val="18"/>
         </w:rPr>
-        <w:t xml:space="preserve">GET  </w:t>
+        <w:t xml:space="preserve">POST  </w:t>
       </w:r>
       <w:r>
         <w:rPr>
@@ -23673,7 +23030,7 @@
           <w:sz w:val="18"/>
           <w:szCs w:val="18"/>
         </w:rPr>
-        <w:t xml:space="preserve">/gamification/leaderboard/school/{schoolId}</w:t>
+        <w:t xml:space="preserve">/conversations/{id}/messages</w:t>
       </w:r>
     </w:p>
     <w:p>
@@ -23681,7 +23038,7 @@
         <w:rPr>
           <w:i/>
         </w:rPr>
-        <w:t xml:space="preserve">School-wide leaderboard, ranked by total points.</w:t>
+        <w:t xml:space="preserve">Send a message.</w:t>
       </w:r>
     </w:p>
     <w:p>
@@ -23692,9 +23049,459 @@
         <w:t xml:space="preserve">Access: </w:t>
       </w:r>
       <w:r>
-        <w:t xml:space="preserve">ADMIN, or an INSTRUCTOR/STUDENT in that same school</w:t>
-      </w:r>
-    </w:p>
+        <w:t xml:space="preserve">Participants only</w:t>
+      </w:r>
+    </w:p>
+    <w:p>
+      <w:r>
+        <w:rPr>
+          <w:b/>
+        </w:rPr>
+        <w:t xml:space="preserve">Request body:</w:t>
+      </w:r>
+    </w:p>
+    <w:tbl>
+      <w:tblPr>
+        <w:tblStyle w:val="TableGrid"/>
+        <w:tblW w:w="0" w:type="auto"/>
+        <w:tblBorders>
+          <w:top w:val="single" w:sz="4" w:color="BFBFBF"/>
+          <w:left w:val="single" w:sz="4" w:color="BFBFBF"/>
+          <w:bottom w:val="single" w:sz="4" w:color="BFBFBF"/>
+          <w:right w:val="single" w:sz="4" w:color="BFBFBF"/>
+          <w:insideH w:val="single" w:sz="4" w:color="BFBFBF"/>
+          <w:insideV w:val="single" w:sz="4" w:color="BFBFBF"/>
+        </w:tblBorders>
+      </w:tblPr>
+      <w:tblGrid>
+        <w:gridCol w:w="2250"/>
+        <w:gridCol w:w="2250"/>
+        <w:gridCol w:w="2250"/>
+        <w:gridCol w:w="2250"/>
+      </w:tblGrid>
+      <w:tr>
+        <w:tc>
+          <w:tcPr>
+            <w:shd w:val="clear" w:fill="2F5496"/>
+            <w:vAlign w:val="center"/>
+          </w:tcPr>
+          <w:p>
+            <w:pPr>
+              <w:shd w:val="clear" w:fill="2F5496"/>
+            </w:pPr>
+            <w:r>
+              <w:rPr>
+                <w:b/>
+                <w:color w:val="FFFFFF"/>
+              </w:rPr>
+              <w:t xml:space="preserve">Field</w:t>
+            </w:r>
+          </w:p>
+        </w:tc>
+        <w:tc>
+          <w:tcPr>
+            <w:shd w:val="clear" w:fill="2F5496"/>
+            <w:vAlign w:val="center"/>
+          </w:tcPr>
+          <w:p>
+            <w:pPr>
+              <w:shd w:val="clear" w:fill="2F5496"/>
+            </w:pPr>
+            <w:r>
+              <w:rPr>
+                <w:b/>
+                <w:color w:val="FFFFFF"/>
+              </w:rPr>
+              <w:t xml:space="preserve">Type</w:t>
+            </w:r>
+          </w:p>
+        </w:tc>
+        <w:tc>
+          <w:tcPr>
+            <w:shd w:val="clear" w:fill="2F5496"/>
+            <w:vAlign w:val="center"/>
+          </w:tcPr>
+          <w:p>
+            <w:pPr>
+              <w:shd w:val="clear" w:fill="2F5496"/>
+            </w:pPr>
+            <w:r>
+              <w:rPr>
+                <w:b/>
+                <w:color w:val="FFFFFF"/>
+              </w:rPr>
+              <w:t xml:space="preserve">Required</w:t>
+            </w:r>
+          </w:p>
+        </w:tc>
+        <w:tc>
+          <w:tcPr>
+            <w:shd w:val="clear" w:fill="2F5496"/>
+            <w:vAlign w:val="center"/>
+          </w:tcPr>
+          <w:p>
+            <w:pPr>
+              <w:shd w:val="clear" w:fill="2F5496"/>
+            </w:pPr>
+            <w:r>
+              <w:rPr>
+                <w:b/>
+                <w:color w:val="FFFFFF"/>
+              </w:rPr>
+              <w:t xml:space="preserve">Notes</w:t>
+            </w:r>
+          </w:p>
+        </w:tc>
+      </w:tr>
+      <w:tr>
+        <w:tc>
+          <w:tcPr>
+            <w:vAlign w:val="center"/>
+          </w:tcPr>
+          <w:p>
+            <w:pPr/>
+            <w:r>
+              <w:t xml:space="preserve">body</w:t>
+            </w:r>
+          </w:p>
+        </w:tc>
+        <w:tc>
+          <w:tcPr>
+            <w:vAlign w:val="center"/>
+          </w:tcPr>
+          <w:p>
+            <w:pPr/>
+            <w:r>
+              <w:t xml:space="preserve">string</w:t>
+            </w:r>
+          </w:p>
+        </w:tc>
+        <w:tc>
+          <w:tcPr>
+            <w:vAlign w:val="center"/>
+          </w:tcPr>
+          <w:p>
+            <w:pPr/>
+            <w:r>
+              <w:t xml:space="preserve">yes</w:t>
+            </w:r>
+          </w:p>
+        </w:tc>
+        <w:tc>
+          <w:tcPr>
+            <w:vAlign w:val="center"/>
+          </w:tcPr>
+          <w:p>
+            <w:pPr/>
+            <w:r>
+              <w:t xml:space="preserve">1-5000 chars</w:t>
+            </w:r>
+          </w:p>
+        </w:tc>
+      </w:tr>
+    </w:tbl>
+    <w:p/>
+    <w:p/>
+    <w:p>
+      <w:r>
+        <w:rPr>
+          <w:b/>
+          <w:rFonts w:ascii="Consolas" w:hAnsi="Consolas" w:cs="Consolas"/>
+          <w:sz w:val="18"/>
+          <w:szCs w:val="18"/>
+        </w:rPr>
+        <w:t xml:space="preserve">POST  </w:t>
+      </w:r>
+      <w:r>
+        <w:rPr>
+          <w:rFonts w:ascii="Consolas" w:hAnsi="Consolas" w:cs="Consolas"/>
+          <w:sz w:val="18"/>
+          <w:szCs w:val="18"/>
+        </w:rPr>
+        <w:t xml:space="preserve">/conversations/{id}/read</w:t>
+      </w:r>
+    </w:p>
+    <w:p>
+      <w:r>
+        <w:rPr>
+          <w:i/>
+        </w:rPr>
+        <w:t xml:space="preserve">Mark everything the other person sent me here as read.</w:t>
+      </w:r>
+    </w:p>
+    <w:p>
+      <w:r>
+        <w:rPr>
+          <w:b/>
+        </w:rPr>
+        <w:t xml:space="preserve">Access: </w:t>
+      </w:r>
+      <w:r>
+        <w:t xml:space="preserve">Participants only</w:t>
+      </w:r>
+    </w:p>
+    <w:p>
+      <w:r>
+        <w:rPr>
+          <w:b/>
+        </w:rPr>
+        <w:t xml:space="preserve">Notes:</w:t>
+      </w:r>
+    </w:p>
+    <w:p>
+      <w:pPr>
+        <w:pStyle w:val="ListParagraph"/>
+        <w:numPr>
+          <w:ilvl w:val="0"/>
+          <w:numId w:val="1"/>
+        </w:numPr>
+      </w:pPr>
+      <w:r>
+        <w:t xml:space="preserve">Call it when the user opens the thread - it's what brings unreadCount back to 0.</w:t>
+      </w:r>
+    </w:p>
+    <w:p/>
+    <w:p>
+      <w:pPr>
+        <w:pStyle w:val="Heading2"/>
+      </w:pPr>
+      <w:r>
+        <w:t xml:space="preserve">Announcements</w:t>
+      </w:r>
+    </w:p>
+    <w:p>
+      <w:r>
+        <w:rPr>
+          <w:b/>
+          <w:rFonts w:ascii="Consolas" w:hAnsi="Consolas" w:cs="Consolas"/>
+          <w:sz w:val="18"/>
+          <w:szCs w:val="18"/>
+        </w:rPr>
+        <w:t xml:space="preserve">POST  </w:t>
+      </w:r>
+      <w:r>
+        <w:rPr>
+          <w:rFonts w:ascii="Consolas" w:hAnsi="Consolas" w:cs="Consolas"/>
+          <w:sz w:val="18"/>
+          <w:szCs w:val="18"/>
+        </w:rPr>
+        <w:t xml:space="preserve">/announcements</w:t>
+      </w:r>
+    </w:p>
+    <w:p>
+      <w:r>
+        <w:rPr>
+          <w:i/>
+        </w:rPr>
+        <w:t xml:space="preserve">Announce something to every student of my school.</w:t>
+      </w:r>
+    </w:p>
+    <w:p>
+      <w:r>
+        <w:rPr>
+          <w:b/>
+        </w:rPr>
+        <w:t xml:space="preserve">Access: </w:t>
+      </w:r>
+      <w:r>
+        <w:t xml:space="preserve">INSTRUCTOR only</w:t>
+      </w:r>
+    </w:p>
+    <w:p>
+      <w:r>
+        <w:rPr>
+          <w:b/>
+        </w:rPr>
+        <w:t xml:space="preserve">Request body:</w:t>
+      </w:r>
+    </w:p>
+    <w:tbl>
+      <w:tblPr>
+        <w:tblStyle w:val="TableGrid"/>
+        <w:tblW w:w="0" w:type="auto"/>
+        <w:tblBorders>
+          <w:top w:val="single" w:sz="4" w:color="BFBFBF"/>
+          <w:left w:val="single" w:sz="4" w:color="BFBFBF"/>
+          <w:bottom w:val="single" w:sz="4" w:color="BFBFBF"/>
+          <w:right w:val="single" w:sz="4" w:color="BFBFBF"/>
+          <w:insideH w:val="single" w:sz="4" w:color="BFBFBF"/>
+          <w:insideV w:val="single" w:sz="4" w:color="BFBFBF"/>
+        </w:tblBorders>
+      </w:tblPr>
+      <w:tblGrid>
+        <w:gridCol w:w="2250"/>
+        <w:gridCol w:w="2250"/>
+        <w:gridCol w:w="2250"/>
+        <w:gridCol w:w="2250"/>
+      </w:tblGrid>
+      <w:tr>
+        <w:tc>
+          <w:tcPr>
+            <w:shd w:val="clear" w:fill="2F5496"/>
+            <w:vAlign w:val="center"/>
+          </w:tcPr>
+          <w:p>
+            <w:pPr>
+              <w:shd w:val="clear" w:fill="2F5496"/>
+            </w:pPr>
+            <w:r>
+              <w:rPr>
+                <w:b/>
+                <w:color w:val="FFFFFF"/>
+              </w:rPr>
+              <w:t xml:space="preserve">Field</w:t>
+            </w:r>
+          </w:p>
+        </w:tc>
+        <w:tc>
+          <w:tcPr>
+            <w:shd w:val="clear" w:fill="2F5496"/>
+            <w:vAlign w:val="center"/>
+          </w:tcPr>
+          <w:p>
+            <w:pPr>
+              <w:shd w:val="clear" w:fill="2F5496"/>
+            </w:pPr>
+            <w:r>
+              <w:rPr>
+                <w:b/>
+                <w:color w:val="FFFFFF"/>
+              </w:rPr>
+              <w:t xml:space="preserve">Type</w:t>
+            </w:r>
+          </w:p>
+        </w:tc>
+        <w:tc>
+          <w:tcPr>
+            <w:shd w:val="clear" w:fill="2F5496"/>
+            <w:vAlign w:val="center"/>
+          </w:tcPr>
+          <w:p>
+            <w:pPr>
+              <w:shd w:val="clear" w:fill="2F5496"/>
+            </w:pPr>
+            <w:r>
+              <w:rPr>
+                <w:b/>
+                <w:color w:val="FFFFFF"/>
+              </w:rPr>
+              <w:t xml:space="preserve">Required</w:t>
+            </w:r>
+          </w:p>
+        </w:tc>
+        <w:tc>
+          <w:tcPr>
+            <w:shd w:val="clear" w:fill="2F5496"/>
+            <w:vAlign w:val="center"/>
+          </w:tcPr>
+          <w:p>
+            <w:pPr>
+              <w:shd w:val="clear" w:fill="2F5496"/>
+            </w:pPr>
+            <w:r>
+              <w:rPr>
+                <w:b/>
+                <w:color w:val="FFFFFF"/>
+              </w:rPr>
+              <w:t xml:space="preserve">Notes</w:t>
+            </w:r>
+          </w:p>
+        </w:tc>
+      </w:tr>
+      <w:tr>
+        <w:tc>
+          <w:tcPr>
+            <w:vAlign w:val="center"/>
+          </w:tcPr>
+          <w:p>
+            <w:pPr/>
+            <w:r>
+              <w:t xml:space="preserve">subject</w:t>
+            </w:r>
+          </w:p>
+        </w:tc>
+        <w:tc>
+          <w:tcPr>
+            <w:vAlign w:val="center"/>
+          </w:tcPr>
+          <w:p>
+            <w:pPr/>
+            <w:r>
+              <w:t xml:space="preserve">string</w:t>
+            </w:r>
+          </w:p>
+        </w:tc>
+        <w:tc>
+          <w:tcPr>
+            <w:vAlign w:val="center"/>
+          </w:tcPr>
+          <w:p>
+            <w:pPr/>
+            <w:r>
+              <w:t xml:space="preserve">yes</w:t>
+            </w:r>
+          </w:p>
+        </w:tc>
+        <w:tc>
+          <w:tcPr>
+            <w:vAlign w:val="center"/>
+          </w:tcPr>
+          <w:p>
+            <w:pPr/>
+            <w:r>
+              <w:t xml:space="preserve">max 200 chars</w:t>
+            </w:r>
+          </w:p>
+        </w:tc>
+      </w:tr>
+      <w:tr>
+        <w:tc>
+          <w:tcPr>
+            <w:vAlign w:val="center"/>
+          </w:tcPr>
+          <w:p>
+            <w:pPr/>
+            <w:r>
+              <w:t xml:space="preserve">body</w:t>
+            </w:r>
+          </w:p>
+        </w:tc>
+        <w:tc>
+          <w:tcPr>
+            <w:vAlign w:val="center"/>
+          </w:tcPr>
+          <w:p>
+            <w:pPr/>
+            <w:r>
+              <w:t xml:space="preserve">string</w:t>
+            </w:r>
+          </w:p>
+        </w:tc>
+        <w:tc>
+          <w:tcPr>
+            <w:vAlign w:val="center"/>
+          </w:tcPr>
+          <w:p>
+            <w:pPr/>
+            <w:r>
+              <w:t xml:space="preserve">yes</w:t>
+            </w:r>
+          </w:p>
+        </w:tc>
+        <w:tc>
+          <w:tcPr>
+            <w:vAlign w:val="center"/>
+          </w:tcPr>
+          <w:p>
+            <w:pPr/>
+            <w:r>
+              <w:t xml:space="preserve">max 5000 chars</w:t>
+            </w:r>
+          </w:p>
+        </w:tc>
+      </w:tr>
+    </w:tbl>
+    <w:p/>
     <w:p>
       <w:r>
         <w:rPr>
@@ -23785,64 +23592,29 @@
           <w:p>
             <w:pPr/>
             <w:r>
-              <w:t xml:space="preserve">Paginated (see the Pagination convention above) — each row:</w:t>
-            </w:r>
-          </w:p>
-        </w:tc>
-        <w:tc>
-          <w:tcPr>
-            <w:vAlign w:val="center"/>
-          </w:tcPr>
-          <w:p>
-            <w:pPr/>
-            <w:r>
-              <w:t xml:space="preserve"/>
-            </w:r>
-          </w:p>
-        </w:tc>
-        <w:tc>
-          <w:tcPr>
-            <w:vAlign w:val="center"/>
-          </w:tcPr>
-          <w:p>
-            <w:pPr/>
-            <w:r>
-              <w:t xml:space="preserve"/>
-            </w:r>
-          </w:p>
-        </w:tc>
-      </w:tr>
-      <w:tr>
-        <w:tc>
-          <w:tcPr>
-            <w:vAlign w:val="center"/>
-          </w:tcPr>
-          <w:p>
-            <w:pPr/>
-            <w:r>
-              <w:t xml:space="preserve">rank / studentId / studentName / totalPoints / currentStreakWeeks</w:t>
-            </w:r>
-          </w:p>
-        </w:tc>
-        <w:tc>
-          <w:tcPr>
-            <w:vAlign w:val="center"/>
-          </w:tcPr>
-          <w:p>
-            <w:pPr/>
-            <w:r>
-              <w:t xml:space="preserve"/>
-            </w:r>
-          </w:p>
-        </w:tc>
-        <w:tc>
-          <w:tcPr>
-            <w:vAlign w:val="center"/>
-          </w:tcPr>
-          <w:p>
-            <w:pPr/>
-            <w:r>
-              <w:t xml:space="preserve"/>
+              <w:t xml:space="preserve">recipientCount</w:t>
+            </w:r>
+          </w:p>
+        </w:tc>
+        <w:tc>
+          <w:tcPr>
+            <w:vAlign w:val="center"/>
+          </w:tcPr>
+          <w:p>
+            <w:pPr/>
+            <w:r>
+              <w:t xml:space="preserve">number</w:t>
+            </w:r>
+          </w:p>
+        </w:tc>
+        <w:tc>
+          <w:tcPr>
+            <w:vAlign w:val="center"/>
+          </w:tcPr>
+          <w:p>
+            <w:pPr/>
+            <w:r>
+              <w:t xml:space="preserve">how many students it went to</w:t>
             </w:r>
           </w:p>
         </w:tc>
@@ -23866,29 +23638,7 @@
         </w:numPr>
       </w:pPr>
       <w:r>
-        <w:t xml:space="preserve">An INSTRUCTOR or STUDENT requesting a DIFFERENT school's leaderboard gets 400, not the data — always pass the caller's own schoolId (from GET /auth/me).</w:t>
-      </w:r>
-    </w:p>
-    <w:p/>
-    <w:p>
-      <w:pPr>
-        <w:pStyle w:val="Heading1"/>
-      </w:pPr>
-      <w:r>
-        <w:t xml:space="preserve">Checklist: Things the Frontend Needs to Build</w:t>
-      </w:r>
-    </w:p>
-    <w:p>
-      <w:r>
-        <w:t xml:space="preserve">A summary of implementation requirements that aren't just "call an endpoint" — read this before starting, it'll save rework.</w:t>
-      </w:r>
-    </w:p>
-    <w:p>
-      <w:pPr>
-        <w:pStyle w:val="Heading2"/>
-      </w:pPr>
-      <w:r>
-        <w:t xml:space="preserve">1. Auth token lifecycle</w:t>
+        <w:t xml:space="preserve">Delivered to each student as an IN_APP notification immediately, and by email (sent in the background in batches, so the response doesn't wait for it).</w:t>
       </w:r>
     </w:p>
     <w:p>
@@ -23900,7 +23650,54 @@
         </w:numPr>
       </w:pPr>
       <w:r>
-        <w:t xml:space="preserve">Store accessToken and refreshToken after login (e.g. in memory + a secure storage mechanism appropriate for your platform — avoid plain localStorage for the refresh token if you can help it, given it's valid for 7 days).</w:t>
+        <w:t xml:space="preserve">One-way: students can't reply to an announcement - a student who wants to respond messages the instructor through a conversation.</w:t>
+      </w:r>
+    </w:p>
+    <w:p/>
+    <w:p>
+      <w:r>
+        <w:rPr>
+          <w:b/>
+          <w:rFonts w:ascii="Consolas" w:hAnsi="Consolas" w:cs="Consolas"/>
+          <w:sz w:val="18"/>
+          <w:szCs w:val="18"/>
+        </w:rPr>
+        <w:t xml:space="preserve">GET  </w:t>
+      </w:r>
+      <w:r>
+        <w:rPr>
+          <w:rFonts w:ascii="Consolas" w:hAnsi="Consolas" w:cs="Consolas"/>
+          <w:sz w:val="18"/>
+          <w:szCs w:val="18"/>
+        </w:rPr>
+        <w:t xml:space="preserve">/announcements</w:t>
+      </w:r>
+    </w:p>
+    <w:p>
+      <w:r>
+        <w:rPr>
+          <w:i/>
+        </w:rPr>
+        <w:t xml:space="preserve">My school's announcements, newest first (paginated).</w:t>
+      </w:r>
+    </w:p>
+    <w:p>
+      <w:r>
+        <w:rPr>
+          <w:b/>
+        </w:rPr>
+        <w:t xml:space="preserve">Access: </w:t>
+      </w:r>
+      <w:r>
+        <w:t xml:space="preserve">STUDENT, INSTRUCTOR, or ADMIN</w:t>
+      </w:r>
+    </w:p>
+    <w:p>
+      <w:r>
+        <w:rPr>
+          <w:b/>
+        </w:rPr>
+        <w:t xml:space="preserve">Notes:</w:t>
       </w:r>
     </w:p>
     <w:p>
@@ -23912,7 +23709,519 @@
         </w:numPr>
       </w:pPr>
       <w:r>
-        <w:t xml:space="preserve">Attach Authorization: Bearer &lt;accessToken&gt; to every request except the public auth endpoints listed at the top of this document.</w:t>
+        <w:t xml:space="preserve">The bootstrap admin sees every school's.</w:t>
+      </w:r>
+    </w:p>
+    <w:p/>
+    <w:p>
+      <w:pPr>
+        <w:pStyle w:val="Heading1"/>
+      </w:pPr>
+      <w:r>
+        <w:t xml:space="preserve">Notifications</w:t>
+      </w:r>
+    </w:p>
+    <w:p>
+      <w:r>
+        <w:t xml:space="preserve">Two things happen here: the system automatically sends notifications for certain events, and admins/instructors can manually send an arbitrary notification via POST /send. Automatic IN_APP notifications currently fire on: a booking being created, a booking being cancelled, a quiz being submitted (pass or fail), a new lesson note being added, and a driving assessment being recorded. All of these are fire-and-forget from the frontend's perspective — nothing needs to be called to trigger them, they're side effects of the endpoints above.</w:t>
+      </w:r>
+    </w:p>
+    <w:p>
+      <w:r>
+        <w:rPr>
+          <w:b/>
+          <w:rFonts w:ascii="Consolas" w:hAnsi="Consolas" w:cs="Consolas"/>
+          <w:sz w:val="18"/>
+          <w:szCs w:val="18"/>
+        </w:rPr>
+        <w:t xml:space="preserve">POST  </w:t>
+      </w:r>
+      <w:r>
+        <w:rPr>
+          <w:rFonts w:ascii="Consolas" w:hAnsi="Consolas" w:cs="Consolas"/>
+          <w:sz w:val="18"/>
+          <w:szCs w:val="18"/>
+        </w:rPr>
+        <w:t xml:space="preserve">/notifications/send</w:t>
+      </w:r>
+    </w:p>
+    <w:p>
+      <w:r>
+        <w:rPr>
+          <w:i/>
+        </w:rPr>
+        <w:t xml:space="preserve">Send a notification to a user.</w:t>
+      </w:r>
+    </w:p>
+    <w:p>
+      <w:r>
+        <w:rPr>
+          <w:b/>
+        </w:rPr>
+        <w:t xml:space="preserve">Access: </w:t>
+      </w:r>
+      <w:r>
+        <w:t xml:space="preserve">ADMIN or INSTRUCTOR</w:t>
+      </w:r>
+    </w:p>
+    <w:p>
+      <w:r>
+        <w:rPr>
+          <w:b/>
+        </w:rPr>
+        <w:t xml:space="preserve">Request body:</w:t>
+      </w:r>
+    </w:p>
+    <w:tbl>
+      <w:tblPr>
+        <w:tblStyle w:val="TableGrid"/>
+        <w:tblW w:w="0" w:type="auto"/>
+        <w:tblBorders>
+          <w:top w:val="single" w:sz="4" w:color="BFBFBF"/>
+          <w:left w:val="single" w:sz="4" w:color="BFBFBF"/>
+          <w:bottom w:val="single" w:sz="4" w:color="BFBFBF"/>
+          <w:right w:val="single" w:sz="4" w:color="BFBFBF"/>
+          <w:insideH w:val="single" w:sz="4" w:color="BFBFBF"/>
+          <w:insideV w:val="single" w:sz="4" w:color="BFBFBF"/>
+        </w:tblBorders>
+      </w:tblPr>
+      <w:tblGrid>
+        <w:gridCol w:w="2250"/>
+        <w:gridCol w:w="2250"/>
+        <w:gridCol w:w="2250"/>
+        <w:gridCol w:w="2250"/>
+      </w:tblGrid>
+      <w:tr>
+        <w:tc>
+          <w:tcPr>
+            <w:shd w:val="clear" w:fill="2F5496"/>
+            <w:vAlign w:val="center"/>
+          </w:tcPr>
+          <w:p>
+            <w:pPr>
+              <w:shd w:val="clear" w:fill="2F5496"/>
+            </w:pPr>
+            <w:r>
+              <w:rPr>
+                <w:b/>
+                <w:color w:val="FFFFFF"/>
+              </w:rPr>
+              <w:t xml:space="preserve">Field</w:t>
+            </w:r>
+          </w:p>
+        </w:tc>
+        <w:tc>
+          <w:tcPr>
+            <w:shd w:val="clear" w:fill="2F5496"/>
+            <w:vAlign w:val="center"/>
+          </w:tcPr>
+          <w:p>
+            <w:pPr>
+              <w:shd w:val="clear" w:fill="2F5496"/>
+            </w:pPr>
+            <w:r>
+              <w:rPr>
+                <w:b/>
+                <w:color w:val="FFFFFF"/>
+              </w:rPr>
+              <w:t xml:space="preserve">Type</w:t>
+            </w:r>
+          </w:p>
+        </w:tc>
+        <w:tc>
+          <w:tcPr>
+            <w:shd w:val="clear" w:fill="2F5496"/>
+            <w:vAlign w:val="center"/>
+          </w:tcPr>
+          <w:p>
+            <w:pPr>
+              <w:shd w:val="clear" w:fill="2F5496"/>
+            </w:pPr>
+            <w:r>
+              <w:rPr>
+                <w:b/>
+                <w:color w:val="FFFFFF"/>
+              </w:rPr>
+              <w:t xml:space="preserve">Required</w:t>
+            </w:r>
+          </w:p>
+        </w:tc>
+        <w:tc>
+          <w:tcPr>
+            <w:shd w:val="clear" w:fill="2F5496"/>
+            <w:vAlign w:val="center"/>
+          </w:tcPr>
+          <w:p>
+            <w:pPr>
+              <w:shd w:val="clear" w:fill="2F5496"/>
+            </w:pPr>
+            <w:r>
+              <w:rPr>
+                <w:b/>
+                <w:color w:val="FFFFFF"/>
+              </w:rPr>
+              <w:t xml:space="preserve">Notes</w:t>
+            </w:r>
+          </w:p>
+        </w:tc>
+      </w:tr>
+      <w:tr>
+        <w:tc>
+          <w:tcPr>
+            <w:vAlign w:val="center"/>
+          </w:tcPr>
+          <w:p>
+            <w:pPr/>
+            <w:r>
+              <w:t xml:space="preserve">userId</w:t>
+            </w:r>
+          </w:p>
+        </w:tc>
+        <w:tc>
+          <w:tcPr>
+            <w:vAlign w:val="center"/>
+          </w:tcPr>
+          <w:p>
+            <w:pPr/>
+            <w:r>
+              <w:t xml:space="preserve">number</w:t>
+            </w:r>
+          </w:p>
+        </w:tc>
+        <w:tc>
+          <w:tcPr>
+            <w:vAlign w:val="center"/>
+          </w:tcPr>
+          <w:p>
+            <w:pPr/>
+            <w:r>
+              <w:t xml:space="preserve">yes</w:t>
+            </w:r>
+          </w:p>
+        </w:tc>
+        <w:tc>
+          <w:tcPr>
+            <w:vAlign w:val="center"/>
+          </w:tcPr>
+          <w:p>
+            <w:pPr/>
+            <w:r>
+              <w:t xml:space="preserve">the raw User.id (not a profile id) of the recipient - must be in the caller's own school (bootstrap admin: anyone)</w:t>
+            </w:r>
+          </w:p>
+        </w:tc>
+      </w:tr>
+      <w:tr>
+        <w:tc>
+          <w:tcPr>
+            <w:vAlign w:val="center"/>
+          </w:tcPr>
+          <w:p>
+            <w:pPr/>
+            <w:r>
+              <w:t xml:space="preserve">subject</w:t>
+            </w:r>
+          </w:p>
+        </w:tc>
+        <w:tc>
+          <w:tcPr>
+            <w:vAlign w:val="center"/>
+          </w:tcPr>
+          <w:p>
+            <w:pPr/>
+            <w:r>
+              <w:t xml:space="preserve">string</w:t>
+            </w:r>
+          </w:p>
+        </w:tc>
+        <w:tc>
+          <w:tcPr>
+            <w:vAlign w:val="center"/>
+          </w:tcPr>
+          <w:p>
+            <w:pPr/>
+            <w:r>
+              <w:t xml:space="preserve">yes</w:t>
+            </w:r>
+          </w:p>
+        </w:tc>
+        <w:tc>
+          <w:tcPr>
+            <w:vAlign w:val="center"/>
+          </w:tcPr>
+          <w:p>
+            <w:pPr/>
+            <w:r>
+              <w:t xml:space="preserve">max 200 chars</w:t>
+            </w:r>
+          </w:p>
+        </w:tc>
+      </w:tr>
+      <w:tr>
+        <w:tc>
+          <w:tcPr>
+            <w:vAlign w:val="center"/>
+          </w:tcPr>
+          <w:p>
+            <w:pPr/>
+            <w:r>
+              <w:t xml:space="preserve">body</w:t>
+            </w:r>
+          </w:p>
+        </w:tc>
+        <w:tc>
+          <w:tcPr>
+            <w:vAlign w:val="center"/>
+          </w:tcPr>
+          <w:p>
+            <w:pPr/>
+            <w:r>
+              <w:t xml:space="preserve">string</w:t>
+            </w:r>
+          </w:p>
+        </w:tc>
+        <w:tc>
+          <w:tcPr>
+            <w:vAlign w:val="center"/>
+          </w:tcPr>
+          <w:p>
+            <w:pPr/>
+            <w:r>
+              <w:t xml:space="preserve">yes</w:t>
+            </w:r>
+          </w:p>
+        </w:tc>
+        <w:tc>
+          <w:tcPr>
+            <w:vAlign w:val="center"/>
+          </w:tcPr>
+          <w:p>
+            <w:pPr/>
+            <w:r>
+              <w:t xml:space="preserve"/>
+            </w:r>
+          </w:p>
+        </w:tc>
+      </w:tr>
+      <w:tr>
+        <w:tc>
+          <w:tcPr>
+            <w:vAlign w:val="center"/>
+          </w:tcPr>
+          <w:p>
+            <w:pPr/>
+            <w:r>
+              <w:t xml:space="preserve">channel</w:t>
+            </w:r>
+          </w:p>
+        </w:tc>
+        <w:tc>
+          <w:tcPr>
+            <w:vAlign w:val="center"/>
+          </w:tcPr>
+          <w:p>
+            <w:pPr/>
+            <w:r>
+              <w:t xml:space="preserve">enum</w:t>
+            </w:r>
+          </w:p>
+        </w:tc>
+        <w:tc>
+          <w:tcPr>
+            <w:vAlign w:val="center"/>
+          </w:tcPr>
+          <w:p>
+            <w:pPr/>
+            <w:r>
+              <w:t xml:space="preserve">yes</w:t>
+            </w:r>
+          </w:p>
+        </w:tc>
+        <w:tc>
+          <w:tcPr>
+            <w:vAlign w:val="center"/>
+          </w:tcPr>
+          <w:p>
+            <w:pPr/>
+            <w:r>
+              <w:t xml:space="preserve">EMAIL, SMS, PUSH, IN_APP</w:t>
+            </w:r>
+          </w:p>
+        </w:tc>
+      </w:tr>
+      <w:tr>
+        <w:tc>
+          <w:tcPr>
+            <w:vAlign w:val="center"/>
+          </w:tcPr>
+          <w:p>
+            <w:pPr/>
+            <w:r>
+              <w:t xml:space="preserve">recipientAddress</w:t>
+            </w:r>
+          </w:p>
+        </w:tc>
+        <w:tc>
+          <w:tcPr>
+            <w:vAlign w:val="center"/>
+          </w:tcPr>
+          <w:p>
+            <w:pPr/>
+            <w:r>
+              <w:t xml:space="preserve">string</w:t>
+            </w:r>
+          </w:p>
+        </w:tc>
+        <w:tc>
+          <w:tcPr>
+            <w:vAlign w:val="center"/>
+          </w:tcPr>
+          <w:p>
+            <w:pPr/>
+            <w:r>
+              <w:t xml:space="preserve">no</w:t>
+            </w:r>
+          </w:p>
+        </w:tc>
+        <w:tc>
+          <w:tcPr>
+            <w:vAlign w:val="center"/>
+          </w:tcPr>
+          <w:p>
+            <w:pPr/>
+            <w:r>
+              <w:t xml:space="preserve">overrides the default recipient address (the user's own email) — rarely needed</w:t>
+            </w:r>
+          </w:p>
+        </w:tc>
+      </w:tr>
+    </w:tbl>
+    <w:p/>
+    <w:p>
+      <w:r>
+        <w:rPr>
+          <w:b/>
+        </w:rPr>
+        <w:t xml:space="preserve">Response (key fields):</w:t>
+      </w:r>
+    </w:p>
+    <w:tbl>
+      <w:tblPr>
+        <w:tblStyle w:val="TableGrid"/>
+        <w:tblW w:w="0" w:type="auto"/>
+        <w:tblBorders>
+          <w:top w:val="single" w:sz="4" w:color="BFBFBF"/>
+          <w:left w:val="single" w:sz="4" w:color="BFBFBF"/>
+          <w:bottom w:val="single" w:sz="4" w:color="BFBFBF"/>
+          <w:right w:val="single" w:sz="4" w:color="BFBFBF"/>
+          <w:insideH w:val="single" w:sz="4" w:color="BFBFBF"/>
+          <w:insideV w:val="single" w:sz="4" w:color="BFBFBF"/>
+        </w:tblBorders>
+      </w:tblPr>
+      <w:tblGrid>
+        <w:gridCol w:w="3000"/>
+        <w:gridCol w:w="3000"/>
+        <w:gridCol w:w="3000"/>
+      </w:tblGrid>
+      <w:tr>
+        <w:tc>
+          <w:tcPr>
+            <w:shd w:val="clear" w:fill="2F5496"/>
+            <w:vAlign w:val="center"/>
+          </w:tcPr>
+          <w:p>
+            <w:pPr>
+              <w:shd w:val="clear" w:fill="2F5496"/>
+            </w:pPr>
+            <w:r>
+              <w:rPr>
+                <w:b/>
+                <w:color w:val="FFFFFF"/>
+              </w:rPr>
+              <w:t xml:space="preserve">Field</w:t>
+            </w:r>
+          </w:p>
+        </w:tc>
+        <w:tc>
+          <w:tcPr>
+            <w:shd w:val="clear" w:fill="2F5496"/>
+            <w:vAlign w:val="center"/>
+          </w:tcPr>
+          <w:p>
+            <w:pPr>
+              <w:shd w:val="clear" w:fill="2F5496"/>
+            </w:pPr>
+            <w:r>
+              <w:rPr>
+                <w:b/>
+                <w:color w:val="FFFFFF"/>
+              </w:rPr>
+              <w:t xml:space="preserve">Type</w:t>
+            </w:r>
+          </w:p>
+        </w:tc>
+        <w:tc>
+          <w:tcPr>
+            <w:shd w:val="clear" w:fill="2F5496"/>
+            <w:vAlign w:val="center"/>
+          </w:tcPr>
+          <w:p>
+            <w:pPr>
+              <w:shd w:val="clear" w:fill="2F5496"/>
+            </w:pPr>
+            <w:r>
+              <w:rPr>
+                <w:b/>
+                <w:color w:val="FFFFFF"/>
+              </w:rPr>
+              <w:t xml:space="preserve">Notes</w:t>
+            </w:r>
+          </w:p>
+        </w:tc>
+      </w:tr>
+      <w:tr>
+        <w:tc>
+          <w:tcPr>
+            <w:vAlign w:val="center"/>
+          </w:tcPr>
+          <w:p>
+            <w:pPr/>
+            <w:r>
+              <w:t xml:space="preserve">status</w:t>
+            </w:r>
+          </w:p>
+        </w:tc>
+        <w:tc>
+          <w:tcPr>
+            <w:vAlign w:val="center"/>
+          </w:tcPr>
+          <w:p>
+            <w:pPr/>
+            <w:r>
+              <w:t xml:space="preserve">enum</w:t>
+            </w:r>
+          </w:p>
+        </w:tc>
+        <w:tc>
+          <w:tcPr>
+            <w:vAlign w:val="center"/>
+          </w:tcPr>
+          <w:p>
+            <w:pPr/>
+            <w:r>
+              <w:t xml:space="preserve">PENDING, SENT, or FAILED — see the important note below</w:t>
+            </w:r>
+          </w:p>
+        </w:tc>
+      </w:tr>
+    </w:tbl>
+    <w:p/>
+    <w:p>
+      <w:r>
+        <w:rPr>
+          <w:b/>
+        </w:rPr>
+        <w:t xml:space="preserve">Notes:</w:t>
       </w:r>
     </w:p>
     <w:p>
@@ -23924,7 +24233,7 @@
         </w:numPr>
       </w:pPr>
       <w:r>
-        <w:t xml:space="preserve">On a 401, call POST /auth/refresh-token once, retry the original request with the new access token; if that also fails, force the user back to the login screen.</w:t>
+        <w:t xml:space="preserve">IMPORTANT — EMAIL and SMS are asynchronous: the response comes back with status PENDING immediately (the actual send happens moments later on a background thread, so the caller isn't stuck waiting on a slow mail server). If you display delivery status in a UI, don't treat PENDING as final — either poll GET /notifications/me afterward, or simply don't surface real-time delivery status for EMAIL at all (the common choice).</w:t>
       </w:r>
     </w:p>
     <w:p>
@@ -23936,15 +24245,7 @@
         </w:numPr>
       </w:pPr>
       <w:r>
-        <w:t xml:space="preserve">Call POST /auth/logout on explicit sign-out to revoke the refresh token server-side, then clear local storage.</w:t>
-      </w:r>
-    </w:p>
-    <w:p>
-      <w:pPr>
-        <w:pStyle w:val="Heading2"/>
-      </w:pPr>
-      <w:r>
-        <w:t xml:space="preserve">2. Fetch and cache profile IDs right after login</w:t>
+        <w:t xml:space="preserve">IN_APP is synchronous and settles to SENT immediately in the same response.</w:t>
       </w:r>
     </w:p>
     <w:p>
@@ -23956,15 +24257,54 @@
         </w:numPr>
       </w:pPr>
       <w:r>
-        <w:t xml:space="preserve">Call GET /auth/me immediately after login and cache studentProfileId / instructorProfileId / schoolId — these (not the raw user ID) are what most other endpoints expect.</w:t>
-      </w:r>
-    </w:p>
-    <w:p>
-      <w:pPr>
-        <w:pStyle w:val="Heading2"/>
-      </w:pPr>
-      <w:r>
-        <w:t xml:space="preserve">3. Role-aware UI</w:t>
+        <w:t xml:space="preserve">SMS sends through Twilio only once the server's TWILIO_ACCOUNT_SID / TWILIO_AUTH_TOKEN / TWILIO_FROM_NUMBER are set, and only to a recipient with a phone number on their profile - otherwise it settles to FAILED. PUSH is not wired to a real provider yet and always comes back FAILED - don't offer it as a user-facing channel choice.</w:t>
+      </w:r>
+    </w:p>
+    <w:p/>
+    <w:p>
+      <w:r>
+        <w:rPr>
+          <w:b/>
+          <w:rFonts w:ascii="Consolas" w:hAnsi="Consolas" w:cs="Consolas"/>
+          <w:sz w:val="18"/>
+          <w:szCs w:val="18"/>
+        </w:rPr>
+        <w:t xml:space="preserve">GET  </w:t>
+      </w:r>
+      <w:r>
+        <w:rPr>
+          <w:rFonts w:ascii="Consolas" w:hAnsi="Consolas" w:cs="Consolas"/>
+          <w:sz w:val="18"/>
+          <w:szCs w:val="18"/>
+        </w:rPr>
+        <w:t xml:space="preserve">/notifications/me</w:t>
+      </w:r>
+    </w:p>
+    <w:p>
+      <w:r>
+        <w:rPr>
+          <w:i/>
+        </w:rPr>
+        <w:t xml:space="preserve">My own notifications, most recent first.</w:t>
+      </w:r>
+    </w:p>
+    <w:p>
+      <w:r>
+        <w:rPr>
+          <w:b/>
+        </w:rPr>
+        <w:t xml:space="preserve">Access: </w:t>
+      </w:r>
+      <w:r>
+        <w:t xml:space="preserve">Any authenticated user</w:t>
+      </w:r>
+    </w:p>
+    <w:p>
+      <w:r>
+        <w:rPr>
+          <w:b/>
+        </w:rPr>
+        <w:t xml:space="preserve">Notes:</w:t>
       </w:r>
     </w:p>
     <w:p>
@@ -23976,7 +24316,973 @@
         </w:numPr>
       </w:pPr>
       <w:r>
-        <w:t xml:space="preserve">Three distinct app experiences: ADMIN (school/user/vehicle management, cross-cutting visibility), INSTRUCTOR (their own students/courses/bookings/lesson notes), STUDENT (their own courses/quizzes/bookings/progress).</w:t>
+        <w:t xml:space="preserve">This is the endpoint for a bell-icon notification list / inbox.</w:t>
+      </w:r>
+    </w:p>
+    <w:p/>
+    <w:p>
+      <w:r>
+        <w:rPr>
+          <w:b/>
+          <w:rFonts w:ascii="Consolas" w:hAnsi="Consolas" w:cs="Consolas"/>
+          <w:sz w:val="18"/>
+          <w:szCs w:val="18"/>
+        </w:rPr>
+        <w:t xml:space="preserve">PATCH  </w:t>
+      </w:r>
+      <w:r>
+        <w:rPr>
+          <w:rFonts w:ascii="Consolas" w:hAnsi="Consolas" w:cs="Consolas"/>
+          <w:sz w:val="18"/>
+          <w:szCs w:val="18"/>
+        </w:rPr>
+        <w:t xml:space="preserve">/notifications/{id}/read</w:t>
+      </w:r>
+    </w:p>
+    <w:p>
+      <w:r>
+        <w:rPr>
+          <w:i/>
+        </w:rPr>
+        <w:t xml:space="preserve">Mark a notification as read.</w:t>
+      </w:r>
+    </w:p>
+    <w:p>
+      <w:r>
+        <w:rPr>
+          <w:b/>
+        </w:rPr>
+        <w:t xml:space="preserve">Access: </w:t>
+      </w:r>
+      <w:r>
+        <w:t xml:space="preserve">Any authenticated user (their own notification only)</w:t>
+      </w:r>
+    </w:p>
+    <w:p/>
+    <w:p>
+      <w:pPr>
+        <w:pStyle w:val="Heading1"/>
+      </w:pPr>
+      <w:r>
+        <w:t xml:space="preserve">Gamification</w:t>
+      </w:r>
+    </w:p>
+    <w:p>
+      <w:r>
+        <w:t xml:space="preserve">Student-only (instructors have no gamification data of their own). Points, a weekly lesson streak, and a fixed set of named badges, plus a school-wide leaderboard. Nothing here is ever called directly to "award" anything — it's entirely a side effect of normal actions elsewhere in the API (completing a booking, passing a quiz, passing a driving assessment). These endpoints are read-only from the frontend's perspective.</w:t>
+      </w:r>
+    </w:p>
+    <w:p>
+      <w:pPr>
+        <w:pStyle w:val="Heading2"/>
+      </w:pPr>
+      <w:r>
+        <w:t xml:space="preserve">How points are earned</w:t>
+      </w:r>
+    </w:p>
+    <w:tbl>
+      <w:tblPr>
+        <w:tblStyle w:val="TableGrid"/>
+        <w:tblW w:w="0" w:type="auto"/>
+        <w:tblBorders>
+          <w:top w:val="single" w:sz="4" w:color="BFBFBF"/>
+          <w:left w:val="single" w:sz="4" w:color="BFBFBF"/>
+          <w:bottom w:val="single" w:sz="4" w:color="BFBFBF"/>
+          <w:right w:val="single" w:sz="4" w:color="BFBFBF"/>
+          <w:insideH w:val="single" w:sz="4" w:color="BFBFBF"/>
+          <w:insideV w:val="single" w:sz="4" w:color="BFBFBF"/>
+        </w:tblBorders>
+      </w:tblPr>
+      <w:tblGrid>
+        <w:gridCol w:w="3000"/>
+        <w:gridCol w:w="3000"/>
+        <w:gridCol w:w="3000"/>
+      </w:tblGrid>
+      <w:tr>
+        <w:tc>
+          <w:tcPr>
+            <w:shd w:val="clear" w:fill="2F5496"/>
+            <w:vAlign w:val="center"/>
+          </w:tcPr>
+          <w:p>
+            <w:pPr>
+              <w:shd w:val="clear" w:fill="2F5496"/>
+            </w:pPr>
+            <w:r>
+              <w:rPr>
+                <w:b/>
+                <w:color w:val="FFFFFF"/>
+              </w:rPr>
+              <w:t xml:space="preserve">Trigger</w:t>
+            </w:r>
+          </w:p>
+        </w:tc>
+        <w:tc>
+          <w:tcPr>
+            <w:shd w:val="clear" w:fill="2F5496"/>
+            <w:vAlign w:val="center"/>
+          </w:tcPr>
+          <w:p>
+            <w:pPr>
+              <w:shd w:val="clear" w:fill="2F5496"/>
+            </w:pPr>
+            <w:r>
+              <w:rPr>
+                <w:b/>
+                <w:color w:val="FFFFFF"/>
+              </w:rPr>
+              <w:t xml:space="preserve">Points</w:t>
+            </w:r>
+          </w:p>
+        </w:tc>
+        <w:tc>
+          <w:tcPr>
+            <w:shd w:val="clear" w:fill="2F5496"/>
+            <w:vAlign w:val="center"/>
+          </w:tcPr>
+          <w:p>
+            <w:pPr>
+              <w:shd w:val="clear" w:fill="2F5496"/>
+            </w:pPr>
+            <w:r>
+              <w:rPr>
+                <w:b/>
+                <w:color w:val="FFFFFF"/>
+              </w:rPr>
+              <w:t xml:space="preserve">Notes</w:t>
+            </w:r>
+          </w:p>
+        </w:tc>
+      </w:tr>
+      <w:tr>
+        <w:tc>
+          <w:tcPr>
+            <w:vAlign w:val="center"/>
+          </w:tcPr>
+          <w:p>
+            <w:pPr/>
+            <w:r>
+              <w:t xml:space="preserve">Booking marked COMPLETED</w:t>
+            </w:r>
+          </w:p>
+        </w:tc>
+        <w:tc>
+          <w:tcPr>
+            <w:vAlign w:val="center"/>
+          </w:tcPr>
+          <w:p>
+            <w:pPr/>
+            <w:r>
+              <w:t xml:space="preserve">10</w:t>
+            </w:r>
+          </w:p>
+        </w:tc>
+        <w:tc>
+          <w:tcPr>
+            <w:vAlign w:val="center"/>
+          </w:tcPr>
+          <w:p>
+            <w:pPr/>
+            <w:r>
+              <w:t xml:space="preserve">awarded once per booking</w:t>
+            </w:r>
+          </w:p>
+        </w:tc>
+      </w:tr>
+      <w:tr>
+        <w:tc>
+          <w:tcPr>
+            <w:vAlign w:val="center"/>
+          </w:tcPr>
+          <w:p>
+            <w:pPr/>
+            <w:r>
+              <w:t xml:space="preserve">Quiz submission passed</w:t>
+            </w:r>
+          </w:p>
+        </w:tc>
+        <w:tc>
+          <w:tcPr>
+            <w:vAlign w:val="center"/>
+          </w:tcPr>
+          <w:p>
+            <w:pPr/>
+            <w:r>
+              <w:t xml:space="preserve">20</w:t>
+            </w:r>
+          </w:p>
+        </w:tc>
+        <w:tc>
+          <w:tcPr>
+            <w:vAlign w:val="center"/>
+          </w:tcPr>
+          <w:p>
+            <w:pPr/>
+            <w:r>
+              <w:t xml:space="preserve">awarded once per quiz per student — retaking an already-passed quiz does not award points again</w:t>
+            </w:r>
+          </w:p>
+        </w:tc>
+      </w:tr>
+      <w:tr>
+        <w:tc>
+          <w:tcPr>
+            <w:vAlign w:val="center"/>
+          </w:tcPr>
+          <w:p>
+            <w:pPr/>
+            <w:r>
+              <w:t xml:space="preserve">Driving assessment result = PASSED</w:t>
+            </w:r>
+          </w:p>
+        </w:tc>
+        <w:tc>
+          <w:tcPr>
+            <w:vAlign w:val="center"/>
+          </w:tcPr>
+          <w:p>
+            <w:pPr/>
+            <w:r>
+              <w:t xml:space="preserve">30</w:t>
+            </w:r>
+          </w:p>
+        </w:tc>
+        <w:tc>
+          <w:tcPr>
+            <w:vAlign w:val="center"/>
+          </w:tcPr>
+          <w:p>
+            <w:pPr/>
+            <w:r>
+              <w:t xml:space="preserve">awarded once per student (the first passed assessment); later passed assessments don't award again</w:t>
+            </w:r>
+          </w:p>
+        </w:tc>
+      </w:tr>
+    </w:tbl>
+    <w:p/>
+    <w:p>
+      <w:pPr>
+        <w:pStyle w:val="Heading2"/>
+      </w:pPr>
+      <w:r>
+        <w:t xml:space="preserve">Weekly streak</w:t>
+      </w:r>
+    </w:p>
+    <w:p>
+      <w:r>
+        <w:t xml:space="preserve">Counts consecutive calendar weeks (Monday-start) in which the student had at least one completed booking. Completing a second lesson in the same week doesn't increase the streak further; missing a week resets it back to 1 on the next completed lesson (it does not silently decay to 0 while the student is simply inactive — nothing changes until their next completed lesson).</w:t>
+      </w:r>
+    </w:p>
+    <w:p>
+      <w:pPr>
+        <w:pStyle w:val="Heading2"/>
+      </w:pPr>
+      <w:r>
+        <w:t xml:space="preserve">Badges</w:t>
+      </w:r>
+    </w:p>
+    <w:p>
+      <w:r>
+        <w:t xml:space="preserve">A fixed catalog, not admin-configurable. Each is awarded at most once per student:</w:t>
+      </w:r>
+    </w:p>
+    <w:tbl>
+      <w:tblPr>
+        <w:tblStyle w:val="TableGrid"/>
+        <w:tblW w:w="0" w:type="auto"/>
+        <w:tblBorders>
+          <w:top w:val="single" w:sz="4" w:color="BFBFBF"/>
+          <w:left w:val="single" w:sz="4" w:color="BFBFBF"/>
+          <w:bottom w:val="single" w:sz="4" w:color="BFBFBF"/>
+          <w:right w:val="single" w:sz="4" w:color="BFBFBF"/>
+          <w:insideH w:val="single" w:sz="4" w:color="BFBFBF"/>
+          <w:insideV w:val="single" w:sz="4" w:color="BFBFBF"/>
+        </w:tblBorders>
+      </w:tblPr>
+      <w:tblGrid>
+        <w:gridCol w:w="4500"/>
+        <w:gridCol w:w="4500"/>
+      </w:tblGrid>
+      <w:tr>
+        <w:tc>
+          <w:tcPr>
+            <w:shd w:val="clear" w:fill="2F5496"/>
+            <w:vAlign w:val="center"/>
+          </w:tcPr>
+          <w:p>
+            <w:pPr>
+              <w:shd w:val="clear" w:fill="2F5496"/>
+            </w:pPr>
+            <w:r>
+              <w:rPr>
+                <w:b/>
+                <w:color w:val="FFFFFF"/>
+              </w:rPr>
+              <w:t xml:space="preserve">Badge</w:t>
+            </w:r>
+          </w:p>
+        </w:tc>
+        <w:tc>
+          <w:tcPr>
+            <w:shd w:val="clear" w:fill="2F5496"/>
+            <w:vAlign w:val="center"/>
+          </w:tcPr>
+          <w:p>
+            <w:pPr>
+              <w:shd w:val="clear" w:fill="2F5496"/>
+            </w:pPr>
+            <w:r>
+              <w:rPr>
+                <w:b/>
+                <w:color w:val="FFFFFF"/>
+              </w:rPr>
+              <w:t xml:space="preserve">Awarded when</w:t>
+            </w:r>
+          </w:p>
+        </w:tc>
+      </w:tr>
+      <w:tr>
+        <w:tc>
+          <w:tcPr>
+            <w:vAlign w:val="center"/>
+          </w:tcPr>
+          <w:p>
+            <w:pPr/>
+            <w:r>
+              <w:t xml:space="preserve">First Lesson</w:t>
+            </w:r>
+          </w:p>
+        </w:tc>
+        <w:tc>
+          <w:tcPr>
+            <w:vAlign w:val="center"/>
+          </w:tcPr>
+          <w:p>
+            <w:pPr/>
+            <w:r>
+              <w:t xml:space="preserve">First booking ever marked completed</w:t>
+            </w:r>
+          </w:p>
+        </w:tc>
+      </w:tr>
+      <w:tr>
+        <w:tc>
+          <w:tcPr>
+            <w:vAlign w:val="center"/>
+          </w:tcPr>
+          <w:p>
+            <w:pPr/>
+            <w:r>
+              <w:t xml:space="preserve">Quiz Master</w:t>
+            </w:r>
+          </w:p>
+        </w:tc>
+        <w:tc>
+          <w:tcPr>
+            <w:vAlign w:val="center"/>
+          </w:tcPr>
+          <w:p>
+            <w:pPr/>
+            <w:r>
+              <w:t xml:space="preserve">First quiz ever passed</w:t>
+            </w:r>
+          </w:p>
+        </w:tc>
+      </w:tr>
+      <w:tr>
+        <w:tc>
+          <w:tcPr>
+            <w:vAlign w:val="center"/>
+          </w:tcPr>
+          <w:p>
+            <w:pPr/>
+            <w:r>
+              <w:t xml:space="preserve">Road Ready</w:t>
+            </w:r>
+          </w:p>
+        </w:tc>
+        <w:tc>
+          <w:tcPr>
+            <w:vAlign w:val="center"/>
+          </w:tcPr>
+          <w:p>
+            <w:pPr/>
+            <w:r>
+              <w:t xml:space="preserve">First driving assessment ever passed</w:t>
+            </w:r>
+          </w:p>
+        </w:tc>
+      </w:tr>
+      <w:tr>
+        <w:tc>
+          <w:tcPr>
+            <w:vAlign w:val="center"/>
+          </w:tcPr>
+          <w:p>
+            <w:pPr/>
+            <w:r>
+              <w:t xml:space="preserve">5-Week Streak</w:t>
+            </w:r>
+          </w:p>
+        </w:tc>
+        <w:tc>
+          <w:tcPr>
+            <w:vAlign w:val="center"/>
+          </w:tcPr>
+          <w:p>
+            <w:pPr/>
+            <w:r>
+              <w:t xml:space="preserve">Weekly streak reaches 5</w:t>
+            </w:r>
+          </w:p>
+        </w:tc>
+      </w:tr>
+      <w:tr>
+        <w:tc>
+          <w:tcPr>
+            <w:vAlign w:val="center"/>
+          </w:tcPr>
+          <w:p>
+            <w:pPr/>
+            <w:r>
+              <w:t xml:space="preserve">10-Week Streak</w:t>
+            </w:r>
+          </w:p>
+        </w:tc>
+        <w:tc>
+          <w:tcPr>
+            <w:vAlign w:val="center"/>
+          </w:tcPr>
+          <w:p>
+            <w:pPr/>
+            <w:r>
+              <w:t xml:space="preserve">Weekly streak reaches 10</w:t>
+            </w:r>
+          </w:p>
+        </w:tc>
+      </w:tr>
+      <w:tr>
+        <w:tc>
+          <w:tcPr>
+            <w:vAlign w:val="center"/>
+          </w:tcPr>
+          <w:p>
+            <w:pPr/>
+            <w:r>
+              <w:t xml:space="preserve">Century Club</w:t>
+            </w:r>
+          </w:p>
+        </w:tc>
+        <w:tc>
+          <w:tcPr>
+            <w:vAlign w:val="center"/>
+          </w:tcPr>
+          <w:p>
+            <w:pPr/>
+            <w:r>
+              <w:t xml:space="preserve">Total points reach 100</w:t>
+            </w:r>
+          </w:p>
+        </w:tc>
+      </w:tr>
+      <w:tr>
+        <w:tc>
+          <w:tcPr>
+            <w:vAlign w:val="center"/>
+          </w:tcPr>
+          <w:p>
+            <w:pPr/>
+            <w:r>
+              <w:t xml:space="preserve">High Achiever</w:t>
+            </w:r>
+          </w:p>
+        </w:tc>
+        <w:tc>
+          <w:tcPr>
+            <w:vAlign w:val="center"/>
+          </w:tcPr>
+          <w:p>
+            <w:pPr/>
+            <w:r>
+              <w:t xml:space="preserve">Total points reach 500</w:t>
+            </w:r>
+          </w:p>
+        </w:tc>
+      </w:tr>
+    </w:tbl>
+    <w:p/>
+    <w:p>
+      <w:r>
+        <w:rPr>
+          <w:b/>
+          <w:rFonts w:ascii="Consolas" w:hAnsi="Consolas" w:cs="Consolas"/>
+          <w:sz w:val="18"/>
+          <w:szCs w:val="18"/>
+        </w:rPr>
+        <w:t xml:space="preserve">GET  </w:t>
+      </w:r>
+      <w:r>
+        <w:rPr>
+          <w:rFonts w:ascii="Consolas" w:hAnsi="Consolas" w:cs="Consolas"/>
+          <w:sz w:val="18"/>
+          <w:szCs w:val="18"/>
+        </w:rPr>
+        <w:t xml:space="preserve">/gamification/me</w:t>
+      </w:r>
+    </w:p>
+    <w:p>
+      <w:r>
+        <w:rPr>
+          <w:i/>
+        </w:rPr>
+        <w:t xml:space="preserve">The current student's own gamification summary.</w:t>
+      </w:r>
+    </w:p>
+    <w:p>
+      <w:r>
+        <w:rPr>
+          <w:b/>
+        </w:rPr>
+        <w:t xml:space="preserve">Access: </w:t>
+      </w:r>
+      <w:r>
+        <w:t xml:space="preserve">STUDENT only</w:t>
+      </w:r>
+    </w:p>
+    <w:p>
+      <w:r>
+        <w:rPr>
+          <w:b/>
+        </w:rPr>
+        <w:t xml:space="preserve">Response (key fields):</w:t>
+      </w:r>
+    </w:p>
+    <w:tbl>
+      <w:tblPr>
+        <w:tblStyle w:val="TableGrid"/>
+        <w:tblW w:w="0" w:type="auto"/>
+        <w:tblBorders>
+          <w:top w:val="single" w:sz="4" w:color="BFBFBF"/>
+          <w:left w:val="single" w:sz="4" w:color="BFBFBF"/>
+          <w:bottom w:val="single" w:sz="4" w:color="BFBFBF"/>
+          <w:right w:val="single" w:sz="4" w:color="BFBFBF"/>
+          <w:insideH w:val="single" w:sz="4" w:color="BFBFBF"/>
+          <w:insideV w:val="single" w:sz="4" w:color="BFBFBF"/>
+        </w:tblBorders>
+      </w:tblPr>
+      <w:tblGrid>
+        <w:gridCol w:w="3000"/>
+        <w:gridCol w:w="3000"/>
+        <w:gridCol w:w="3000"/>
+      </w:tblGrid>
+      <w:tr>
+        <w:tc>
+          <w:tcPr>
+            <w:shd w:val="clear" w:fill="2F5496"/>
+            <w:vAlign w:val="center"/>
+          </w:tcPr>
+          <w:p>
+            <w:pPr>
+              <w:shd w:val="clear" w:fill="2F5496"/>
+            </w:pPr>
+            <w:r>
+              <w:rPr>
+                <w:b/>
+                <w:color w:val="FFFFFF"/>
+              </w:rPr>
+              <w:t xml:space="preserve">Field</w:t>
+            </w:r>
+          </w:p>
+        </w:tc>
+        <w:tc>
+          <w:tcPr>
+            <w:shd w:val="clear" w:fill="2F5496"/>
+            <w:vAlign w:val="center"/>
+          </w:tcPr>
+          <w:p>
+            <w:pPr>
+              <w:shd w:val="clear" w:fill="2F5496"/>
+            </w:pPr>
+            <w:r>
+              <w:rPr>
+                <w:b/>
+                <w:color w:val="FFFFFF"/>
+              </w:rPr>
+              <w:t xml:space="preserve">Type</w:t>
+            </w:r>
+          </w:p>
+        </w:tc>
+        <w:tc>
+          <w:tcPr>
+            <w:shd w:val="clear" w:fill="2F5496"/>
+            <w:vAlign w:val="center"/>
+          </w:tcPr>
+          <w:p>
+            <w:pPr>
+              <w:shd w:val="clear" w:fill="2F5496"/>
+            </w:pPr>
+            <w:r>
+              <w:rPr>
+                <w:b/>
+                <w:color w:val="FFFFFF"/>
+              </w:rPr>
+              <w:t xml:space="preserve">Notes</w:t>
+            </w:r>
+          </w:p>
+        </w:tc>
+      </w:tr>
+      <w:tr>
+        <w:tc>
+          <w:tcPr>
+            <w:vAlign w:val="center"/>
+          </w:tcPr>
+          <w:p>
+            <w:pPr/>
+            <w:r>
+              <w:t xml:space="preserve">studentId / studentName</w:t>
+            </w:r>
+          </w:p>
+        </w:tc>
+        <w:tc>
+          <w:tcPr>
+            <w:vAlign w:val="center"/>
+          </w:tcPr>
+          <w:p>
+            <w:pPr/>
+            <w:r>
+              <w:t xml:space="preserve"/>
+            </w:r>
+          </w:p>
+        </w:tc>
+        <w:tc>
+          <w:tcPr>
+            <w:vAlign w:val="center"/>
+          </w:tcPr>
+          <w:p>
+            <w:pPr/>
+            <w:r>
+              <w:t xml:space="preserve"/>
+            </w:r>
+          </w:p>
+        </w:tc>
+      </w:tr>
+      <w:tr>
+        <w:tc>
+          <w:tcPr>
+            <w:vAlign w:val="center"/>
+          </w:tcPr>
+          <w:p>
+            <w:pPr/>
+            <w:r>
+              <w:t xml:space="preserve">totalPoints / currentStreakWeeks / longestStreakWeeks</w:t>
+            </w:r>
+          </w:p>
+        </w:tc>
+        <w:tc>
+          <w:tcPr>
+            <w:vAlign w:val="center"/>
+          </w:tcPr>
+          <w:p>
+            <w:pPr/>
+            <w:r>
+              <w:t xml:space="preserve">number</w:t>
+            </w:r>
+          </w:p>
+        </w:tc>
+        <w:tc>
+          <w:tcPr>
+            <w:vAlign w:val="center"/>
+          </w:tcPr>
+          <w:p>
+            <w:pPr/>
+            <w:r>
+              <w:t xml:space="preserve"/>
+            </w:r>
+          </w:p>
+        </w:tc>
+      </w:tr>
+      <w:tr>
+        <w:tc>
+          <w:tcPr>
+            <w:vAlign w:val="center"/>
+          </w:tcPr>
+          <w:p>
+            <w:pPr/>
+            <w:r>
+              <w:t xml:space="preserve">schoolRank</w:t>
+            </w:r>
+          </w:p>
+        </w:tc>
+        <w:tc>
+          <w:tcPr>
+            <w:vAlign w:val="center"/>
+          </w:tcPr>
+          <w:p>
+            <w:pPr/>
+            <w:r>
+              <w:t xml:space="preserve">number</w:t>
+            </w:r>
+          </w:p>
+        </w:tc>
+        <w:tc>
+          <w:tcPr>
+            <w:vAlign w:val="center"/>
+          </w:tcPr>
+          <w:p>
+            <w:pPr/>
+            <w:r>
+              <w:t xml:space="preserve">1-based rank by totalPoints within the student's own school</w:t>
+            </w:r>
+          </w:p>
+        </w:tc>
+      </w:tr>
+      <w:tr>
+        <w:tc>
+          <w:tcPr>
+            <w:vAlign w:val="center"/>
+          </w:tcPr>
+          <w:p>
+            <w:pPr/>
+            <w:r>
+              <w:t xml:space="preserve">badges</w:t>
+            </w:r>
+          </w:p>
+        </w:tc>
+        <w:tc>
+          <w:tcPr>
+            <w:vAlign w:val="center"/>
+          </w:tcPr>
+          <w:p>
+            <w:pPr/>
+            <w:r>
+              <w:t xml:space="preserve">array</w:t>
+            </w:r>
+          </w:p>
+        </w:tc>
+        <w:tc>
+          <w:tcPr>
+            <w:vAlign w:val="center"/>
+          </w:tcPr>
+          <w:p>
+            <w:pPr/>
+            <w:r>
+              <w:t xml:space="preserve">each item: badge (enum), displayName, description, awardedAt</w:t>
+            </w:r>
+          </w:p>
+        </w:tc>
+      </w:tr>
+    </w:tbl>
+    <w:p/>
+    <w:p>
+      <w:r>
+        <w:rPr>
+          <w:b/>
+        </w:rPr>
+        <w:t xml:space="preserve">Example response:</w:t>
+      </w:r>
+    </w:p>
+    <w:p>
+      <w:pPr>
+        <w:pStyle w:val="Code"/>
+        <w:shd w:val="clear" w:fill="F3F3F3"/>
+      </w:pPr>
+      <w:r>
+        <w:rPr>
+          <w:rFonts w:ascii="Consolas" w:hAnsi="Consolas"/>
+          <w:sz w:val="18"/>
+        </w:rPr>
+        <w:t xml:space="preserve">{</w:t>
+      </w:r>
+    </w:p>
+    <w:p>
+      <w:pPr>
+        <w:pStyle w:val="Code"/>
+        <w:shd w:val="clear" w:fill="F3F3F3"/>
+      </w:pPr>
+      <w:r>
+        <w:rPr>
+          <w:rFonts w:ascii="Consolas" w:hAnsi="Consolas"/>
+          <w:sz w:val="18"/>
+        </w:rPr>
+        <w:t xml:space="preserve">  "success": true,</w:t>
+      </w:r>
+    </w:p>
+    <w:p>
+      <w:pPr>
+        <w:pStyle w:val="Code"/>
+        <w:shd w:val="clear" w:fill="F3F3F3"/>
+      </w:pPr>
+      <w:r>
+        <w:rPr>
+          <w:rFonts w:ascii="Consolas" w:hAnsi="Consolas"/>
+          <w:sz w:val="18"/>
+        </w:rPr>
+        <w:t xml:space="preserve">  "message": "Operation successful",</w:t>
+      </w:r>
+    </w:p>
+    <w:p>
+      <w:pPr>
+        <w:pStyle w:val="Code"/>
+        <w:shd w:val="clear" w:fill="F3F3F3"/>
+      </w:pPr>
+      <w:r>
+        <w:rPr>
+          <w:rFonts w:ascii="Consolas" w:hAnsi="Consolas"/>
+          <w:sz w:val="18"/>
+        </w:rPr>
+        <w:t xml:space="preserve">  "data": {</w:t>
+      </w:r>
+    </w:p>
+    <w:p>
+      <w:pPr>
+        <w:pStyle w:val="Code"/>
+        <w:shd w:val="clear" w:fill="F3F3F3"/>
+      </w:pPr>
+      <w:r>
+        <w:rPr>
+          <w:rFonts w:ascii="Consolas" w:hAnsi="Consolas"/>
+          <w:sz w:val="18"/>
+        </w:rPr>
+        <w:t xml:space="preserve">    "studentId": 15,</w:t>
+      </w:r>
+    </w:p>
+    <w:p>
+      <w:pPr>
+        <w:pStyle w:val="Code"/>
+        <w:shd w:val="clear" w:fill="F3F3F3"/>
+      </w:pPr>
+      <w:r>
+        <w:rPr>
+          <w:rFonts w:ascii="Consolas" w:hAnsi="Consolas"/>
+          <w:sz w:val="18"/>
+        </w:rPr>
+        <w:t xml:space="preserve">    "studentName": "Jamie Jones",</w:t>
+      </w:r>
+    </w:p>
+    <w:p>
+      <w:pPr>
+        <w:pStyle w:val="Code"/>
+        <w:shd w:val="clear" w:fill="F3F3F3"/>
+      </w:pPr>
+      <w:r>
+        <w:rPr>
+          <w:rFonts w:ascii="Consolas" w:hAnsi="Consolas"/>
+          <w:sz w:val="18"/>
+        </w:rPr>
+        <w:t xml:space="preserve">    "totalPoints": 60,</w:t>
+      </w:r>
+    </w:p>
+    <w:p>
+      <w:pPr>
+        <w:pStyle w:val="Code"/>
+        <w:shd w:val="clear" w:fill="F3F3F3"/>
+      </w:pPr>
+      <w:r>
+        <w:rPr>
+          <w:rFonts w:ascii="Consolas" w:hAnsi="Consolas"/>
+          <w:sz w:val="18"/>
+        </w:rPr>
+        <w:t xml:space="preserve">    "currentStreakWeeks": 3,</w:t>
+      </w:r>
+    </w:p>
+    <w:p>
+      <w:pPr>
+        <w:pStyle w:val="Code"/>
+        <w:shd w:val="clear" w:fill="F3F3F3"/>
+      </w:pPr>
+      <w:r>
+        <w:rPr>
+          <w:rFonts w:ascii="Consolas" w:hAnsi="Consolas"/>
+          <w:sz w:val="18"/>
+        </w:rPr>
+        <w:t xml:space="preserve">    "longestStreakWeeks": 3,</w:t>
+      </w:r>
+    </w:p>
+    <w:p>
+      <w:pPr>
+        <w:pStyle w:val="Code"/>
+        <w:shd w:val="clear" w:fill="F3F3F3"/>
+      </w:pPr>
+      <w:r>
+        <w:rPr>
+          <w:rFonts w:ascii="Consolas" w:hAnsi="Consolas"/>
+          <w:sz w:val="18"/>
+        </w:rPr>
+        <w:t xml:space="preserve">    "schoolRank": 4,</w:t>
+      </w:r>
+    </w:p>
+    <w:p>
+      <w:pPr>
+        <w:pStyle w:val="Code"/>
+        <w:shd w:val="clear" w:fill="F3F3F3"/>
+      </w:pPr>
+      <w:r>
+        <w:rPr>
+          <w:rFonts w:ascii="Consolas" w:hAnsi="Consolas"/>
+          <w:sz w:val="18"/>
+        </w:rPr>
+        <w:t xml:space="preserve">    "badges": [</w:t>
+      </w:r>
+    </w:p>
+    <w:p>
+      <w:pPr>
+        <w:pStyle w:val="Code"/>
+        <w:shd w:val="clear" w:fill="F3F3F3"/>
+      </w:pPr>
+      <w:r>
+        <w:rPr>
+          <w:rFonts w:ascii="Consolas" w:hAnsi="Consolas"/>
+          <w:sz w:val="18"/>
+        </w:rPr>
+        <w:t xml:space="preserve">      {"badge": "FIRST_LESSON", "displayName": "First Lesson", "description": "Completed your first practical lesson", "awardedAt": "2026-07-02T10:15:00"}</w:t>
+      </w:r>
+    </w:p>
+    <w:p>
+      <w:pPr>
+        <w:pStyle w:val="Code"/>
+        <w:shd w:val="clear" w:fill="F3F3F3"/>
+      </w:pPr>
+      <w:r>
+        <w:rPr>
+          <w:rFonts w:ascii="Consolas" w:hAnsi="Consolas"/>
+          <w:sz w:val="18"/>
+        </w:rPr>
+        <w:t xml:space="preserve">    ]</w:t>
+      </w:r>
+    </w:p>
+    <w:p>
+      <w:pPr>
+        <w:pStyle w:val="Code"/>
+        <w:shd w:val="clear" w:fill="F3F3F3"/>
+      </w:pPr>
+      <w:r>
+        <w:rPr>
+          <w:rFonts w:ascii="Consolas" w:hAnsi="Consolas"/>
+          <w:sz w:val="18"/>
+        </w:rPr>
+        <w:t xml:space="preserve">  }</w:t>
+      </w:r>
+    </w:p>
+    <w:p>
+      <w:pPr>
+        <w:pStyle w:val="Code"/>
+        <w:shd w:val="clear" w:fill="F3F3F3"/>
+      </w:pPr>
+      <w:r>
+        <w:rPr>
+          <w:rFonts w:ascii="Consolas" w:hAnsi="Consolas"/>
+          <w:sz w:val="18"/>
+        </w:rPr>
+        <w:t xml:space="preserve">}</w:t>
+      </w:r>
+    </w:p>
+    <w:p>
+      <w:r>
+        <w:rPr>
+          <w:b/>
+        </w:rPr>
+        <w:t xml:space="preserve">Notes:</w:t>
       </w:r>
     </w:p>
     <w:p>
@@ -23988,7 +25294,54 @@
         </w:numPr>
       </w:pPr>
       <w:r>
-        <w:t xml:space="preserve">ADMIN is itself two different dashboards, not one — check GET /auth/me's bootstrapAdmin flag. The bootstrap admin manages ALL schools/admins (school create/delete, the deletion-request review queue); a regular admin only ever sees their own school and has no delete button at all, only a "request deletion" one. Don't build a single generic "admin" screen that tries to cover both.</w:t>
+        <w:t xml:space="preserve">This is the endpoint for a student's own "my progress" / points-and-badges widget.</w:t>
+      </w:r>
+    </w:p>
+    <w:p/>
+    <w:p>
+      <w:r>
+        <w:rPr>
+          <w:b/>
+          <w:rFonts w:ascii="Consolas" w:hAnsi="Consolas" w:cs="Consolas"/>
+          <w:sz w:val="18"/>
+          <w:szCs w:val="18"/>
+        </w:rPr>
+        <w:t xml:space="preserve">GET  </w:t>
+      </w:r>
+      <w:r>
+        <w:rPr>
+          <w:rFonts w:ascii="Consolas" w:hAnsi="Consolas" w:cs="Consolas"/>
+          <w:sz w:val="18"/>
+          <w:szCs w:val="18"/>
+        </w:rPr>
+        <w:t xml:space="preserve">/gamification/students/{studentId}</w:t>
+      </w:r>
+    </w:p>
+    <w:p>
+      <w:r>
+        <w:rPr>
+          <w:i/>
+        </w:rPr>
+        <w:t xml:space="preserve">Another student's gamification summary.</w:t>
+      </w:r>
+    </w:p>
+    <w:p>
+      <w:r>
+        <w:rPr>
+          <w:b/>
+        </w:rPr>
+        <w:t xml:space="preserve">Access: </w:t>
+      </w:r>
+      <w:r>
+        <w:t xml:space="preserve">ADMIN, an INSTRUCTOR in the same school, or the STUDENT themselves</w:t>
+      </w:r>
+    </w:p>
+    <w:p>
+      <w:r>
+        <w:rPr>
+          <w:b/>
+        </w:rPr>
+        <w:t xml:space="preserve">Notes:</w:t>
       </w:r>
     </w:p>
     <w:p>
@@ -24000,15 +25353,208 @@
         </w:numPr>
       </w:pPr>
       <w:r>
-        <w:t xml:space="preserve">Remember bookings are instructor-initiated — don't build a student-facing "book a lesson" button; build an instructor-facing "schedule a lesson for my student" flow instead.</w:t>
-      </w:r>
-    </w:p>
-    <w:p>
-      <w:pPr>
-        <w:pStyle w:val="Heading2"/>
-      </w:pPr>
-      <w:r>
-        <w:t xml:space="preserve">4. File uploads are multipart, and PDF-only</w:t>
+        <w:t xml:space="preserve">Same response shape as /gamification/me. Use this for an instructor-facing student detail screen, not for a student's own widget (use /me for that, it resolves the caller's own profile automatically).</w:t>
+      </w:r>
+    </w:p>
+    <w:p/>
+    <w:p>
+      <w:r>
+        <w:rPr>
+          <w:b/>
+          <w:rFonts w:ascii="Consolas" w:hAnsi="Consolas" w:cs="Consolas"/>
+          <w:sz w:val="18"/>
+          <w:szCs w:val="18"/>
+        </w:rPr>
+        <w:t xml:space="preserve">GET  </w:t>
+      </w:r>
+      <w:r>
+        <w:rPr>
+          <w:rFonts w:ascii="Consolas" w:hAnsi="Consolas" w:cs="Consolas"/>
+          <w:sz w:val="18"/>
+          <w:szCs w:val="18"/>
+        </w:rPr>
+        <w:t xml:space="preserve">/gamification/leaderboard/school/{schoolId}</w:t>
+      </w:r>
+    </w:p>
+    <w:p>
+      <w:r>
+        <w:rPr>
+          <w:i/>
+        </w:rPr>
+        <w:t xml:space="preserve">School-wide leaderboard, ranked by total points.</w:t>
+      </w:r>
+    </w:p>
+    <w:p>
+      <w:r>
+        <w:rPr>
+          <w:b/>
+        </w:rPr>
+        <w:t xml:space="preserve">Access: </w:t>
+      </w:r>
+      <w:r>
+        <w:t xml:space="preserve">ADMIN, or an INSTRUCTOR/STUDENT in that same school</w:t>
+      </w:r>
+    </w:p>
+    <w:p>
+      <w:r>
+        <w:rPr>
+          <w:b/>
+        </w:rPr>
+        <w:t xml:space="preserve">Response (key fields):</w:t>
+      </w:r>
+    </w:p>
+    <w:tbl>
+      <w:tblPr>
+        <w:tblStyle w:val="TableGrid"/>
+        <w:tblW w:w="0" w:type="auto"/>
+        <w:tblBorders>
+          <w:top w:val="single" w:sz="4" w:color="BFBFBF"/>
+          <w:left w:val="single" w:sz="4" w:color="BFBFBF"/>
+          <w:bottom w:val="single" w:sz="4" w:color="BFBFBF"/>
+          <w:right w:val="single" w:sz="4" w:color="BFBFBF"/>
+          <w:insideH w:val="single" w:sz="4" w:color="BFBFBF"/>
+          <w:insideV w:val="single" w:sz="4" w:color="BFBFBF"/>
+        </w:tblBorders>
+      </w:tblPr>
+      <w:tblGrid>
+        <w:gridCol w:w="3000"/>
+        <w:gridCol w:w="3000"/>
+        <w:gridCol w:w="3000"/>
+      </w:tblGrid>
+      <w:tr>
+        <w:tc>
+          <w:tcPr>
+            <w:shd w:val="clear" w:fill="2F5496"/>
+            <w:vAlign w:val="center"/>
+          </w:tcPr>
+          <w:p>
+            <w:pPr>
+              <w:shd w:val="clear" w:fill="2F5496"/>
+            </w:pPr>
+            <w:r>
+              <w:rPr>
+                <w:b/>
+                <w:color w:val="FFFFFF"/>
+              </w:rPr>
+              <w:t xml:space="preserve">Field</w:t>
+            </w:r>
+          </w:p>
+        </w:tc>
+        <w:tc>
+          <w:tcPr>
+            <w:shd w:val="clear" w:fill="2F5496"/>
+            <w:vAlign w:val="center"/>
+          </w:tcPr>
+          <w:p>
+            <w:pPr>
+              <w:shd w:val="clear" w:fill="2F5496"/>
+            </w:pPr>
+            <w:r>
+              <w:rPr>
+                <w:b/>
+                <w:color w:val="FFFFFF"/>
+              </w:rPr>
+              <w:t xml:space="preserve">Type</w:t>
+            </w:r>
+          </w:p>
+        </w:tc>
+        <w:tc>
+          <w:tcPr>
+            <w:shd w:val="clear" w:fill="2F5496"/>
+            <w:vAlign w:val="center"/>
+          </w:tcPr>
+          <w:p>
+            <w:pPr>
+              <w:shd w:val="clear" w:fill="2F5496"/>
+            </w:pPr>
+            <w:r>
+              <w:rPr>
+                <w:b/>
+                <w:color w:val="FFFFFF"/>
+              </w:rPr>
+              <w:t xml:space="preserve">Notes</w:t>
+            </w:r>
+          </w:p>
+        </w:tc>
+      </w:tr>
+      <w:tr>
+        <w:tc>
+          <w:tcPr>
+            <w:vAlign w:val="center"/>
+          </w:tcPr>
+          <w:p>
+            <w:pPr/>
+            <w:r>
+              <w:t xml:space="preserve">Paginated (see the Pagination convention above) — each row:</w:t>
+            </w:r>
+          </w:p>
+        </w:tc>
+        <w:tc>
+          <w:tcPr>
+            <w:vAlign w:val="center"/>
+          </w:tcPr>
+          <w:p>
+            <w:pPr/>
+            <w:r>
+              <w:t xml:space="preserve"/>
+            </w:r>
+          </w:p>
+        </w:tc>
+        <w:tc>
+          <w:tcPr>
+            <w:vAlign w:val="center"/>
+          </w:tcPr>
+          <w:p>
+            <w:pPr/>
+            <w:r>
+              <w:t xml:space="preserve"/>
+            </w:r>
+          </w:p>
+        </w:tc>
+      </w:tr>
+      <w:tr>
+        <w:tc>
+          <w:tcPr>
+            <w:vAlign w:val="center"/>
+          </w:tcPr>
+          <w:p>
+            <w:pPr/>
+            <w:r>
+              <w:t xml:space="preserve">rank / studentId / studentName / totalPoints / currentStreakWeeks</w:t>
+            </w:r>
+          </w:p>
+        </w:tc>
+        <w:tc>
+          <w:tcPr>
+            <w:vAlign w:val="center"/>
+          </w:tcPr>
+          <w:p>
+            <w:pPr/>
+            <w:r>
+              <w:t xml:space="preserve"/>
+            </w:r>
+          </w:p>
+        </w:tc>
+        <w:tc>
+          <w:tcPr>
+            <w:vAlign w:val="center"/>
+          </w:tcPr>
+          <w:p>
+            <w:pPr/>
+            <w:r>
+              <w:t xml:space="preserve"/>
+            </w:r>
+          </w:p>
+        </w:tc>
+      </w:tr>
+    </w:tbl>
+    <w:p/>
+    <w:p>
+      <w:r>
+        <w:rPr>
+          <w:b/>
+        </w:rPr>
+        <w:t xml:space="preserve">Notes:</w:t>
       </w:r>
     </w:p>
     <w:p>
@@ -24020,7 +25566,29 @@
         </w:numPr>
       </w:pPr>
       <w:r>
-        <w:t xml:space="preserve">Only the lesson-note attachment endpoints (upload and replace) take multipart/form-data. Every other endpoint in this API is JSON.</w:t>
+        <w:t xml:space="preserve">An INSTRUCTOR or STUDENT requesting a DIFFERENT school's leaderboard gets 400, not the data — always pass the caller's own schoolId (from GET /auth/me).</w:t>
+      </w:r>
+    </w:p>
+    <w:p/>
+    <w:p>
+      <w:pPr>
+        <w:pStyle w:val="Heading1"/>
+      </w:pPr>
+      <w:r>
+        <w:t xml:space="preserve">Checklist: Things the Frontend Needs to Build</w:t>
+      </w:r>
+    </w:p>
+    <w:p>
+      <w:r>
+        <w:t xml:space="preserve">A summary of implementation requirements that aren't just "call an endpoint" — read this before starting, it'll save rework.</w:t>
+      </w:r>
+    </w:p>
+    <w:p>
+      <w:pPr>
+        <w:pStyle w:val="Heading2"/>
+      </w:pPr>
+      <w:r>
+        <w:t xml:space="preserve">1. Auth token lifecycle</w:t>
       </w:r>
     </w:p>
     <w:p>
@@ -24032,15 +25600,7 @@
         </w:numPr>
       </w:pPr>
       <w:r>
-        <w:t xml:space="preserve">50 MB max, PDF only, enforced server-side — validate client-side too for a faster error message, but don't rely on client-side validation alone.</w:t>
-      </w:r>
-    </w:p>
-    <w:p>
-      <w:pPr>
-        <w:pStyle w:val="Heading2"/>
-      </w:pPr>
-      <w:r>
-        <w:t xml:space="preserve">5. Multi-step flows the frontend orchestrates</w:t>
+        <w:t xml:space="preserve">Store accessToken and refreshToken after login (e.g. in memory + a secure storage mechanism appropriate for your platform — avoid plain localStorage for the refresh token if you can help it, given it's valid for 7 days).</w:t>
       </w:r>
     </w:p>
     <w:p>
@@ -24052,7 +25612,7 @@
         </w:numPr>
       </w:pPr>
       <w:r>
-        <w:t xml:space="preserve">"Instructor books a lesson": needs the student's StudentProfile.id (populate the picker from GET /students/school/{schoolId} using the instructor's own schoolId — no need to make the instructor type a raw student ID) and the instructor's own InstructorProfile.id (from /auth/me), plus optionally a vehicle ID from a vehicle-list call. There's no single "book by student email" convenience endpoint.</w:t>
+        <w:t xml:space="preserve">Attach Authorization: Bearer &lt;accessToken&gt; to every request except the public auth endpoints listed at the top of this document.</w:t>
       </w:r>
     </w:p>
     <w:p>
@@ -24064,7 +25624,7 @@
         </w:numPr>
       </w:pPr>
       <w:r>
-        <w:t xml:space="preserve">"Student checks license progress": GET /progress/license/students/{studentId} using their own cached studentProfileId.</w:t>
+        <w:t xml:space="preserve">On a 401, call POST /auth/refresh-token once, retry the original request with the new access token; if that also fails, force the user back to the login screen.</w:t>
       </w:r>
     </w:p>
     <w:p>
@@ -24076,7 +25636,7 @@
         </w:numPr>
       </w:pPr>
       <w:r>
-        <w:t xml:space="preserve">"Instructor plans a route for today's lesson": needs an existing bookingId first (create/confirm the booking, then generate the route against it).</w:t>
+        <w:t xml:space="preserve">Call POST /auth/logout on explicit sign-out to revoke the refresh token server-side, then clear local storage.</w:t>
       </w:r>
     </w:p>
     <w:p>
@@ -24084,7 +25644,7 @@
         <w:pStyle w:val="Heading2"/>
       </w:pPr>
       <w:r>
-        <w:t xml:space="preserve">6. Quiz-taking UX</w:t>
+        <w:t xml:space="preserve">2. Fetch and cache profile IDs right after login</w:t>
       </w:r>
     </w:p>
     <w:p>
@@ -24096,7 +25656,15 @@
         </w:numPr>
       </w:pPr>
       <w:r>
-        <w:t xml:space="preserve">Fetching a quiz for a student to take: GET /quizzes/{id} with forStudent=true (or just omit the parameter, that's the default) — correct answers are stripped.</w:t>
+        <w:t xml:space="preserve">Call GET /auth/me immediately after login and cache studentProfileId / instructorProfileId / schoolId — these (not the raw user ID) are what most other endpoints expect.</w:t>
+      </w:r>
+    </w:p>
+    <w:p>
+      <w:pPr>
+        <w:pStyle w:val="Heading2"/>
+      </w:pPr>
+      <w:r>
+        <w:t xml:space="preserve">3. Role-aware UI</w:t>
       </w:r>
     </w:p>
     <w:p>
@@ -24108,7 +25676,7 @@
         </w:numPr>
       </w:pPr>
       <w:r>
-        <w:t xml:space="preserve">An instructor/admin authoring or reviewing a quiz should explicitly pass forStudent=false to see answers.</w:t>
+        <w:t xml:space="preserve">Three distinct app experiences: ADMIN (school/user/vehicle management, cross-cutting visibility), INSTRUCTOR (their own students/courses/bookings/lesson notes), STUDENT (their own courses/quizzes/bookings/progress).</w:t>
       </w:r>
     </w:p>
     <w:p>
@@ -24120,15 +25688,7 @@
         </w:numPr>
       </w:pPr>
       <w:r>
-        <w:t xml:space="preserve">Submitting is a separate call (POST .../submit); there's a maxAttempts limit enforced server-side — disable the submit button client-side once the student has exhausted their attempts (check attemptNumber from prior submissions) to avoid a confusing 400.</w:t>
-      </w:r>
-    </w:p>
-    <w:p>
-      <w:pPr>
-        <w:pStyle w:val="Heading2"/>
-      </w:pPr>
-      <w:r>
-        <w:t xml:space="preserve">7. Error handling</w:t>
+        <w:t xml:space="preserve">ADMIN is itself two different dashboards, not one — check GET /auth/me's bootstrapAdmin flag. The bootstrap admin manages ALL schools/admins (school create/delete, the deletion-request review queue); a regular admin only ever sees their own school and has no delete button at all, only a "request deletion" one. Don't build a single generic "admin" screen that tries to cover both.</w:t>
       </w:r>
     </w:p>
     <w:p>
@@ -24140,7 +25700,15 @@
         </w:numPr>
       </w:pPr>
       <w:r>
-        <w:t xml:space="preserve">Check the success boolean in every response body, not just the HTTP status.</w:t>
+        <w:t xml:space="preserve">Remember bookings are instructor-initiated — don't build a student-facing "book a lesson" button; build an instructor-facing "schedule a lesson for my student" flow instead.</w:t>
+      </w:r>
+    </w:p>
+    <w:p>
+      <w:pPr>
+        <w:pStyle w:val="Heading2"/>
+      </w:pPr>
+      <w:r>
+        <w:t xml:space="preserve">4. File uploads are multipart, and PDF-only</w:t>
       </w:r>
     </w:p>
     <w:p>
@@ -24152,15 +25720,7 @@
         </w:numPr>
       </w:pPr>
       <w:r>
-        <w:t xml:space="preserve">Surface the message field to the user on failure — these are written to be human-readable (e.g. "Instructor and student must belong to the same school"), not generic codes.</w:t>
-      </w:r>
-    </w:p>
-    <w:p>
-      <w:pPr>
-        <w:pStyle w:val="Heading2"/>
-      </w:pPr>
-      <w:r>
-        <w:t xml:space="preserve">8. CORS</w:t>
+        <w:t xml:space="preserve">Only the lesson-note attachment endpoints (upload and replace) take multipart/form-data. Every other endpoint in this API is JSON.</w:t>
       </w:r>
     </w:p>
     <w:p>
@@ -24172,7 +25732,7 @@
         </w:numPr>
       </w:pPr>
       <w:r>
-        <w:t xml:space="preserve">The backend only accepts requests from origins listed in its CORS_ALLOWED_ORIGINS config — currently set to localhost dev origins. Once the frontend has a real deployed URL, that's a BACKEND-side config change (an environment variable + a redeploy) that the backend team needs to make — it isn't something the frontend can work around on its own.</w:t>
+        <w:t xml:space="preserve">50 MB max, PDF only, enforced server-side — validate client-side too for a faster error message, but don't rely on client-side validation alone.</w:t>
       </w:r>
     </w:p>
     <w:p>
@@ -24180,7 +25740,7 @@
         <w:pStyle w:val="Heading2"/>
       </w:pPr>
       <w:r>
-        <w:t xml:space="preserve">9. Environment configuration</w:t>
+        <w:t xml:space="preserve">5. Multi-step flows the frontend orchestrates</w:t>
       </w:r>
     </w:p>
     <w:p>
@@ -24192,15 +25752,7 @@
         </w:numPr>
       </w:pPr>
       <w:r>
-        <w:t xml:space="preserve">The only thing the frontend needs to configure is the backend's base URL. All third-party credentials (Cloudinary, the mail relay, the routing service, error tracking) are server-side only — no API keys belong in frontend code or environment config for this integration.</w:t>
-      </w:r>
-    </w:p>
-    <w:p>
-      <w:pPr>
-        <w:pStyle w:val="Heading2"/>
-      </w:pPr>
-      <w:r>
-        <w:t xml:space="preserve">10. Gamification and driving-assessment UI (student-only)</w:t>
+        <w:t xml:space="preserve">"Instructor books a lesson": needs the student's StudentProfile.id (populate the picker from GET /students/school/{schoolId} using the instructor's own schoolId — no need to make the instructor type a raw student ID) and the instructor's own InstructorProfile.id (from /auth/me), plus optionally a vehicle ID from a vehicle-list call. There's no single "book by student email" convenience endpoint.</w:t>
       </w:r>
     </w:p>
     <w:p>
@@ -24212,7 +25764,7 @@
         </w:numPr>
       </w:pPr>
       <w:r>
-        <w:t xml:space="preserve">Gamification is STUDENT-facing only — don't build any gamification UI in the instructor or admin experience beyond the read-only "view a student's summary" screen (GET /gamification/students/{studentId}).</w:t>
+        <w:t xml:space="preserve">"Student checks license progress": GET /progress/license/students/{studentId} using their own cached studentProfileId.</w:t>
       </w:r>
     </w:p>
     <w:p>
@@ -24224,7 +25776,15 @@
         </w:numPr>
       </w:pPr>
       <w:r>
-        <w:t xml:space="preserve">Points/streak/badges update as a side effect of other actions (booking completed, quiz passed, assessment passed) — there's no "refresh my points" action to build, just re-fetch GET /gamification/me after those actions if you want the UI to reflect the change immediately.</w:t>
+        <w:t xml:space="preserve">"Instructor plans a route for today's lesson": needs an existing bookingId first (create/confirm the booking, then generate the route against it).</w:t>
+      </w:r>
+    </w:p>
+    <w:p>
+      <w:pPr>
+        <w:pStyle w:val="Heading2"/>
+      </w:pPr>
+      <w:r>
+        <w:t xml:space="preserve">6. Quiz-taking UX</w:t>
       </w:r>
     </w:p>
     <w:p>
@@ -24236,7 +25796,191 @@
         </w:numPr>
       </w:pPr>
       <w:r>
+        <w:t xml:space="preserve">Fetching a quiz for a student to take: GET /quizzes/{id} with forStudent=true (or just omit the parameter, that's the default) — correct answers are stripped.</w:t>
+      </w:r>
+    </w:p>
+    <w:p>
+      <w:pPr>
+        <w:pStyle w:val="ListParagraph"/>
+        <w:numPr>
+          <w:ilvl w:val="0"/>
+          <w:numId w:val="1"/>
+        </w:numPr>
+      </w:pPr>
+      <w:r>
+        <w:t xml:space="preserve">An instructor/admin authoring or reviewing a quiz should explicitly pass forStudent=false to see answers.</w:t>
+      </w:r>
+    </w:p>
+    <w:p>
+      <w:pPr>
+        <w:pStyle w:val="ListParagraph"/>
+        <w:numPr>
+          <w:ilvl w:val="0"/>
+          <w:numId w:val="1"/>
+        </w:numPr>
+      </w:pPr>
+      <w:r>
+        <w:t xml:space="preserve">Submitting is a separate call (POST .../submit); there's a maxAttempts limit enforced server-side — disable the submit button client-side once the student has exhausted their attempts (check attemptNumber from prior submissions) to avoid a confusing 400.</w:t>
+      </w:r>
+    </w:p>
+    <w:p>
+      <w:pPr>
+        <w:pStyle w:val="Heading2"/>
+      </w:pPr>
+      <w:r>
+        <w:t xml:space="preserve">7. Error handling</w:t>
+      </w:r>
+    </w:p>
+    <w:p>
+      <w:pPr>
+        <w:pStyle w:val="ListParagraph"/>
+        <w:numPr>
+          <w:ilvl w:val="0"/>
+          <w:numId w:val="1"/>
+        </w:numPr>
+      </w:pPr>
+      <w:r>
+        <w:t xml:space="preserve">Check the success boolean in every response body, not just the HTTP status.</w:t>
+      </w:r>
+    </w:p>
+    <w:p>
+      <w:pPr>
+        <w:pStyle w:val="ListParagraph"/>
+        <w:numPr>
+          <w:ilvl w:val="0"/>
+          <w:numId w:val="1"/>
+        </w:numPr>
+      </w:pPr>
+      <w:r>
+        <w:t xml:space="preserve">Surface the message field to the user on failure — these are written to be human-readable (e.g. "Instructor and student must belong to the same school"), not generic codes.</w:t>
+      </w:r>
+    </w:p>
+    <w:p>
+      <w:pPr>
+        <w:pStyle w:val="Heading2"/>
+      </w:pPr>
+      <w:r>
+        <w:t xml:space="preserve">8. CORS</w:t>
+      </w:r>
+    </w:p>
+    <w:p>
+      <w:pPr>
+        <w:pStyle w:val="ListParagraph"/>
+        <w:numPr>
+          <w:ilvl w:val="0"/>
+          <w:numId w:val="1"/>
+        </w:numPr>
+      </w:pPr>
+      <w:r>
+        <w:t xml:space="preserve">The backend only accepts requests from origins listed in its CORS_ALLOWED_ORIGINS config — currently set to localhost dev origins. Once the frontend has a real deployed URL, that's a BACKEND-side config change (an environment variable + a redeploy) that the backend team needs to make — it isn't something the frontend can work around on its own.</w:t>
+      </w:r>
+    </w:p>
+    <w:p>
+      <w:pPr>
+        <w:pStyle w:val="Heading2"/>
+      </w:pPr>
+      <w:r>
+        <w:t xml:space="preserve">9. Environment configuration</w:t>
+      </w:r>
+    </w:p>
+    <w:p>
+      <w:pPr>
+        <w:pStyle w:val="ListParagraph"/>
+        <w:numPr>
+          <w:ilvl w:val="0"/>
+          <w:numId w:val="1"/>
+        </w:numPr>
+      </w:pPr>
+      <w:r>
+        <w:t xml:space="preserve">The only thing the frontend needs to configure is the backend's base URL. All third-party credentials (Cloudinary, the mail relay, the routing service, error tracking) are server-side only — no API keys belong in frontend code or environment config for this integration.</w:t>
+      </w:r>
+    </w:p>
+    <w:p>
+      <w:pPr>
+        <w:pStyle w:val="Heading2"/>
+      </w:pPr>
+      <w:r>
+        <w:t xml:space="preserve">10. Gamification and driving-assessment UI (student-only)</w:t>
+      </w:r>
+    </w:p>
+    <w:p>
+      <w:pPr>
+        <w:pStyle w:val="ListParagraph"/>
+        <w:numPr>
+          <w:ilvl w:val="0"/>
+          <w:numId w:val="1"/>
+        </w:numPr>
+      </w:pPr>
+      <w:r>
+        <w:t xml:space="preserve">Gamification is STUDENT-facing only — don't build any gamification UI in the instructor or admin experience beyond the read-only "view a student's summary" screen (GET /gamification/students/{studentId}).</w:t>
+      </w:r>
+    </w:p>
+    <w:p>
+      <w:pPr>
+        <w:pStyle w:val="ListParagraph"/>
+        <w:numPr>
+          <w:ilvl w:val="0"/>
+          <w:numId w:val="1"/>
+        </w:numPr>
+      </w:pPr>
+      <w:r>
+        <w:t xml:space="preserve">Points/streak/badges update as a side effect of other actions (booking completed, quiz passed, assessment passed) — there's no "refresh my points" action to build, just re-fetch GET /gamification/me after those actions if you want the UI to reflect the change immediately.</w:t>
+      </w:r>
+    </w:p>
+    <w:p>
+      <w:pPr>
+        <w:pStyle w:val="ListParagraph"/>
+        <w:numPr>
+          <w:ilvl w:val="0"/>
+          <w:numId w:val="1"/>
+        </w:numPr>
+      </w:pPr>
+      <w:r>
         <w:t xml:space="preserve">Driving assessments are instructor-authored, like lesson notes, but are NOT editable beyond the feedback text (no score/result edit, no delete) — don't reuse the lesson-note edit/delete UI pattern for assessments.</w:t>
+      </w:r>
+    </w:p>
+    <w:p>
+      <w:pPr>
+        <w:pStyle w:val="Heading2"/>
+      </w:pPr>
+      <w:r>
+        <w:t xml:space="preserve">11. Messaging screens</w:t>
+      </w:r>
+    </w:p>
+    <w:p>
+      <w:pPr>
+        <w:pStyle w:val="ListParagraph"/>
+        <w:numPr>
+          <w:ilvl w:val="0"/>
+          <w:numId w:val="1"/>
+        </w:numPr>
+      </w:pPr>
+      <w:r>
+        <w:t xml:space="preserve">Student and instructor both need an inbox (GET /conversations), a thread view (GET /conversations/{id}/messages, newest first) and a "new conversation" picker fed by GET /conversations/contacts.</w:t>
+      </w:r>
+    </w:p>
+    <w:p>
+      <w:pPr>
+        <w:pStyle w:val="ListParagraph"/>
+        <w:numPr>
+          <w:ilvl w:val="0"/>
+          <w:numId w:val="1"/>
+        </w:numPr>
+      </w:pPr>
+      <w:r>
+        <w:t xml:space="preserve">Poll while the inbox/thread is open - there's no realtime push - and call POST /conversations/{id}/read when a thread is opened.</w:t>
+      </w:r>
+    </w:p>
+    <w:p>
+      <w:pPr>
+        <w:pStyle w:val="ListParagraph"/>
+        <w:numPr>
+          <w:ilvl w:val="0"/>
+          <w:numId w:val="1"/>
+        </w:numPr>
+      </w:pPr>
+      <w:r>
+        <w:t xml:space="preserve">Instructors also need an "announce to all my students" form (POST /announcements); everyone gets an announcements list (GET /announcements).</w:t>
       </w:r>
     </w:p>
     <w:sectPr>

</xml_diff>

<commit_message>
Document realtime WebSocket updates in the frontend API guide
New "Realtime updates (WebSocket)" section: the /ws URL and allowed
origins, authenticating in the STOMP CONNECT frame, the single
/user/queue/events subscription, heartbeats, reconnect-with-backoff after
deploys (then refetch, since missed events aren't replayed), reconnecting
after a token refresh, and a table of every event type and payload. The
messaging section and checklist now point at the WebSocket instead of
polling. Frontend_API_Guide.docx regenerated.
</commit_message>
<xml_diff>
--- a/project-with-changes/docs/Frontend_API_Guide.docx
+++ b/project-with-changes/docs/Frontend_API_Guide.docx
@@ -22033,7 +22033,7 @@
     </w:p>
     <w:p>
       <w:r>
-        <w:t xml:space="preserve">There is no push/realtime channel: poll GET /conversations (and GET /notifications/me) while the messaging screen is open, e.g. every 10-30 seconds, and refresh the open thread when its unreadCount or lastMessageAt changes. Each new message also creates an IN_APP notification for the recipient ("New message from &lt;name&gt;").</w:t>
+        <w:t xml:space="preserve">New messages, read receipts and announcements are pushed instantly over the realtime WebSocket (see "Realtime updates" below). Each new message also creates an IN_APP notification for the recipient ("New message from &lt;name&gt;").</w:t>
       </w:r>
     </w:p>
     <w:p>
@@ -23718,6 +23718,320 @@
         <w:pStyle w:val="Heading1"/>
       </w:pPr>
       <w:r>
+        <w:t xml:space="preserve">Realtime updates (WebSocket)</w:t>
+      </w:r>
+    </w:p>
+    <w:p>
+      <w:r>
+        <w:t xml:space="preserve">While the app is open, keep one WebSocket connection per logged-in user and the backend pushes events to it the moment they happen - no polling. It speaks STOMP over a plain WebSocket; use a STOMP client library such as @stomp/stompjs.</w:t>
+      </w:r>
+    </w:p>
+    <w:p>
+      <w:pPr>
+        <w:pStyle w:val="ListParagraph"/>
+        <w:numPr>
+          <w:ilvl w:val="0"/>
+          <w:numId w:val="1"/>
+        </w:numPr>
+      </w:pPr>
+      <w:r>
+        <w:t xml:space="preserve">URL: wss://&lt;your-backend-host&gt;/ws (ws://localhost:&lt;PORT&gt;/ws locally). The page's origin must be one of CORS_ALLOWED_ORIGINS.</w:t>
+      </w:r>
+    </w:p>
+    <w:p>
+      <w:pPr>
+        <w:pStyle w:val="ListParagraph"/>
+        <w:numPr>
+          <w:ilvl w:val="0"/>
+          <w:numId w:val="1"/>
+        </w:numPr>
+      </w:pPr>
+      <w:r>
+        <w:t xml:space="preserve">Authenticate in the STOMP CONNECT frame, not the URL: connectHeaders = { Authorization: "Bearer &lt;accessToken&gt;" }. A missing/expired/refresh token, or a disabled/deleted account, gets a STOMP ERROR frame and the connection closes.</w:t>
+      </w:r>
+    </w:p>
+    <w:p>
+      <w:pPr>
+        <w:pStyle w:val="ListParagraph"/>
+        <w:numPr>
+          <w:ilvl w:val="0"/>
+          <w:numId w:val="1"/>
+        </w:numPr>
+      </w:pPr>
+      <w:r>
+        <w:t xml:space="preserve">Subscribe to exactly one destination: /user/queue/events - it's private to the logged-in user. Subscribing to anything else is rejected; sending anything is rejected.</w:t>
+      </w:r>
+    </w:p>
+    <w:p>
+      <w:pPr>
+        <w:pStyle w:val="ListParagraph"/>
+        <w:numPr>
+          <w:ilvl w:val="0"/>
+          <w:numId w:val="1"/>
+        </w:numPr>
+      </w:pPr>
+      <w:r>
+        <w:t xml:space="preserve">Heartbeats: set 10000/10000 (the server's value) so dead connections are noticed.</w:t>
+      </w:r>
+    </w:p>
+    <w:p>
+      <w:pPr>
+        <w:pStyle w:val="ListParagraph"/>
+        <w:numPr>
+          <w:ilvl w:val="0"/>
+          <w:numId w:val="1"/>
+        </w:numPr>
+      </w:pPr>
+      <w:r>
+        <w:t xml:space="preserve">Reconnect automatically with backoff: the server drops every connection on each deploy or restart. After reconnecting, refetch GET /conversations and GET /notifications/me - events that happened while disconnected are not replayed.</w:t>
+      </w:r>
+    </w:p>
+    <w:p>
+      <w:pPr>
+        <w:pStyle w:val="ListParagraph"/>
+        <w:numPr>
+          <w:ilvl w:val="0"/>
+          <w:numId w:val="1"/>
+        </w:numPr>
+      </w:pPr>
+      <w:r>
+        <w:t xml:space="preserve">When the access token is refreshed, reconnect with the new one (the server checks it on CONNECT only).</w:t>
+      </w:r>
+    </w:p>
+    <w:p>
+      <w:r>
+        <w:rPr>
+          <w:b/>
+        </w:rPr>
+        <w:t xml:space="preserve">Every event arrives as { "type": ..., "payload": ... }:</w:t>
+      </w:r>
+    </w:p>
+    <w:tbl>
+      <w:tblPr>
+        <w:tblStyle w:val="TableGrid"/>
+        <w:tblW w:w="0" w:type="auto"/>
+        <w:tblBorders>
+          <w:top w:val="single" w:sz="4" w:color="BFBFBF"/>
+          <w:left w:val="single" w:sz="4" w:color="BFBFBF"/>
+          <w:bottom w:val="single" w:sz="4" w:color="BFBFBF"/>
+          <w:right w:val="single" w:sz="4" w:color="BFBFBF"/>
+          <w:insideH w:val="single" w:sz="4" w:color="BFBFBF"/>
+          <w:insideV w:val="single" w:sz="4" w:color="BFBFBF"/>
+        </w:tblBorders>
+      </w:tblPr>
+      <w:tblGrid>
+        <w:gridCol w:w="3000"/>
+        <w:gridCol w:w="3000"/>
+        <w:gridCol w:w="3000"/>
+      </w:tblGrid>
+      <w:tr>
+        <w:tc>
+          <w:tcPr>
+            <w:shd w:val="clear" w:fill="2F5496"/>
+            <w:vAlign w:val="center"/>
+          </w:tcPr>
+          <w:p>
+            <w:pPr>
+              <w:shd w:val="clear" w:fill="2F5496"/>
+            </w:pPr>
+            <w:r>
+              <w:rPr>
+                <w:b/>
+                <w:color w:val="FFFFFF"/>
+              </w:rPr>
+              <w:t xml:space="preserve">type</w:t>
+            </w:r>
+          </w:p>
+        </w:tc>
+        <w:tc>
+          <w:tcPr>
+            <w:shd w:val="clear" w:fill="2F5496"/>
+            <w:vAlign w:val="center"/>
+          </w:tcPr>
+          <w:p>
+            <w:pPr>
+              <w:shd w:val="clear" w:fill="2F5496"/>
+            </w:pPr>
+            <w:r>
+              <w:rPr>
+                <w:b/>
+                <w:color w:val="FFFFFF"/>
+              </w:rPr>
+              <w:t xml:space="preserve">payload</w:t>
+            </w:r>
+          </w:p>
+        </w:tc>
+        <w:tc>
+          <w:tcPr>
+            <w:shd w:val="clear" w:fill="2F5496"/>
+            <w:vAlign w:val="center"/>
+          </w:tcPr>
+          <w:p>
+            <w:pPr>
+              <w:shd w:val="clear" w:fill="2F5496"/>
+            </w:pPr>
+            <w:r>
+              <w:rPr>
+                <w:b/>
+                <w:color w:val="FFFFFF"/>
+              </w:rPr>
+              <w:t xml:space="preserve">When</w:t>
+            </w:r>
+          </w:p>
+        </w:tc>
+      </w:tr>
+      <w:tr>
+        <w:tc>
+          <w:tcPr>
+            <w:vAlign w:val="center"/>
+          </w:tcPr>
+          <w:p>
+            <w:pPr/>
+            <w:r>
+              <w:t xml:space="preserve">MESSAGE_CREATED</w:t>
+            </w:r>
+          </w:p>
+        </w:tc>
+        <w:tc>
+          <w:tcPr>
+            <w:vAlign w:val="center"/>
+          </w:tcPr>
+          <w:p>
+            <w:pPr/>
+            <w:r>
+              <w:t xml:space="preserve">a message (same shape as GET /conversations/{id}/messages items; mine is from the receiver's point of view)</w:t>
+            </w:r>
+          </w:p>
+        </w:tc>
+        <w:tc>
+          <w:tcPr>
+            <w:vAlign w:val="center"/>
+          </w:tcPr>
+          <w:p>
+            <w:pPr/>
+            <w:r>
+              <w:t xml:space="preserve">a message is sent in one of my conversations - including by me on another tab/device</w:t>
+            </w:r>
+          </w:p>
+        </w:tc>
+      </w:tr>
+      <w:tr>
+        <w:tc>
+          <w:tcPr>
+            <w:vAlign w:val="center"/>
+          </w:tcPr>
+          <w:p>
+            <w:pPr/>
+            <w:r>
+              <w:t xml:space="preserve">CONVERSATION_READ</w:t>
+            </w:r>
+          </w:p>
+        </w:tc>
+        <w:tc>
+          <w:tcPr>
+            <w:vAlign w:val="center"/>
+          </w:tcPr>
+          <w:p>
+            <w:pPr/>
+            <w:r>
+              <w:t xml:space="preserve">{ conversationId, readByUserId, readAt }</w:t>
+            </w:r>
+          </w:p>
+        </w:tc>
+        <w:tc>
+          <w:tcPr>
+            <w:vAlign w:val="center"/>
+          </w:tcPr>
+          <w:p>
+            <w:pPr/>
+            <w:r>
+              <w:t xml:space="preserve">the other participant read my messages</w:t>
+            </w:r>
+          </w:p>
+        </w:tc>
+      </w:tr>
+      <w:tr>
+        <w:tc>
+          <w:tcPr>
+            <w:vAlign w:val="center"/>
+          </w:tcPr>
+          <w:p>
+            <w:pPr/>
+            <w:r>
+              <w:t xml:space="preserve">NOTIFICATION_CREATED</w:t>
+            </w:r>
+          </w:p>
+        </w:tc>
+        <w:tc>
+          <w:tcPr>
+            <w:vAlign w:val="center"/>
+          </w:tcPr>
+          <w:p>
+            <w:pPr/>
+            <w:r>
+              <w:t xml:space="preserve">a notification (same shape as GET /notifications/me items)</w:t>
+            </w:r>
+          </w:p>
+        </w:tc>
+        <w:tc>
+          <w:tcPr>
+            <w:vAlign w:val="center"/>
+          </w:tcPr>
+          <w:p>
+            <w:pPr/>
+            <w:r>
+              <w:t xml:space="preserve">any new IN_APP notification for me</w:t>
+            </w:r>
+          </w:p>
+        </w:tc>
+      </w:tr>
+      <w:tr>
+        <w:tc>
+          <w:tcPr>
+            <w:vAlign w:val="center"/>
+          </w:tcPr>
+          <w:p>
+            <w:pPr/>
+            <w:r>
+              <w:t xml:space="preserve">ANNOUNCEMENT_CREATED</w:t>
+            </w:r>
+          </w:p>
+        </w:tc>
+        <w:tc>
+          <w:tcPr>
+            <w:vAlign w:val="center"/>
+          </w:tcPr>
+          <w:p>
+            <w:pPr/>
+            <w:r>
+              <w:t xml:space="preserve">an announcement (same shape as GET /announcements items)</w:t>
+            </w:r>
+          </w:p>
+        </w:tc>
+        <w:tc>
+          <w:tcPr>
+            <w:vAlign w:val="center"/>
+          </w:tcPr>
+          <w:p>
+            <w:pPr/>
+            <w:r>
+              <w:t xml:space="preserve">an instructor of my school posted an announcement</w:t>
+            </w:r>
+          </w:p>
+        </w:tc>
+      </w:tr>
+    </w:tbl>
+    <w:p/>
+    <w:p>
+      <w:r>
+        <w:t xml:space="preserve">The REST endpoints stay the source of truth - events are a signal to update the UI without waiting, not a replacement for fetching.</w:t>
+      </w:r>
+    </w:p>
+    <w:p>
+      <w:pPr>
+        <w:pStyle w:val="Heading1"/>
+      </w:pPr>
+      <w:r>
         <w:t xml:space="preserve">Notifications</w:t>
       </w:r>
     </w:p>
@@ -25968,7 +26282,7 @@
         </w:numPr>
       </w:pPr>
       <w:r>
-        <w:t xml:space="preserve">Poll while the inbox/thread is open - there's no realtime push - and call POST /conversations/{id}/read when a thread is opened.</w:t>
+        <w:t xml:space="preserve">Update the inbox/thread from the realtime WebSocket events (see "Realtime updates"), and call POST /conversations/{id}/read when a thread is opened.</w:t>
       </w:r>
     </w:p>
     <w:p>

</xml_diff>

<commit_message>
Require a one-time code to verify new accounts at first login
Login for an unverified account now returns a verification challenge
instead of tokens. A 6-digit code is sent by email (through Resend) or
WhatsApp (through Twilio Verify) and exchanged for tokens once confirmed.
Existing accounts are marked verified so nobody is locked out.
</commit_message>
<xml_diff>
--- a/project-with-changes/docs/Frontend_API_Guide.docx
+++ b/project-with-changes/docs/Frontend_API_Guide.docx
@@ -1376,585 +1376,6 @@
         <w:t xml:space="preserve">Immediately after login, call GET /auth/me (below) — the login response does not include the instructor/student profile ID you'll need for most other calls.</w:t>
       </w:r>
     </w:p>
-    <w:p/>
-    <w:p>
-      <w:r>
-        <w:rPr>
-          <w:b/>
-          <w:rFonts w:ascii="Consolas" w:hAnsi="Consolas" w:cs="Consolas"/>
-          <w:sz w:val="18"/>
-          <w:szCs w:val="18"/>
-        </w:rPr>
-        <w:t xml:space="preserve">GET  </w:t>
-      </w:r>
-      <w:r>
-        <w:rPr>
-          <w:rFonts w:ascii="Consolas" w:hAnsi="Consolas" w:cs="Consolas"/>
-          <w:sz w:val="18"/>
-          <w:szCs w:val="18"/>
-        </w:rPr>
-        <w:t xml:space="preserve">/auth/me</w:t>
-      </w:r>
-    </w:p>
-    <w:p>
-      <w:r>
-        <w:rPr>
-          <w:i/>
-        </w:rPr>
-        <w:t xml:space="preserve">Get the current user's identity and profile IDs.</w:t>
-      </w:r>
-    </w:p>
-    <w:p>
-      <w:r>
-        <w:rPr>
-          <w:b/>
-        </w:rPr>
-        <w:t xml:space="preserve">Access: </w:t>
-      </w:r>
-      <w:r>
-        <w:t xml:space="preserve">Any authenticated user</w:t>
-      </w:r>
-    </w:p>
-    <w:p>
-      <w:r>
-        <w:rPr>
-          <w:b/>
-        </w:rPr>
-        <w:t xml:space="preserve">Response (key fields):</w:t>
-      </w:r>
-    </w:p>
-    <w:tbl>
-      <w:tblPr>
-        <w:tblStyle w:val="TableGrid"/>
-        <w:tblW w:w="0" w:type="auto"/>
-        <w:tblBorders>
-          <w:top w:val="single" w:sz="4" w:color="BFBFBF"/>
-          <w:left w:val="single" w:sz="4" w:color="BFBFBF"/>
-          <w:bottom w:val="single" w:sz="4" w:color="BFBFBF"/>
-          <w:right w:val="single" w:sz="4" w:color="BFBFBF"/>
-          <w:insideH w:val="single" w:sz="4" w:color="BFBFBF"/>
-          <w:insideV w:val="single" w:sz="4" w:color="BFBFBF"/>
-        </w:tblBorders>
-      </w:tblPr>
-      <w:tblGrid>
-        <w:gridCol w:w="3000"/>
-        <w:gridCol w:w="3000"/>
-        <w:gridCol w:w="3000"/>
-      </w:tblGrid>
-      <w:tr>
-        <w:tc>
-          <w:tcPr>
-            <w:shd w:val="clear" w:fill="2F5496"/>
-            <w:vAlign w:val="center"/>
-          </w:tcPr>
-          <w:p>
-            <w:pPr>
-              <w:shd w:val="clear" w:fill="2F5496"/>
-            </w:pPr>
-            <w:r>
-              <w:rPr>
-                <w:b/>
-                <w:color w:val="FFFFFF"/>
-              </w:rPr>
-              <w:t xml:space="preserve">Field</w:t>
-            </w:r>
-          </w:p>
-        </w:tc>
-        <w:tc>
-          <w:tcPr>
-            <w:shd w:val="clear" w:fill="2F5496"/>
-            <w:vAlign w:val="center"/>
-          </w:tcPr>
-          <w:p>
-            <w:pPr>
-              <w:shd w:val="clear" w:fill="2F5496"/>
-            </w:pPr>
-            <w:r>
-              <w:rPr>
-                <w:b/>
-                <w:color w:val="FFFFFF"/>
-              </w:rPr>
-              <w:t xml:space="preserve">Type</w:t>
-            </w:r>
-          </w:p>
-        </w:tc>
-        <w:tc>
-          <w:tcPr>
-            <w:shd w:val="clear" w:fill="2F5496"/>
-            <w:vAlign w:val="center"/>
-          </w:tcPr>
-          <w:p>
-            <w:pPr>
-              <w:shd w:val="clear" w:fill="2F5496"/>
-            </w:pPr>
-            <w:r>
-              <w:rPr>
-                <w:b/>
-                <w:color w:val="FFFFFF"/>
-              </w:rPr>
-              <w:t xml:space="preserve">Notes</w:t>
-            </w:r>
-          </w:p>
-        </w:tc>
-      </w:tr>
-      <w:tr>
-        <w:tc>
-          <w:tcPr>
-            <w:vAlign w:val="center"/>
-          </w:tcPr>
-          <w:p>
-            <w:pPr/>
-            <w:r>
-              <w:t xml:space="preserve">userId</w:t>
-            </w:r>
-          </w:p>
-        </w:tc>
-        <w:tc>
-          <w:tcPr>
-            <w:vAlign w:val="center"/>
-          </w:tcPr>
-          <w:p>
-            <w:pPr/>
-            <w:r>
-              <w:t xml:space="preserve">number</w:t>
-            </w:r>
-          </w:p>
-        </w:tc>
-        <w:tc>
-          <w:tcPr>
-            <w:vAlign w:val="center"/>
-          </w:tcPr>
-          <w:p>
-            <w:pPr/>
-            <w:r>
-              <w:t xml:space="preserve">the raw User.id — rarely needed directly</w:t>
-            </w:r>
-          </w:p>
-        </w:tc>
-      </w:tr>
-      <w:tr>
-        <w:tc>
-          <w:tcPr>
-            <w:vAlign w:val="center"/>
-          </w:tcPr>
-          <w:p>
-            <w:pPr/>
-            <w:r>
-              <w:t xml:space="preserve">email / roles</w:t>
-            </w:r>
-          </w:p>
-        </w:tc>
-        <w:tc>
-          <w:tcPr>
-            <w:vAlign w:val="center"/>
-          </w:tcPr>
-          <w:p>
-            <w:pPr/>
-            <w:r>
-              <w:t xml:space="preserve"/>
-            </w:r>
-          </w:p>
-        </w:tc>
-        <w:tc>
-          <w:tcPr>
-            <w:vAlign w:val="center"/>
-          </w:tcPr>
-          <w:p>
-            <w:pPr/>
-            <w:r>
-              <w:t xml:space="preserve"/>
-            </w:r>
-          </w:p>
-        </w:tc>
-      </w:tr>
-      <w:tr>
-        <w:tc>
-          <w:tcPr>
-            <w:vAlign w:val="center"/>
-          </w:tcPr>
-          <w:p>
-            <w:pPr/>
-            <w:r>
-              <w:t xml:space="preserve">studentProfileId</w:t>
-            </w:r>
-          </w:p>
-        </w:tc>
-        <w:tc>
-          <w:tcPr>
-            <w:vAlign w:val="center"/>
-          </w:tcPr>
-          <w:p>
-            <w:pPr/>
-            <w:r>
-              <w:t xml:space="preserve">number or null</w:t>
-            </w:r>
-          </w:p>
-        </w:tc>
-        <w:tc>
-          <w:tcPr>
-            <w:vAlign w:val="center"/>
-          </w:tcPr>
-          <w:p>
-            <w:pPr/>
-            <w:r>
-              <w:t xml:space="preserve">set only if the user has a STUDENT role</w:t>
-            </w:r>
-          </w:p>
-        </w:tc>
-      </w:tr>
-      <w:tr>
-        <w:tc>
-          <w:tcPr>
-            <w:vAlign w:val="center"/>
-          </w:tcPr>
-          <w:p>
-            <w:pPr/>
-            <w:r>
-              <w:t xml:space="preserve">instructorProfileId</w:t>
-            </w:r>
-          </w:p>
-        </w:tc>
-        <w:tc>
-          <w:tcPr>
-            <w:vAlign w:val="center"/>
-          </w:tcPr>
-          <w:p>
-            <w:pPr/>
-            <w:r>
-              <w:t xml:space="preserve">number or null</w:t>
-            </w:r>
-          </w:p>
-        </w:tc>
-        <w:tc>
-          <w:tcPr>
-            <w:vAlign w:val="center"/>
-          </w:tcPr>
-          <w:p>
-            <w:pPr/>
-            <w:r>
-              <w:t xml:space="preserve">set only if the user has an INSTRUCTOR role</w:t>
-            </w:r>
-          </w:p>
-        </w:tc>
-      </w:tr>
-      <w:tr>
-        <w:tc>
-          <w:tcPr>
-            <w:vAlign w:val="center"/>
-          </w:tcPr>
-          <w:p>
-            <w:pPr/>
-            <w:r>
-              <w:t xml:space="preserve">schoolId</w:t>
-            </w:r>
-          </w:p>
-        </w:tc>
-        <w:tc>
-          <w:tcPr>
-            <w:vAlign w:val="center"/>
-          </w:tcPr>
-          <w:p>
-            <w:pPr/>
-            <w:r>
-              <w:t xml:space="preserve">number or null</w:t>
-            </w:r>
-          </w:p>
-        </w:tc>
-        <w:tc>
-          <w:tcPr>
-            <w:vAlign w:val="center"/>
-          </w:tcPr>
-          <w:p>
-            <w:pPr/>
-            <w:r>
-              <w:t xml:space="preserve">the user's school — for an ADMIN this is the school they OWN (null for the bootstrap admin, who owns none)</w:t>
-            </w:r>
-          </w:p>
-        </w:tc>
-      </w:tr>
-      <w:tr>
-        <w:tc>
-          <w:tcPr>
-            <w:vAlign w:val="center"/>
-          </w:tcPr>
-          <w:p>
-            <w:pPr/>
-            <w:r>
-              <w:t xml:space="preserve">bootstrapAdmin</w:t>
-            </w:r>
-          </w:p>
-        </w:tc>
-        <w:tc>
-          <w:tcPr>
-            <w:vAlign w:val="center"/>
-          </w:tcPr>
-          <w:p>
-            <w:pPr/>
-            <w:r>
-              <w:t xml:space="preserve">boolean</w:t>
-            </w:r>
-          </w:p>
-        </w:tc>
-        <w:tc>
-          <w:tcPr>
-            <w:vAlign w:val="center"/>
-          </w:tcPr>
-          <w:p>
-            <w:pPr/>
-            <w:r>
-              <w:t xml:space="preserve">true only for the one permanent super-admin — decides which admin dashboard to render, see the Roles section above</w:t>
-            </w:r>
-          </w:p>
-        </w:tc>
-      </w:tr>
-      <w:tr>
-        <w:tc>
-          <w:tcPr>
-            <w:vAlign w:val="center"/>
-          </w:tcPr>
-          <w:p>
-            <w:pPr/>
-            <w:r>
-              <w:t xml:space="preserve">enabled / emailVerified</w:t>
-            </w:r>
-          </w:p>
-        </w:tc>
-        <w:tc>
-          <w:tcPr>
-            <w:vAlign w:val="center"/>
-          </w:tcPr>
-          <w:p>
-            <w:pPr/>
-            <w:r>
-              <w:t xml:space="preserve">boolean</w:t>
-            </w:r>
-          </w:p>
-        </w:tc>
-        <w:tc>
-          <w:tcPr>
-            <w:vAlign w:val="center"/>
-          </w:tcPr>
-          <w:p>
-            <w:pPr/>
-            <w:r>
-              <w:t xml:space="preserve"/>
-            </w:r>
-          </w:p>
-        </w:tc>
-      </w:tr>
-    </w:tbl>
-    <w:p/>
-    <w:p>
-      <w:r>
-        <w:rPr>
-          <w:b/>
-        </w:rPr>
-        <w:t xml:space="preserve">Example response:</w:t>
-      </w:r>
-    </w:p>
-    <w:p>
-      <w:pPr>
-        <w:pStyle w:val="Code"/>
-        <w:shd w:val="clear" w:fill="F3F3F3"/>
-      </w:pPr>
-      <w:r>
-        <w:rPr>
-          <w:rFonts w:ascii="Consolas" w:hAnsi="Consolas"/>
-          <w:sz w:val="18"/>
-        </w:rPr>
-        <w:t xml:space="preserve">{</w:t>
-      </w:r>
-    </w:p>
-    <w:p>
-      <w:pPr>
-        <w:pStyle w:val="Code"/>
-        <w:shd w:val="clear" w:fill="F3F3F3"/>
-      </w:pPr>
-      <w:r>
-        <w:rPr>
-          <w:rFonts w:ascii="Consolas" w:hAnsi="Consolas"/>
-          <w:sz w:val="18"/>
-        </w:rPr>
-        <w:t xml:space="preserve">  "success": true,</w:t>
-      </w:r>
-    </w:p>
-    <w:p>
-      <w:pPr>
-        <w:pStyle w:val="Code"/>
-        <w:shd w:val="clear" w:fill="F3F3F3"/>
-      </w:pPr>
-      <w:r>
-        <w:rPr>
-          <w:rFonts w:ascii="Consolas" w:hAnsi="Consolas"/>
-          <w:sz w:val="18"/>
-        </w:rPr>
-        <w:t xml:space="preserve">  "message": "Operation successful",</w:t>
-      </w:r>
-    </w:p>
-    <w:p>
-      <w:pPr>
-        <w:pStyle w:val="Code"/>
-        <w:shd w:val="clear" w:fill="F3F3F3"/>
-      </w:pPr>
-      <w:r>
-        <w:rPr>
-          <w:rFonts w:ascii="Consolas" w:hAnsi="Consolas"/>
-          <w:sz w:val="18"/>
-        </w:rPr>
-        <w:t xml:space="preserve">  "data": {</w:t>
-      </w:r>
-    </w:p>
-    <w:p>
-      <w:pPr>
-        <w:pStyle w:val="Code"/>
-        <w:shd w:val="clear" w:fill="F3F3F3"/>
-      </w:pPr>
-      <w:r>
-        <w:rPr>
-          <w:rFonts w:ascii="Consolas" w:hAnsi="Consolas"/>
-          <w:sz w:val="18"/>
-        </w:rPr>
-        <w:t xml:space="preserve">    "userId": 12,</w:t>
-      </w:r>
-    </w:p>
-    <w:p>
-      <w:pPr>
-        <w:pStyle w:val="Code"/>
-        <w:shd w:val="clear" w:fill="F3F3F3"/>
-      </w:pPr>
-      <w:r>
-        <w:rPr>
-          <w:rFonts w:ascii="Consolas" w:hAnsi="Consolas"/>
-          <w:sz w:val="18"/>
-        </w:rPr>
-        <w:t xml:space="preserve">    "email": "instructor.smith@example.com",</w:t>
-      </w:r>
-    </w:p>
-    <w:p>
-      <w:pPr>
-        <w:pStyle w:val="Code"/>
-        <w:shd w:val="clear" w:fill="F3F3F3"/>
-      </w:pPr>
-      <w:r>
-        <w:rPr>
-          <w:rFonts w:ascii="Consolas" w:hAnsi="Consolas"/>
-          <w:sz w:val="18"/>
-        </w:rPr>
-        <w:t xml:space="preserve">    "roles": ["INSTRUCTOR"],</w:t>
-      </w:r>
-    </w:p>
-    <w:p>
-      <w:pPr>
-        <w:pStyle w:val="Code"/>
-        <w:shd w:val="clear" w:fill="F3F3F3"/>
-      </w:pPr>
-      <w:r>
-        <w:rPr>
-          <w:rFonts w:ascii="Consolas" w:hAnsi="Consolas"/>
-          <w:sz w:val="18"/>
-        </w:rPr>
-        <w:t xml:space="preserve">    "studentProfileId": null,</w:t>
-      </w:r>
-    </w:p>
-    <w:p>
-      <w:pPr>
-        <w:pStyle w:val="Code"/>
-        <w:shd w:val="clear" w:fill="F3F3F3"/>
-      </w:pPr>
-      <w:r>
-        <w:rPr>
-          <w:rFonts w:ascii="Consolas" w:hAnsi="Consolas"/>
-          <w:sz w:val="18"/>
-        </w:rPr>
-        <w:t xml:space="preserve">    "instructorProfileId": 4,</w:t>
-      </w:r>
-    </w:p>
-    <w:p>
-      <w:pPr>
-        <w:pStyle w:val="Code"/>
-        <w:shd w:val="clear" w:fill="F3F3F3"/>
-      </w:pPr>
-      <w:r>
-        <w:rPr>
-          <w:rFonts w:ascii="Consolas" w:hAnsi="Consolas"/>
-          <w:sz w:val="18"/>
-        </w:rPr>
-        <w:t xml:space="preserve">    "schoolId": 2,</w:t>
-      </w:r>
-    </w:p>
-    <w:p>
-      <w:pPr>
-        <w:pStyle w:val="Code"/>
-        <w:shd w:val="clear" w:fill="F3F3F3"/>
-      </w:pPr>
-      <w:r>
-        <w:rPr>
-          <w:rFonts w:ascii="Consolas" w:hAnsi="Consolas"/>
-          <w:sz w:val="18"/>
-        </w:rPr>
-        <w:t xml:space="preserve">    "bootstrapAdmin": false,</w:t>
-      </w:r>
-    </w:p>
-    <w:p>
-      <w:pPr>
-        <w:pStyle w:val="Code"/>
-        <w:shd w:val="clear" w:fill="F3F3F3"/>
-      </w:pPr>
-      <w:r>
-        <w:rPr>
-          <w:rFonts w:ascii="Consolas" w:hAnsi="Consolas"/>
-          <w:sz w:val="18"/>
-        </w:rPr>
-        <w:t xml:space="preserve">    "enabled": true,</w:t>
-      </w:r>
-    </w:p>
-    <w:p>
-      <w:pPr>
-        <w:pStyle w:val="Code"/>
-        <w:shd w:val="clear" w:fill="F3F3F3"/>
-      </w:pPr>
-      <w:r>
-        <w:rPr>
-          <w:rFonts w:ascii="Consolas" w:hAnsi="Consolas"/>
-          <w:sz w:val="18"/>
-        </w:rPr>
-        <w:t xml:space="preserve">    "emailVerified": false</w:t>
-      </w:r>
-    </w:p>
-    <w:p>
-      <w:pPr>
-        <w:pStyle w:val="Code"/>
-        <w:shd w:val="clear" w:fill="F3F3F3"/>
-      </w:pPr>
-      <w:r>
-        <w:rPr>
-          <w:rFonts w:ascii="Consolas" w:hAnsi="Consolas"/>
-          <w:sz w:val="18"/>
-        </w:rPr>
-        <w:t xml:space="preserve">  }</w:t>
-      </w:r>
-    </w:p>
-    <w:p>
-      <w:pPr>
-        <w:pStyle w:val="Code"/>
-        <w:shd w:val="clear" w:fill="F3F3F3"/>
-      </w:pPr>
-      <w:r>
-        <w:rPr>
-          <w:rFonts w:ascii="Consolas" w:hAnsi="Consolas"/>
-          <w:sz w:val="18"/>
-        </w:rPr>
-        <w:t xml:space="preserve">}</w:t>
-      </w:r>
-    </w:p>
-    <w:p>
-      <w:r>
-        <w:rPr>
-          <w:b/>
-        </w:rPr>
-        <w:t xml:space="preserve">Notes:</w:t>
-      </w:r>
-    </w:p>
     <w:p>
       <w:pPr>
         <w:pStyle w:val="ListParagraph"/>
@@ -1964,7 +1385,29 @@
         </w:numPr>
       </w:pPr>
       <w:r>
-        <w:t xml:space="preserve">This is critical: booking, lesson-note, lesson-route, and license-workflow endpoints all take a StudentProfile.id or InstructorProfile.id in their path or body — NOT the raw user ID. Cache instructorProfileId / studentProfileId from this call right after login.</w:t>
+        <w:t xml:space="preserve">A NEW account's first login returns NO tokens: instead "verificationRequired": true and a "verification" object. Always check for this before looking for accessToken - see "Account verification" right below.</w:t>
+      </w:r>
+    </w:p>
+    <w:p/>
+    <w:p>
+      <w:pPr>
+        <w:pStyle w:val="Heading2"/>
+      </w:pPr>
+      <w:r>
+        <w:t xml:space="preserve">Account verification (one-time code at first login)</w:t>
+      </w:r>
+    </w:p>
+    <w:p>
+      <w:r>
+        <w:t xml:space="preserve">Every account created from now on must be verified before it can log in: at its first login, the user proves they own the email address (or the WhatsApp number on their profile) by entering a 6-digit code. Accounts that existed before this feature, and the bootstrap admin, are already verified and never see this. Once verified, an account logs in normally forever after.</w:t>
+      </w:r>
+    </w:p>
+    <w:p>
+      <w:r>
+        <w:rPr>
+          <w:b/>
+        </w:rPr>
+        <w:t xml:space="preserve">The flow to build:</w:t>
       </w:r>
     </w:p>
     <w:p>
@@ -1976,10 +1419,113 @@
         </w:numPr>
       </w:pPr>
       <w:r>
-        <w:t xml:space="preserve">For an ADMIN caller, schoolId is their OWNED school (from POST /schools), not a profile-based school like students/instructors have — use it the same way either way (e.g. as the schoolId for GET /students/school/{schoolId}).</w:t>
-      </w:r>
-    </w:p>
-    <w:p/>
+        <w:t xml:space="preserve">1. POST /auth/login with the right password answers 200 with verificationRequired=true, NO accessToken/refreshToken, and verification = { challengeId, expiresInSeconds, channels, maskedEmail, maskedPhone }. (A wrong password is still a plain 401 - no challenge.)</w:t>
+      </w:r>
+    </w:p>
+    <w:p>
+      <w:pPr>
+        <w:pStyle w:val="ListParagraph"/>
+        <w:numPr>
+          <w:ilvl w:val="0"/>
+          <w:numId w:val="1"/>
+        </w:numPr>
+      </w:pPr>
+      <w:r>
+        <w:t xml:space="preserve">2. Show a "Verify your account" screen. If channels contains both EMAIL and WHATSAPP, let the user choose, showing maskedEmail (e.g. s***@example.com) / maskedPhone (e.g. +********4567) so they know where the code goes. WHATSAPP is only listed when the user's profile has a phone number in international format (+233...) and the backend has WhatsApp set up - so collect phone numbers with the country code.</w:t>
+      </w:r>
+    </w:p>
+    <w:p>
+      <w:pPr>
+        <w:pStyle w:val="ListParagraph"/>
+        <w:numPr>
+          <w:ilvl w:val="0"/>
+          <w:numId w:val="1"/>
+        </w:numPr>
+      </w:pPr>
+      <w:r>
+        <w:t xml:space="preserve">3. POST /auth/verification/send { challengeId, channel } sends the code.</w:t>
+      </w:r>
+    </w:p>
+    <w:p>
+      <w:pPr>
+        <w:pStyle w:val="ListParagraph"/>
+        <w:numPr>
+          <w:ilvl w:val="0"/>
+          <w:numId w:val="1"/>
+        </w:numPr>
+      </w:pPr>
+      <w:r>
+        <w:t xml:space="preserve">4. Show a 6-digit code input. POST /auth/verification/confirm { challengeId, code } returns exactly what a normal login returns (accessToken, refreshToken, ...). Carry on as after any login (GET /auth/me, etc.).</w:t>
+      </w:r>
+    </w:p>
+    <w:p>
+      <w:pPr>
+        <w:pStyle w:val="ListParagraph"/>
+        <w:numPr>
+          <w:ilvl w:val="0"/>
+          <w:numId w:val="1"/>
+        </w:numPr>
+      </w:pPr>
+      <w:r>
+        <w:t xml:space="preserve">Keep challengeId in memory only (not localStorage). It expires after 15 minutes (expiresInSeconds) - after that, or on any "please log in again" message, send the user back to the login form.</w:t>
+      </w:r>
+    </w:p>
+    <w:p>
+      <w:r>
+        <w:rPr>
+          <w:b/>
+        </w:rPr>
+        <w:t xml:space="preserve">Rules the UI should reflect:</w:t>
+      </w:r>
+    </w:p>
+    <w:p>
+      <w:pPr>
+        <w:pStyle w:val="ListParagraph"/>
+        <w:numPr>
+          <w:ilvl w:val="0"/>
+          <w:numId w:val="1"/>
+        </w:numPr>
+      </w:pPr>
+      <w:r>
+        <w:t xml:space="preserve">A code is valid for 10 minutes and allows 5 attempts. A wrong code answers 400 with a message like "Incorrect code - 4 attempts left"; after the 5th wrong try the code is dead ("request a new one") - offer a Resend button.</w:t>
+      </w:r>
+    </w:p>
+    <w:p>
+      <w:pPr>
+        <w:pStyle w:val="ListParagraph"/>
+        <w:numPr>
+          <w:ilvl w:val="0"/>
+          <w:numId w:val="1"/>
+        </w:numPr>
+      </w:pPr>
+      <w:r>
+        <w:t xml:space="preserve">Resend = call /auth/verification/send again (either channel). The new code replaces the old one. At most one send per 60 seconds: an earlier resend answers 429 with a Retry-After header (seconds) - disable the Resend button with a countdown.</w:t>
+      </w:r>
+    </w:p>
+    <w:p>
+      <w:pPr>
+        <w:pStyle w:val="ListParagraph"/>
+        <w:numPr>
+          <w:ilvl w:val="0"/>
+          <w:numId w:val="1"/>
+        </w:numPr>
+      </w:pPr>
+      <w:r>
+        <w:t xml:space="preserve">503 from send means the email/WhatsApp provider failed or isn't configured - show the message and let the user retry or pick the other channel.</w:t>
+      </w:r>
+    </w:p>
+    <w:p>
+      <w:pPr>
+        <w:pStyle w:val="ListParagraph"/>
+        <w:numPr>
+          <w:ilvl w:val="0"/>
+          <w:numId w:val="1"/>
+        </w:numPr>
+      </w:pPr>
+      <w:r>
+        <w:t xml:space="preserve">These endpoints share the auth rate limit (10 requests per minute per IP with login, register, refresh, forgot/reset password) - another reason to disable buttons while a request is in flight.</w:t>
+      </w:r>
+    </w:p>
     <w:p>
       <w:r>
         <w:rPr>
@@ -1996,7 +1542,7 @@
           <w:sz w:val="18"/>
           <w:szCs w:val="18"/>
         </w:rPr>
-        <w:t xml:space="preserve">/auth/register</w:t>
+        <w:t xml:space="preserve">/auth/verification/send</w:t>
       </w:r>
     </w:p>
     <w:p>
@@ -2004,7 +1550,7 @@
         <w:rPr>
           <w:i/>
         </w:rPr>
-        <w:t xml:space="preserve">Create a STUDENT or INSTRUCTOR account.</w:t>
+        <w:t xml:space="preserve">Send a one-time code for an unverified account.</w:t>
       </w:r>
     </w:p>
     <w:p>
@@ -2015,7 +1561,7 @@
         <w:t xml:space="preserve">Access: </w:t>
       </w:r>
       <w:r>
-        <w:t xml:space="preserve">ADMIN or INSTRUCTOR bearer token</w:t>
+        <w:t xml:space="preserve">Public (the challengeId from login is the credential)</w:t>
       </w:r>
     </w:p>
     <w:p>
@@ -2127,7 +1673,7 @@
           <w:p>
             <w:pPr/>
             <w:r>
-              <w:t xml:space="preserve">email</w:t>
+              <w:t xml:space="preserve">challengeId</w:t>
             </w:r>
           </w:p>
         </w:tc>
@@ -2160,31 +1706,31 @@
           <w:p>
             <w:pPr/>
             <w:r>
-              <w:t xml:space="preserve"/>
-            </w:r>
-          </w:p>
-        </w:tc>
-      </w:tr>
-      <w:tr>
-        <w:tc>
-          <w:tcPr>
-            <w:vAlign w:val="center"/>
-          </w:tcPr>
-          <w:p>
-            <w:pPr/>
-            <w:r>
-              <w:t xml:space="preserve">password</w:t>
-            </w:r>
-          </w:p>
-        </w:tc>
-        <w:tc>
-          <w:tcPr>
-            <w:vAlign w:val="center"/>
-          </w:tcPr>
-          <w:p>
-            <w:pPr/>
-            <w:r>
-              <w:t xml:space="preserve">string</w:t>
+              <w:t xml:space="preserve">from the login response's verification object</w:t>
+            </w:r>
+          </w:p>
+        </w:tc>
+      </w:tr>
+      <w:tr>
+        <w:tc>
+          <w:tcPr>
+            <w:vAlign w:val="center"/>
+          </w:tcPr>
+          <w:p>
+            <w:pPr/>
+            <w:r>
+              <w:t xml:space="preserve">channel</w:t>
+            </w:r>
+          </w:p>
+        </w:tc>
+        <w:tc>
+          <w:tcPr>
+            <w:vAlign w:val="center"/>
+          </w:tcPr>
+          <w:p>
+            <w:pPr/>
+            <w:r>
+              <w:t xml:space="preserve">enum</w:t>
             </w:r>
           </w:p>
         </w:tc>
@@ -2206,375 +1752,7 @@
           <w:p>
             <w:pPr/>
             <w:r>
-              <w:t xml:space="preserve">8-100 chars</w:t>
-            </w:r>
-          </w:p>
-        </w:tc>
-      </w:tr>
-      <w:tr>
-        <w:tc>
-          <w:tcPr>
-            <w:vAlign w:val="center"/>
-          </w:tcPr>
-          <w:p>
-            <w:pPr/>
-            <w:r>
-              <w:t xml:space="preserve">firstName / lastName</w:t>
-            </w:r>
-          </w:p>
-        </w:tc>
-        <w:tc>
-          <w:tcPr>
-            <w:vAlign w:val="center"/>
-          </w:tcPr>
-          <w:p>
-            <w:pPr/>
-            <w:r>
-              <w:t xml:space="preserve">string</w:t>
-            </w:r>
-          </w:p>
-        </w:tc>
-        <w:tc>
-          <w:tcPr>
-            <w:vAlign w:val="center"/>
-          </w:tcPr>
-          <w:p>
-            <w:pPr/>
-            <w:r>
-              <w:t xml:space="preserve">yes</w:t>
-            </w:r>
-          </w:p>
-        </w:tc>
-        <w:tc>
-          <w:tcPr>
-            <w:vAlign w:val="center"/>
-          </w:tcPr>
-          <w:p>
-            <w:pPr/>
-            <w:r>
-              <w:t xml:space="preserve"/>
-            </w:r>
-          </w:p>
-        </w:tc>
-      </w:tr>
-      <w:tr>
-        <w:tc>
-          <w:tcPr>
-            <w:vAlign w:val="center"/>
-          </w:tcPr>
-          <w:p>
-            <w:pPr/>
-            <w:r>
-              <w:t xml:space="preserve">phone</w:t>
-            </w:r>
-          </w:p>
-        </w:tc>
-        <w:tc>
-          <w:tcPr>
-            <w:vAlign w:val="center"/>
-          </w:tcPr>
-          <w:p>
-            <w:pPr/>
-            <w:r>
-              <w:t xml:space="preserve">string</w:t>
-            </w:r>
-          </w:p>
-        </w:tc>
-        <w:tc>
-          <w:tcPr>
-            <w:vAlign w:val="center"/>
-          </w:tcPr>
-          <w:p>
-            <w:pPr/>
-            <w:r>
-              <w:t xml:space="preserve">no</w:t>
-            </w:r>
-          </w:p>
-        </w:tc>
-        <w:tc>
-          <w:tcPr>
-            <w:vAlign w:val="center"/>
-          </w:tcPr>
-          <w:p>
-            <w:pPr/>
-            <w:r>
-              <w:t xml:space="preserve"/>
-            </w:r>
-          </w:p>
-        </w:tc>
-      </w:tr>
-      <w:tr>
-        <w:tc>
-          <w:tcPr>
-            <w:vAlign w:val="center"/>
-          </w:tcPr>
-          <w:p>
-            <w:pPr/>
-            <w:r>
-              <w:t xml:space="preserve">dateOfBirth</w:t>
-            </w:r>
-          </w:p>
-        </w:tc>
-        <w:tc>
-          <w:tcPr>
-            <w:vAlign w:val="center"/>
-          </w:tcPr>
-          <w:p>
-            <w:pPr/>
-            <w:r>
-              <w:t xml:space="preserve">date (YYYY-MM-DD)</w:t>
-            </w:r>
-          </w:p>
-        </w:tc>
-        <w:tc>
-          <w:tcPr>
-            <w:vAlign w:val="center"/>
-          </w:tcPr>
-          <w:p>
-            <w:pPr/>
-            <w:r>
-              <w:t xml:space="preserve">no</w:t>
-            </w:r>
-          </w:p>
-        </w:tc>
-        <w:tc>
-          <w:tcPr>
-            <w:vAlign w:val="center"/>
-          </w:tcPr>
-          <w:p>
-            <w:pPr/>
-            <w:r>
-              <w:t xml:space="preserve"/>
-            </w:r>
-          </w:p>
-        </w:tc>
-      </w:tr>
-      <w:tr>
-        <w:tc>
-          <w:tcPr>
-            <w:vAlign w:val="center"/>
-          </w:tcPr>
-          <w:p>
-            <w:pPr/>
-            <w:r>
-              <w:t xml:space="preserve">schoolId</w:t>
-            </w:r>
-          </w:p>
-        </w:tc>
-        <w:tc>
-          <w:tcPr>
-            <w:vAlign w:val="center"/>
-          </w:tcPr>
-          <w:p>
-            <w:pPr/>
-            <w:r>
-              <w:t xml:space="preserve">number</w:t>
-            </w:r>
-          </w:p>
-        </w:tc>
-        <w:tc>
-          <w:tcPr>
-            <w:vAlign w:val="center"/>
-          </w:tcPr>
-          <w:p>
-            <w:pPr/>
-            <w:r>
-              <w:t xml:space="preserve">yes</w:t>
-            </w:r>
-          </w:p>
-        </w:tc>
-        <w:tc>
-          <w:tcPr>
-            <w:vAlign w:val="center"/>
-          </w:tcPr>
-          <w:p>
-            <w:pPr/>
-            <w:r>
-              <w:t xml:space="preserve">instructor callers can only use their own schoolId</w:t>
-            </w:r>
-          </w:p>
-        </w:tc>
-      </w:tr>
-      <w:tr>
-        <w:tc>
-          <w:tcPr>
-            <w:vAlign w:val="center"/>
-          </w:tcPr>
-          <w:p>
-            <w:pPr/>
-            <w:r>
-              <w:t xml:space="preserve">role</w:t>
-            </w:r>
-          </w:p>
-        </w:tc>
-        <w:tc>
-          <w:tcPr>
-            <w:vAlign w:val="center"/>
-          </w:tcPr>
-          <w:p>
-            <w:pPr/>
-            <w:r>
-              <w:t xml:space="preserve">enum</w:t>
-            </w:r>
-          </w:p>
-        </w:tc>
-        <w:tc>
-          <w:tcPr>
-            <w:vAlign w:val="center"/>
-          </w:tcPr>
-          <w:p>
-            <w:pPr/>
-            <w:r>
-              <w:t xml:space="preserve">yes</w:t>
-            </w:r>
-          </w:p>
-        </w:tc>
-        <w:tc>
-          <w:tcPr>
-            <w:vAlign w:val="center"/>
-          </w:tcPr>
-          <w:p>
-            <w:pPr/>
-            <w:r>
-              <w:t xml:space="preserve">STUDENT or INSTRUCTOR — instructor callers may only create STUDENT</w:t>
-            </w:r>
-          </w:p>
-        </w:tc>
-      </w:tr>
-      <w:tr>
-        <w:tc>
-          <w:tcPr>
-            <w:vAlign w:val="center"/>
-          </w:tcPr>
-          <w:p>
-            <w:pPr/>
-            <w:r>
-              <w:t xml:space="preserve">licenseNumber</w:t>
-            </w:r>
-          </w:p>
-        </w:tc>
-        <w:tc>
-          <w:tcPr>
-            <w:vAlign w:val="center"/>
-          </w:tcPr>
-          <w:p>
-            <w:pPr/>
-            <w:r>
-              <w:t xml:space="preserve">string</w:t>
-            </w:r>
-          </w:p>
-        </w:tc>
-        <w:tc>
-          <w:tcPr>
-            <w:vAlign w:val="center"/>
-          </w:tcPr>
-          <w:p>
-            <w:pPr/>
-            <w:r>
-              <w:t xml:space="preserve">yes for INSTRUCTOR, optional for STUDENT</w:t>
-            </w:r>
-          </w:p>
-        </w:tc>
-        <w:tc>
-          <w:tcPr>
-            <w:vAlign w:val="center"/>
-          </w:tcPr>
-          <w:p>
-            <w:pPr/>
-            <w:r>
-              <w:t xml:space="preserve">max 50 chars</w:t>
-            </w:r>
-          </w:p>
-        </w:tc>
-      </w:tr>
-      <w:tr>
-        <w:tc>
-          <w:tcPr>
-            <w:vAlign w:val="center"/>
-          </w:tcPr>
-          <w:p>
-            <w:pPr/>
-            <w:r>
-              <w:t xml:space="preserve">specialization</w:t>
-            </w:r>
-          </w:p>
-        </w:tc>
-        <w:tc>
-          <w:tcPr>
-            <w:vAlign w:val="center"/>
-          </w:tcPr>
-          <w:p>
-            <w:pPr/>
-            <w:r>
-              <w:t xml:space="preserve">string</w:t>
-            </w:r>
-          </w:p>
-        </w:tc>
-        <w:tc>
-          <w:tcPr>
-            <w:vAlign w:val="center"/>
-          </w:tcPr>
-          <w:p>
-            <w:pPr/>
-            <w:r>
-              <w:t xml:space="preserve">no</w:t>
-            </w:r>
-          </w:p>
-        </w:tc>
-        <w:tc>
-          <w:tcPr>
-            <w:vAlign w:val="center"/>
-          </w:tcPr>
-          <w:p>
-            <w:pPr/>
-            <w:r>
-              <w:t xml:space="preserve">instructor only</w:t>
-            </w:r>
-          </w:p>
-        </w:tc>
-      </w:tr>
-      <w:tr>
-        <w:tc>
-          <w:tcPr>
-            <w:vAlign w:val="center"/>
-          </w:tcPr>
-          <w:p>
-            <w:pPr/>
-            <w:r>
-              <w:t xml:space="preserve">yearsExperience</w:t>
-            </w:r>
-          </w:p>
-        </w:tc>
-        <w:tc>
-          <w:tcPr>
-            <w:vAlign w:val="center"/>
-          </w:tcPr>
-          <w:p>
-            <w:pPr/>
-            <w:r>
-              <w:t xml:space="preserve">number</w:t>
-            </w:r>
-          </w:p>
-        </w:tc>
-        <w:tc>
-          <w:tcPr>
-            <w:vAlign w:val="center"/>
-          </w:tcPr>
-          <w:p>
-            <w:pPr/>
-            <w:r>
-              <w:t xml:space="preserve">no</w:t>
-            </w:r>
-          </w:p>
-        </w:tc>
-        <w:tc>
-          <w:tcPr>
-            <w:vAlign w:val="center"/>
-          </w:tcPr>
-          <w:p>
-            <w:pPr/>
-            <w:r>
-              <w:t xml:space="preserve">instructor only</w:t>
+              <w:t xml:space="preserve">EMAIL or WHATSAPP - only one listed in verification.channels</w:t>
             </w:r>
           </w:p>
         </w:tc>
@@ -2612,7 +1790,7 @@
           <w:rFonts w:ascii="Consolas" w:hAnsi="Consolas"/>
           <w:sz w:val="18"/>
         </w:rPr>
-        <w:t xml:space="preserve">  "email": "student.jones@example.com",</w:t>
+        <w:t xml:space="preserve">  "challengeId": "q4Jd0...Xw",</w:t>
       </w:r>
     </w:p>
     <w:p>
@@ -2625,7 +1803,7 @@
           <w:rFonts w:ascii="Consolas" w:hAnsi="Consolas"/>
           <w:sz w:val="18"/>
         </w:rPr>
-        <w:t xml:space="preserve">  "password": "SecurePass123!",</w:t>
+        <w:t xml:space="preserve">  "channel": "EMAIL"</w:t>
       </w:r>
     </w:p>
     <w:p>
@@ -2638,7 +1816,15 @@
           <w:rFonts w:ascii="Consolas" w:hAnsi="Consolas"/>
           <w:sz w:val="18"/>
         </w:rPr>
-        <w:t xml:space="preserve">  "firstName": "Jamie",</w:t>
+        <w:t xml:space="preserve">}</w:t>
+      </w:r>
+    </w:p>
+    <w:p>
+      <w:r>
+        <w:rPr>
+          <w:b/>
+        </w:rPr>
+        <w:t xml:space="preserve">Example response:</w:t>
       </w:r>
     </w:p>
     <w:p>
@@ -2651,7 +1837,7 @@
           <w:rFonts w:ascii="Consolas" w:hAnsi="Consolas"/>
           <w:sz w:val="18"/>
         </w:rPr>
-        <w:t xml:space="preserve">  "lastName": "Jones",</w:t>
+        <w:t xml:space="preserve">{</w:t>
       </w:r>
     </w:p>
     <w:p>
@@ -2664,7 +1850,7 @@
           <w:rFonts w:ascii="Consolas" w:hAnsi="Consolas"/>
           <w:sz w:val="18"/>
         </w:rPr>
-        <w:t xml:space="preserve">  "schoolId": 2,</w:t>
+        <w:t xml:space="preserve">  "success": true,</w:t>
       </w:r>
     </w:p>
     <w:p>
@@ -2677,7 +1863,7 @@
           <w:rFonts w:ascii="Consolas" w:hAnsi="Consolas"/>
           <w:sz w:val="18"/>
         </w:rPr>
-        <w:t xml:space="preserve">  "role": "STUDENT",</w:t>
+        <w:t xml:space="preserve">  "message": "Verification code sent",</w:t>
       </w:r>
     </w:p>
     <w:p>
@@ -2690,7 +1876,345 @@
           <w:rFonts w:ascii="Consolas" w:hAnsi="Consolas"/>
           <w:sz w:val="18"/>
         </w:rPr>
-        <w:t xml:space="preserve">  "licenseNumber": "LIC-2026-0031"</w:t>
+        <w:t xml:space="preserve">  "data": null</w:t>
+      </w:r>
+    </w:p>
+    <w:p>
+      <w:pPr>
+        <w:pStyle w:val="Code"/>
+        <w:shd w:val="clear" w:fill="F3F3F3"/>
+      </w:pPr>
+      <w:r>
+        <w:rPr>
+          <w:rFonts w:ascii="Consolas" w:hAnsi="Consolas"/>
+          <w:sz w:val="18"/>
+        </w:rPr>
+        <w:t xml:space="preserve">}</w:t>
+      </w:r>
+    </w:p>
+    <w:p>
+      <w:r>
+        <w:rPr>
+          <w:b/>
+        </w:rPr>
+        <w:t xml:space="preserve">Notes:</w:t>
+      </w:r>
+    </w:p>
+    <w:p>
+      <w:pPr>
+        <w:pStyle w:val="ListParagraph"/>
+        <w:numPr>
+          <w:ilvl w:val="0"/>
+          <w:numId w:val="1"/>
+        </w:numPr>
+      </w:pPr>
+      <w:r>
+        <w:t xml:space="preserve">400: unknown/expired challenge ("please log in again") or WHATSAPP not available.</w:t>
+      </w:r>
+    </w:p>
+    <w:p>
+      <w:pPr>
+        <w:pStyle w:val="ListParagraph"/>
+        <w:numPr>
+          <w:ilvl w:val="0"/>
+          <w:numId w:val="1"/>
+        </w:numPr>
+      </w:pPr>
+      <w:r>
+        <w:t xml:space="preserve">429 + Retry-After: a code was sent less than 60 seconds ago.</w:t>
+      </w:r>
+    </w:p>
+    <w:p>
+      <w:pPr>
+        <w:pStyle w:val="ListParagraph"/>
+        <w:numPr>
+          <w:ilvl w:val="0"/>
+          <w:numId w:val="1"/>
+        </w:numPr>
+      </w:pPr>
+      <w:r>
+        <w:t xml:space="preserve">503: the email or WhatsApp provider failed - nothing was sent, retry right away.</w:t>
+      </w:r>
+    </w:p>
+    <w:p/>
+    <w:p>
+      <w:r>
+        <w:rPr>
+          <w:b/>
+          <w:rFonts w:ascii="Consolas" w:hAnsi="Consolas" w:cs="Consolas"/>
+          <w:sz w:val="18"/>
+          <w:szCs w:val="18"/>
+        </w:rPr>
+        <w:t xml:space="preserve">POST  </w:t>
+      </w:r>
+      <w:r>
+        <w:rPr>
+          <w:rFonts w:ascii="Consolas" w:hAnsi="Consolas" w:cs="Consolas"/>
+          <w:sz w:val="18"/>
+          <w:szCs w:val="18"/>
+        </w:rPr>
+        <w:t xml:space="preserve">/auth/verification/confirm</w:t>
+      </w:r>
+    </w:p>
+    <w:p>
+      <w:r>
+        <w:rPr>
+          <w:i/>
+        </w:rPr>
+        <w:t xml:space="preserve">Confirm the code: verifies the account and logs in.</w:t>
+      </w:r>
+    </w:p>
+    <w:p>
+      <w:r>
+        <w:rPr>
+          <w:b/>
+        </w:rPr>
+        <w:t xml:space="preserve">Access: </w:t>
+      </w:r>
+      <w:r>
+        <w:t xml:space="preserve">Public (the challengeId from login is the credential)</w:t>
+      </w:r>
+    </w:p>
+    <w:p>
+      <w:r>
+        <w:rPr>
+          <w:b/>
+        </w:rPr>
+        <w:t xml:space="preserve">Request body:</w:t>
+      </w:r>
+    </w:p>
+    <w:tbl>
+      <w:tblPr>
+        <w:tblStyle w:val="TableGrid"/>
+        <w:tblW w:w="0" w:type="auto"/>
+        <w:tblBorders>
+          <w:top w:val="single" w:sz="4" w:color="BFBFBF"/>
+          <w:left w:val="single" w:sz="4" w:color="BFBFBF"/>
+          <w:bottom w:val="single" w:sz="4" w:color="BFBFBF"/>
+          <w:right w:val="single" w:sz="4" w:color="BFBFBF"/>
+          <w:insideH w:val="single" w:sz="4" w:color="BFBFBF"/>
+          <w:insideV w:val="single" w:sz="4" w:color="BFBFBF"/>
+        </w:tblBorders>
+      </w:tblPr>
+      <w:tblGrid>
+        <w:gridCol w:w="2250"/>
+        <w:gridCol w:w="2250"/>
+        <w:gridCol w:w="2250"/>
+        <w:gridCol w:w="2250"/>
+      </w:tblGrid>
+      <w:tr>
+        <w:tc>
+          <w:tcPr>
+            <w:shd w:val="clear" w:fill="2F5496"/>
+            <w:vAlign w:val="center"/>
+          </w:tcPr>
+          <w:p>
+            <w:pPr>
+              <w:shd w:val="clear" w:fill="2F5496"/>
+            </w:pPr>
+            <w:r>
+              <w:rPr>
+                <w:b/>
+                <w:color w:val="FFFFFF"/>
+              </w:rPr>
+              <w:t xml:space="preserve">Field</w:t>
+            </w:r>
+          </w:p>
+        </w:tc>
+        <w:tc>
+          <w:tcPr>
+            <w:shd w:val="clear" w:fill="2F5496"/>
+            <w:vAlign w:val="center"/>
+          </w:tcPr>
+          <w:p>
+            <w:pPr>
+              <w:shd w:val="clear" w:fill="2F5496"/>
+            </w:pPr>
+            <w:r>
+              <w:rPr>
+                <w:b/>
+                <w:color w:val="FFFFFF"/>
+              </w:rPr>
+              <w:t xml:space="preserve">Type</w:t>
+            </w:r>
+          </w:p>
+        </w:tc>
+        <w:tc>
+          <w:tcPr>
+            <w:shd w:val="clear" w:fill="2F5496"/>
+            <w:vAlign w:val="center"/>
+          </w:tcPr>
+          <w:p>
+            <w:pPr>
+              <w:shd w:val="clear" w:fill="2F5496"/>
+            </w:pPr>
+            <w:r>
+              <w:rPr>
+                <w:b/>
+                <w:color w:val="FFFFFF"/>
+              </w:rPr>
+              <w:t xml:space="preserve">Required</w:t>
+            </w:r>
+          </w:p>
+        </w:tc>
+        <w:tc>
+          <w:tcPr>
+            <w:shd w:val="clear" w:fill="2F5496"/>
+            <w:vAlign w:val="center"/>
+          </w:tcPr>
+          <w:p>
+            <w:pPr>
+              <w:shd w:val="clear" w:fill="2F5496"/>
+            </w:pPr>
+            <w:r>
+              <w:rPr>
+                <w:b/>
+                <w:color w:val="FFFFFF"/>
+              </w:rPr>
+              <w:t xml:space="preserve">Notes</w:t>
+            </w:r>
+          </w:p>
+        </w:tc>
+      </w:tr>
+      <w:tr>
+        <w:tc>
+          <w:tcPr>
+            <w:vAlign w:val="center"/>
+          </w:tcPr>
+          <w:p>
+            <w:pPr/>
+            <w:r>
+              <w:t xml:space="preserve">challengeId</w:t>
+            </w:r>
+          </w:p>
+        </w:tc>
+        <w:tc>
+          <w:tcPr>
+            <w:vAlign w:val="center"/>
+          </w:tcPr>
+          <w:p>
+            <w:pPr/>
+            <w:r>
+              <w:t xml:space="preserve">string</w:t>
+            </w:r>
+          </w:p>
+        </w:tc>
+        <w:tc>
+          <w:tcPr>
+            <w:vAlign w:val="center"/>
+          </w:tcPr>
+          <w:p>
+            <w:pPr/>
+            <w:r>
+              <w:t xml:space="preserve">yes</w:t>
+            </w:r>
+          </w:p>
+        </w:tc>
+        <w:tc>
+          <w:tcPr>
+            <w:vAlign w:val="center"/>
+          </w:tcPr>
+          <w:p>
+            <w:pPr/>
+            <w:r>
+              <w:t xml:space="preserve">same as for /send</w:t>
+            </w:r>
+          </w:p>
+        </w:tc>
+      </w:tr>
+      <w:tr>
+        <w:tc>
+          <w:tcPr>
+            <w:vAlign w:val="center"/>
+          </w:tcPr>
+          <w:p>
+            <w:pPr/>
+            <w:r>
+              <w:t xml:space="preserve">code</w:t>
+            </w:r>
+          </w:p>
+        </w:tc>
+        <w:tc>
+          <w:tcPr>
+            <w:vAlign w:val="center"/>
+          </w:tcPr>
+          <w:p>
+            <w:pPr/>
+            <w:r>
+              <w:t xml:space="preserve">string</w:t>
+            </w:r>
+          </w:p>
+        </w:tc>
+        <w:tc>
+          <w:tcPr>
+            <w:vAlign w:val="center"/>
+          </w:tcPr>
+          <w:p>
+            <w:pPr/>
+            <w:r>
+              <w:t xml:space="preserve">yes</w:t>
+            </w:r>
+          </w:p>
+        </w:tc>
+        <w:tc>
+          <w:tcPr>
+            <w:vAlign w:val="center"/>
+          </w:tcPr>
+          <w:p>
+            <w:pPr/>
+            <w:r>
+              <w:t xml:space="preserve">exactly 6 digits</w:t>
+            </w:r>
+          </w:p>
+        </w:tc>
+      </w:tr>
+    </w:tbl>
+    <w:p/>
+    <w:p>
+      <w:r>
+        <w:rPr>
+          <w:b/>
+        </w:rPr>
+        <w:t xml:space="preserve">Example request:</w:t>
+      </w:r>
+    </w:p>
+    <w:p>
+      <w:pPr>
+        <w:pStyle w:val="Code"/>
+        <w:shd w:val="clear" w:fill="F3F3F3"/>
+      </w:pPr>
+      <w:r>
+        <w:rPr>
+          <w:rFonts w:ascii="Consolas" w:hAnsi="Consolas"/>
+          <w:sz w:val="18"/>
+        </w:rPr>
+        <w:t xml:space="preserve">{</w:t>
+      </w:r>
+    </w:p>
+    <w:p>
+      <w:pPr>
+        <w:pStyle w:val="Code"/>
+        <w:shd w:val="clear" w:fill="F3F3F3"/>
+      </w:pPr>
+      <w:r>
+        <w:rPr>
+          <w:rFonts w:ascii="Consolas" w:hAnsi="Consolas"/>
+          <w:sz w:val="18"/>
+        </w:rPr>
+        <w:t xml:space="preserve">  "challengeId": "q4Jd0...Xw",</w:t>
+      </w:r>
+    </w:p>
+    <w:p>
+      <w:pPr>
+        <w:pStyle w:val="Code"/>
+        <w:shd w:val="clear" w:fill="F3F3F3"/>
+      </w:pPr>
+      <w:r>
+        <w:rPr>
+          <w:rFonts w:ascii="Consolas" w:hAnsi="Consolas"/>
+          <w:sz w:val="18"/>
+        </w:rPr>
+        <w:t xml:space="preserve">  "code": "482913"</w:t>
       </w:r>
     </w:p>
     <w:p>
@@ -2796,6 +2320,1487 @@
           <w:p>
             <w:pPr/>
             <w:r>
+              <w:t xml:space="preserve">Same shape as /auth/login's normal response</w:t>
+            </w:r>
+          </w:p>
+        </w:tc>
+        <w:tc>
+          <w:tcPr>
+            <w:vAlign w:val="center"/>
+          </w:tcPr>
+          <w:p>
+            <w:pPr/>
+            <w:r>
+              <w:t xml:space="preserve"/>
+            </w:r>
+          </w:p>
+        </w:tc>
+        <w:tc>
+          <w:tcPr>
+            <w:vAlign w:val="center"/>
+          </w:tcPr>
+          <w:p>
+            <w:pPr/>
+            <w:r>
+              <w:t xml:space="preserve">accessToken, refreshToken, tokenType, expiresIn, user</w:t>
+            </w:r>
+          </w:p>
+        </w:tc>
+      </w:tr>
+    </w:tbl>
+    <w:p/>
+    <w:p>
+      <w:r>
+        <w:rPr>
+          <w:b/>
+        </w:rPr>
+        <w:t xml:space="preserve">Notes:</w:t>
+      </w:r>
+    </w:p>
+    <w:p>
+      <w:pPr>
+        <w:pStyle w:val="ListParagraph"/>
+        <w:numPr>
+          <w:ilvl w:val="0"/>
+          <w:numId w:val="1"/>
+        </w:numPr>
+      </w:pPr>
+      <w:r>
+        <w:t xml:space="preserve">400 with a human-readable message for a wrong code (with attempts left), a dead code (request a new one), or an expired challenge (log in again).</w:t>
+      </w:r>
+    </w:p>
+    <w:p>
+      <w:pPr>
+        <w:pStyle w:val="ListParagraph"/>
+        <w:numPr>
+          <w:ilvl w:val="0"/>
+          <w:numId w:val="1"/>
+        </w:numPr>
+      </w:pPr>
+      <w:r>
+        <w:t xml:space="preserve">The challenge is single-use: after success, a new session needs a normal login.</w:t>
+      </w:r>
+    </w:p>
+    <w:p/>
+    <w:p>
+      <w:r>
+        <w:rPr>
+          <w:b/>
+          <w:rFonts w:ascii="Consolas" w:hAnsi="Consolas" w:cs="Consolas"/>
+          <w:sz w:val="18"/>
+          <w:szCs w:val="18"/>
+        </w:rPr>
+        <w:t xml:space="preserve">GET  </w:t>
+      </w:r>
+      <w:r>
+        <w:rPr>
+          <w:rFonts w:ascii="Consolas" w:hAnsi="Consolas" w:cs="Consolas"/>
+          <w:sz w:val="18"/>
+          <w:szCs w:val="18"/>
+        </w:rPr>
+        <w:t xml:space="preserve">/auth/me</w:t>
+      </w:r>
+    </w:p>
+    <w:p>
+      <w:r>
+        <w:rPr>
+          <w:i/>
+        </w:rPr>
+        <w:t xml:space="preserve">Get the current user's identity and profile IDs.</w:t>
+      </w:r>
+    </w:p>
+    <w:p>
+      <w:r>
+        <w:rPr>
+          <w:b/>
+        </w:rPr>
+        <w:t xml:space="preserve">Access: </w:t>
+      </w:r>
+      <w:r>
+        <w:t xml:space="preserve">Any authenticated user</w:t>
+      </w:r>
+    </w:p>
+    <w:p>
+      <w:r>
+        <w:rPr>
+          <w:b/>
+        </w:rPr>
+        <w:t xml:space="preserve">Response (key fields):</w:t>
+      </w:r>
+    </w:p>
+    <w:tbl>
+      <w:tblPr>
+        <w:tblStyle w:val="TableGrid"/>
+        <w:tblW w:w="0" w:type="auto"/>
+        <w:tblBorders>
+          <w:top w:val="single" w:sz="4" w:color="BFBFBF"/>
+          <w:left w:val="single" w:sz="4" w:color="BFBFBF"/>
+          <w:bottom w:val="single" w:sz="4" w:color="BFBFBF"/>
+          <w:right w:val="single" w:sz="4" w:color="BFBFBF"/>
+          <w:insideH w:val="single" w:sz="4" w:color="BFBFBF"/>
+          <w:insideV w:val="single" w:sz="4" w:color="BFBFBF"/>
+        </w:tblBorders>
+      </w:tblPr>
+      <w:tblGrid>
+        <w:gridCol w:w="3000"/>
+        <w:gridCol w:w="3000"/>
+        <w:gridCol w:w="3000"/>
+      </w:tblGrid>
+      <w:tr>
+        <w:tc>
+          <w:tcPr>
+            <w:shd w:val="clear" w:fill="2F5496"/>
+            <w:vAlign w:val="center"/>
+          </w:tcPr>
+          <w:p>
+            <w:pPr>
+              <w:shd w:val="clear" w:fill="2F5496"/>
+            </w:pPr>
+            <w:r>
+              <w:rPr>
+                <w:b/>
+                <w:color w:val="FFFFFF"/>
+              </w:rPr>
+              <w:t xml:space="preserve">Field</w:t>
+            </w:r>
+          </w:p>
+        </w:tc>
+        <w:tc>
+          <w:tcPr>
+            <w:shd w:val="clear" w:fill="2F5496"/>
+            <w:vAlign w:val="center"/>
+          </w:tcPr>
+          <w:p>
+            <w:pPr>
+              <w:shd w:val="clear" w:fill="2F5496"/>
+            </w:pPr>
+            <w:r>
+              <w:rPr>
+                <w:b/>
+                <w:color w:val="FFFFFF"/>
+              </w:rPr>
+              <w:t xml:space="preserve">Type</w:t>
+            </w:r>
+          </w:p>
+        </w:tc>
+        <w:tc>
+          <w:tcPr>
+            <w:shd w:val="clear" w:fill="2F5496"/>
+            <w:vAlign w:val="center"/>
+          </w:tcPr>
+          <w:p>
+            <w:pPr>
+              <w:shd w:val="clear" w:fill="2F5496"/>
+            </w:pPr>
+            <w:r>
+              <w:rPr>
+                <w:b/>
+                <w:color w:val="FFFFFF"/>
+              </w:rPr>
+              <w:t xml:space="preserve">Notes</w:t>
+            </w:r>
+          </w:p>
+        </w:tc>
+      </w:tr>
+      <w:tr>
+        <w:tc>
+          <w:tcPr>
+            <w:vAlign w:val="center"/>
+          </w:tcPr>
+          <w:p>
+            <w:pPr/>
+            <w:r>
+              <w:t xml:space="preserve">userId</w:t>
+            </w:r>
+          </w:p>
+        </w:tc>
+        <w:tc>
+          <w:tcPr>
+            <w:vAlign w:val="center"/>
+          </w:tcPr>
+          <w:p>
+            <w:pPr/>
+            <w:r>
+              <w:t xml:space="preserve">number</w:t>
+            </w:r>
+          </w:p>
+        </w:tc>
+        <w:tc>
+          <w:tcPr>
+            <w:vAlign w:val="center"/>
+          </w:tcPr>
+          <w:p>
+            <w:pPr/>
+            <w:r>
+              <w:t xml:space="preserve">the raw User.id — rarely needed directly</w:t>
+            </w:r>
+          </w:p>
+        </w:tc>
+      </w:tr>
+      <w:tr>
+        <w:tc>
+          <w:tcPr>
+            <w:vAlign w:val="center"/>
+          </w:tcPr>
+          <w:p>
+            <w:pPr/>
+            <w:r>
+              <w:t xml:space="preserve">email / roles</w:t>
+            </w:r>
+          </w:p>
+        </w:tc>
+        <w:tc>
+          <w:tcPr>
+            <w:vAlign w:val="center"/>
+          </w:tcPr>
+          <w:p>
+            <w:pPr/>
+            <w:r>
+              <w:t xml:space="preserve"/>
+            </w:r>
+          </w:p>
+        </w:tc>
+        <w:tc>
+          <w:tcPr>
+            <w:vAlign w:val="center"/>
+          </w:tcPr>
+          <w:p>
+            <w:pPr/>
+            <w:r>
+              <w:t xml:space="preserve"/>
+            </w:r>
+          </w:p>
+        </w:tc>
+      </w:tr>
+      <w:tr>
+        <w:tc>
+          <w:tcPr>
+            <w:vAlign w:val="center"/>
+          </w:tcPr>
+          <w:p>
+            <w:pPr/>
+            <w:r>
+              <w:t xml:space="preserve">studentProfileId</w:t>
+            </w:r>
+          </w:p>
+        </w:tc>
+        <w:tc>
+          <w:tcPr>
+            <w:vAlign w:val="center"/>
+          </w:tcPr>
+          <w:p>
+            <w:pPr/>
+            <w:r>
+              <w:t xml:space="preserve">number or null</w:t>
+            </w:r>
+          </w:p>
+        </w:tc>
+        <w:tc>
+          <w:tcPr>
+            <w:vAlign w:val="center"/>
+          </w:tcPr>
+          <w:p>
+            <w:pPr/>
+            <w:r>
+              <w:t xml:space="preserve">set only if the user has a STUDENT role</w:t>
+            </w:r>
+          </w:p>
+        </w:tc>
+      </w:tr>
+      <w:tr>
+        <w:tc>
+          <w:tcPr>
+            <w:vAlign w:val="center"/>
+          </w:tcPr>
+          <w:p>
+            <w:pPr/>
+            <w:r>
+              <w:t xml:space="preserve">instructorProfileId</w:t>
+            </w:r>
+          </w:p>
+        </w:tc>
+        <w:tc>
+          <w:tcPr>
+            <w:vAlign w:val="center"/>
+          </w:tcPr>
+          <w:p>
+            <w:pPr/>
+            <w:r>
+              <w:t xml:space="preserve">number or null</w:t>
+            </w:r>
+          </w:p>
+        </w:tc>
+        <w:tc>
+          <w:tcPr>
+            <w:vAlign w:val="center"/>
+          </w:tcPr>
+          <w:p>
+            <w:pPr/>
+            <w:r>
+              <w:t xml:space="preserve">set only if the user has an INSTRUCTOR role</w:t>
+            </w:r>
+          </w:p>
+        </w:tc>
+      </w:tr>
+      <w:tr>
+        <w:tc>
+          <w:tcPr>
+            <w:vAlign w:val="center"/>
+          </w:tcPr>
+          <w:p>
+            <w:pPr/>
+            <w:r>
+              <w:t xml:space="preserve">schoolId</w:t>
+            </w:r>
+          </w:p>
+        </w:tc>
+        <w:tc>
+          <w:tcPr>
+            <w:vAlign w:val="center"/>
+          </w:tcPr>
+          <w:p>
+            <w:pPr/>
+            <w:r>
+              <w:t xml:space="preserve">number or null</w:t>
+            </w:r>
+          </w:p>
+        </w:tc>
+        <w:tc>
+          <w:tcPr>
+            <w:vAlign w:val="center"/>
+          </w:tcPr>
+          <w:p>
+            <w:pPr/>
+            <w:r>
+              <w:t xml:space="preserve">the user's school — for an ADMIN this is the school they OWN (null for the bootstrap admin, who owns none)</w:t>
+            </w:r>
+          </w:p>
+        </w:tc>
+      </w:tr>
+      <w:tr>
+        <w:tc>
+          <w:tcPr>
+            <w:vAlign w:val="center"/>
+          </w:tcPr>
+          <w:p>
+            <w:pPr/>
+            <w:r>
+              <w:t xml:space="preserve">bootstrapAdmin</w:t>
+            </w:r>
+          </w:p>
+        </w:tc>
+        <w:tc>
+          <w:tcPr>
+            <w:vAlign w:val="center"/>
+          </w:tcPr>
+          <w:p>
+            <w:pPr/>
+            <w:r>
+              <w:t xml:space="preserve">boolean</w:t>
+            </w:r>
+          </w:p>
+        </w:tc>
+        <w:tc>
+          <w:tcPr>
+            <w:vAlign w:val="center"/>
+          </w:tcPr>
+          <w:p>
+            <w:pPr/>
+            <w:r>
+              <w:t xml:space="preserve">true only for the one permanent super-admin — decides which admin dashboard to render, see the Roles section above</w:t>
+            </w:r>
+          </w:p>
+        </w:tc>
+      </w:tr>
+      <w:tr>
+        <w:tc>
+          <w:tcPr>
+            <w:vAlign w:val="center"/>
+          </w:tcPr>
+          <w:p>
+            <w:pPr/>
+            <w:r>
+              <w:t xml:space="preserve">enabled / emailVerified</w:t>
+            </w:r>
+          </w:p>
+        </w:tc>
+        <w:tc>
+          <w:tcPr>
+            <w:vAlign w:val="center"/>
+          </w:tcPr>
+          <w:p>
+            <w:pPr/>
+            <w:r>
+              <w:t xml:space="preserve">boolean</w:t>
+            </w:r>
+          </w:p>
+        </w:tc>
+        <w:tc>
+          <w:tcPr>
+            <w:vAlign w:val="center"/>
+          </w:tcPr>
+          <w:p>
+            <w:pPr/>
+            <w:r>
+              <w:t xml:space="preserve">emailVerified is true once the account verified by email (false if it verified by WhatsApp instead) - you never need it for the login flow</w:t>
+            </w:r>
+          </w:p>
+        </w:tc>
+      </w:tr>
+    </w:tbl>
+    <w:p/>
+    <w:p>
+      <w:r>
+        <w:rPr>
+          <w:b/>
+        </w:rPr>
+        <w:t xml:space="preserve">Example response:</w:t>
+      </w:r>
+    </w:p>
+    <w:p>
+      <w:pPr>
+        <w:pStyle w:val="Code"/>
+        <w:shd w:val="clear" w:fill="F3F3F3"/>
+      </w:pPr>
+      <w:r>
+        <w:rPr>
+          <w:rFonts w:ascii="Consolas" w:hAnsi="Consolas"/>
+          <w:sz w:val="18"/>
+        </w:rPr>
+        <w:t xml:space="preserve">{</w:t>
+      </w:r>
+    </w:p>
+    <w:p>
+      <w:pPr>
+        <w:pStyle w:val="Code"/>
+        <w:shd w:val="clear" w:fill="F3F3F3"/>
+      </w:pPr>
+      <w:r>
+        <w:rPr>
+          <w:rFonts w:ascii="Consolas" w:hAnsi="Consolas"/>
+          <w:sz w:val="18"/>
+        </w:rPr>
+        <w:t xml:space="preserve">  "success": true,</w:t>
+      </w:r>
+    </w:p>
+    <w:p>
+      <w:pPr>
+        <w:pStyle w:val="Code"/>
+        <w:shd w:val="clear" w:fill="F3F3F3"/>
+      </w:pPr>
+      <w:r>
+        <w:rPr>
+          <w:rFonts w:ascii="Consolas" w:hAnsi="Consolas"/>
+          <w:sz w:val="18"/>
+        </w:rPr>
+        <w:t xml:space="preserve">  "message": "Operation successful",</w:t>
+      </w:r>
+    </w:p>
+    <w:p>
+      <w:pPr>
+        <w:pStyle w:val="Code"/>
+        <w:shd w:val="clear" w:fill="F3F3F3"/>
+      </w:pPr>
+      <w:r>
+        <w:rPr>
+          <w:rFonts w:ascii="Consolas" w:hAnsi="Consolas"/>
+          <w:sz w:val="18"/>
+        </w:rPr>
+        <w:t xml:space="preserve">  "data": {</w:t>
+      </w:r>
+    </w:p>
+    <w:p>
+      <w:pPr>
+        <w:pStyle w:val="Code"/>
+        <w:shd w:val="clear" w:fill="F3F3F3"/>
+      </w:pPr>
+      <w:r>
+        <w:rPr>
+          <w:rFonts w:ascii="Consolas" w:hAnsi="Consolas"/>
+          <w:sz w:val="18"/>
+        </w:rPr>
+        <w:t xml:space="preserve">    "userId": 12,</w:t>
+      </w:r>
+    </w:p>
+    <w:p>
+      <w:pPr>
+        <w:pStyle w:val="Code"/>
+        <w:shd w:val="clear" w:fill="F3F3F3"/>
+      </w:pPr>
+      <w:r>
+        <w:rPr>
+          <w:rFonts w:ascii="Consolas" w:hAnsi="Consolas"/>
+          <w:sz w:val="18"/>
+        </w:rPr>
+        <w:t xml:space="preserve">    "email": "instructor.smith@example.com",</w:t>
+      </w:r>
+    </w:p>
+    <w:p>
+      <w:pPr>
+        <w:pStyle w:val="Code"/>
+        <w:shd w:val="clear" w:fill="F3F3F3"/>
+      </w:pPr>
+      <w:r>
+        <w:rPr>
+          <w:rFonts w:ascii="Consolas" w:hAnsi="Consolas"/>
+          <w:sz w:val="18"/>
+        </w:rPr>
+        <w:t xml:space="preserve">    "roles": ["INSTRUCTOR"],</w:t>
+      </w:r>
+    </w:p>
+    <w:p>
+      <w:pPr>
+        <w:pStyle w:val="Code"/>
+        <w:shd w:val="clear" w:fill="F3F3F3"/>
+      </w:pPr>
+      <w:r>
+        <w:rPr>
+          <w:rFonts w:ascii="Consolas" w:hAnsi="Consolas"/>
+          <w:sz w:val="18"/>
+        </w:rPr>
+        <w:t xml:space="preserve">    "studentProfileId": null,</w:t>
+      </w:r>
+    </w:p>
+    <w:p>
+      <w:pPr>
+        <w:pStyle w:val="Code"/>
+        <w:shd w:val="clear" w:fill="F3F3F3"/>
+      </w:pPr>
+      <w:r>
+        <w:rPr>
+          <w:rFonts w:ascii="Consolas" w:hAnsi="Consolas"/>
+          <w:sz w:val="18"/>
+        </w:rPr>
+        <w:t xml:space="preserve">    "instructorProfileId": 4,</w:t>
+      </w:r>
+    </w:p>
+    <w:p>
+      <w:pPr>
+        <w:pStyle w:val="Code"/>
+        <w:shd w:val="clear" w:fill="F3F3F3"/>
+      </w:pPr>
+      <w:r>
+        <w:rPr>
+          <w:rFonts w:ascii="Consolas" w:hAnsi="Consolas"/>
+          <w:sz w:val="18"/>
+        </w:rPr>
+        <w:t xml:space="preserve">    "schoolId": 2,</w:t>
+      </w:r>
+    </w:p>
+    <w:p>
+      <w:pPr>
+        <w:pStyle w:val="Code"/>
+        <w:shd w:val="clear" w:fill="F3F3F3"/>
+      </w:pPr>
+      <w:r>
+        <w:rPr>
+          <w:rFonts w:ascii="Consolas" w:hAnsi="Consolas"/>
+          <w:sz w:val="18"/>
+        </w:rPr>
+        <w:t xml:space="preserve">    "bootstrapAdmin": false,</w:t>
+      </w:r>
+    </w:p>
+    <w:p>
+      <w:pPr>
+        <w:pStyle w:val="Code"/>
+        <w:shd w:val="clear" w:fill="F3F3F3"/>
+      </w:pPr>
+      <w:r>
+        <w:rPr>
+          <w:rFonts w:ascii="Consolas" w:hAnsi="Consolas"/>
+          <w:sz w:val="18"/>
+        </w:rPr>
+        <w:t xml:space="preserve">    "enabled": true,</w:t>
+      </w:r>
+    </w:p>
+    <w:p>
+      <w:pPr>
+        <w:pStyle w:val="Code"/>
+        <w:shd w:val="clear" w:fill="F3F3F3"/>
+      </w:pPr>
+      <w:r>
+        <w:rPr>
+          <w:rFonts w:ascii="Consolas" w:hAnsi="Consolas"/>
+          <w:sz w:val="18"/>
+        </w:rPr>
+        <w:t xml:space="preserve">    "emailVerified": false</w:t>
+      </w:r>
+    </w:p>
+    <w:p>
+      <w:pPr>
+        <w:pStyle w:val="Code"/>
+        <w:shd w:val="clear" w:fill="F3F3F3"/>
+      </w:pPr>
+      <w:r>
+        <w:rPr>
+          <w:rFonts w:ascii="Consolas" w:hAnsi="Consolas"/>
+          <w:sz w:val="18"/>
+        </w:rPr>
+        <w:t xml:space="preserve">  }</w:t>
+      </w:r>
+    </w:p>
+    <w:p>
+      <w:pPr>
+        <w:pStyle w:val="Code"/>
+        <w:shd w:val="clear" w:fill="F3F3F3"/>
+      </w:pPr>
+      <w:r>
+        <w:rPr>
+          <w:rFonts w:ascii="Consolas" w:hAnsi="Consolas"/>
+          <w:sz w:val="18"/>
+        </w:rPr>
+        <w:t xml:space="preserve">}</w:t>
+      </w:r>
+    </w:p>
+    <w:p>
+      <w:r>
+        <w:rPr>
+          <w:b/>
+        </w:rPr>
+        <w:t xml:space="preserve">Notes:</w:t>
+      </w:r>
+    </w:p>
+    <w:p>
+      <w:pPr>
+        <w:pStyle w:val="ListParagraph"/>
+        <w:numPr>
+          <w:ilvl w:val="0"/>
+          <w:numId w:val="1"/>
+        </w:numPr>
+      </w:pPr>
+      <w:r>
+        <w:t xml:space="preserve">This is critical: booking, lesson-note, lesson-route, and license-workflow endpoints all take a StudentProfile.id or InstructorProfile.id in their path or body — NOT the raw user ID. Cache instructorProfileId / studentProfileId from this call right after login.</w:t>
+      </w:r>
+    </w:p>
+    <w:p>
+      <w:pPr>
+        <w:pStyle w:val="ListParagraph"/>
+        <w:numPr>
+          <w:ilvl w:val="0"/>
+          <w:numId w:val="1"/>
+        </w:numPr>
+      </w:pPr>
+      <w:r>
+        <w:t xml:space="preserve">For an ADMIN caller, schoolId is their OWNED school (from POST /schools), not a profile-based school like students/instructors have — use it the same way either way (e.g. as the schoolId for GET /students/school/{schoolId}).</w:t>
+      </w:r>
+    </w:p>
+    <w:p/>
+    <w:p>
+      <w:r>
+        <w:rPr>
+          <w:b/>
+          <w:rFonts w:ascii="Consolas" w:hAnsi="Consolas" w:cs="Consolas"/>
+          <w:sz w:val="18"/>
+          <w:szCs w:val="18"/>
+        </w:rPr>
+        <w:t xml:space="preserve">POST  </w:t>
+      </w:r>
+      <w:r>
+        <w:rPr>
+          <w:rFonts w:ascii="Consolas" w:hAnsi="Consolas" w:cs="Consolas"/>
+          <w:sz w:val="18"/>
+          <w:szCs w:val="18"/>
+        </w:rPr>
+        <w:t xml:space="preserve">/auth/register</w:t>
+      </w:r>
+    </w:p>
+    <w:p>
+      <w:r>
+        <w:rPr>
+          <w:i/>
+        </w:rPr>
+        <w:t xml:space="preserve">Create a STUDENT or INSTRUCTOR account.</w:t>
+      </w:r>
+    </w:p>
+    <w:p>
+      <w:r>
+        <w:rPr>
+          <w:b/>
+        </w:rPr>
+        <w:t xml:space="preserve">Access: </w:t>
+      </w:r>
+      <w:r>
+        <w:t xml:space="preserve">ADMIN or INSTRUCTOR bearer token</w:t>
+      </w:r>
+    </w:p>
+    <w:p>
+      <w:r>
+        <w:rPr>
+          <w:b/>
+        </w:rPr>
+        <w:t xml:space="preserve">Request body:</w:t>
+      </w:r>
+    </w:p>
+    <w:tbl>
+      <w:tblPr>
+        <w:tblStyle w:val="TableGrid"/>
+        <w:tblW w:w="0" w:type="auto"/>
+        <w:tblBorders>
+          <w:top w:val="single" w:sz="4" w:color="BFBFBF"/>
+          <w:left w:val="single" w:sz="4" w:color="BFBFBF"/>
+          <w:bottom w:val="single" w:sz="4" w:color="BFBFBF"/>
+          <w:right w:val="single" w:sz="4" w:color="BFBFBF"/>
+          <w:insideH w:val="single" w:sz="4" w:color="BFBFBF"/>
+          <w:insideV w:val="single" w:sz="4" w:color="BFBFBF"/>
+        </w:tblBorders>
+      </w:tblPr>
+      <w:tblGrid>
+        <w:gridCol w:w="2250"/>
+        <w:gridCol w:w="2250"/>
+        <w:gridCol w:w="2250"/>
+        <w:gridCol w:w="2250"/>
+      </w:tblGrid>
+      <w:tr>
+        <w:tc>
+          <w:tcPr>
+            <w:shd w:val="clear" w:fill="2F5496"/>
+            <w:vAlign w:val="center"/>
+          </w:tcPr>
+          <w:p>
+            <w:pPr>
+              <w:shd w:val="clear" w:fill="2F5496"/>
+            </w:pPr>
+            <w:r>
+              <w:rPr>
+                <w:b/>
+                <w:color w:val="FFFFFF"/>
+              </w:rPr>
+              <w:t xml:space="preserve">Field</w:t>
+            </w:r>
+          </w:p>
+        </w:tc>
+        <w:tc>
+          <w:tcPr>
+            <w:shd w:val="clear" w:fill="2F5496"/>
+            <w:vAlign w:val="center"/>
+          </w:tcPr>
+          <w:p>
+            <w:pPr>
+              <w:shd w:val="clear" w:fill="2F5496"/>
+            </w:pPr>
+            <w:r>
+              <w:rPr>
+                <w:b/>
+                <w:color w:val="FFFFFF"/>
+              </w:rPr>
+              <w:t xml:space="preserve">Type</w:t>
+            </w:r>
+          </w:p>
+        </w:tc>
+        <w:tc>
+          <w:tcPr>
+            <w:shd w:val="clear" w:fill="2F5496"/>
+            <w:vAlign w:val="center"/>
+          </w:tcPr>
+          <w:p>
+            <w:pPr>
+              <w:shd w:val="clear" w:fill="2F5496"/>
+            </w:pPr>
+            <w:r>
+              <w:rPr>
+                <w:b/>
+                <w:color w:val="FFFFFF"/>
+              </w:rPr>
+              <w:t xml:space="preserve">Required</w:t>
+            </w:r>
+          </w:p>
+        </w:tc>
+        <w:tc>
+          <w:tcPr>
+            <w:shd w:val="clear" w:fill="2F5496"/>
+            <w:vAlign w:val="center"/>
+          </w:tcPr>
+          <w:p>
+            <w:pPr>
+              <w:shd w:val="clear" w:fill="2F5496"/>
+            </w:pPr>
+            <w:r>
+              <w:rPr>
+                <w:b/>
+                <w:color w:val="FFFFFF"/>
+              </w:rPr>
+              <w:t xml:space="preserve">Notes</w:t>
+            </w:r>
+          </w:p>
+        </w:tc>
+      </w:tr>
+      <w:tr>
+        <w:tc>
+          <w:tcPr>
+            <w:vAlign w:val="center"/>
+          </w:tcPr>
+          <w:p>
+            <w:pPr/>
+            <w:r>
+              <w:t xml:space="preserve">email</w:t>
+            </w:r>
+          </w:p>
+        </w:tc>
+        <w:tc>
+          <w:tcPr>
+            <w:vAlign w:val="center"/>
+          </w:tcPr>
+          <w:p>
+            <w:pPr/>
+            <w:r>
+              <w:t xml:space="preserve">string</w:t>
+            </w:r>
+          </w:p>
+        </w:tc>
+        <w:tc>
+          <w:tcPr>
+            <w:vAlign w:val="center"/>
+          </w:tcPr>
+          <w:p>
+            <w:pPr/>
+            <w:r>
+              <w:t xml:space="preserve">yes</w:t>
+            </w:r>
+          </w:p>
+        </w:tc>
+        <w:tc>
+          <w:tcPr>
+            <w:vAlign w:val="center"/>
+          </w:tcPr>
+          <w:p>
+            <w:pPr/>
+            <w:r>
+              <w:t xml:space="preserve"/>
+            </w:r>
+          </w:p>
+        </w:tc>
+      </w:tr>
+      <w:tr>
+        <w:tc>
+          <w:tcPr>
+            <w:vAlign w:val="center"/>
+          </w:tcPr>
+          <w:p>
+            <w:pPr/>
+            <w:r>
+              <w:t xml:space="preserve">password</w:t>
+            </w:r>
+          </w:p>
+        </w:tc>
+        <w:tc>
+          <w:tcPr>
+            <w:vAlign w:val="center"/>
+          </w:tcPr>
+          <w:p>
+            <w:pPr/>
+            <w:r>
+              <w:t xml:space="preserve">string</w:t>
+            </w:r>
+          </w:p>
+        </w:tc>
+        <w:tc>
+          <w:tcPr>
+            <w:vAlign w:val="center"/>
+          </w:tcPr>
+          <w:p>
+            <w:pPr/>
+            <w:r>
+              <w:t xml:space="preserve">yes</w:t>
+            </w:r>
+          </w:p>
+        </w:tc>
+        <w:tc>
+          <w:tcPr>
+            <w:vAlign w:val="center"/>
+          </w:tcPr>
+          <w:p>
+            <w:pPr/>
+            <w:r>
+              <w:t xml:space="preserve">8-100 chars</w:t>
+            </w:r>
+          </w:p>
+        </w:tc>
+      </w:tr>
+      <w:tr>
+        <w:tc>
+          <w:tcPr>
+            <w:vAlign w:val="center"/>
+          </w:tcPr>
+          <w:p>
+            <w:pPr/>
+            <w:r>
+              <w:t xml:space="preserve">firstName / lastName</w:t>
+            </w:r>
+          </w:p>
+        </w:tc>
+        <w:tc>
+          <w:tcPr>
+            <w:vAlign w:val="center"/>
+          </w:tcPr>
+          <w:p>
+            <w:pPr/>
+            <w:r>
+              <w:t xml:space="preserve">string</w:t>
+            </w:r>
+          </w:p>
+        </w:tc>
+        <w:tc>
+          <w:tcPr>
+            <w:vAlign w:val="center"/>
+          </w:tcPr>
+          <w:p>
+            <w:pPr/>
+            <w:r>
+              <w:t xml:space="preserve">yes</w:t>
+            </w:r>
+          </w:p>
+        </w:tc>
+        <w:tc>
+          <w:tcPr>
+            <w:vAlign w:val="center"/>
+          </w:tcPr>
+          <w:p>
+            <w:pPr/>
+            <w:r>
+              <w:t xml:space="preserve"/>
+            </w:r>
+          </w:p>
+        </w:tc>
+      </w:tr>
+      <w:tr>
+        <w:tc>
+          <w:tcPr>
+            <w:vAlign w:val="center"/>
+          </w:tcPr>
+          <w:p>
+            <w:pPr/>
+            <w:r>
+              <w:t xml:space="preserve">phone</w:t>
+            </w:r>
+          </w:p>
+        </w:tc>
+        <w:tc>
+          <w:tcPr>
+            <w:vAlign w:val="center"/>
+          </w:tcPr>
+          <w:p>
+            <w:pPr/>
+            <w:r>
+              <w:t xml:space="preserve">string</w:t>
+            </w:r>
+          </w:p>
+        </w:tc>
+        <w:tc>
+          <w:tcPr>
+            <w:vAlign w:val="center"/>
+          </w:tcPr>
+          <w:p>
+            <w:pPr/>
+            <w:r>
+              <w:t xml:space="preserve">no</w:t>
+            </w:r>
+          </w:p>
+        </w:tc>
+        <w:tc>
+          <w:tcPr>
+            <w:vAlign w:val="center"/>
+          </w:tcPr>
+          <w:p>
+            <w:pPr/>
+            <w:r>
+              <w:t xml:space="preserve">max 20 chars. Collect it WITH the country code (+233...) - only then can the user receive their verification code on WhatsApp</w:t>
+            </w:r>
+          </w:p>
+        </w:tc>
+      </w:tr>
+      <w:tr>
+        <w:tc>
+          <w:tcPr>
+            <w:vAlign w:val="center"/>
+          </w:tcPr>
+          <w:p>
+            <w:pPr/>
+            <w:r>
+              <w:t xml:space="preserve">dateOfBirth</w:t>
+            </w:r>
+          </w:p>
+        </w:tc>
+        <w:tc>
+          <w:tcPr>
+            <w:vAlign w:val="center"/>
+          </w:tcPr>
+          <w:p>
+            <w:pPr/>
+            <w:r>
+              <w:t xml:space="preserve">date (YYYY-MM-DD)</w:t>
+            </w:r>
+          </w:p>
+        </w:tc>
+        <w:tc>
+          <w:tcPr>
+            <w:vAlign w:val="center"/>
+          </w:tcPr>
+          <w:p>
+            <w:pPr/>
+            <w:r>
+              <w:t xml:space="preserve">no</w:t>
+            </w:r>
+          </w:p>
+        </w:tc>
+        <w:tc>
+          <w:tcPr>
+            <w:vAlign w:val="center"/>
+          </w:tcPr>
+          <w:p>
+            <w:pPr/>
+            <w:r>
+              <w:t xml:space="preserve"/>
+            </w:r>
+          </w:p>
+        </w:tc>
+      </w:tr>
+      <w:tr>
+        <w:tc>
+          <w:tcPr>
+            <w:vAlign w:val="center"/>
+          </w:tcPr>
+          <w:p>
+            <w:pPr/>
+            <w:r>
+              <w:t xml:space="preserve">schoolId</w:t>
+            </w:r>
+          </w:p>
+        </w:tc>
+        <w:tc>
+          <w:tcPr>
+            <w:vAlign w:val="center"/>
+          </w:tcPr>
+          <w:p>
+            <w:pPr/>
+            <w:r>
+              <w:t xml:space="preserve">number</w:t>
+            </w:r>
+          </w:p>
+        </w:tc>
+        <w:tc>
+          <w:tcPr>
+            <w:vAlign w:val="center"/>
+          </w:tcPr>
+          <w:p>
+            <w:pPr/>
+            <w:r>
+              <w:t xml:space="preserve">yes</w:t>
+            </w:r>
+          </w:p>
+        </w:tc>
+        <w:tc>
+          <w:tcPr>
+            <w:vAlign w:val="center"/>
+          </w:tcPr>
+          <w:p>
+            <w:pPr/>
+            <w:r>
+              <w:t xml:space="preserve">instructor callers can only use their own schoolId</w:t>
+            </w:r>
+          </w:p>
+        </w:tc>
+      </w:tr>
+      <w:tr>
+        <w:tc>
+          <w:tcPr>
+            <w:vAlign w:val="center"/>
+          </w:tcPr>
+          <w:p>
+            <w:pPr/>
+            <w:r>
+              <w:t xml:space="preserve">role</w:t>
+            </w:r>
+          </w:p>
+        </w:tc>
+        <w:tc>
+          <w:tcPr>
+            <w:vAlign w:val="center"/>
+          </w:tcPr>
+          <w:p>
+            <w:pPr/>
+            <w:r>
+              <w:t xml:space="preserve">enum</w:t>
+            </w:r>
+          </w:p>
+        </w:tc>
+        <w:tc>
+          <w:tcPr>
+            <w:vAlign w:val="center"/>
+          </w:tcPr>
+          <w:p>
+            <w:pPr/>
+            <w:r>
+              <w:t xml:space="preserve">yes</w:t>
+            </w:r>
+          </w:p>
+        </w:tc>
+        <w:tc>
+          <w:tcPr>
+            <w:vAlign w:val="center"/>
+          </w:tcPr>
+          <w:p>
+            <w:pPr/>
+            <w:r>
+              <w:t xml:space="preserve">STUDENT or INSTRUCTOR — instructor callers may only create STUDENT</w:t>
+            </w:r>
+          </w:p>
+        </w:tc>
+      </w:tr>
+      <w:tr>
+        <w:tc>
+          <w:tcPr>
+            <w:vAlign w:val="center"/>
+          </w:tcPr>
+          <w:p>
+            <w:pPr/>
+            <w:r>
+              <w:t xml:space="preserve">licenseNumber</w:t>
+            </w:r>
+          </w:p>
+        </w:tc>
+        <w:tc>
+          <w:tcPr>
+            <w:vAlign w:val="center"/>
+          </w:tcPr>
+          <w:p>
+            <w:pPr/>
+            <w:r>
+              <w:t xml:space="preserve">string</w:t>
+            </w:r>
+          </w:p>
+        </w:tc>
+        <w:tc>
+          <w:tcPr>
+            <w:vAlign w:val="center"/>
+          </w:tcPr>
+          <w:p>
+            <w:pPr/>
+            <w:r>
+              <w:t xml:space="preserve">yes for INSTRUCTOR, optional for STUDENT</w:t>
+            </w:r>
+          </w:p>
+        </w:tc>
+        <w:tc>
+          <w:tcPr>
+            <w:vAlign w:val="center"/>
+          </w:tcPr>
+          <w:p>
+            <w:pPr/>
+            <w:r>
+              <w:t xml:space="preserve">max 50 chars</w:t>
+            </w:r>
+          </w:p>
+        </w:tc>
+      </w:tr>
+      <w:tr>
+        <w:tc>
+          <w:tcPr>
+            <w:vAlign w:val="center"/>
+          </w:tcPr>
+          <w:p>
+            <w:pPr/>
+            <w:r>
+              <w:t xml:space="preserve">specialization</w:t>
+            </w:r>
+          </w:p>
+        </w:tc>
+        <w:tc>
+          <w:tcPr>
+            <w:vAlign w:val="center"/>
+          </w:tcPr>
+          <w:p>
+            <w:pPr/>
+            <w:r>
+              <w:t xml:space="preserve">string</w:t>
+            </w:r>
+          </w:p>
+        </w:tc>
+        <w:tc>
+          <w:tcPr>
+            <w:vAlign w:val="center"/>
+          </w:tcPr>
+          <w:p>
+            <w:pPr/>
+            <w:r>
+              <w:t xml:space="preserve">no</w:t>
+            </w:r>
+          </w:p>
+        </w:tc>
+        <w:tc>
+          <w:tcPr>
+            <w:vAlign w:val="center"/>
+          </w:tcPr>
+          <w:p>
+            <w:pPr/>
+            <w:r>
+              <w:t xml:space="preserve">instructor only</w:t>
+            </w:r>
+          </w:p>
+        </w:tc>
+      </w:tr>
+      <w:tr>
+        <w:tc>
+          <w:tcPr>
+            <w:vAlign w:val="center"/>
+          </w:tcPr>
+          <w:p>
+            <w:pPr/>
+            <w:r>
+              <w:t xml:space="preserve">yearsExperience</w:t>
+            </w:r>
+          </w:p>
+        </w:tc>
+        <w:tc>
+          <w:tcPr>
+            <w:vAlign w:val="center"/>
+          </w:tcPr>
+          <w:p>
+            <w:pPr/>
+            <w:r>
+              <w:t xml:space="preserve">number</w:t>
+            </w:r>
+          </w:p>
+        </w:tc>
+        <w:tc>
+          <w:tcPr>
+            <w:vAlign w:val="center"/>
+          </w:tcPr>
+          <w:p>
+            <w:pPr/>
+            <w:r>
+              <w:t xml:space="preserve">no</w:t>
+            </w:r>
+          </w:p>
+        </w:tc>
+        <w:tc>
+          <w:tcPr>
+            <w:vAlign w:val="center"/>
+          </w:tcPr>
+          <w:p>
+            <w:pPr/>
+            <w:r>
+              <w:t xml:space="preserve">instructor only</w:t>
+            </w:r>
+          </w:p>
+        </w:tc>
+      </w:tr>
+    </w:tbl>
+    <w:p/>
+    <w:p>
+      <w:r>
+        <w:rPr>
+          <w:b/>
+        </w:rPr>
+        <w:t xml:space="preserve">Example request:</w:t>
+      </w:r>
+    </w:p>
+    <w:p>
+      <w:pPr>
+        <w:pStyle w:val="Code"/>
+        <w:shd w:val="clear" w:fill="F3F3F3"/>
+      </w:pPr>
+      <w:r>
+        <w:rPr>
+          <w:rFonts w:ascii="Consolas" w:hAnsi="Consolas"/>
+          <w:sz w:val="18"/>
+        </w:rPr>
+        <w:t xml:space="preserve">{</w:t>
+      </w:r>
+    </w:p>
+    <w:p>
+      <w:pPr>
+        <w:pStyle w:val="Code"/>
+        <w:shd w:val="clear" w:fill="F3F3F3"/>
+      </w:pPr>
+      <w:r>
+        <w:rPr>
+          <w:rFonts w:ascii="Consolas" w:hAnsi="Consolas"/>
+          <w:sz w:val="18"/>
+        </w:rPr>
+        <w:t xml:space="preserve">  "email": "student.jones@example.com",</w:t>
+      </w:r>
+    </w:p>
+    <w:p>
+      <w:pPr>
+        <w:pStyle w:val="Code"/>
+        <w:shd w:val="clear" w:fill="F3F3F3"/>
+      </w:pPr>
+      <w:r>
+        <w:rPr>
+          <w:rFonts w:ascii="Consolas" w:hAnsi="Consolas"/>
+          <w:sz w:val="18"/>
+        </w:rPr>
+        <w:t xml:space="preserve">  "password": "SecurePass123!",</w:t>
+      </w:r>
+    </w:p>
+    <w:p>
+      <w:pPr>
+        <w:pStyle w:val="Code"/>
+        <w:shd w:val="clear" w:fill="F3F3F3"/>
+      </w:pPr>
+      <w:r>
+        <w:rPr>
+          <w:rFonts w:ascii="Consolas" w:hAnsi="Consolas"/>
+          <w:sz w:val="18"/>
+        </w:rPr>
+        <w:t xml:space="preserve">  "firstName": "Jamie",</w:t>
+      </w:r>
+    </w:p>
+    <w:p>
+      <w:pPr>
+        <w:pStyle w:val="Code"/>
+        <w:shd w:val="clear" w:fill="F3F3F3"/>
+      </w:pPr>
+      <w:r>
+        <w:rPr>
+          <w:rFonts w:ascii="Consolas" w:hAnsi="Consolas"/>
+          <w:sz w:val="18"/>
+        </w:rPr>
+        <w:t xml:space="preserve">  "lastName": "Jones",</w:t>
+      </w:r>
+    </w:p>
+    <w:p>
+      <w:pPr>
+        <w:pStyle w:val="Code"/>
+        <w:shd w:val="clear" w:fill="F3F3F3"/>
+      </w:pPr>
+      <w:r>
+        <w:rPr>
+          <w:rFonts w:ascii="Consolas" w:hAnsi="Consolas"/>
+          <w:sz w:val="18"/>
+        </w:rPr>
+        <w:t xml:space="preserve">  "schoolId": 2,</w:t>
+      </w:r>
+    </w:p>
+    <w:p>
+      <w:pPr>
+        <w:pStyle w:val="Code"/>
+        <w:shd w:val="clear" w:fill="F3F3F3"/>
+      </w:pPr>
+      <w:r>
+        <w:rPr>
+          <w:rFonts w:ascii="Consolas" w:hAnsi="Consolas"/>
+          <w:sz w:val="18"/>
+        </w:rPr>
+        <w:t xml:space="preserve">  "role": "STUDENT",</w:t>
+      </w:r>
+    </w:p>
+    <w:p>
+      <w:pPr>
+        <w:pStyle w:val="Code"/>
+        <w:shd w:val="clear" w:fill="F3F3F3"/>
+      </w:pPr>
+      <w:r>
+        <w:rPr>
+          <w:rFonts w:ascii="Consolas" w:hAnsi="Consolas"/>
+          <w:sz w:val="18"/>
+        </w:rPr>
+        <w:t xml:space="preserve">  "licenseNumber": "LIC-2026-0031"</w:t>
+      </w:r>
+    </w:p>
+    <w:p>
+      <w:pPr>
+        <w:pStyle w:val="Code"/>
+        <w:shd w:val="clear" w:fill="F3F3F3"/>
+      </w:pPr>
+      <w:r>
+        <w:rPr>
+          <w:rFonts w:ascii="Consolas" w:hAnsi="Consolas"/>
+          <w:sz w:val="18"/>
+        </w:rPr>
+        <w:t xml:space="preserve">}</w:t>
+      </w:r>
+    </w:p>
+    <w:p>
+      <w:r>
+        <w:rPr>
+          <w:b/>
+        </w:rPr>
+        <w:t xml:space="preserve">Response (key fields):</w:t>
+      </w:r>
+    </w:p>
+    <w:tbl>
+      <w:tblPr>
+        <w:tblStyle w:val="TableGrid"/>
+        <w:tblW w:w="0" w:type="auto"/>
+        <w:tblBorders>
+          <w:top w:val="single" w:sz="4" w:color="BFBFBF"/>
+          <w:left w:val="single" w:sz="4" w:color="BFBFBF"/>
+          <w:bottom w:val="single" w:sz="4" w:color="BFBFBF"/>
+          <w:right w:val="single" w:sz="4" w:color="BFBFBF"/>
+          <w:insideH w:val="single" w:sz="4" w:color="BFBFBF"/>
+          <w:insideV w:val="single" w:sz="4" w:color="BFBFBF"/>
+        </w:tblBorders>
+      </w:tblPr>
+      <w:tblGrid>
+        <w:gridCol w:w="3000"/>
+        <w:gridCol w:w="3000"/>
+        <w:gridCol w:w="3000"/>
+      </w:tblGrid>
+      <w:tr>
+        <w:tc>
+          <w:tcPr>
+            <w:shd w:val="clear" w:fill="2F5496"/>
+            <w:vAlign w:val="center"/>
+          </w:tcPr>
+          <w:p>
+            <w:pPr>
+              <w:shd w:val="clear" w:fill="2F5496"/>
+            </w:pPr>
+            <w:r>
+              <w:rPr>
+                <w:b/>
+                <w:color w:val="FFFFFF"/>
+              </w:rPr>
+              <w:t xml:space="preserve">Field</w:t>
+            </w:r>
+          </w:p>
+        </w:tc>
+        <w:tc>
+          <w:tcPr>
+            <w:shd w:val="clear" w:fill="2F5496"/>
+            <w:vAlign w:val="center"/>
+          </w:tcPr>
+          <w:p>
+            <w:pPr>
+              <w:shd w:val="clear" w:fill="2F5496"/>
+            </w:pPr>
+            <w:r>
+              <w:rPr>
+                <w:b/>
+                <w:color w:val="FFFFFF"/>
+              </w:rPr>
+              <w:t xml:space="preserve">Type</w:t>
+            </w:r>
+          </w:p>
+        </w:tc>
+        <w:tc>
+          <w:tcPr>
+            <w:shd w:val="clear" w:fill="2F5496"/>
+            <w:vAlign w:val="center"/>
+          </w:tcPr>
+          <w:p>
+            <w:pPr>
+              <w:shd w:val="clear" w:fill="2F5496"/>
+            </w:pPr>
+            <w:r>
+              <w:rPr>
+                <w:b/>
+                <w:color w:val="FFFFFF"/>
+              </w:rPr>
+              <w:t xml:space="preserve">Notes</w:t>
+            </w:r>
+          </w:p>
+        </w:tc>
+      </w:tr>
+      <w:tr>
+        <w:tc>
+          <w:tcPr>
+            <w:vAlign w:val="center"/>
+          </w:tcPr>
+          <w:p>
+            <w:pPr/>
+            <w:r>
               <w:t xml:space="preserve">user.id / user.email / user.roles</w:t>
             </w:r>
           </w:p>
@@ -2818,7 +3823,7 @@
           <w:p>
             <w:pPr/>
             <w:r>
-              <w:t xml:space="preserve">the NEW user's identity only - no accessToken/refreshToken/tokenType/expiresIn. The account's creator never receives a session for it; the new user logs in themselves with the password they were given</w:t>
+              <w:t xml:space="preserve">the NEW user's identity only - no accessToken/refreshToken/tokenType/expiresIn. The account's creator never receives a session for it; the new user logs in themselves with the password they were given, and verifies the account with a one-time code at that first login</w:t>
             </w:r>
           </w:p>
         </w:tc>

</xml_diff>

<commit_message>
Add a switch to turn account verification off until email can reach real users
Without a verified sending domain, Resend only delivers to the account
owner, so no other new account could log in. VERIFICATION_REQUIRED=false
lets everyone log in with just a password meanwhile. Accounts created in
the meantime stay unverified and verify at their next login once it's back
on. Also brings the frontend guide up to date: the verification screens
checklist, the full list of automatic notifications, and the 429/503
statuses.
</commit_message>
<xml_diff>
--- a/project-with-changes/docs/Frontend_API_Guide.docx
+++ b/project-with-changes/docs/Frontend_API_Guide.docx
@@ -39,7 +39,7 @@
     </w:p>
     <w:p>
       <w:r>
-        <w:t xml:space="preserve">Every path in this document is relative to that base (e.g. "POST /auth/login" means POST https://.../api/v1/auth/login). Every endpoint requires a Bearer JWT in the Authorization header EXCEPT: login, refresh-token, forgot-password, reset-password. (Register also requires a token — see the Authentication section, there is no public self-registration.)</w:t>
+        <w:t xml:space="preserve">Every path in this document is relative to that base (e.g. "POST /auth/login" means POST https://.../api/v1/auth/login). Every endpoint requires a Bearer JWT in the Authorization header EXCEPT: login, refresh-token, forgot-password, reset-password, verification/send and verification/confirm. (Register also requires a token — see the Authentication section, there is no public self-registration.)</w:t>
       </w:r>
     </w:p>
     <w:p>
@@ -424,6 +424,30 @@
           <w:p>
             <w:pPr/>
             <w:r>
+              <w:t xml:space="preserve">429</w:t>
+            </w:r>
+          </w:p>
+        </w:tc>
+        <w:tc>
+          <w:tcPr>
+            <w:vAlign w:val="center"/>
+          </w:tcPr>
+          <w:p>
+            <w:pPr/>
+            <w:r>
+              <w:t xml:space="preserve">Too many requests - rate limit, or a verification code resent too soon (see the Retry-After header)</w:t>
+            </w:r>
+          </w:p>
+        </w:tc>
+      </w:tr>
+      <w:tr>
+        <w:tc>
+          <w:tcPr>
+            <w:vAlign w:val="center"/>
+          </w:tcPr>
+          <w:p>
+            <w:pPr/>
+            <w:r>
               <w:t xml:space="preserve">500</w:t>
             </w:r>
           </w:p>
@@ -436,6 +460,30 @@
             <w:pPr/>
             <w:r>
               <w:t xml:space="preserve">Unexpected server error — report these, they're bugs</w:t>
+            </w:r>
+          </w:p>
+        </w:tc>
+      </w:tr>
+      <w:tr>
+        <w:tc>
+          <w:tcPr>
+            <w:vAlign w:val="center"/>
+          </w:tcPr>
+          <w:p>
+            <w:pPr/>
+            <w:r>
+              <w:t xml:space="preserve">503</w:t>
+            </w:r>
+          </w:p>
+        </w:tc>
+        <w:tc>
+          <w:tcPr>
+            <w:vAlign w:val="center"/>
+          </w:tcPr>
+          <w:p>
+            <w:pPr/>
+            <w:r>
+              <w:t xml:space="preserve">An outside provider (email, WhatsApp) failed or isn't configured - safe to retry</w:t>
             </w:r>
           </w:p>
         </w:tc>
@@ -1404,6 +1452,11 @@
     </w:p>
     <w:p>
       <w:r>
+        <w:t xml:space="preserve">The backend can run with verification switched OFF (it is, until the company has its own email domain): then login simply returns tokens for everyone and verificationRequired never appears. Build the verification screens anyway and always branch on verificationRequired - when the backend switches verification on, the app must work with no frontend release.</w:t>
+      </w:r>
+    </w:p>
+    <w:p>
+      <w:r>
         <w:rPr>
           <w:b/>
         </w:rPr>
@@ -26287,7 +26340,12 @@
     </w:p>
     <w:p>
       <w:r>
-        <w:t xml:space="preserve">Two things happen here: the system automatically sends notifications for certain events, and admins/instructors can manually send an arbitrary notification via POST /send. Automatic IN_APP notifications currently fire on: a booking being created, a booking being cancelled, a quiz being submitted (pass or fail), a new lesson note being added, and a driving assessment being recorded. All of these are fire-and-forget from the frontend's perspective — nothing needs to be called to trigger them, they're side effects of the endpoints above.</w:t>
+        <w:t xml:space="preserve">Two things happen here: the system automatically sends notifications for certain events, and admins/instructors can manually send an arbitrary notification via POST /send. Automatic IN_APP notifications currently fire on: a new account (welcome), a booking being created or cancelled (also by SMS when configured), a quiz being submitted (pass or fail), a new lesson note, a driving assessment being recorded, a new direct message, a school announcement (also by email), a lesson question being asked (to the instructor(s)) or answered (to the student), and school deletion requests (to the admins involved). A password change sends an EMAIL. All of these are side effects of the endpoints above - nothing needs to be called to trigger them.</w:t>
+      </w:r>
+    </w:p>
+    <w:p>
+      <w:r>
+        <w:t xml:space="preserve">They're created a moment AFTER the action succeeds, never as part of it: a notification that fails can't fail the booking/message/etc., and a booking that fails never notifies anyone. So don't re-fetch GET /notifications/me in the same breath as the action's response and expect the new item - update from the NOTIFICATION_CREATED WebSocket event instead (see "Realtime updates"), or refresh a bit later.</w:t>
       </w:r>
     </w:p>
     <w:p>
@@ -28200,15 +28258,7 @@
         </w:numPr>
       </w:pPr>
       <w:r>
-        <w:t xml:space="preserve">Call POST /auth/logout on explicit sign-out to revoke the refresh token server-side, then clear local storage.</w:t>
-      </w:r>
-    </w:p>
-    <w:p>
-      <w:pPr>
-        <w:pStyle w:val="Heading2"/>
-      </w:pPr>
-      <w:r>
-        <w:t xml:space="preserve">2. Fetch and cache profile IDs right after login</w:t>
+        <w:t xml:space="preserve">Login has TWO possible successful answers: tokens, or verificationRequired + a challenge (see item 13). Check for verificationRequired first.</w:t>
       </w:r>
     </w:p>
     <w:p>
@@ -28220,7 +28270,7 @@
         </w:numPr>
       </w:pPr>
       <w:r>
-        <w:t xml:space="preserve">Call GET /auth/me immediately after login and cache studentProfileId / instructorProfileId / schoolId — these (not the raw user ID) are what most other endpoints expect.</w:t>
+        <w:t xml:space="preserve">Call POST /auth/logout on explicit sign-out to revoke the refresh token server-side, then clear local storage.</w:t>
       </w:r>
     </w:p>
     <w:p>
@@ -28228,7 +28278,7 @@
         <w:pStyle w:val="Heading2"/>
       </w:pPr>
       <w:r>
-        <w:t xml:space="preserve">3. Role-aware UI</w:t>
+        <w:t xml:space="preserve">2. Fetch and cache profile IDs right after login</w:t>
       </w:r>
     </w:p>
     <w:p>
@@ -28240,7 +28290,15 @@
         </w:numPr>
       </w:pPr>
       <w:r>
-        <w:t xml:space="preserve">Three distinct app experiences: ADMIN (school/user/vehicle management, cross-cutting visibility), INSTRUCTOR (their own students/courses/bookings/lesson notes), STUDENT (their own courses/quizzes/bookings/progress).</w:t>
+        <w:t xml:space="preserve">Call GET /auth/me immediately after login and cache studentProfileId / instructorProfileId / schoolId — these (not the raw user ID) are what most other endpoints expect.</w:t>
+      </w:r>
+    </w:p>
+    <w:p>
+      <w:pPr>
+        <w:pStyle w:val="Heading2"/>
+      </w:pPr>
+      <w:r>
+        <w:t xml:space="preserve">3. Role-aware UI</w:t>
       </w:r>
     </w:p>
     <w:p>
@@ -28252,7 +28310,7 @@
         </w:numPr>
       </w:pPr>
       <w:r>
-        <w:t xml:space="preserve">ADMIN is itself two different dashboards, not one — check GET /auth/me's bootstrapAdmin flag. The bootstrap admin manages ALL schools/admins (school create/delete, the deletion-request review queue); a regular admin only ever sees their own school and has no delete button at all, only a "request deletion" one. Don't build a single generic "admin" screen that tries to cover both.</w:t>
+        <w:t xml:space="preserve">Three distinct app experiences: ADMIN (school/user/vehicle management, cross-cutting visibility), INSTRUCTOR (their own students/courses/bookings/lesson notes), STUDENT (their own courses/quizzes/bookings/progress).</w:t>
       </w:r>
     </w:p>
     <w:p>
@@ -28264,15 +28322,7 @@
         </w:numPr>
       </w:pPr>
       <w:r>
-        <w:t xml:space="preserve">Remember bookings are instructor-initiated — don't build a student-facing "book a lesson" button; build an instructor-facing "schedule a lesson for my student" flow instead.</w:t>
-      </w:r>
-    </w:p>
-    <w:p>
-      <w:pPr>
-        <w:pStyle w:val="Heading2"/>
-      </w:pPr>
-      <w:r>
-        <w:t xml:space="preserve">4. File uploads are multipart, and PDF-only</w:t>
+        <w:t xml:space="preserve">ADMIN is itself two different dashboards, not one — check GET /auth/me's bootstrapAdmin flag. The bootstrap admin manages ALL schools/admins (school create/delete, the deletion-request review queue); a regular admin only ever sees their own school and has no delete button at all, only a "request deletion" one. Don't build a single generic "admin" screen that tries to cover both.</w:t>
       </w:r>
     </w:p>
     <w:p>
@@ -28284,7 +28334,15 @@
         </w:numPr>
       </w:pPr>
       <w:r>
-        <w:t xml:space="preserve">Only the file endpoints take multipart/form-data: lesson-note attachments (upload and replace) and course resources (POST /resources/upload, PUT /resources/{id}/file). Every other endpoint in this API is JSON.</w:t>
+        <w:t xml:space="preserve">Remember bookings are instructor-initiated — don't build a student-facing "book a lesson" button; build an instructor-facing "schedule a lesson for my student" flow instead.</w:t>
+      </w:r>
+    </w:p>
+    <w:p>
+      <w:pPr>
+        <w:pStyle w:val="Heading2"/>
+      </w:pPr>
+      <w:r>
+        <w:t xml:space="preserve">4. File uploads are multipart, and PDF-only</w:t>
       </w:r>
     </w:p>
     <w:p>
@@ -28296,15 +28354,7 @@
         </w:numPr>
       </w:pPr>
       <w:r>
-        <w:t xml:space="preserve">50 MB max, PDF only, enforced server-side — validate client-side too for a faster error message, but don't rely on client-side validation alone.</w:t>
-      </w:r>
-    </w:p>
-    <w:p>
-      <w:pPr>
-        <w:pStyle w:val="Heading2"/>
-      </w:pPr>
-      <w:r>
-        <w:t xml:space="preserve">5. Multi-step flows the frontend orchestrates</w:t>
+        <w:t xml:space="preserve">Only the file endpoints take multipart/form-data: lesson-note attachments (upload and replace) and course resources (POST /resources/upload, PUT /resources/{id}/file). Every other endpoint in this API is JSON.</w:t>
       </w:r>
     </w:p>
     <w:p>
@@ -28316,7 +28366,15 @@
         </w:numPr>
       </w:pPr>
       <w:r>
-        <w:t xml:space="preserve">"Instructor books a lesson": needs the student's StudentProfile.id (populate the picker from GET /students/school/{schoolId} using the instructor's own schoolId — no need to make the instructor type a raw student ID) and the instructor's own InstructorProfile.id (from /auth/me), plus optionally a vehicle ID from a vehicle-list call. There's no single "book by student email" convenience endpoint.</w:t>
+        <w:t xml:space="preserve">50 MB max, PDF only, enforced server-side — validate client-side too for a faster error message, but don't rely on client-side validation alone.</w:t>
+      </w:r>
+    </w:p>
+    <w:p>
+      <w:pPr>
+        <w:pStyle w:val="Heading2"/>
+      </w:pPr>
+      <w:r>
+        <w:t xml:space="preserve">5. Multi-step flows the frontend orchestrates</w:t>
       </w:r>
     </w:p>
     <w:p>
@@ -28328,7 +28386,7 @@
         </w:numPr>
       </w:pPr>
       <w:r>
-        <w:t xml:space="preserve">"Student checks license progress": GET /progress/license/students/{studentId} using their own cached studentProfileId.</w:t>
+        <w:t xml:space="preserve">"Instructor books a lesson": needs the student's StudentProfile.id (populate the picker from GET /students/school/{schoolId} using the instructor's own schoolId — no need to make the instructor type a raw student ID) and the instructor's own InstructorProfile.id (from /auth/me), plus optionally a vehicle ID from a vehicle-list call. There's no single "book by student email" convenience endpoint.</w:t>
       </w:r>
     </w:p>
     <w:p>
@@ -28340,15 +28398,7 @@
         </w:numPr>
       </w:pPr>
       <w:r>
-        <w:t xml:space="preserve">"Instructor plans a route for today's lesson": needs an existing bookingId first (create/confirm the booking, then generate the route against it).</w:t>
-      </w:r>
-    </w:p>
-    <w:p>
-      <w:pPr>
-        <w:pStyle w:val="Heading2"/>
-      </w:pPr>
-      <w:r>
-        <w:t xml:space="preserve">6. Quiz-taking UX</w:t>
+        <w:t xml:space="preserve">"Student checks license progress": GET /progress/license/students/{studentId} using their own cached studentProfileId.</w:t>
       </w:r>
     </w:p>
     <w:p>
@@ -28360,7 +28410,15 @@
         </w:numPr>
       </w:pPr>
       <w:r>
-        <w:t xml:space="preserve">Fetching a quiz for a student to take: GET /quizzes/{id} with forStudent=true (or just omit the parameter, that's the default) — correct answers are stripped.</w:t>
+        <w:t xml:space="preserve">"Instructor plans a route for today's lesson": needs an existing bookingId first (create/confirm the booking, then generate the route against it).</w:t>
+      </w:r>
+    </w:p>
+    <w:p>
+      <w:pPr>
+        <w:pStyle w:val="Heading2"/>
+      </w:pPr>
+      <w:r>
+        <w:t xml:space="preserve">6. Quiz-taking UX</w:t>
       </w:r>
     </w:p>
     <w:p>
@@ -28372,7 +28430,7 @@
         </w:numPr>
       </w:pPr>
       <w:r>
-        <w:t xml:space="preserve">An instructor/admin authoring or reviewing a quiz should explicitly pass forStudent=false to see answers.</w:t>
+        <w:t xml:space="preserve">Fetching a quiz for a student to take: GET /quizzes/{id} with forStudent=true (or just omit the parameter, that's the default) — correct answers are stripped.</w:t>
       </w:r>
     </w:p>
     <w:p>
@@ -28384,15 +28442,7 @@
         </w:numPr>
       </w:pPr>
       <w:r>
-        <w:t xml:space="preserve">Submitting is a separate call (POST .../submit); there's a maxAttempts limit enforced server-side — disable the submit button client-side once the student has exhausted their attempts (check attemptNumber from prior submissions) to avoid a confusing 400.</w:t>
-      </w:r>
-    </w:p>
-    <w:p>
-      <w:pPr>
-        <w:pStyle w:val="Heading2"/>
-      </w:pPr>
-      <w:r>
-        <w:t xml:space="preserve">7. Error handling</w:t>
+        <w:t xml:space="preserve">An instructor/admin authoring or reviewing a quiz should explicitly pass forStudent=false to see answers.</w:t>
       </w:r>
     </w:p>
     <w:p>
@@ -28404,7 +28454,15 @@
         </w:numPr>
       </w:pPr>
       <w:r>
-        <w:t xml:space="preserve">Check the success boolean in every response body, not just the HTTP status.</w:t>
+        <w:t xml:space="preserve">Submitting is a separate call (POST .../submit); there's a maxAttempts limit enforced server-side — disable the submit button client-side once the student has exhausted their attempts (check attemptNumber from prior submissions) to avoid a confusing 400.</w:t>
+      </w:r>
+    </w:p>
+    <w:p>
+      <w:pPr>
+        <w:pStyle w:val="Heading2"/>
+      </w:pPr>
+      <w:r>
+        <w:t xml:space="preserve">7. Error handling</w:t>
       </w:r>
     </w:p>
     <w:p>
@@ -28416,15 +28474,7 @@
         </w:numPr>
       </w:pPr>
       <w:r>
-        <w:t xml:space="preserve">Surface the message field to the user on failure — these are written to be human-readable (e.g. "Instructor and student must belong to the same school"), not generic codes.</w:t>
-      </w:r>
-    </w:p>
-    <w:p>
-      <w:pPr>
-        <w:pStyle w:val="Heading2"/>
-      </w:pPr>
-      <w:r>
-        <w:t xml:space="preserve">8. CORS</w:t>
+        <w:t xml:space="preserve">Check the success boolean in every response body, not just the HTTP status.</w:t>
       </w:r>
     </w:p>
     <w:p>
@@ -28436,7 +28486,7 @@
         </w:numPr>
       </w:pPr>
       <w:r>
-        <w:t xml:space="preserve">The backend only accepts requests from origins listed in its CORS_ALLOWED_ORIGINS config — currently set to localhost dev origins. Once the frontend has a real deployed URL, that's a BACKEND-side config change (an environment variable + a redeploy) that the backend team needs to make — it isn't something the frontend can work around on its own.</w:t>
+        <w:t xml:space="preserve">Surface the message field to the user on failure — these are written to be human-readable (e.g. "Instructor and student must belong to the same school"), not generic codes.</w:t>
       </w:r>
     </w:p>
     <w:p>
@@ -28444,7 +28494,7 @@
         <w:pStyle w:val="Heading2"/>
       </w:pPr>
       <w:r>
-        <w:t xml:space="preserve">9. Environment configuration</w:t>
+        <w:t xml:space="preserve">8. CORS</w:t>
       </w:r>
     </w:p>
     <w:p>
@@ -28456,7 +28506,7 @@
         </w:numPr>
       </w:pPr>
       <w:r>
-        <w:t xml:space="preserve">The only thing the frontend needs to configure is the backend's base URL. All third-party credentials (Cloudinary, the mail relay, the routing service, error tracking) are server-side only — no API keys belong in frontend code or environment config for this integration.</w:t>
+        <w:t xml:space="preserve">The backend only accepts requests from origins listed in its CORS_ALLOWED_ORIGINS config — currently set to localhost dev origins. Once the frontend has a real deployed URL, that's a BACKEND-side config change (an environment variable + a redeploy) that the backend team needs to make — it isn't something the frontend can work around on its own.</w:t>
       </w:r>
     </w:p>
     <w:p>
@@ -28464,7 +28514,7 @@
         <w:pStyle w:val="Heading2"/>
       </w:pPr>
       <w:r>
-        <w:t xml:space="preserve">10. Gamification and driving-assessment UI (student-only)</w:t>
+        <w:t xml:space="preserve">9. Environment configuration</w:t>
       </w:r>
     </w:p>
     <w:p>
@@ -28476,7 +28526,15 @@
         </w:numPr>
       </w:pPr>
       <w:r>
-        <w:t xml:space="preserve">Gamification is STUDENT-facing only — don't build any gamification UI in the instructor or admin experience beyond the read-only "view a student's summary" screen (GET /gamification/students/{studentId}).</w:t>
+        <w:t xml:space="preserve">The only thing the frontend needs to configure is the backend's base URL. All third-party credentials (Cloudinary, the mail relay, the routing service, error tracking) are server-side only — no API keys belong in frontend code or environment config for this integration.</w:t>
+      </w:r>
+    </w:p>
+    <w:p>
+      <w:pPr>
+        <w:pStyle w:val="Heading2"/>
+      </w:pPr>
+      <w:r>
+        <w:t xml:space="preserve">10. Gamification and driving-assessment UI (student-only)</w:t>
       </w:r>
     </w:p>
     <w:p>
@@ -28488,7 +28546,7 @@
         </w:numPr>
       </w:pPr>
       <w:r>
-        <w:t xml:space="preserve">Points/streak/badges update as a side effect of other actions (booking completed, quiz passed, assessment passed) — there's no "refresh my points" action to build, just re-fetch GET /gamification/me after those actions if you want the UI to reflect the change immediately.</w:t>
+        <w:t xml:space="preserve">Gamification is STUDENT-facing only — don't build any gamification UI in the instructor or admin experience beyond the read-only "view a student's summary" screen (GET /gamification/students/{studentId}).</w:t>
       </w:r>
     </w:p>
     <w:p>
@@ -28500,15 +28558,7 @@
         </w:numPr>
       </w:pPr>
       <w:r>
-        <w:t xml:space="preserve">Driving assessments are instructor-authored, like lesson notes, but are NOT editable beyond the feedback text (no score/result edit, no delete) — don't reuse the lesson-note edit/delete UI pattern for assessments.</w:t>
-      </w:r>
-    </w:p>
-    <w:p>
-      <w:pPr>
-        <w:pStyle w:val="Heading2"/>
-      </w:pPr>
-      <w:r>
-        <w:t xml:space="preserve">11. Messaging screens</w:t>
+        <w:t xml:space="preserve">Points/streak/badges update as a side effect of other actions (booking completed, quiz passed, assessment passed) — there's no "refresh my points" action to build, just re-fetch GET /gamification/me after those actions if you want the UI to reflect the change immediately.</w:t>
       </w:r>
     </w:p>
     <w:p>
@@ -28520,7 +28570,15 @@
         </w:numPr>
       </w:pPr>
       <w:r>
-        <w:t xml:space="preserve">Student and instructor both need an inbox (GET /conversations), a thread view (GET /conversations/{id}/messages, newest first) and a "new conversation" picker fed by GET /conversations/contacts.</w:t>
+        <w:t xml:space="preserve">Driving assessments are instructor-authored, like lesson notes, but are NOT editable beyond the feedback text (no score/result edit, no delete) — don't reuse the lesson-note edit/delete UI pattern for assessments.</w:t>
+      </w:r>
+    </w:p>
+    <w:p>
+      <w:pPr>
+        <w:pStyle w:val="Heading2"/>
+      </w:pPr>
+      <w:r>
+        <w:t xml:space="preserve">11. Messaging screens</w:t>
       </w:r>
     </w:p>
     <w:p>
@@ -28532,7 +28590,7 @@
         </w:numPr>
       </w:pPr>
       <w:r>
-        <w:t xml:space="preserve">Update the inbox/thread from the realtime WebSocket events (see "Realtime updates"), and call POST /conversations/{id}/read when a thread is opened.</w:t>
+        <w:t xml:space="preserve">Student and instructor both need an inbox (GET /conversations), a thread view (GET /conversations/{id}/messages, newest first) and a "new conversation" picker fed by GET /conversations/contacts.</w:t>
       </w:r>
     </w:p>
     <w:p>
@@ -28544,15 +28602,7 @@
         </w:numPr>
       </w:pPr>
       <w:r>
-        <w:t xml:space="preserve">Instructors also need an "announce to all my students" form (POST /announcements); everyone gets an announcements list (GET /announcements).</w:t>
-      </w:r>
-    </w:p>
-    <w:p>
-      <w:pPr>
-        <w:pStyle w:val="Heading2"/>
-      </w:pPr>
-      <w:r>
-        <w:t xml:space="preserve">12. Course materials (PDF) screens</w:t>
+        <w:t xml:space="preserve">Update the inbox/thread from the realtime WebSocket events (see "Realtime updates"), and call POST /conversations/{id}/read when a thread is opened.</w:t>
       </w:r>
     </w:p>
     <w:p>
@@ -28564,7 +28614,15 @@
         </w:numPr>
       </w:pPr>
       <w:r>
-        <w:t xml:space="preserve">Instructor/admin: on each video lesson of their course, an "Add material" upload (file picker covering device + cloud storage, plus drag-and-drop), and per item: rename, replace file, delete (with a confirmation).</w:t>
+        <w:t xml:space="preserve">Instructors also need an "announce to all my students" form (POST /announcements); everyone gets an announcements list (GET /announcements).</w:t>
+      </w:r>
+    </w:p>
+    <w:p>
+      <w:pPr>
+        <w:pStyle w:val="Heading2"/>
+      </w:pPr>
+      <w:r>
+        <w:t xml:space="preserve">12. Course materials (PDF) screens</w:t>
       </w:r>
     </w:p>
     <w:p>
@@ -28576,7 +28634,111 @@
         </w:numPr>
       </w:pPr>
       <w:r>
+        <w:t xml:space="preserve">Instructor/admin: on each video lesson of their course, an "Add material" upload (file picker covering device + cloud storage, plus drag-and-drop), and per item: rename, replace file, delete (with a confirmation).</w:t>
+      </w:r>
+    </w:p>
+    <w:p>
+      <w:pPr>
+        <w:pStyle w:val="ListParagraph"/>
+        <w:numPr>
+          <w:ilvl w:val="0"/>
+          <w:numId w:val="1"/>
+        </w:numPr>
+      </w:pPr>
+      <w:r>
         <w:t xml:space="preserve">Student: the lesson's materials list with "View" (opens the PDF, ?inline=true) and "Download" buttons - both fetch with the access token (see GET /resources/{id}/download).</w:t>
+      </w:r>
+    </w:p>
+    <w:p>
+      <w:pPr>
+        <w:pStyle w:val="Heading2"/>
+      </w:pPr>
+      <w:r>
+        <w:t xml:space="preserve">13. Account verification screens</w:t>
+      </w:r>
+    </w:p>
+    <w:p>
+      <w:pPr>
+        <w:pStyle w:val="ListParagraph"/>
+        <w:numPr>
+          <w:ilvl w:val="0"/>
+          <w:numId w:val="1"/>
+        </w:numPr>
+      </w:pPr>
+      <w:r>
+        <w:t xml:space="preserve">After login: if the response has verificationRequired=true, go to a "Verify your account" screen instead of the app (full flow and error cases in the Authentication section).</w:t>
+      </w:r>
+    </w:p>
+    <w:p>
+      <w:pPr>
+        <w:pStyle w:val="ListParagraph"/>
+        <w:numPr>
+          <w:ilvl w:val="0"/>
+          <w:numId w:val="1"/>
+        </w:numPr>
+      </w:pPr>
+      <w:r>
+        <w:t xml:space="preserve">Channel choice: show EMAIL always, WHATSAPP only when listed, with maskedEmail / maskedPhone so the user knows where the code goes.</w:t>
+      </w:r>
+    </w:p>
+    <w:p>
+      <w:pPr>
+        <w:pStyle w:val="ListParagraph"/>
+        <w:numPr>
+          <w:ilvl w:val="0"/>
+          <w:numId w:val="1"/>
+        </w:numPr>
+      </w:pPr>
+      <w:r>
+        <w:t xml:space="preserve">Code entry: a 6-digit numeric input (inputmode=numeric, autocomplete=one-time-code so phones can auto-fill it), a Resend button disabled for the Retry-After seconds after each send, and the server's message shown on a wrong code.</w:t>
+      </w:r>
+    </w:p>
+    <w:p>
+      <w:pPr>
+        <w:pStyle w:val="ListParagraph"/>
+        <w:numPr>
+          <w:ilvl w:val="0"/>
+          <w:numId w:val="1"/>
+        </w:numPr>
+      </w:pPr>
+      <w:r>
+        <w:t xml:space="preserve">On success the confirm response IS the login response - store the tokens and continue exactly as after a normal login (GET /auth/me, route by role).</w:t>
+      </w:r>
+    </w:p>
+    <w:p>
+      <w:pPr>
+        <w:pStyle w:val="ListParagraph"/>
+        <w:numPr>
+          <w:ilvl w:val="0"/>
+          <w:numId w:val="1"/>
+        </w:numPr>
+      </w:pPr>
+      <w:r>
+        <w:t xml:space="preserve">Keep challengeId in memory only; on "please log in again" or after 15 minutes, send the user back to the login form.</w:t>
+      </w:r>
+    </w:p>
+    <w:p>
+      <w:pPr>
+        <w:pStyle w:val="ListParagraph"/>
+        <w:numPr>
+          <w:ilvl w:val="0"/>
+          <w:numId w:val="1"/>
+        </w:numPr>
+      </w:pPr>
+      <w:r>
+        <w:t xml:space="preserve">Wherever a phone number is entered (the register form, profile edit), collect it with the country code (+233...) - it's what makes WhatsApp codes possible.</w:t>
+      </w:r>
+    </w:p>
+    <w:p>
+      <w:pPr>
+        <w:pStyle w:val="ListParagraph"/>
+        <w:numPr>
+          <w:ilvl w:val="0"/>
+          <w:numId w:val="1"/>
+        </w:numPr>
+      </w:pPr>
+      <w:r>
+        <w:t xml:space="preserve">Verification may be switched off on the backend for now (login then just returns tokens). Build and keep this flow anyway - it turns on without a frontend release.</w:t>
       </w:r>
     </w:p>
     <w:sectPr>

</xml_diff>

<commit_message>
Document every Render environment variable in one checklist
Adds a Render environment checklist to DEPLOYMENT.md grouped by what each
variable is for (required, live features, first deploy, optional, never
set) and fills the gaps: token and reset-link lifetimes, GCS storage,
and keeping BOOTSTRAP_ADMIN_EMAIL set permanently. .env.example gains
TWILIO_FROM_NUMBER and RATE_LIMIT_CLIENT_IP_HEADER, and the frontend
guide now names the live base and WebSocket URLs.
</commit_message>
<xml_diff>
--- a/project-with-changes/docs/Frontend_API_Guide.docx
+++ b/project-with-changes/docs/Frontend_API_Guide.docx
@@ -34,7 +34,12 @@
           <w:rFonts w:ascii="Consolas" w:hAnsi="Consolas"/>
           <w:sz w:val="18"/>
         </w:rPr>
-        <w:t xml:space="preserve">https://&lt;your-service-name&gt;.onrender.com/api/v1</w:t>
+        <w:t xml:space="preserve">https://driving-school-backend-1hjt.onrender.com/api/v1</w:t>
+      </w:r>
+    </w:p>
+    <w:p>
+      <w:r>
+        <w:t xml:space="preserve">That's the live backend on Render. Locally it's http://localhost:8080/api/v1. When the company gets its own domain the backend may move to e.g. https://api.&lt;domain&gt; - keep the base URL in ONE frontend config value so that's a one-line change.</w:t>
       </w:r>
     </w:p>
     <w:p>
@@ -26038,7 +26043,7 @@
         </w:numPr>
       </w:pPr>
       <w:r>
-        <w:t xml:space="preserve">URL: wss://&lt;your-backend-host&gt;/ws (ws://localhost:&lt;PORT&gt;/ws locally). The page's origin must be one of CORS_ALLOWED_ORIGINS.</w:t>
+        <w:t xml:space="preserve">URL: wss://driving-school-backend-1hjt.onrender.com/ws (ws://localhost:8080/ws locally) - derive it from the same base-URL config value. The page's origin must be one of CORS_ALLOWED_ORIGINS.</w:t>
       </w:r>
     </w:p>
     <w:p>

</xml_diff>

<commit_message>
Strip active content from uploaded PDFs instead of rejecting them
The byte search for /OpenAction and /AA refused ordinary Word, Google
Docs and LaTeX exports, whose open actions just go to a page or set the
view, and could not see anything inside compressed object streams.
Parse with PDFBox instead, remove only what can run code or reach
outside the document, and store the cleaned copy.
</commit_message>
<xml_diff>
--- a/project-with-changes/docs/Frontend_API_Guide.docx
+++ b/project-with-changes/docs/Frontend_API_Guide.docx
@@ -12388,7 +12388,19 @@
         </w:numPr>
       </w:pPr>
       <w:r>
-        <w:t xml:space="preserve">Validate client-side before uploading (PDF only, 50 MB max) for a fast error message, and show upload progress - the server enforces the same rules and also rejects files that aren't really PDFs or that contain active content (scripts, embedded files).</w:t>
+        <w:t xml:space="preserve">Validate client-side before uploading (PDF only, 50 MB max) for a fast error message, and show upload progress - the server enforces the same rules and rejects files that aren't really PDFs, or that are password-protected.</w:t>
+      </w:r>
+    </w:p>
+    <w:p>
+      <w:pPr>
+        <w:pStyle w:val="ListParagraph"/>
+        <w:numPr>
+          <w:ilvl w:val="0"/>
+          <w:numId w:val="1"/>
+        </w:numPr>
+      </w:pPr>
+      <w:r>
+        <w:t xml:space="preserve">Ordinary PDFs from Word, Google Docs, LaTeX, scanners etc. upload as-is. If a PDF contains active content (JavaScript, launch/submit actions, embedded files, media), the upload still succeeds and the server stores a cleaned copy with only those parts removed - the text and pages are untouched. fileSize in the response is the size of the stored copy.</w:t>
       </w:r>
     </w:p>
     <w:p>
@@ -12911,7 +12923,7 @@
         </w:numPr>
       </w:pPr>
       <w:r>
-        <w:t xml:space="preserve">multipart/form-data, not JSON. 413 if the file is over 50 MB; 400 if the file part is missing. 400 with a message if the file isn't a valid PDF, is too large, or the caller doesn't own the lesson's course.</w:t>
+        <w:t xml:space="preserve">multipart/form-data, not JSON. 413 if the file is over 50 MB; 400 if the file part is missing. 400 with a message if the file isn't a valid PDF or is password-protected; 403 if the caller doesn't own the lesson's course. Active content is stripped, not rejected (see above).</w:t>
       </w:r>
     </w:p>
     <w:p/>

</xml_diff>

<commit_message>
Limit how long a login lasts: remember me and a 2-hour idle timeout
A login used to stay refreshable for 7 days on any computer. Sessions now
end after 2 hours without a refresh and last at most 12 hours, or 7 days
with "keep me signed in"; admin sessions at most a day. The session's
start and choice travel inside the refresh token, and tokens issued
before this change keep working.
</commit_message>
<xml_diff>
--- a/project-with-changes/docs/Frontend_API_Guide.docx
+++ b/project-with-changes/docs/Frontend_API_Guide.docx
@@ -1044,6 +1044,52 @@
           </w:p>
         </w:tc>
       </w:tr>
+      <w:tr>
+        <w:tc>
+          <w:tcPr>
+            <w:vAlign w:val="center"/>
+          </w:tcPr>
+          <w:p>
+            <w:pPr/>
+            <w:r>
+              <w:t xml:space="preserve">rememberMe</w:t>
+            </w:r>
+          </w:p>
+        </w:tc>
+        <w:tc>
+          <w:tcPr>
+            <w:vAlign w:val="center"/>
+          </w:tcPr>
+          <w:p>
+            <w:pPr/>
+            <w:r>
+              <w:t xml:space="preserve">boolean</w:t>
+            </w:r>
+          </w:p>
+        </w:tc>
+        <w:tc>
+          <w:tcPr>
+            <w:vAlign w:val="center"/>
+          </w:tcPr>
+          <w:p>
+            <w:pPr/>
+            <w:r>
+              <w:t xml:space="preserve">no</w:t>
+            </w:r>
+          </w:p>
+        </w:tc>
+        <w:tc>
+          <w:tcPr>
+            <w:vAlign w:val="center"/>
+          </w:tcPr>
+          <w:p>
+            <w:pPr/>
+            <w:r>
+              <w:t xml:space="preserve">the "Keep me signed in" checkbox - see Sessions below</w:t>
+            </w:r>
+          </w:p>
+        </w:tc>
+      </w:tr>
     </w:tbl>
     <w:p/>
     <w:p>
@@ -1514,6 +1560,74 @@
       </w:r>
     </w:p>
     <w:p/>
+    <w:p>
+      <w:pPr>
+        <w:pStyle w:val="Heading2"/>
+      </w:pPr>
+      <w:r>
+        <w:t xml:space="preserve">Sessions: how long a login lasts</w:t>
+      </w:r>
+    </w:p>
+    <w:p>
+      <w:pPr>
+        <w:pStyle w:val="ListParagraph"/>
+        <w:numPr>
+          <w:ilvl w:val="0"/>
+          <w:numId w:val="1"/>
+        </w:numPr>
+      </w:pPr>
+      <w:r>
+        <w:t xml:space="preserve">Access tokens last 15 minutes; refresh them with POST /auth/refresh-token (every refresh returns a NEW refresh token - always store the latest one).</w:t>
+      </w:r>
+    </w:p>
+    <w:p>
+      <w:pPr>
+        <w:pStyle w:val="ListParagraph"/>
+        <w:numPr>
+          <w:ilvl w:val="0"/>
+          <w:numId w:val="1"/>
+        </w:numPr>
+      </w:pPr>
+      <w:r>
+        <w:t xml:space="preserve">Inactivity: a session that isn't refreshed for 2 hours ends - the refresh token expires and the user must log in again. Refresh only when the user actually does something (e.g. on a 401 from a real request); pause background polling when the tab is hidden, or an idle open tab will keep the session alive.</w:t>
+      </w:r>
+    </w:p>
+    <w:p>
+      <w:pPr>
+        <w:pStyle w:val="ListParagraph"/>
+        <w:numPr>
+          <w:ilvl w:val="0"/>
+          <w:numId w:val="1"/>
+        </w:numPr>
+      </w:pPr>
+      <w:r>
+        <w:t xml:space="preserve">Maximum length, however active: 12 hours without "Keep me signed in", 7 days with it (rememberMe: true on login, or on /auth/verification/confirm). Admin sessions never last more than 1 day.</w:t>
+      </w:r>
+    </w:p>
+    <w:p>
+      <w:pPr>
+        <w:pStyle w:val="ListParagraph"/>
+        <w:numPr>
+          <w:ilvl w:val="0"/>
+          <w:numId w:val="1"/>
+        </w:numPr>
+      </w:pPr>
+      <w:r>
+        <w:t xml:space="preserve">When the refresh call answers 401, clear the tokens and show the login screen with a short "Your session has ended" message.</w:t>
+      </w:r>
+    </w:p>
+    <w:p>
+      <w:pPr>
+        <w:pStyle w:val="ListParagraph"/>
+        <w:numPr>
+          <w:ilvl w:val="0"/>
+          <w:numId w:val="1"/>
+        </w:numPr>
+      </w:pPr>
+      <w:r>
+        <w:t xml:space="preserve">Without rememberMe, keep the refresh token in sessionStorage (gone when the browser closes) rather than localStorage - that's what makes "not remembered" mean signed out on a shared school computer.</w:t>
+      </w:r>
+    </w:p>
     <w:p>
       <w:pPr>
         <w:pStyle w:val="Heading2"/>
@@ -2298,6 +2412,52 @@
           </w:p>
         </w:tc>
       </w:tr>
+      <w:tr>
+        <w:tc>
+          <w:tcPr>
+            <w:vAlign w:val="center"/>
+          </w:tcPr>
+          <w:p>
+            <w:pPr/>
+            <w:r>
+              <w:t xml:space="preserve">rememberMe</w:t>
+            </w:r>
+          </w:p>
+        </w:tc>
+        <w:tc>
+          <w:tcPr>
+            <w:vAlign w:val="center"/>
+          </w:tcPr>
+          <w:p>
+            <w:pPr/>
+            <w:r>
+              <w:t xml:space="preserve">boolean</w:t>
+            </w:r>
+          </w:p>
+        </w:tc>
+        <w:tc>
+          <w:tcPr>
+            <w:vAlign w:val="center"/>
+          </w:tcPr>
+          <w:p>
+            <w:pPr/>
+            <w:r>
+              <w:t xml:space="preserve">no</w:t>
+            </w:r>
+          </w:p>
+        </w:tc>
+        <w:tc>
+          <w:tcPr>
+            <w:vAlign w:val="center"/>
+          </w:tcPr>
+          <w:p>
+            <w:pPr/>
+            <w:r>
+              <w:t xml:space="preserve">repeat the login form's "Keep me signed in" choice</w:t>
+            </w:r>
+          </w:p>
+        </w:tc>
+      </w:tr>
     </w:tbl>
     <w:p/>
     <w:p>
@@ -31835,7 +31995,7 @@
         </w:numPr>
       </w:pPr>
       <w:r>
-        <w:t xml:space="preserve">Store accessToken and refreshToken after login (e.g. in memory + a secure storage mechanism appropriate for your platform — avoid plain localStorage for the refresh token if you can help it, given it's valid for 7 days).</w:t>
+        <w:t xml:space="preserve">Store accessToken and refreshToken after login: with "Keep me signed in" the refresh token may live in localStorage, without it use sessionStorage. Replace the stored refresh token after every refresh. Sessions end after 2 hours without a refresh and after 12 hours / 7 days at most (admins 1 day) - see "Sessions" in the Authentication section.</w:t>
       </w:r>
     </w:p>
     <w:p>

</xml_diff>

<commit_message>
Mark students present automatically at school; record lesson type and topic
A student who checks in within the school's area is now present straight
away. One who can't be placed at the school is recorded anyway, awaiting
an instructor's confirmation, with the reason kept. Students must say
whether it's a practical or theory lesson and can add the topic, which
is stored with the attendance and shown on the day sheet.
</commit_message>
<xml_diff>
--- a/project-with-changes/docs/Frontend_API_Guide.docx
+++ b/project-with-changes/docs/Frontend_API_Guide.docx
@@ -27293,7 +27293,7 @@
     </w:p>
     <w:p>
       <w:r>
-        <w:t xml:space="preserve">Students and instructors check in once a day from their phone; the server checks they are at the school. A student's check-in waits for an instructor or the admin to confirm it; an instructor's counts straight away. Staff can record or correct any day by hand, see a day's list (including who didn't check in), and download printable Excel sheets.</w:t>
+        <w:t xml:space="preserve">Students and instructors check in once a day from their phone, and students say whether it's a practical or theory lesson (plus an optional topic). A student inside the school area is marked present automatically; a student who can't be placed at the school is still recorded, but waits for an instructor (or the admin) to confirm. Instructors must be at the school to check in. Staff can record or correct any day by hand, see a day's list (including who didn't check in), and download printable Excel sheets.</w:t>
       </w:r>
     </w:p>
     <w:p>
@@ -27317,7 +27317,31 @@
         </w:numPr>
       </w:pPr>
       <w:r>
-        <w:t xml:space="preserve">Statuses: PENDING_CONFIRMATION (student checked in, not confirmed yet), PRESENT, LATE, ABSENT, and in day lists only NOT_CHECKED_IN (no record yet today - from tomorrow on that day shows as ABSENT).</w:t>
+        <w:t xml:space="preserve">Statuses: PRESENT, PENDING_CONFIRMATION (a student's check-in from outside the school area - see confirmationReason - waiting for an instructor), LATE, ABSENT, and in day lists only NOT_CHECKED_IN (no record yet today - from tomorrow on that day shows as ABSENT).</w:t>
+      </w:r>
+    </w:p>
+    <w:p>
+      <w:pPr>
+        <w:pStyle w:val="ListParagraph"/>
+        <w:numPr>
+          <w:ilvl w:val="0"/>
+          <w:numId w:val="1"/>
+        </w:numPr>
+      </w:pPr>
+      <w:r>
+        <w:t xml:space="preserve">confirmationReason (only on check-ins that needed confirming): OUTSIDE_SCHOOL_AREA, LOCATION_NOT_PRECISE (the phone's fix was worse than 100 m) or SCHOOL_LOCATION_NOT_SET. It stays on the record after confirmation, for the history.</w:t>
+      </w:r>
+    </w:p>
+    <w:p>
+      <w:pPr>
+        <w:pStyle w:val="ListParagraph"/>
+        <w:numPr>
+          <w:ilvl w:val="0"/>
+          <w:numId w:val="1"/>
+        </w:numPr>
+      </w:pPr>
+      <w:r>
+        <w:t xml:space="preserve">lessonType: PRACTICAL or THEORY (always set on a student's check-in); topic: optional text.</w:t>
       </w:r>
     </w:p>
     <w:p>
@@ -28122,6 +28146,98 @@
           </w:p>
         </w:tc>
       </w:tr>
+      <w:tr>
+        <w:tc>
+          <w:tcPr>
+            <w:vAlign w:val="center"/>
+          </w:tcPr>
+          <w:p>
+            <w:pPr/>
+            <w:r>
+              <w:t xml:space="preserve">lessonType</w:t>
+            </w:r>
+          </w:p>
+        </w:tc>
+        <w:tc>
+          <w:tcPr>
+            <w:vAlign w:val="center"/>
+          </w:tcPr>
+          <w:p>
+            <w:pPr/>
+            <w:r>
+              <w:t xml:space="preserve">PRACTICAL | THEORY</w:t>
+            </w:r>
+          </w:p>
+        </w:tc>
+        <w:tc>
+          <w:tcPr>
+            <w:vAlign w:val="center"/>
+          </w:tcPr>
+          <w:p>
+            <w:pPr/>
+            <w:r>
+              <w:t xml:space="preserve">yes for students</w:t>
+            </w:r>
+          </w:p>
+        </w:tc>
+        <w:tc>
+          <w:tcPr>
+            <w:vAlign w:val="center"/>
+          </w:tcPr>
+          <w:p>
+            <w:pPr/>
+            <w:r>
+              <w:t xml:space="preserve">the radio button - 400 if a student leaves it out; instructors can omit it</w:t>
+            </w:r>
+          </w:p>
+        </w:tc>
+      </w:tr>
+      <w:tr>
+        <w:tc>
+          <w:tcPr>
+            <w:vAlign w:val="center"/>
+          </w:tcPr>
+          <w:p>
+            <w:pPr/>
+            <w:r>
+              <w:t xml:space="preserve">topic</w:t>
+            </w:r>
+          </w:p>
+        </w:tc>
+        <w:tc>
+          <w:tcPr>
+            <w:vAlign w:val="center"/>
+          </w:tcPr>
+          <w:p>
+            <w:pPr/>
+            <w:r>
+              <w:t xml:space="preserve">string</w:t>
+            </w:r>
+          </w:p>
+        </w:tc>
+        <w:tc>
+          <w:tcPr>
+            <w:vAlign w:val="center"/>
+          </w:tcPr>
+          <w:p>
+            <w:pPr/>
+            <w:r>
+              <w:t xml:space="preserve">no</w:t>
+            </w:r>
+          </w:p>
+        </w:tc>
+        <w:tc>
+          <w:tcPr>
+            <w:vAlign w:val="center"/>
+          </w:tcPr>
+          <w:p>
+            <w:pPr/>
+            <w:r>
+              <w:t xml:space="preserve">max 200, e.g. "Reverse parking" or "Road signs"</w:t>
+            </w:r>
+          </w:p>
+        </w:tc>
+      </w:tr>
     </w:tbl>
     <w:p/>
     <w:p>
@@ -28181,7 +28297,33 @@
           <w:rFonts w:ascii="Consolas" w:hAnsi="Consolas"/>
           <w:sz w:val="18"/>
         </w:rPr>
-        <w:t xml:space="preserve">  "accuracyMeters": 14</w:t>
+        <w:t xml:space="preserve">  "accuracyMeters": 14,</w:t>
+      </w:r>
+    </w:p>
+    <w:p>
+      <w:pPr>
+        <w:pStyle w:val="Code"/>
+        <w:shd w:val="clear" w:fill="F3F3F3"/>
+      </w:pPr>
+      <w:r>
+        <w:rPr>
+          <w:rFonts w:ascii="Consolas" w:hAnsi="Consolas"/>
+          <w:sz w:val="18"/>
+        </w:rPr>
+        <w:t xml:space="preserve">  "lessonType": "PRACTICAL",</w:t>
+      </w:r>
+    </w:p>
+    <w:p>
+      <w:pPr>
+        <w:pStyle w:val="Code"/>
+        <w:shd w:val="clear" w:fill="F3F3F3"/>
+      </w:pPr>
+      <w:r>
+        <w:rPr>
+          <w:rFonts w:ascii="Consolas" w:hAnsi="Consolas"/>
+          <w:sz w:val="18"/>
+        </w:rPr>
+        <w:t xml:space="preserve">  "topic": "Reverse parking"</w:t>
       </w:r>
     </w:p>
     <w:p>
@@ -28309,7 +28451,77 @@
           <w:p>
             <w:pPr/>
             <w:r>
-              <w:t xml:space="preserve">status PENDING_CONFIRMATION for a student, PRESENT for an instructor</w:t>
+              <w:t xml:space="preserve">status PRESENT when at the school; PENDING_CONFIRMATION for a student who isn't</w:t>
+            </w:r>
+          </w:p>
+        </w:tc>
+      </w:tr>
+      <w:tr>
+        <w:tc>
+          <w:tcPr>
+            <w:vAlign w:val="center"/>
+          </w:tcPr>
+          <w:p>
+            <w:pPr/>
+            <w:r>
+              <w:t xml:space="preserve">confirmationReason</w:t>
+            </w:r>
+          </w:p>
+        </w:tc>
+        <w:tc>
+          <w:tcPr>
+            <w:vAlign w:val="center"/>
+          </w:tcPr>
+          <w:p>
+            <w:pPr/>
+            <w:r>
+              <w:t xml:space="preserve">enum or absent</w:t>
+            </w:r>
+          </w:p>
+        </w:tc>
+        <w:tc>
+          <w:tcPr>
+            <w:vAlign w:val="center"/>
+          </w:tcPr>
+          <w:p>
+            <w:pPr/>
+            <w:r>
+              <w:t xml:space="preserve">why it needs confirming (see above)</w:t>
+            </w:r>
+          </w:p>
+        </w:tc>
+      </w:tr>
+      <w:tr>
+        <w:tc>
+          <w:tcPr>
+            <w:vAlign w:val="center"/>
+          </w:tcPr>
+          <w:p>
+            <w:pPr/>
+            <w:r>
+              <w:t xml:space="preserve">lessonType / topic</w:t>
+            </w:r>
+          </w:p>
+        </w:tc>
+        <w:tc>
+          <w:tcPr>
+            <w:vAlign w:val="center"/>
+          </w:tcPr>
+          <w:p>
+            <w:pPr/>
+            <w:r>
+              <w:t xml:space="preserve"/>
+            </w:r>
+          </w:p>
+        </w:tc>
+        <w:tc>
+          <w:tcPr>
+            <w:vAlign w:val="center"/>
+          </w:tcPr>
+          <w:p>
+            <w:pPr/>
+            <w:r>
+              <w:t xml:space="preserve">as sent</w:t>
             </w:r>
           </w:p>
         </w:tc>
@@ -28344,7 +28556,7 @@
           <w:p>
             <w:pPr/>
             <w:r>
-              <w:t xml:space="preserve">how far from the school, and the fix's precision</w:t>
+              <w:t xml:space="preserve">how far from the school (absent if the school has no location), and the fix's precision</w:t>
             </w:r>
           </w:p>
         </w:tc>
@@ -28380,7 +28592,7 @@
         </w:numPr>
       </w:pPr>
       <w:r>
-        <w:t xml:space="preserve">400 with data { accuracyMeters, maxAccuracyMeters } if accuracy is worse than 100 m - tell the user to turn on precise location / move outdoors and retry.</w:t>
+        <w:t xml:space="preserve">Student, status PRESENT: show "You're checked in". Status PENDING_CONFIRMATION: show "Checked in - an instructor needs to confirm it because you're about 420 m from school" (use confirmationReason and distanceMeters).</w:t>
       </w:r>
     </w:p>
     <w:p>
@@ -28392,7 +28604,7 @@
         </w:numPr>
       </w:pPr>
       <w:r>
-        <w:t xml:space="preserve">400 with data { distanceMeters, radiusMeters } if they're too far - show "You're about 420 m from school".</w:t>
+        <w:t xml:space="preserve">Instructors are rejected instead: 400 with data { accuracyMeters, maxAccuracyMeters } if accuracy is worse than 100 m, 400 with data { distanceMeters, radiusMeters } if too far, 400 if the school has no location yet.</w:t>
       </w:r>
     </w:p>
     <w:p>
@@ -29359,6 +29571,52 @@
           </w:p>
         </w:tc>
       </w:tr>
+      <w:tr>
+        <w:tc>
+          <w:tcPr>
+            <w:vAlign w:val="center"/>
+          </w:tcPr>
+          <w:p>
+            <w:pPr/>
+            <w:r>
+              <w:t xml:space="preserve">lessonType / topic</w:t>
+            </w:r>
+          </w:p>
+        </w:tc>
+        <w:tc>
+          <w:tcPr>
+            <w:vAlign w:val="center"/>
+          </w:tcPr>
+          <w:p>
+            <w:pPr/>
+            <w:r>
+              <w:t xml:space="preserve">PRACTICAL | THEORY / string</w:t>
+            </w:r>
+          </w:p>
+        </w:tc>
+        <w:tc>
+          <w:tcPr>
+            <w:vAlign w:val="center"/>
+          </w:tcPr>
+          <w:p>
+            <w:pPr/>
+            <w:r>
+              <w:t xml:space="preserve">no</w:t>
+            </w:r>
+          </w:p>
+        </w:tc>
+        <w:tc>
+          <w:tcPr>
+            <w:vAlign w:val="center"/>
+          </w:tcPr>
+          <w:p>
+            <w:pPr/>
+            <w:r>
+              <w:t xml:space="preserve">kept from the check-in if left out</w:t>
+            </w:r>
+          </w:p>
+        </w:tc>
+      </w:tr>
     </w:tbl>
     <w:p/>
     <w:p>
@@ -30099,7 +30357,7 @@
         </w:numPr>
       </w:pPr>
       <w:r>
-        <w:t xml:space="preserve">Columns: name, status, check-in time (school time), distance, accuracy, confirmed by, recorded by, reason - plus a count per status at the bottom.</w:t>
+        <w:t xml:space="preserve">Columns: name, status (with why, if awaiting confirmation), lesson (practical/theory), topic, check-in time (school time), distance, accuracy, confirmed by, recorded by, reason - plus a count per status at the bottom.</w:t>
       </w:r>
     </w:p>
     <w:p/>
@@ -32531,7 +32789,7 @@
         </w:numPr>
       </w:pPr>
       <w:r>
-        <w:t xml:space="preserve">Student / instructor: a "Check in" button that gets the location (high accuracy), posts it, and shows the result - including the distance message when they're too far or the precision message when GPS is poor - and their recent history.</w:t>
+        <w:t xml:space="preserve">Student: before the "Check in" button, a required radio choice - Practical lesson / Theory lesson - and an optional "Topic" text field; then get the location (high accuracy), post everything, and show the result: "checked in", or "waiting for an instructor to confirm" with the reason. Plus their recent history.</w:t>
       </w:r>
     </w:p>
     <w:p>
@@ -32543,7 +32801,19 @@
         </w:numPr>
       </w:pPr>
       <w:r>
-        <w:t xml:space="preserve">Instructor / admin: today's list for the school with Confirm on pending students and late / absent / present corrections, a date picker for past days, and Download buttons for the register (date range) and the day list.</w:t>
+        <w:t xml:space="preserve">Instructor: the same button without the lesson fields; show the distance / precision message when they're rejected.</w:t>
+      </w:r>
+    </w:p>
+    <w:p>
+      <w:pPr>
+        <w:pStyle w:val="ListParagraph"/>
+        <w:numPr>
+          <w:ilvl w:val="0"/>
+          <w:numId w:val="1"/>
+        </w:numPr>
+      </w:pPr>
+      <w:r>
+        <w:t xml:space="preserve">Instructor / admin: today's list for the school - with each student's lesson type and topic - Confirm on pending students (show the reason and distance so they can judge), late / absent / present corrections, a date picker for past days, and Download buttons for the register (date range) and the day list.</w:t>
       </w:r>
     </w:p>
     <w:p>

</xml_diff>

<commit_message>
Let staff take a roll call to catch people who sign in and leave
A self check-in only proves someone reached the premises. Instructors
(for students) and the school admin (for students and instructors) can
now save a day's list in one go, keeping who was really there and
marking anyone who left as absent; every entry records who reviewed it
and when.
</commit_message>
<xml_diff>
--- a/project-with-changes/docs/Frontend_API_Guide.docx
+++ b/project-with-changes/docs/Frontend_API_Guide.docx
@@ -28499,6 +28499,41 @@
           <w:p>
             <w:pPr/>
             <w:r>
+              <w:t xml:space="preserve">reviewedByName / reviewedAt</w:t>
+            </w:r>
+          </w:p>
+        </w:tc>
+        <w:tc>
+          <w:tcPr>
+            <w:vAlign w:val="center"/>
+          </w:tcPr>
+          <w:p>
+            <w:pPr/>
+            <w:r>
+              <w:t xml:space="preserve"/>
+            </w:r>
+          </w:p>
+        </w:tc>
+        <w:tc>
+          <w:tcPr>
+            <w:vAlign w:val="center"/>
+          </w:tcPr>
+          <w:p>
+            <w:pPr/>
+            <w:r>
+              <w:t xml:space="preserve">absent until staff take the day's roll call (see below)</w:t>
+            </w:r>
+          </w:p>
+        </w:tc>
+      </w:tr>
+      <w:tr>
+        <w:tc>
+          <w:tcPr>
+            <w:vAlign w:val="center"/>
+          </w:tcPr>
+          <w:p>
+            <w:pPr/>
+            <w:r>
               <w:t xml:space="preserve">lessonType / topic</w:t>
             </w:r>
           </w:p>
@@ -29641,6 +29676,19 @@
     </w:p>
     <w:p/>
     <w:p>
+      <w:pPr>
+        <w:pStyle w:val="Heading2"/>
+      </w:pPr>
+      <w:r>
+        <w:t xml:space="preserve">Roll call: confirming who was really there</w:t>
+      </w:r>
+    </w:p>
+    <w:p>
+      <w:r>
+        <w:t xml:space="preserve">A check-in only proves someone came onto the premises - they could sign in and leave. So staff take a roll call: during or after the lesson they go through the day's list, keep the people who are really there and mark anyone who left as ABSENT, then save the whole list in one go. Every saved entry is stamped with who reviewed it and when (reviewedByName / reviewedAt), so an unreviewed day stands out.</w:t>
+      </w:r>
+    </w:p>
+    <w:p>
       <w:r>
         <w:rPr>
           <w:b/>
@@ -29648,7 +29696,7 @@
           <w:sz w:val="18"/>
           <w:szCs w:val="18"/>
         </w:rPr>
-        <w:t xml:space="preserve">GET  </w:t>
+        <w:t xml:space="preserve">PUT  </w:t>
       </w:r>
       <w:r>
         <w:rPr>
@@ -29656,7 +29704,7 @@
           <w:sz w:val="18"/>
           <w:szCs w:val="18"/>
         </w:rPr>
-        <w:t xml:space="preserve">/attendance/users/{userId}</w:t>
+        <w:t xml:space="preserve">/attendance/school/{schoolId}/roll-call</w:t>
       </w:r>
     </w:p>
     <w:p>
@@ -29664,7 +29712,7 @@
         <w:rPr>
           <w:i/>
         </w:rPr>
-        <w:t xml:space="preserve">One person's history.</w:t>
+        <w:t xml:space="preserve">Save a day's roll call.</w:t>
       </w:r>
     </w:p>
     <w:p>
@@ -29675,15 +29723,15 @@
         <w:t xml:space="preserve">Access: </w:t>
       </w:r>
       <w:r>
-        <w:t xml:space="preserve">The person themselves; ADMIN of their school; INSTRUCTOR for students of their school</w:t>
-      </w:r>
-    </w:p>
-    <w:p>
-      <w:r>
-        <w:rPr>
-          <w:b/>
-        </w:rPr>
-        <w:t xml:space="preserve">Query / path parameters:</w:t>
+        <w:t xml:space="preserve">Students: an INSTRUCTOR of that school or its ADMIN. Instructors (role=INSTRUCTOR): the school's ADMIN only</w:t>
+      </w:r>
+    </w:p>
+    <w:p>
+      <w:r>
+        <w:rPr>
+          <w:b/>
+        </w:rPr>
+        <w:t xml:space="preserve">Request body:</w:t>
       </w:r>
     </w:p>
     <w:tbl>
@@ -29720,7 +29768,7 @@
                 <w:b/>
                 <w:color w:val="FFFFFF"/>
               </w:rPr>
-              <w:t xml:space="preserve">Name</w:t>
+              <w:t xml:space="preserve">Field</w:t>
             </w:r>
           </w:p>
         </w:tc>
@@ -29787,18 +29835,64 @@
           <w:p>
             <w:pPr/>
             <w:r>
-              <w:t xml:space="preserve">from / to</w:t>
-            </w:r>
-          </w:p>
-        </w:tc>
-        <w:tc>
-          <w:tcPr>
-            <w:vAlign w:val="center"/>
-          </w:tcPr>
-          <w:p>
-            <w:pPr/>
-            <w:r>
-              <w:t xml:space="preserve">date (query)</w:t>
+              <w:t xml:space="preserve">date</w:t>
+            </w:r>
+          </w:p>
+        </w:tc>
+        <w:tc>
+          <w:tcPr>
+            <w:vAlign w:val="center"/>
+          </w:tcPr>
+          <w:p>
+            <w:pPr/>
+            <w:r>
+              <w:t xml:space="preserve">date</w:t>
+            </w:r>
+          </w:p>
+        </w:tc>
+        <w:tc>
+          <w:tcPr>
+            <w:vAlign w:val="center"/>
+          </w:tcPr>
+          <w:p>
+            <w:pPr/>
+            <w:r>
+              <w:t xml:space="preserve">yes</w:t>
+            </w:r>
+          </w:p>
+        </w:tc>
+        <w:tc>
+          <w:tcPr>
+            <w:vAlign w:val="center"/>
+          </w:tcPr>
+          <w:p>
+            <w:pPr/>
+            <w:r>
+              <w:t xml:space="preserve">today or earlier</w:t>
+            </w:r>
+          </w:p>
+        </w:tc>
+      </w:tr>
+      <w:tr>
+        <w:tc>
+          <w:tcPr>
+            <w:vAlign w:val="center"/>
+          </w:tcPr>
+          <w:p>
+            <w:pPr/>
+            <w:r>
+              <w:t xml:space="preserve">role</w:t>
+            </w:r>
+          </w:p>
+        </w:tc>
+        <w:tc>
+          <w:tcPr>
+            <w:vAlign w:val="center"/>
+          </w:tcPr>
+          <w:p>
+            <w:pPr/>
+            <w:r>
+              <w:t xml:space="preserve">STUDENT | INSTRUCTOR</w:t>
             </w:r>
           </w:p>
         </w:tc>
@@ -29820,27 +29914,498 @@
           <w:p>
             <w:pPr/>
             <w:r>
-              <w:t xml:space="preserve">default: the last 30 days; at most 62 days</w:t>
+              <w:t xml:space="preserve">default STUDENT</w:t>
+            </w:r>
+          </w:p>
+        </w:tc>
+      </w:tr>
+      <w:tr>
+        <w:tc>
+          <w:tcPr>
+            <w:vAlign w:val="center"/>
+          </w:tcPr>
+          <w:p>
+            <w:pPr/>
+            <w:r>
+              <w:t xml:space="preserve">entries</w:t>
+            </w:r>
+          </w:p>
+        </w:tc>
+        <w:tc>
+          <w:tcPr>
+            <w:vAlign w:val="center"/>
+          </w:tcPr>
+          <w:p>
+            <w:pPr/>
+            <w:r>
+              <w:t xml:space="preserve">array</w:t>
+            </w:r>
+          </w:p>
+        </w:tc>
+        <w:tc>
+          <w:tcPr>
+            <w:vAlign w:val="center"/>
+          </w:tcPr>
+          <w:p>
+            <w:pPr/>
+            <w:r>
+              <w:t xml:space="preserve">yes</w:t>
+            </w:r>
+          </w:p>
+        </w:tc>
+        <w:tc>
+          <w:tcPr>
+            <w:vAlign w:val="center"/>
+          </w:tcPr>
+          <w:p>
+            <w:pPr/>
+            <w:r>
+              <w:t xml:space="preserve">one per person you checked - typically the whole day list</w:t>
+            </w:r>
+          </w:p>
+        </w:tc>
+      </w:tr>
+      <w:tr>
+        <w:tc>
+          <w:tcPr>
+            <w:vAlign w:val="center"/>
+          </w:tcPr>
+          <w:p>
+            <w:pPr/>
+            <w:r>
+              <w:t xml:space="preserve">entries[].userId</w:t>
+            </w:r>
+          </w:p>
+        </w:tc>
+        <w:tc>
+          <w:tcPr>
+            <w:vAlign w:val="center"/>
+          </w:tcPr>
+          <w:p>
+            <w:pPr/>
+            <w:r>
+              <w:t xml:space="preserve">number</w:t>
+            </w:r>
+          </w:p>
+        </w:tc>
+        <w:tc>
+          <w:tcPr>
+            <w:vAlign w:val="center"/>
+          </w:tcPr>
+          <w:p>
+            <w:pPr/>
+            <w:r>
+              <w:t xml:space="preserve">yes</w:t>
+            </w:r>
+          </w:p>
+        </w:tc>
+        <w:tc>
+          <w:tcPr>
+            <w:vAlign w:val="center"/>
+          </w:tcPr>
+          <w:p>
+            <w:pPr/>
+            <w:r>
+              <w:t xml:space="preserve">userId from the day list</w:t>
+            </w:r>
+          </w:p>
+        </w:tc>
+      </w:tr>
+      <w:tr>
+        <w:tc>
+          <w:tcPr>
+            <w:vAlign w:val="center"/>
+          </w:tcPr>
+          <w:p>
+            <w:pPr/>
+            <w:r>
+              <w:t xml:space="preserve">entries[].status</w:t>
+            </w:r>
+          </w:p>
+        </w:tc>
+        <w:tc>
+          <w:tcPr>
+            <w:vAlign w:val="center"/>
+          </w:tcPr>
+          <w:p>
+            <w:pPr/>
+            <w:r>
+              <w:t xml:space="preserve">PRESENT | LATE | ABSENT</w:t>
+            </w:r>
+          </w:p>
+        </w:tc>
+        <w:tc>
+          <w:tcPr>
+            <w:vAlign w:val="center"/>
+          </w:tcPr>
+          <w:p>
+            <w:pPr/>
+            <w:r>
+              <w:t xml:space="preserve">yes</w:t>
+            </w:r>
+          </w:p>
+        </w:tc>
+        <w:tc>
+          <w:tcPr>
+            <w:vAlign w:val="center"/>
+          </w:tcPr>
+          <w:p>
+            <w:pPr/>
+            <w:r>
+              <w:t xml:space="preserve">what you saw</w:t>
+            </w:r>
+          </w:p>
+        </w:tc>
+      </w:tr>
+      <w:tr>
+        <w:tc>
+          <w:tcPr>
+            <w:vAlign w:val="center"/>
+          </w:tcPr>
+          <w:p>
+            <w:pPr/>
+            <w:r>
+              <w:t xml:space="preserve">entries[].reason</w:t>
+            </w:r>
+          </w:p>
+        </w:tc>
+        <w:tc>
+          <w:tcPr>
+            <w:vAlign w:val="center"/>
+          </w:tcPr>
+          <w:p>
+            <w:pPr/>
+            <w:r>
+              <w:t xml:space="preserve">string</w:t>
+            </w:r>
+          </w:p>
+        </w:tc>
+        <w:tc>
+          <w:tcPr>
+            <w:vAlign w:val="center"/>
+          </w:tcPr>
+          <w:p>
+            <w:pPr/>
+            <w:r>
+              <w:t xml:space="preserve">no</w:t>
+            </w:r>
+          </w:p>
+        </w:tc>
+        <w:tc>
+          <w:tcPr>
+            <w:vAlign w:val="center"/>
+          </w:tcPr>
+          <w:p>
+            <w:pPr/>
+            <w:r>
+              <w:t xml:space="preserve">max 500, e.g. "Signed in and left"</w:t>
             </w:r>
           </w:p>
         </w:tc>
       </w:tr>
     </w:tbl>
     <w:p/>
+    <w:p>
+      <w:r>
+        <w:rPr>
+          <w:b/>
+        </w:rPr>
+        <w:t xml:space="preserve">Example request:</w:t>
+      </w:r>
+    </w:p>
+    <w:p>
+      <w:pPr>
+        <w:pStyle w:val="Code"/>
+        <w:shd w:val="clear" w:fill="F3F3F3"/>
+      </w:pPr>
+      <w:r>
+        <w:rPr>
+          <w:rFonts w:ascii="Consolas" w:hAnsi="Consolas"/>
+          <w:sz w:val="18"/>
+        </w:rPr>
+        <w:t xml:space="preserve">{</w:t>
+      </w:r>
+    </w:p>
+    <w:p>
+      <w:pPr>
+        <w:pStyle w:val="Code"/>
+        <w:shd w:val="clear" w:fill="F3F3F3"/>
+      </w:pPr>
+      <w:r>
+        <w:rPr>
+          <w:rFonts w:ascii="Consolas" w:hAnsi="Consolas"/>
+          <w:sz w:val="18"/>
+        </w:rPr>
+        <w:t xml:space="preserve">  "date": "2026-10-02",</w:t>
+      </w:r>
+    </w:p>
+    <w:p>
+      <w:pPr>
+        <w:pStyle w:val="Code"/>
+        <w:shd w:val="clear" w:fill="F3F3F3"/>
+      </w:pPr>
+      <w:r>
+        <w:rPr>
+          <w:rFonts w:ascii="Consolas" w:hAnsi="Consolas"/>
+          <w:sz w:val="18"/>
+        </w:rPr>
+        <w:t xml:space="preserve">  "role": "STUDENT",</w:t>
+      </w:r>
+    </w:p>
+    <w:p>
+      <w:pPr>
+        <w:pStyle w:val="Code"/>
+        <w:shd w:val="clear" w:fill="F3F3F3"/>
+      </w:pPr>
+      <w:r>
+        <w:rPr>
+          <w:rFonts w:ascii="Consolas" w:hAnsi="Consolas"/>
+          <w:sz w:val="18"/>
+        </w:rPr>
+        <w:t xml:space="preserve">  "entries": [</w:t>
+      </w:r>
+    </w:p>
+    <w:p>
+      <w:pPr>
+        <w:pStyle w:val="Code"/>
+        <w:shd w:val="clear" w:fill="F3F3F3"/>
+      </w:pPr>
+      <w:r>
+        <w:rPr>
+          <w:rFonts w:ascii="Consolas" w:hAnsi="Consolas"/>
+          <w:sz w:val="18"/>
+        </w:rPr>
+        <w:t xml:space="preserve">    { "userId": 31, "status": "PRESENT" },</w:t>
+      </w:r>
+    </w:p>
+    <w:p>
+      <w:pPr>
+        <w:pStyle w:val="Code"/>
+        <w:shd w:val="clear" w:fill="F3F3F3"/>
+      </w:pPr>
+      <w:r>
+        <w:rPr>
+          <w:rFonts w:ascii="Consolas" w:hAnsi="Consolas"/>
+          <w:sz w:val="18"/>
+        </w:rPr>
+        <w:t xml:space="preserve">    { "userId": 34, "status": "ABSENT", "reason": "Signed in and left" },</w:t>
+      </w:r>
+    </w:p>
+    <w:p>
+      <w:pPr>
+        <w:pStyle w:val="Code"/>
+        <w:shd w:val="clear" w:fill="F3F3F3"/>
+      </w:pPr>
+      <w:r>
+        <w:rPr>
+          <w:rFonts w:ascii="Consolas" w:hAnsi="Consolas"/>
+          <w:sz w:val="18"/>
+        </w:rPr>
+        <w:t xml:space="preserve">    { "userId": 35, "status": "LATE", "reason": "Arrived 09:40" }</w:t>
+      </w:r>
+    </w:p>
+    <w:p>
+      <w:pPr>
+        <w:pStyle w:val="Code"/>
+        <w:shd w:val="clear" w:fill="F3F3F3"/>
+      </w:pPr>
+      <w:r>
+        <w:rPr>
+          <w:rFonts w:ascii="Consolas" w:hAnsi="Consolas"/>
+          <w:sz w:val="18"/>
+        </w:rPr>
+        <w:t xml:space="preserve">  ]</w:t>
+      </w:r>
+    </w:p>
+    <w:p>
+      <w:pPr>
+        <w:pStyle w:val="Code"/>
+        <w:shd w:val="clear" w:fill="F3F3F3"/>
+      </w:pPr>
+      <w:r>
+        <w:rPr>
+          <w:rFonts w:ascii="Consolas" w:hAnsi="Consolas"/>
+          <w:sz w:val="18"/>
+        </w:rPr>
+        <w:t xml:space="preserve">}</w:t>
+      </w:r>
+    </w:p>
+    <w:p>
+      <w:r>
+        <w:rPr>
+          <w:b/>
+        </w:rPr>
+        <w:t xml:space="preserve">Response (key fields):</w:t>
+      </w:r>
+    </w:p>
+    <w:tbl>
+      <w:tblPr>
+        <w:tblStyle w:val="TableGrid"/>
+        <w:tblW w:w="0" w:type="auto"/>
+        <w:tblBorders>
+          <w:top w:val="single" w:sz="4" w:color="BFBFBF"/>
+          <w:left w:val="single" w:sz="4" w:color="BFBFBF"/>
+          <w:bottom w:val="single" w:sz="4" w:color="BFBFBF"/>
+          <w:right w:val="single" w:sz="4" w:color="BFBFBF"/>
+          <w:insideH w:val="single" w:sz="4" w:color="BFBFBF"/>
+          <w:insideV w:val="single" w:sz="4" w:color="BFBFBF"/>
+        </w:tblBorders>
+      </w:tblPr>
+      <w:tblGrid>
+        <w:gridCol w:w="3000"/>
+        <w:gridCol w:w="3000"/>
+        <w:gridCol w:w="3000"/>
+      </w:tblGrid>
+      <w:tr>
+        <w:tc>
+          <w:tcPr>
+            <w:shd w:val="clear" w:fill="2F5496"/>
+            <w:vAlign w:val="center"/>
+          </w:tcPr>
+          <w:p>
+            <w:pPr>
+              <w:shd w:val="clear" w:fill="2F5496"/>
+            </w:pPr>
+            <w:r>
+              <w:rPr>
+                <w:b/>
+                <w:color w:val="FFFFFF"/>
+              </w:rPr>
+              <w:t xml:space="preserve">Field</w:t>
+            </w:r>
+          </w:p>
+        </w:tc>
+        <w:tc>
+          <w:tcPr>
+            <w:shd w:val="clear" w:fill="2F5496"/>
+            <w:vAlign w:val="center"/>
+          </w:tcPr>
+          <w:p>
+            <w:pPr>
+              <w:shd w:val="clear" w:fill="2F5496"/>
+            </w:pPr>
+            <w:r>
+              <w:rPr>
+                <w:b/>
+                <w:color w:val="FFFFFF"/>
+              </w:rPr>
+              <w:t xml:space="preserve">Type</w:t>
+            </w:r>
+          </w:p>
+        </w:tc>
+        <w:tc>
+          <w:tcPr>
+            <w:shd w:val="clear" w:fill="2F5496"/>
+            <w:vAlign w:val="center"/>
+          </w:tcPr>
+          <w:p>
+            <w:pPr>
+              <w:shd w:val="clear" w:fill="2F5496"/>
+            </w:pPr>
+            <w:r>
+              <w:rPr>
+                <w:b/>
+                <w:color w:val="FFFFFF"/>
+              </w:rPr>
+              <w:t xml:space="preserve">Notes</w:t>
+            </w:r>
+          </w:p>
+        </w:tc>
+      </w:tr>
+      <w:tr>
+        <w:tc>
+          <w:tcPr>
+            <w:vAlign w:val="center"/>
+          </w:tcPr>
+          <w:p>
+            <w:pPr/>
+            <w:r>
+              <w:t xml:space="preserve">[] of attendance entries</w:t>
+            </w:r>
+          </w:p>
+        </w:tc>
+        <w:tc>
+          <w:tcPr>
+            <w:vAlign w:val="center"/>
+          </w:tcPr>
+          <w:p>
+            <w:pPr/>
+            <w:r>
+              <w:t xml:space="preserve"/>
+            </w:r>
+          </w:p>
+        </w:tc>
+        <w:tc>
+          <w:tcPr>
+            <w:vAlign w:val="center"/>
+          </w:tcPr>
+          <w:p>
+            <w:pPr/>
+            <w:r>
+              <w:t xml:space="preserve">the saved entries, each with reviewedByName / reviewedAt</w:t>
+            </w:r>
+          </w:p>
+        </w:tc>
+      </w:tr>
+    </w:tbl>
     <w:p/>
     <w:p>
-      <w:pPr>
-        <w:pStyle w:val="Heading2"/>
-      </w:pPr>
-      <w:r>
-        <w:t xml:space="preserve">Printable Excel sheets</w:t>
-      </w:r>
-    </w:p>
-    <w:p>
-      <w:r>
-        <w:t xml:space="preserve">Both return an .xlsx file (not JSON) - fetch with the access token, then save it (e.g. create a blob URL and click a download link). They're laid out to print: landscape, fitted to the page width, header repeated on every page, page numbers.</w:t>
-      </w:r>
-    </w:p>
+      <w:r>
+        <w:rPr>
+          <w:b/>
+        </w:rPr>
+        <w:t xml:space="preserve">Notes:</w:t>
+      </w:r>
+    </w:p>
+    <w:p>
+      <w:pPr>
+        <w:pStyle w:val="ListParagraph"/>
+        <w:numPr>
+          <w:ilvl w:val="0"/>
+          <w:numId w:val="1"/>
+        </w:numPr>
+      </w:pPr>
+      <w:r>
+        <w:t xml:space="preserve">A self check-in kept as PRESENT stays a check-in (location and time kept) and is simply marked reviewed; one changed to ABSENT/LATE becomes a staff correction (source MANUAL, recordedByName, reason).</w:t>
+      </w:r>
+    </w:p>
+    <w:p>
+      <w:pPr>
+        <w:pStyle w:val="ListParagraph"/>
+        <w:numPr>
+          <w:ilvl w:val="0"/>
+          <w:numId w:val="1"/>
+        </w:numPr>
+      </w:pPr>
+      <w:r>
+        <w:t xml:space="preserve">A PENDING_CONFIRMATION check-in saved as PRESENT is confirmed at the same time.</w:t>
+      </w:r>
+    </w:p>
+    <w:p>
+      <w:pPr>
+        <w:pStyle w:val="ListParagraph"/>
+        <w:numPr>
+          <w:ilvl w:val="0"/>
+          <w:numId w:val="1"/>
+        </w:numPr>
+      </w:pPr>
+      <w:r>
+        <w:t xml:space="preserve">Someone with no check-in can be included (e.g. ABSENT, or PRESENT if they forgot to check in).</w:t>
+      </w:r>
+    </w:p>
+    <w:p>
+      <w:pPr>
+        <w:pStyle w:val="ListParagraph"/>
+        <w:numPr>
+          <w:ilvl w:val="0"/>
+          <w:numId w:val="1"/>
+        </w:numPr>
+      </w:pPr>
+      <w:r>
+        <w:t xml:space="preserve">400 if an entry isn't an active student/instructor of the school, or the date is in the future.</w:t>
+      </w:r>
+    </w:p>
+    <w:p/>
     <w:p>
       <w:r>
         <w:rPr>
@@ -29857,7 +30422,7 @@
           <w:sz w:val="18"/>
           <w:szCs w:val="18"/>
         </w:rPr>
-        <w:t xml:space="preserve">/attendance/school/{schoolId}/export/register</w:t>
+        <w:t xml:space="preserve">/attendance/users/{userId}</w:t>
       </w:r>
     </w:p>
     <w:p>
@@ -29865,7 +30430,7 @@
         <w:rPr>
           <w:i/>
         </w:rPr>
-        <w:t xml:space="preserve">Register: people x days for a date range.</w:t>
+        <w:t xml:space="preserve">One person's history.</w:t>
       </w:r>
     </w:p>
     <w:p>
@@ -29876,7 +30441,7 @@
         <w:t xml:space="preserve">Access: </w:t>
       </w:r>
       <w:r>
-        <w:t xml:space="preserve">ADMIN (own school) or INSTRUCTOR of that school</w:t>
+        <w:t xml:space="preserve">The person themselves; ADMIN of their school; INSTRUCTOR for students of their school</w:t>
       </w:r>
     </w:p>
     <w:p>
@@ -30026,88 +30591,23 @@
           </w:p>
         </w:tc>
       </w:tr>
-      <w:tr>
-        <w:tc>
-          <w:tcPr>
-            <w:vAlign w:val="center"/>
-          </w:tcPr>
-          <w:p>
-            <w:pPr/>
-            <w:r>
-              <w:t xml:space="preserve">role</w:t>
-            </w:r>
-          </w:p>
-        </w:tc>
-        <w:tc>
-          <w:tcPr>
-            <w:vAlign w:val="center"/>
-          </w:tcPr>
-          <w:p>
-            <w:pPr/>
-            <w:r>
-              <w:t xml:space="preserve">STUDENT | INSTRUCTOR (query)</w:t>
-            </w:r>
-          </w:p>
-        </w:tc>
-        <w:tc>
-          <w:tcPr>
-            <w:vAlign w:val="center"/>
-          </w:tcPr>
-          <w:p>
-            <w:pPr/>
-            <w:r>
-              <w:t xml:space="preserve">no</w:t>
-            </w:r>
-          </w:p>
-        </w:tc>
-        <w:tc>
-          <w:tcPr>
-            <w:vAlign w:val="center"/>
-          </w:tcPr>
-          <w:p>
-            <w:pPr/>
-            <w:r>
-              <w:t xml:space="preserve">default STUDENT</w:t>
-            </w:r>
-          </w:p>
-        </w:tc>
-      </w:tr>
     </w:tbl>
     <w:p/>
-    <w:p>
-      <w:r>
-        <w:rPr>
-          <w:b/>
-        </w:rPr>
-        <w:t xml:space="preserve">Notes:</w:t>
-      </w:r>
-    </w:p>
-    <w:p>
-      <w:pPr>
-        <w:pStyle w:val="ListParagraph"/>
-        <w:numPr>
-          <w:ilvl w:val="0"/>
-          <w:numId w:val="1"/>
-        </w:numPr>
-      </w:pPr>
-      <w:r>
-        <w:t xml:space="preserve">One row per person, one column per day with P (present), L (late), A (absent), ? (awaiting confirmation) or blank (today/future with nothing yet), then totals.</w:t>
-      </w:r>
-    </w:p>
-    <w:p>
-      <w:pPr>
-        <w:pStyle w:val="ListParagraph"/>
-        <w:numPr>
-          <w:ilvl w:val="0"/>
-          <w:numId w:val="1"/>
-        </w:numPr>
-      </w:pPr>
-      <w:r>
-        <w:t xml:space="preserve">File name e.g. attendance-register-student-2026-09-01-to-2026-09-30.xlsx (from Content-Disposition).</w:t>
-      </w:r>
-    </w:p>
     <w:p/>
     <w:p>
+      <w:pPr>
+        <w:pStyle w:val="Heading2"/>
+      </w:pPr>
+      <w:r>
+        <w:t xml:space="preserve">Printable Excel sheets</w:t>
+      </w:r>
+    </w:p>
+    <w:p>
+      <w:r>
+        <w:t xml:space="preserve">Both return an .xlsx file (not JSON) - fetch with the access token, then save it (e.g. create a blob URL and click a download link). They're laid out to print: landscape, fitted to the page width, header repeated on every page, page numbers.</w:t>
+      </w:r>
+    </w:p>
+    <w:p>
       <w:r>
         <w:rPr>
           <w:b/>
@@ -30123,7 +30623,7 @@
           <w:sz w:val="18"/>
           <w:szCs w:val="18"/>
         </w:rPr>
-        <w:t xml:space="preserve">/attendance/school/{schoolId}/export/day</w:t>
+        <w:t xml:space="preserve">/attendance/school/{schoolId}/export/register</w:t>
       </w:r>
     </w:p>
     <w:p>
@@ -30131,7 +30631,7 @@
         <w:rPr>
           <w:i/>
         </w:rPr>
-        <w:t xml:space="preserve">One day's detailed list.</w:t>
+        <w:t xml:space="preserve">Register: people x days for a date range.</w:t>
       </w:r>
     </w:p>
     <w:p>
@@ -30254,7 +30754,7 @@
           <w:p>
             <w:pPr/>
             <w:r>
-              <w:t xml:space="preserve">date</w:t>
+              <w:t xml:space="preserve">from / to</w:t>
             </w:r>
           </w:p>
         </w:tc>
@@ -30287,7 +30787,7 @@
           <w:p>
             <w:pPr/>
             <w:r>
-              <w:t xml:space="preserve">default today</w:t>
+              <w:t xml:space="preserve">default: the last 30 days; at most 62 days</w:t>
             </w:r>
           </w:p>
         </w:tc>
@@ -30357,29 +30857,23 @@
         </w:numPr>
       </w:pPr>
       <w:r>
-        <w:t xml:space="preserve">Columns: name, status (with why, if awaiting confirmation), lesson (practical/theory), topic, check-in time (school time), distance, accuracy, confirmed by, recorded by, reason - plus a count per status at the bottom.</w:t>
+        <w:t xml:space="preserve">One row per person, one column per day with P (present), L (late), A (absent), ? (awaiting confirmation) or blank (today/future with nothing yet), then totals.</w:t>
+      </w:r>
+    </w:p>
+    <w:p>
+      <w:pPr>
+        <w:pStyle w:val="ListParagraph"/>
+        <w:numPr>
+          <w:ilvl w:val="0"/>
+          <w:numId w:val="1"/>
+        </w:numPr>
+      </w:pPr>
+      <w:r>
+        <w:t xml:space="preserve">File name e.g. attendance-register-student-2026-09-01-to-2026-09-30.xlsx (from Content-Disposition).</w:t>
       </w:r>
     </w:p>
     <w:p/>
     <w:p>
-      <w:pPr>
-        <w:pStyle w:val="Heading1"/>
-      </w:pPr>
-      <w:r>
-        <w:t xml:space="preserve">Notifications</w:t>
-      </w:r>
-    </w:p>
-    <w:p>
-      <w:r>
-        <w:t xml:space="preserve">Two things happen here: the system automatically sends notifications for certain events, and admins/instructors can manually send an arbitrary notification via POST /send. Automatic IN_APP notifications currently fire on: a new account (welcome), a booking being created or cancelled (also by SMS when configured), a quiz being submitted (pass or fail), a new lesson note, a driving assessment being recorded, a new direct message, a school announcement (also by email), a lesson question being asked (to the instructor(s)) or answered (to the student), and school deletion requests (to the admins involved). A password change sends an EMAIL. All of these are side effects of the endpoints above - nothing needs to be called to trigger them.</w:t>
-      </w:r>
-    </w:p>
-    <w:p>
-      <w:r>
-        <w:t xml:space="preserve">They're created a moment AFTER the action succeeds, never as part of it: a notification that fails can't fail the booking/message/etc., and a booking that fails never notifies anyone. So don't re-fetch GET /notifications/me in the same breath as the action's response and expect the new item - update from the NOTIFICATION_CREATED WebSocket event instead (see "Realtime updates"), or refresh a bit later.</w:t>
-      </w:r>
-    </w:p>
-    <w:p>
       <w:r>
         <w:rPr>
           <w:b/>
@@ -30387,7 +30881,7 @@
           <w:sz w:val="18"/>
           <w:szCs w:val="18"/>
         </w:rPr>
-        <w:t xml:space="preserve">POST  </w:t>
+        <w:t xml:space="preserve">GET  </w:t>
       </w:r>
       <w:r>
         <w:rPr>
@@ -30395,7 +30889,7 @@
           <w:sz w:val="18"/>
           <w:szCs w:val="18"/>
         </w:rPr>
-        <w:t xml:space="preserve">/notifications/send</w:t>
+        <w:t xml:space="preserve">/attendance/school/{schoolId}/export/day</w:t>
       </w:r>
     </w:p>
     <w:p>
@@ -30403,7 +30897,7 @@
         <w:rPr>
           <w:i/>
         </w:rPr>
-        <w:t xml:space="preserve">Send a notification to a user.</w:t>
+        <w:t xml:space="preserve">One day's detailed list.</w:t>
       </w:r>
     </w:p>
     <w:p>
@@ -30414,15 +30908,15 @@
         <w:t xml:space="preserve">Access: </w:t>
       </w:r>
       <w:r>
-        <w:t xml:space="preserve">ADMIN or INSTRUCTOR</w:t>
-      </w:r>
-    </w:p>
-    <w:p>
-      <w:r>
-        <w:rPr>
-          <w:b/>
-        </w:rPr>
-        <w:t xml:space="preserve">Request body:</w:t>
+        <w:t xml:space="preserve">ADMIN (own school) or INSTRUCTOR of that school</w:t>
+      </w:r>
+    </w:p>
+    <w:p>
+      <w:r>
+        <w:rPr>
+          <w:b/>
+        </w:rPr>
+        <w:t xml:space="preserve">Query / path parameters:</w:t>
       </w:r>
     </w:p>
     <w:tbl>
@@ -30459,6 +30953,278 @@
                 <w:b/>
                 <w:color w:val="FFFFFF"/>
               </w:rPr>
+              <w:t xml:space="preserve">Name</w:t>
+            </w:r>
+          </w:p>
+        </w:tc>
+        <w:tc>
+          <w:tcPr>
+            <w:shd w:val="clear" w:fill="2F5496"/>
+            <w:vAlign w:val="center"/>
+          </w:tcPr>
+          <w:p>
+            <w:pPr>
+              <w:shd w:val="clear" w:fill="2F5496"/>
+            </w:pPr>
+            <w:r>
+              <w:rPr>
+                <w:b/>
+                <w:color w:val="FFFFFF"/>
+              </w:rPr>
+              <w:t xml:space="preserve">Type</w:t>
+            </w:r>
+          </w:p>
+        </w:tc>
+        <w:tc>
+          <w:tcPr>
+            <w:shd w:val="clear" w:fill="2F5496"/>
+            <w:vAlign w:val="center"/>
+          </w:tcPr>
+          <w:p>
+            <w:pPr>
+              <w:shd w:val="clear" w:fill="2F5496"/>
+            </w:pPr>
+            <w:r>
+              <w:rPr>
+                <w:b/>
+                <w:color w:val="FFFFFF"/>
+              </w:rPr>
+              <w:t xml:space="preserve">Required</w:t>
+            </w:r>
+          </w:p>
+        </w:tc>
+        <w:tc>
+          <w:tcPr>
+            <w:shd w:val="clear" w:fill="2F5496"/>
+            <w:vAlign w:val="center"/>
+          </w:tcPr>
+          <w:p>
+            <w:pPr>
+              <w:shd w:val="clear" w:fill="2F5496"/>
+            </w:pPr>
+            <w:r>
+              <w:rPr>
+                <w:b/>
+                <w:color w:val="FFFFFF"/>
+              </w:rPr>
+              <w:t xml:space="preserve">Notes</w:t>
+            </w:r>
+          </w:p>
+        </w:tc>
+      </w:tr>
+      <w:tr>
+        <w:tc>
+          <w:tcPr>
+            <w:vAlign w:val="center"/>
+          </w:tcPr>
+          <w:p>
+            <w:pPr/>
+            <w:r>
+              <w:t xml:space="preserve">date</w:t>
+            </w:r>
+          </w:p>
+        </w:tc>
+        <w:tc>
+          <w:tcPr>
+            <w:vAlign w:val="center"/>
+          </w:tcPr>
+          <w:p>
+            <w:pPr/>
+            <w:r>
+              <w:t xml:space="preserve">date (query)</w:t>
+            </w:r>
+          </w:p>
+        </w:tc>
+        <w:tc>
+          <w:tcPr>
+            <w:vAlign w:val="center"/>
+          </w:tcPr>
+          <w:p>
+            <w:pPr/>
+            <w:r>
+              <w:t xml:space="preserve">no</w:t>
+            </w:r>
+          </w:p>
+        </w:tc>
+        <w:tc>
+          <w:tcPr>
+            <w:vAlign w:val="center"/>
+          </w:tcPr>
+          <w:p>
+            <w:pPr/>
+            <w:r>
+              <w:t xml:space="preserve">default today</w:t>
+            </w:r>
+          </w:p>
+        </w:tc>
+      </w:tr>
+      <w:tr>
+        <w:tc>
+          <w:tcPr>
+            <w:vAlign w:val="center"/>
+          </w:tcPr>
+          <w:p>
+            <w:pPr/>
+            <w:r>
+              <w:t xml:space="preserve">role</w:t>
+            </w:r>
+          </w:p>
+        </w:tc>
+        <w:tc>
+          <w:tcPr>
+            <w:vAlign w:val="center"/>
+          </w:tcPr>
+          <w:p>
+            <w:pPr/>
+            <w:r>
+              <w:t xml:space="preserve">STUDENT | INSTRUCTOR (query)</w:t>
+            </w:r>
+          </w:p>
+        </w:tc>
+        <w:tc>
+          <w:tcPr>
+            <w:vAlign w:val="center"/>
+          </w:tcPr>
+          <w:p>
+            <w:pPr/>
+            <w:r>
+              <w:t xml:space="preserve">no</w:t>
+            </w:r>
+          </w:p>
+        </w:tc>
+        <w:tc>
+          <w:tcPr>
+            <w:vAlign w:val="center"/>
+          </w:tcPr>
+          <w:p>
+            <w:pPr/>
+            <w:r>
+              <w:t xml:space="preserve">default STUDENT</w:t>
+            </w:r>
+          </w:p>
+        </w:tc>
+      </w:tr>
+    </w:tbl>
+    <w:p/>
+    <w:p>
+      <w:r>
+        <w:rPr>
+          <w:b/>
+        </w:rPr>
+        <w:t xml:space="preserve">Notes:</w:t>
+      </w:r>
+    </w:p>
+    <w:p>
+      <w:pPr>
+        <w:pStyle w:val="ListParagraph"/>
+        <w:numPr>
+          <w:ilvl w:val="0"/>
+          <w:numId w:val="1"/>
+        </w:numPr>
+      </w:pPr>
+      <w:r>
+        <w:t xml:space="preserve">Columns: name, status (with why, if awaiting confirmation), lesson (practical/theory), topic, check-in time (school time), distance, accuracy, confirmed by, recorded by, reason, roll call by - plus a count per status at the bottom.</w:t>
+      </w:r>
+    </w:p>
+    <w:p/>
+    <w:p>
+      <w:pPr>
+        <w:pStyle w:val="Heading1"/>
+      </w:pPr>
+      <w:r>
+        <w:t xml:space="preserve">Notifications</w:t>
+      </w:r>
+    </w:p>
+    <w:p>
+      <w:r>
+        <w:t xml:space="preserve">Two things happen here: the system automatically sends notifications for certain events, and admins/instructors can manually send an arbitrary notification via POST /send. Automatic IN_APP notifications currently fire on: a new account (welcome), a booking being created or cancelled (also by SMS when configured), a quiz being submitted (pass or fail), a new lesson note, a driving assessment being recorded, a new direct message, a school announcement (also by email), a lesson question being asked (to the instructor(s)) or answered (to the student), and school deletion requests (to the admins involved). A password change sends an EMAIL. All of these are side effects of the endpoints above - nothing needs to be called to trigger them.</w:t>
+      </w:r>
+    </w:p>
+    <w:p>
+      <w:r>
+        <w:t xml:space="preserve">They're created a moment AFTER the action succeeds, never as part of it: a notification that fails can't fail the booking/message/etc., and a booking that fails never notifies anyone. So don't re-fetch GET /notifications/me in the same breath as the action's response and expect the new item - update from the NOTIFICATION_CREATED WebSocket event instead (see "Realtime updates"), or refresh a bit later.</w:t>
+      </w:r>
+    </w:p>
+    <w:p>
+      <w:r>
+        <w:rPr>
+          <w:b/>
+          <w:rFonts w:ascii="Consolas" w:hAnsi="Consolas" w:cs="Consolas"/>
+          <w:sz w:val="18"/>
+          <w:szCs w:val="18"/>
+        </w:rPr>
+        <w:t xml:space="preserve">POST  </w:t>
+      </w:r>
+      <w:r>
+        <w:rPr>
+          <w:rFonts w:ascii="Consolas" w:hAnsi="Consolas" w:cs="Consolas"/>
+          <w:sz w:val="18"/>
+          <w:szCs w:val="18"/>
+        </w:rPr>
+        <w:t xml:space="preserve">/notifications/send</w:t>
+      </w:r>
+    </w:p>
+    <w:p>
+      <w:r>
+        <w:rPr>
+          <w:i/>
+        </w:rPr>
+        <w:t xml:space="preserve">Send a notification to a user.</w:t>
+      </w:r>
+    </w:p>
+    <w:p>
+      <w:r>
+        <w:rPr>
+          <w:b/>
+        </w:rPr>
+        <w:t xml:space="preserve">Access: </w:t>
+      </w:r>
+      <w:r>
+        <w:t xml:space="preserve">ADMIN or INSTRUCTOR</w:t>
+      </w:r>
+    </w:p>
+    <w:p>
+      <w:r>
+        <w:rPr>
+          <w:b/>
+        </w:rPr>
+        <w:t xml:space="preserve">Request body:</w:t>
+      </w:r>
+    </w:p>
+    <w:tbl>
+      <w:tblPr>
+        <w:tblStyle w:val="TableGrid"/>
+        <w:tblW w:w="0" w:type="auto"/>
+        <w:tblBorders>
+          <w:top w:val="single" w:sz="4" w:color="BFBFBF"/>
+          <w:left w:val="single" w:sz="4" w:color="BFBFBF"/>
+          <w:bottom w:val="single" w:sz="4" w:color="BFBFBF"/>
+          <w:right w:val="single" w:sz="4" w:color="BFBFBF"/>
+          <w:insideH w:val="single" w:sz="4" w:color="BFBFBF"/>
+          <w:insideV w:val="single" w:sz="4" w:color="BFBFBF"/>
+        </w:tblBorders>
+      </w:tblPr>
+      <w:tblGrid>
+        <w:gridCol w:w="2250"/>
+        <w:gridCol w:w="2250"/>
+        <w:gridCol w:w="2250"/>
+        <w:gridCol w:w="2250"/>
+      </w:tblGrid>
+      <w:tr>
+        <w:tc>
+          <w:tcPr>
+            <w:shd w:val="clear" w:fill="2F5496"/>
+            <w:vAlign w:val="center"/>
+          </w:tcPr>
+          <w:p>
+            <w:pPr>
+              <w:shd w:val="clear" w:fill="2F5496"/>
+            </w:pPr>
+            <w:r>
+              <w:rPr>
+                <w:b/>
+                <w:color w:val="FFFFFF"/>
+              </w:rPr>
               <w:t xml:space="preserve">Field</w:t>
             </w:r>
           </w:p>
@@ -32814,6 +33580,18 @@
       </w:pPr>
       <w:r>
         <w:t xml:space="preserve">Instructor / admin: today's list for the school - with each student's lesson type and topic - Confirm on pending students (show the reason and distance so they can judge), late / absent / present corrections, a date picker for past days, and Download buttons for the register (date range) and the day list.</w:t>
+      </w:r>
+    </w:p>
+    <w:p>
+      <w:pPr>
+        <w:pStyle w:val="ListParagraph"/>
+        <w:numPr>
+          <w:ilvl w:val="0"/>
+          <w:numId w:val="1"/>
+        </w:numPr>
+      </w:pPr>
+      <w:r>
+        <w:t xml:space="preserve">Roll call (the anti "sign in and leave" check): a "Take roll call" mode on the day list - every row gets Present / Late / Absent (pre-filled from today's status) and a reason box; one Save sends the whole list to PUT /attendance/school/{id}/roll-call. Show a "Reviewed by ... at ..." badge per row and a "Roll call not taken yet" banner when no row has reviewedAt. Admins get the same for instructors (role=INSTRUCTOR).</w:t>
       </w:r>
     </w:p>
     <w:p>

</xml_diff>

<commit_message>
Count rate limits per user so a school's shared Wi-Fi isn't throttled
Every limit was counted per internet address, and a whole school shares
one, so a busy class was refused together and a class couldn't even all
log in. Logged-in requests are now counted per user, the auth endpoints
allow a classroom logging in at once, and password guessing is capped
per account instead.
</commit_message>
<xml_diff>
--- a/project-with-changes/docs/Frontend_API_Guide.docx
+++ b/project-with-changes/docs/Frontend_API_Guide.docx
@@ -512,7 +512,7 @@
           <w:p>
             <w:pPr/>
             <w:r>
-              <w:t xml:space="preserve">Too many requests - rate limit, or a verification code resent too soon (see the Retry-After header)</w:t>
+              <w:t xml:space="preserve">Too many requests - see "Rate limits" below, or a verification code resent too soon (Retry-After header)</w:t>
             </w:r>
           </w:p>
         </w:tc>
@@ -567,6 +567,74 @@
       </w:tr>
     </w:tbl>
     <w:p/>
+    <w:p>
+      <w:pPr>
+        <w:pStyle w:val="Heading2"/>
+      </w:pPr>
+      <w:r>
+        <w:t xml:space="preserve">Rate limits</w:t>
+      </w:r>
+    </w:p>
+    <w:p>
+      <w:pPr>
+        <w:pStyle w:val="ListParagraph"/>
+        <w:numPr>
+          <w:ilvl w:val="0"/>
+          <w:numId w:val="1"/>
+        </w:numPr>
+      </w:pPr>
+      <w:r>
+        <w:t xml:space="preserve">Logged-in requests (with a valid access token): 300 per minute PER USER - students sharing the school Wi-Fi don't share a limit.</w:t>
+      </w:r>
+    </w:p>
+    <w:p>
+      <w:pPr>
+        <w:pStyle w:val="ListParagraph"/>
+        <w:numPr>
+          <w:ilvl w:val="0"/>
+          <w:numId w:val="1"/>
+        </w:numPr>
+      </w:pPr>
+      <w:r>
+        <w:t xml:space="preserve">Login, token refresh, password reset and verification: 60 per minute per internet address (a whole class can log in at once), plus at most 10 login attempts per account per 15 minutes - the 11th gets 429 "Too many login attempts for this account".</w:t>
+      </w:r>
+    </w:p>
+    <w:p>
+      <w:pPr>
+        <w:pStyle w:val="ListParagraph"/>
+        <w:numPr>
+          <w:ilvl w:val="0"/>
+          <w:numId w:val="1"/>
+        </w:numPr>
+      </w:pPr>
+      <w:r>
+        <w:t xml:space="preserve">Any other request without a token: 100 per minute per address.</w:t>
+      </w:r>
+    </w:p>
+    <w:p>
+      <w:pPr>
+        <w:pStyle w:val="ListParagraph"/>
+        <w:numPr>
+          <w:ilvl w:val="0"/>
+          <w:numId w:val="1"/>
+        </w:numPr>
+      </w:pPr>
+      <w:r>
+        <w:t xml:space="preserve">A 429 from the general limit carries X-Rate-Limit-Retry-After-Seconds; the per-account login one carries Retry-After. Show "Please wait a moment" and retry after that - don't retry in a tight loop. X-Rate-Limit-Remaining is on every allowed response.</w:t>
+      </w:r>
+    </w:p>
+    <w:p>
+      <w:pPr>
+        <w:pStyle w:val="ListParagraph"/>
+        <w:numPr>
+          <w:ilvl w:val="0"/>
+          <w:numId w:val="1"/>
+        </w:numPr>
+      </w:pPr>
+      <w:r>
+        <w:t xml:space="preserve">Keep polling modest (prefer the WebSocket events) so one open tab doesn't use a user's budget.</w:t>
+      </w:r>
+    </w:p>
     <w:p>
       <w:pPr>
         <w:pStyle w:val="Heading2"/>
@@ -1767,7 +1835,7 @@
         </w:numPr>
       </w:pPr>
       <w:r>
-        <w:t xml:space="preserve">These endpoints share the auth rate limit (10 requests per minute per IP with login, register, refresh, forgot/reset password) - another reason to disable buttons while a request is in flight.</w:t>
+        <w:t xml:space="preserve">These endpoints share the auth rate limit (60 requests per minute per internet address, with login, refresh and forgot/reset password) - another reason to disable buttons while a request is in flight.</w:t>
       </w:r>
     </w:p>
     <w:p>

</xml_diff>

<commit_message>
Let a school's admin upload a logo
JPEG, PNG, WebP or SVG up to 2 MB, stored on Cloudinary scaled to fit
512x512; an SVG is converted to PNG since SVGs can carry scripts. The
logo is on every school response, and GET /auth/me now includes the
school's name and logo.
</commit_message>
<xml_diff>
--- a/project-with-changes/docs/Frontend_API_Guide.docx
+++ b/project-with-changes/docs/Frontend_API_Guide.docx
@@ -3962,6 +3962,41 @@
           <w:p>
             <w:pPr/>
             <w:r>
+              <w:t xml:space="preserve">schoolName / schoolLogoUrl</w:t>
+            </w:r>
+          </w:p>
+        </w:tc>
+        <w:tc>
+          <w:tcPr>
+            <w:vAlign w:val="center"/>
+          </w:tcPr>
+          <w:p>
+            <w:pPr/>
+            <w:r>
+              <w:t xml:space="preserve">string or absent</w:t>
+            </w:r>
+          </w:p>
+        </w:tc>
+        <w:tc>
+          <w:tcPr>
+            <w:vAlign w:val="center"/>
+          </w:tcPr>
+          <w:p>
+            <w:pPr/>
+            <w:r>
+              <w:t xml:space="preserve">the caller's school and its logo - show them in the app header straight after login (absent for the bootstrap admin / no logo)</w:t>
+            </w:r>
+          </w:p>
+        </w:tc>
+      </w:tr>
+      <w:tr>
+        <w:tc>
+          <w:tcPr>
+            <w:vAlign w:val="center"/>
+          </w:tcPr>
+          <w:p>
+            <w:pPr/>
+            <w:r>
               <w:t xml:space="preserve">accountStatus / inviteExpiresAt</w:t>
             </w:r>
           </w:p>
@@ -29523,7 +29558,7 @@
           <w:sz w:val="18"/>
           <w:szCs w:val="18"/>
         </w:rPr>
-        <w:t xml:space="preserve">PUT  </w:t>
+        <w:t xml:space="preserve">POST  </w:t>
       </w:r>
       <w:r>
         <w:rPr>
@@ -29531,7 +29566,7 @@
           <w:sz w:val="18"/>
           <w:szCs w:val="18"/>
         </w:rPr>
-        <w:t xml:space="preserve">/schools/{schoolId}/location</w:t>
+        <w:t xml:space="preserve">/schools/me/logo</w:t>
       </w:r>
     </w:p>
     <w:p>
@@ -29539,7 +29574,7 @@
         <w:rPr>
           <w:i/>
         </w:rPr>
-        <w:t xml:space="preserve">Same, for a given school.</w:t>
+        <w:t xml:space="preserve">Upload or replace my school's logo.</w:t>
       </w:r>
     </w:p>
     <w:p>
@@ -29550,54 +29585,7 @@
         <w:t xml:space="preserve">Access: </w:t>
       </w:r>
       <w:r>
-        <w:t xml:space="preserve">ADMIN (bootstrap: any school; regular admin: their own)</w:t>
-      </w:r>
-    </w:p>
-    <w:p/>
-    <w:p>
-      <w:pPr>
-        <w:pStyle w:val="Heading2"/>
-      </w:pPr>
-      <w:r>
-        <w:t xml:space="preserve">Checking in (student / instructor)</w:t>
-      </w:r>
-    </w:p>
-    <w:p>
-      <w:r>
-        <w:rPr>
-          <w:b/>
-          <w:rFonts w:ascii="Consolas" w:hAnsi="Consolas" w:cs="Consolas"/>
-          <w:sz w:val="18"/>
-          <w:szCs w:val="18"/>
-        </w:rPr>
-        <w:t xml:space="preserve">POST  </w:t>
-      </w:r>
-      <w:r>
-        <w:rPr>
-          <w:rFonts w:ascii="Consolas" w:hAnsi="Consolas" w:cs="Consolas"/>
-          <w:sz w:val="18"/>
-          <w:szCs w:val="18"/>
-        </w:rPr>
-        <w:t xml:space="preserve">/attendance/check-in</w:t>
-      </w:r>
-    </w:p>
-    <w:p>
-      <w:r>
-        <w:rPr>
-          <w:i/>
-        </w:rPr>
-        <w:t xml:space="preserve">Check in for today from the current location.</w:t>
-      </w:r>
-    </w:p>
-    <w:p>
-      <w:r>
-        <w:rPr>
-          <w:b/>
-        </w:rPr>
-        <w:t xml:space="preserve">Access: </w:t>
-      </w:r>
-      <w:r>
-        <w:t xml:space="preserve">STUDENT or INSTRUCTOR</w:t>
+        <w:t xml:space="preserve">ADMIN (the school's own admin)</w:t>
       </w:r>
     </w:p>
     <w:p>
@@ -29709,18 +29697,18 @@
           <w:p>
             <w:pPr/>
             <w:r>
-              <w:t xml:space="preserve">latitude / longitude</w:t>
-            </w:r>
-          </w:p>
-        </w:tc>
-        <w:tc>
-          <w:tcPr>
-            <w:vAlign w:val="center"/>
-          </w:tcPr>
-          <w:p>
-            <w:pPr/>
-            <w:r>
-              <w:t xml:space="preserve">number</w:t>
+              <w:t xml:space="preserve">file</w:t>
+            </w:r>
+          </w:p>
+        </w:tc>
+        <w:tc>
+          <w:tcPr>
+            <w:vAlign w:val="center"/>
+          </w:tcPr>
+          <w:p>
+            <w:pPr/>
+            <w:r>
+              <w:t xml:space="preserve">file (multipart/form-data)</w:t>
             </w:r>
           </w:p>
         </w:tc>
@@ -29742,250 +29730,13 @@
           <w:p>
             <w:pPr/>
             <w:r>
-              <w:t xml:space="preserve">from navigator.geolocation (coords.latitude / coords.longitude)</w:t>
-            </w:r>
-          </w:p>
-        </w:tc>
-      </w:tr>
-      <w:tr>
-        <w:tc>
-          <w:tcPr>
-            <w:vAlign w:val="center"/>
-          </w:tcPr>
-          <w:p>
-            <w:pPr/>
-            <w:r>
-              <w:t xml:space="preserve">accuracyMeters</w:t>
-            </w:r>
-          </w:p>
-        </w:tc>
-        <w:tc>
-          <w:tcPr>
-            <w:vAlign w:val="center"/>
-          </w:tcPr>
-          <w:p>
-            <w:pPr/>
-            <w:r>
-              <w:t xml:space="preserve">number</w:t>
-            </w:r>
-          </w:p>
-        </w:tc>
-        <w:tc>
-          <w:tcPr>
-            <w:vAlign w:val="center"/>
-          </w:tcPr>
-          <w:p>
-            <w:pPr/>
-            <w:r>
-              <w:t xml:space="preserve">yes</w:t>
-            </w:r>
-          </w:p>
-        </w:tc>
-        <w:tc>
-          <w:tcPr>
-            <w:vAlign w:val="center"/>
-          </w:tcPr>
-          <w:p>
-            <w:pPr/>
-            <w:r>
-              <w:t xml:space="preserve">coords.accuracy</w:t>
-            </w:r>
-          </w:p>
-        </w:tc>
-      </w:tr>
-      <w:tr>
-        <w:tc>
-          <w:tcPr>
-            <w:vAlign w:val="center"/>
-          </w:tcPr>
-          <w:p>
-            <w:pPr/>
-            <w:r>
-              <w:t xml:space="preserve">lessonType</w:t>
-            </w:r>
-          </w:p>
-        </w:tc>
-        <w:tc>
-          <w:tcPr>
-            <w:vAlign w:val="center"/>
-          </w:tcPr>
-          <w:p>
-            <w:pPr/>
-            <w:r>
-              <w:t xml:space="preserve">PRACTICAL | THEORY</w:t>
-            </w:r>
-          </w:p>
-        </w:tc>
-        <w:tc>
-          <w:tcPr>
-            <w:vAlign w:val="center"/>
-          </w:tcPr>
-          <w:p>
-            <w:pPr/>
-            <w:r>
-              <w:t xml:space="preserve">yes for students</w:t>
-            </w:r>
-          </w:p>
-        </w:tc>
-        <w:tc>
-          <w:tcPr>
-            <w:vAlign w:val="center"/>
-          </w:tcPr>
-          <w:p>
-            <w:pPr/>
-            <w:r>
-              <w:t xml:space="preserve">the radio button - 400 if a student leaves it out; instructors can omit it</w:t>
-            </w:r>
-          </w:p>
-        </w:tc>
-      </w:tr>
-      <w:tr>
-        <w:tc>
-          <w:tcPr>
-            <w:vAlign w:val="center"/>
-          </w:tcPr>
-          <w:p>
-            <w:pPr/>
-            <w:r>
-              <w:t xml:space="preserve">topic</w:t>
-            </w:r>
-          </w:p>
-        </w:tc>
-        <w:tc>
-          <w:tcPr>
-            <w:vAlign w:val="center"/>
-          </w:tcPr>
-          <w:p>
-            <w:pPr/>
-            <w:r>
-              <w:t xml:space="preserve">string</w:t>
-            </w:r>
-          </w:p>
-        </w:tc>
-        <w:tc>
-          <w:tcPr>
-            <w:vAlign w:val="center"/>
-          </w:tcPr>
-          <w:p>
-            <w:pPr/>
-            <w:r>
-              <w:t xml:space="preserve">no</w:t>
-            </w:r>
-          </w:p>
-        </w:tc>
-        <w:tc>
-          <w:tcPr>
-            <w:vAlign w:val="center"/>
-          </w:tcPr>
-          <w:p>
-            <w:pPr/>
-            <w:r>
-              <w:t xml:space="preserve">max 200, e.g. "Reverse parking" or "Road signs"</w:t>
+              <w:t xml:space="preserve">JPEG, PNG, WebP or SVG, max 2 MB - checked by content</w:t>
             </w:r>
           </w:p>
         </w:tc>
       </w:tr>
     </w:tbl>
     <w:p/>
-    <w:p>
-      <w:r>
-        <w:rPr>
-          <w:b/>
-        </w:rPr>
-        <w:t xml:space="preserve">Example request:</w:t>
-      </w:r>
-    </w:p>
-    <w:p>
-      <w:pPr>
-        <w:pStyle w:val="Code"/>
-        <w:shd w:val="clear" w:fill="F3F3F3"/>
-      </w:pPr>
-      <w:r>
-        <w:rPr>
-          <w:rFonts w:ascii="Consolas" w:hAnsi="Consolas"/>
-          <w:sz w:val="18"/>
-        </w:rPr>
-        <w:t xml:space="preserve">{</w:t>
-      </w:r>
-    </w:p>
-    <w:p>
-      <w:pPr>
-        <w:pStyle w:val="Code"/>
-        <w:shd w:val="clear" w:fill="F3F3F3"/>
-      </w:pPr>
-      <w:r>
-        <w:rPr>
-          <w:rFonts w:ascii="Consolas" w:hAnsi="Consolas"/>
-          <w:sz w:val="18"/>
-        </w:rPr>
-        <w:t xml:space="preserve">  "latitude": 5.60391,</w:t>
-      </w:r>
-    </w:p>
-    <w:p>
-      <w:pPr>
-        <w:pStyle w:val="Code"/>
-        <w:shd w:val="clear" w:fill="F3F3F3"/>
-      </w:pPr>
-      <w:r>
-        <w:rPr>
-          <w:rFonts w:ascii="Consolas" w:hAnsi="Consolas"/>
-          <w:sz w:val="18"/>
-        </w:rPr>
-        <w:t xml:space="preserve">  "longitude": -0.18712,</w:t>
-      </w:r>
-    </w:p>
-    <w:p>
-      <w:pPr>
-        <w:pStyle w:val="Code"/>
-        <w:shd w:val="clear" w:fill="F3F3F3"/>
-      </w:pPr>
-      <w:r>
-        <w:rPr>
-          <w:rFonts w:ascii="Consolas" w:hAnsi="Consolas"/>
-          <w:sz w:val="18"/>
-        </w:rPr>
-        <w:t xml:space="preserve">  "accuracyMeters": 14,</w:t>
-      </w:r>
-    </w:p>
-    <w:p>
-      <w:pPr>
-        <w:pStyle w:val="Code"/>
-        <w:shd w:val="clear" w:fill="F3F3F3"/>
-      </w:pPr>
-      <w:r>
-        <w:rPr>
-          <w:rFonts w:ascii="Consolas" w:hAnsi="Consolas"/>
-          <w:sz w:val="18"/>
-        </w:rPr>
-        <w:t xml:space="preserve">  "lessonType": "PRACTICAL",</w:t>
-      </w:r>
-    </w:p>
-    <w:p>
-      <w:pPr>
-        <w:pStyle w:val="Code"/>
-        <w:shd w:val="clear" w:fill="F3F3F3"/>
-      </w:pPr>
-      <w:r>
-        <w:rPr>
-          <w:rFonts w:ascii="Consolas" w:hAnsi="Consolas"/>
-          <w:sz w:val="18"/>
-        </w:rPr>
-        <w:t xml:space="preserve">  "topic": "Reverse parking"</w:t>
-      </w:r>
-    </w:p>
-    <w:p>
-      <w:pPr>
-        <w:pStyle w:val="Code"/>
-        <w:shd w:val="clear" w:fill="F3F3F3"/>
-      </w:pPr>
-      <w:r>
-        <w:rPr>
-          <w:rFonts w:ascii="Consolas" w:hAnsi="Consolas"/>
-          <w:sz w:val="18"/>
-        </w:rPr>
-        <w:t xml:space="preserve">}</w:t>
-      </w:r>
-    </w:p>
     <w:p>
       <w:r>
         <w:rPr>
@@ -30076,7 +29827,7 @@
           <w:p>
             <w:pPr/>
             <w:r>
-              <w:t xml:space="preserve">id / date / status / checkedInAt</w:t>
+              <w:t xml:space="preserve">the school</w:t>
             </w:r>
           </w:p>
         </w:tc>
@@ -30098,147 +29849,7 @@
           <w:p>
             <w:pPr/>
             <w:r>
-              <w:t xml:space="preserve">status PRESENT when at the school; PENDING_CONFIRMATION for a student who isn't</w:t>
-            </w:r>
-          </w:p>
-        </w:tc>
-      </w:tr>
-      <w:tr>
-        <w:tc>
-          <w:tcPr>
-            <w:vAlign w:val="center"/>
-          </w:tcPr>
-          <w:p>
-            <w:pPr/>
-            <w:r>
-              <w:t xml:space="preserve">confirmationReason</w:t>
-            </w:r>
-          </w:p>
-        </w:tc>
-        <w:tc>
-          <w:tcPr>
-            <w:vAlign w:val="center"/>
-          </w:tcPr>
-          <w:p>
-            <w:pPr/>
-            <w:r>
-              <w:t xml:space="preserve">enum or absent</w:t>
-            </w:r>
-          </w:p>
-        </w:tc>
-        <w:tc>
-          <w:tcPr>
-            <w:vAlign w:val="center"/>
-          </w:tcPr>
-          <w:p>
-            <w:pPr/>
-            <w:r>
-              <w:t xml:space="preserve">why it needs confirming (see above)</w:t>
-            </w:r>
-          </w:p>
-        </w:tc>
-      </w:tr>
-      <w:tr>
-        <w:tc>
-          <w:tcPr>
-            <w:vAlign w:val="center"/>
-          </w:tcPr>
-          <w:p>
-            <w:pPr/>
-            <w:r>
-              <w:t xml:space="preserve">reviewedByName / reviewedAt</w:t>
-            </w:r>
-          </w:p>
-        </w:tc>
-        <w:tc>
-          <w:tcPr>
-            <w:vAlign w:val="center"/>
-          </w:tcPr>
-          <w:p>
-            <w:pPr/>
-            <w:r>
-              <w:t xml:space="preserve"/>
-            </w:r>
-          </w:p>
-        </w:tc>
-        <w:tc>
-          <w:tcPr>
-            <w:vAlign w:val="center"/>
-          </w:tcPr>
-          <w:p>
-            <w:pPr/>
-            <w:r>
-              <w:t xml:space="preserve">absent until staff take the day's roll call (see below)</w:t>
-            </w:r>
-          </w:p>
-        </w:tc>
-      </w:tr>
-      <w:tr>
-        <w:tc>
-          <w:tcPr>
-            <w:vAlign w:val="center"/>
-          </w:tcPr>
-          <w:p>
-            <w:pPr/>
-            <w:r>
-              <w:t xml:space="preserve">lessonType / topic</w:t>
-            </w:r>
-          </w:p>
-        </w:tc>
-        <w:tc>
-          <w:tcPr>
-            <w:vAlign w:val="center"/>
-          </w:tcPr>
-          <w:p>
-            <w:pPr/>
-            <w:r>
-              <w:t xml:space="preserve"/>
-            </w:r>
-          </w:p>
-        </w:tc>
-        <w:tc>
-          <w:tcPr>
-            <w:vAlign w:val="center"/>
-          </w:tcPr>
-          <w:p>
-            <w:pPr/>
-            <w:r>
-              <w:t xml:space="preserve">as sent</w:t>
-            </w:r>
-          </w:p>
-        </w:tc>
-      </w:tr>
-      <w:tr>
-        <w:tc>
-          <w:tcPr>
-            <w:vAlign w:val="center"/>
-          </w:tcPr>
-          <w:p>
-            <w:pPr/>
-            <w:r>
-              <w:t xml:space="preserve">distanceMeters / accuracyMeters</w:t>
-            </w:r>
-          </w:p>
-        </w:tc>
-        <w:tc>
-          <w:tcPr>
-            <w:vAlign w:val="center"/>
-          </w:tcPr>
-          <w:p>
-            <w:pPr/>
-            <w:r>
-              <w:t xml:space="preserve">number</w:t>
-            </w:r>
-          </w:p>
-        </w:tc>
-        <w:tc>
-          <w:tcPr>
-            <w:vAlign w:val="center"/>
-          </w:tcPr>
-          <w:p>
-            <w:pPr/>
-            <w:r>
-              <w:t xml:space="preserve">how far from the school (absent if the school has no location), and the fix's precision</w:t>
+              <w:t xml:space="preserve">same shape as GET /schools/{id}, with logoUrl - a public URL you can put straight in an &lt;img&gt;</w:t>
             </w:r>
           </w:p>
         </w:tc>
@@ -30262,7 +29873,7 @@
         </w:numPr>
       </w:pPr>
       <w:r>
-        <w:t xml:space="preserve">Use getCurrentPosition with { enableHighAccuracy: true }; ask for location permission with a short explanation first.</w:t>
+        <w:t xml:space="preserve">Scaled to fit 512 x 512 (never cropped or enlarged). An SVG is converted to PNG on upload (SVGs can carry scripts), so logoUrl always points to a plain image.</w:t>
       </w:r>
     </w:p>
     <w:p>
@@ -30274,7 +29885,7 @@
         </w:numPr>
       </w:pPr>
       <w:r>
-        <w:t xml:space="preserve">Student, status PRESENT: show "You're checked in". Status PENDING_CONFIRMATION: show "Checked in - an instructor needs to confirm it because you're about 420 m from school" (use confirmationReason and distanceMeters).</w:t>
+        <w:t xml:space="preserve">logoUrl is also on every school response, and every signed-in user gets schoolName / schoolLogoUrl from GET /auth/me.</w:t>
       </w:r>
     </w:p>
     <w:p>
@@ -30286,19 +29897,7 @@
         </w:numPr>
       </w:pPr>
       <w:r>
-        <w:t xml:space="preserve">Instructors are rejected instead: 400 with data { accuracyMeters, maxAccuracyMeters } if accuracy is worse than 100 m, 400 with data { distanceMeters, radiusMeters } if too far, 400 if the school has no location yet.</w:t>
-      </w:r>
-    </w:p>
-    <w:p>
-      <w:pPr>
-        <w:pStyle w:val="ListParagraph"/>
-        <w:numPr>
-          <w:ilvl w:val="0"/>
-          <w:numId w:val="1"/>
-        </w:numPr>
-      </w:pPr>
-      <w:r>
-        <w:t xml:space="preserve">400 "You've already checked in today" on a second try - show today's record (GET /attendance/me) instead of the button.</w:t>
+        <w:t xml:space="preserve">400 for a non-image or a file over 2 MB; 503 if storage is unavailable.</w:t>
       </w:r>
     </w:p>
     <w:p/>
@@ -30310,7 +29909,7 @@
           <w:sz w:val="18"/>
           <w:szCs w:val="18"/>
         </w:rPr>
-        <w:t xml:space="preserve">GET  </w:t>
+        <w:t xml:space="preserve">DELETE  </w:t>
       </w:r>
       <w:r>
         <w:rPr>
@@ -30318,7 +29917,7 @@
           <w:sz w:val="18"/>
           <w:szCs w:val="18"/>
         </w:rPr>
-        <w:t xml:space="preserve">/attendance/me</w:t>
+        <w:t xml:space="preserve">/schools/me/logo</w:t>
       </w:r>
     </w:p>
     <w:p>
@@ -30326,7 +29925,7 @@
         <w:rPr>
           <w:i/>
         </w:rPr>
-        <w:t xml:space="preserve">My attendance history, newest first.</w:t>
+        <w:t xml:space="preserve">Remove my school's logo.</w:t>
       </w:r>
     </w:p>
     <w:p>
@@ -30337,6 +29936,92 @@
         <w:t xml:space="preserve">Access: </w:t>
       </w:r>
       <w:r>
+        <w:t xml:space="preserve">ADMIN (the school's own admin)</w:t>
+      </w:r>
+    </w:p>
+    <w:p/>
+    <w:p>
+      <w:r>
+        <w:rPr>
+          <w:b/>
+          <w:rFonts w:ascii="Consolas" w:hAnsi="Consolas" w:cs="Consolas"/>
+          <w:sz w:val="18"/>
+          <w:szCs w:val="18"/>
+        </w:rPr>
+        <w:t xml:space="preserve">PUT  </w:t>
+      </w:r>
+      <w:r>
+        <w:rPr>
+          <w:rFonts w:ascii="Consolas" w:hAnsi="Consolas" w:cs="Consolas"/>
+          <w:sz w:val="18"/>
+          <w:szCs w:val="18"/>
+        </w:rPr>
+        <w:t xml:space="preserve">/schools/{schoolId}/location</w:t>
+      </w:r>
+    </w:p>
+    <w:p>
+      <w:r>
+        <w:rPr>
+          <w:i/>
+        </w:rPr>
+        <w:t xml:space="preserve">Same, for a given school.</w:t>
+      </w:r>
+    </w:p>
+    <w:p>
+      <w:r>
+        <w:rPr>
+          <w:b/>
+        </w:rPr>
+        <w:t xml:space="preserve">Access: </w:t>
+      </w:r>
+      <w:r>
+        <w:t xml:space="preserve">ADMIN (bootstrap: any school; regular admin: their own)</w:t>
+      </w:r>
+    </w:p>
+    <w:p/>
+    <w:p>
+      <w:pPr>
+        <w:pStyle w:val="Heading2"/>
+      </w:pPr>
+      <w:r>
+        <w:t xml:space="preserve">Checking in (student / instructor)</w:t>
+      </w:r>
+    </w:p>
+    <w:p>
+      <w:r>
+        <w:rPr>
+          <w:b/>
+          <w:rFonts w:ascii="Consolas" w:hAnsi="Consolas" w:cs="Consolas"/>
+          <w:sz w:val="18"/>
+          <w:szCs w:val="18"/>
+        </w:rPr>
+        <w:t xml:space="preserve">POST  </w:t>
+      </w:r>
+      <w:r>
+        <w:rPr>
+          <w:rFonts w:ascii="Consolas" w:hAnsi="Consolas" w:cs="Consolas"/>
+          <w:sz w:val="18"/>
+          <w:szCs w:val="18"/>
+        </w:rPr>
+        <w:t xml:space="preserve">/attendance/check-in</w:t>
+      </w:r>
+    </w:p>
+    <w:p>
+      <w:r>
+        <w:rPr>
+          <w:i/>
+        </w:rPr>
+        <w:t xml:space="preserve">Check in for today from the current location.</w:t>
+      </w:r>
+    </w:p>
+    <w:p>
+      <w:r>
+        <w:rPr>
+          <w:b/>
+        </w:rPr>
+        <w:t xml:space="preserve">Access: </w:t>
+      </w:r>
+      <w:r>
         <w:t xml:space="preserve">STUDENT or INSTRUCTOR</w:t>
       </w:r>
     </w:p>
@@ -30345,7 +30030,7 @@
         <w:rPr>
           <w:b/>
         </w:rPr>
-        <w:t xml:space="preserve">Query / path parameters:</w:t>
+        <w:t xml:space="preserve">Request body:</w:t>
       </w:r>
     </w:p>
     <w:tbl>
@@ -30382,7 +30067,7 @@
                 <w:b/>
                 <w:color w:val="FFFFFF"/>
               </w:rPr>
-              <w:t xml:space="preserve">Name</w:t>
+              <w:t xml:space="preserve">Field</w:t>
             </w:r>
           </w:p>
         </w:tc>
@@ -30449,18 +30134,156 @@
           <w:p>
             <w:pPr/>
             <w:r>
-              <w:t xml:space="preserve">from / to</w:t>
-            </w:r>
-          </w:p>
-        </w:tc>
-        <w:tc>
-          <w:tcPr>
-            <w:vAlign w:val="center"/>
-          </w:tcPr>
-          <w:p>
-            <w:pPr/>
-            <w:r>
-              <w:t xml:space="preserve">date (query)</w:t>
+              <w:t xml:space="preserve">latitude / longitude</w:t>
+            </w:r>
+          </w:p>
+        </w:tc>
+        <w:tc>
+          <w:tcPr>
+            <w:vAlign w:val="center"/>
+          </w:tcPr>
+          <w:p>
+            <w:pPr/>
+            <w:r>
+              <w:t xml:space="preserve">number</w:t>
+            </w:r>
+          </w:p>
+        </w:tc>
+        <w:tc>
+          <w:tcPr>
+            <w:vAlign w:val="center"/>
+          </w:tcPr>
+          <w:p>
+            <w:pPr/>
+            <w:r>
+              <w:t xml:space="preserve">yes</w:t>
+            </w:r>
+          </w:p>
+        </w:tc>
+        <w:tc>
+          <w:tcPr>
+            <w:vAlign w:val="center"/>
+          </w:tcPr>
+          <w:p>
+            <w:pPr/>
+            <w:r>
+              <w:t xml:space="preserve">from navigator.geolocation (coords.latitude / coords.longitude)</w:t>
+            </w:r>
+          </w:p>
+        </w:tc>
+      </w:tr>
+      <w:tr>
+        <w:tc>
+          <w:tcPr>
+            <w:vAlign w:val="center"/>
+          </w:tcPr>
+          <w:p>
+            <w:pPr/>
+            <w:r>
+              <w:t xml:space="preserve">accuracyMeters</w:t>
+            </w:r>
+          </w:p>
+        </w:tc>
+        <w:tc>
+          <w:tcPr>
+            <w:vAlign w:val="center"/>
+          </w:tcPr>
+          <w:p>
+            <w:pPr/>
+            <w:r>
+              <w:t xml:space="preserve">number</w:t>
+            </w:r>
+          </w:p>
+        </w:tc>
+        <w:tc>
+          <w:tcPr>
+            <w:vAlign w:val="center"/>
+          </w:tcPr>
+          <w:p>
+            <w:pPr/>
+            <w:r>
+              <w:t xml:space="preserve">yes</w:t>
+            </w:r>
+          </w:p>
+        </w:tc>
+        <w:tc>
+          <w:tcPr>
+            <w:vAlign w:val="center"/>
+          </w:tcPr>
+          <w:p>
+            <w:pPr/>
+            <w:r>
+              <w:t xml:space="preserve">coords.accuracy</w:t>
+            </w:r>
+          </w:p>
+        </w:tc>
+      </w:tr>
+      <w:tr>
+        <w:tc>
+          <w:tcPr>
+            <w:vAlign w:val="center"/>
+          </w:tcPr>
+          <w:p>
+            <w:pPr/>
+            <w:r>
+              <w:t xml:space="preserve">lessonType</w:t>
+            </w:r>
+          </w:p>
+        </w:tc>
+        <w:tc>
+          <w:tcPr>
+            <w:vAlign w:val="center"/>
+          </w:tcPr>
+          <w:p>
+            <w:pPr/>
+            <w:r>
+              <w:t xml:space="preserve">PRACTICAL | THEORY</w:t>
+            </w:r>
+          </w:p>
+        </w:tc>
+        <w:tc>
+          <w:tcPr>
+            <w:vAlign w:val="center"/>
+          </w:tcPr>
+          <w:p>
+            <w:pPr/>
+            <w:r>
+              <w:t xml:space="preserve">yes for students</w:t>
+            </w:r>
+          </w:p>
+        </w:tc>
+        <w:tc>
+          <w:tcPr>
+            <w:vAlign w:val="center"/>
+          </w:tcPr>
+          <w:p>
+            <w:pPr/>
+            <w:r>
+              <w:t xml:space="preserve">the radio button - 400 if a student leaves it out; instructors can omit it</w:t>
+            </w:r>
+          </w:p>
+        </w:tc>
+      </w:tr>
+      <w:tr>
+        <w:tc>
+          <w:tcPr>
+            <w:vAlign w:val="center"/>
+          </w:tcPr>
+          <w:p>
+            <w:pPr/>
+            <w:r>
+              <w:t xml:space="preserve">topic</w:t>
+            </w:r>
+          </w:p>
+        </w:tc>
+        <w:tc>
+          <w:tcPr>
+            <w:vAlign w:val="center"/>
+          </w:tcPr>
+          <w:p>
+            <w:pPr/>
+            <w:r>
+              <w:t xml:space="preserve">string</w:t>
             </w:r>
           </w:p>
         </w:tc>
@@ -30482,22 +30305,428 @@
           <w:p>
             <w:pPr/>
             <w:r>
-              <w:t xml:space="preserve">default: the last 30 days; at most 62 days</w:t>
+              <w:t xml:space="preserve">max 200, e.g. "Reverse parking" or "Road signs"</w:t>
             </w:r>
           </w:p>
         </w:tc>
       </w:tr>
     </w:tbl>
     <w:p/>
+    <w:p>
+      <w:r>
+        <w:rPr>
+          <w:b/>
+        </w:rPr>
+        <w:t xml:space="preserve">Example request:</w:t>
+      </w:r>
+    </w:p>
+    <w:p>
+      <w:pPr>
+        <w:pStyle w:val="Code"/>
+        <w:shd w:val="clear" w:fill="F3F3F3"/>
+      </w:pPr>
+      <w:r>
+        <w:rPr>
+          <w:rFonts w:ascii="Consolas" w:hAnsi="Consolas"/>
+          <w:sz w:val="18"/>
+        </w:rPr>
+        <w:t xml:space="preserve">{</w:t>
+      </w:r>
+    </w:p>
+    <w:p>
+      <w:pPr>
+        <w:pStyle w:val="Code"/>
+        <w:shd w:val="clear" w:fill="F3F3F3"/>
+      </w:pPr>
+      <w:r>
+        <w:rPr>
+          <w:rFonts w:ascii="Consolas" w:hAnsi="Consolas"/>
+          <w:sz w:val="18"/>
+        </w:rPr>
+        <w:t xml:space="preserve">  "latitude": 5.60391,</w:t>
+      </w:r>
+    </w:p>
+    <w:p>
+      <w:pPr>
+        <w:pStyle w:val="Code"/>
+        <w:shd w:val="clear" w:fill="F3F3F3"/>
+      </w:pPr>
+      <w:r>
+        <w:rPr>
+          <w:rFonts w:ascii="Consolas" w:hAnsi="Consolas"/>
+          <w:sz w:val="18"/>
+        </w:rPr>
+        <w:t xml:space="preserve">  "longitude": -0.18712,</w:t>
+      </w:r>
+    </w:p>
+    <w:p>
+      <w:pPr>
+        <w:pStyle w:val="Code"/>
+        <w:shd w:val="clear" w:fill="F3F3F3"/>
+      </w:pPr>
+      <w:r>
+        <w:rPr>
+          <w:rFonts w:ascii="Consolas" w:hAnsi="Consolas"/>
+          <w:sz w:val="18"/>
+        </w:rPr>
+        <w:t xml:space="preserve">  "accuracyMeters": 14,</w:t>
+      </w:r>
+    </w:p>
+    <w:p>
+      <w:pPr>
+        <w:pStyle w:val="Code"/>
+        <w:shd w:val="clear" w:fill="F3F3F3"/>
+      </w:pPr>
+      <w:r>
+        <w:rPr>
+          <w:rFonts w:ascii="Consolas" w:hAnsi="Consolas"/>
+          <w:sz w:val="18"/>
+        </w:rPr>
+        <w:t xml:space="preserve">  "lessonType": "PRACTICAL",</w:t>
+      </w:r>
+    </w:p>
+    <w:p>
+      <w:pPr>
+        <w:pStyle w:val="Code"/>
+        <w:shd w:val="clear" w:fill="F3F3F3"/>
+      </w:pPr>
+      <w:r>
+        <w:rPr>
+          <w:rFonts w:ascii="Consolas" w:hAnsi="Consolas"/>
+          <w:sz w:val="18"/>
+        </w:rPr>
+        <w:t xml:space="preserve">  "topic": "Reverse parking"</w:t>
+      </w:r>
+    </w:p>
+    <w:p>
+      <w:pPr>
+        <w:pStyle w:val="Code"/>
+        <w:shd w:val="clear" w:fill="F3F3F3"/>
+      </w:pPr>
+      <w:r>
+        <w:rPr>
+          <w:rFonts w:ascii="Consolas" w:hAnsi="Consolas"/>
+          <w:sz w:val="18"/>
+        </w:rPr>
+        <w:t xml:space="preserve">}</w:t>
+      </w:r>
+    </w:p>
+    <w:p>
+      <w:r>
+        <w:rPr>
+          <w:b/>
+        </w:rPr>
+        <w:t xml:space="preserve">Response (key fields):</w:t>
+      </w:r>
+    </w:p>
+    <w:tbl>
+      <w:tblPr>
+        <w:tblStyle w:val="TableGrid"/>
+        <w:tblW w:w="0" w:type="auto"/>
+        <w:tblBorders>
+          <w:top w:val="single" w:sz="4" w:color="BFBFBF"/>
+          <w:left w:val="single" w:sz="4" w:color="BFBFBF"/>
+          <w:bottom w:val="single" w:sz="4" w:color="BFBFBF"/>
+          <w:right w:val="single" w:sz="4" w:color="BFBFBF"/>
+          <w:insideH w:val="single" w:sz="4" w:color="BFBFBF"/>
+          <w:insideV w:val="single" w:sz="4" w:color="BFBFBF"/>
+        </w:tblBorders>
+      </w:tblPr>
+      <w:tblGrid>
+        <w:gridCol w:w="3000"/>
+        <w:gridCol w:w="3000"/>
+        <w:gridCol w:w="3000"/>
+      </w:tblGrid>
+      <w:tr>
+        <w:tc>
+          <w:tcPr>
+            <w:shd w:val="clear" w:fill="2F5496"/>
+            <w:vAlign w:val="center"/>
+          </w:tcPr>
+          <w:p>
+            <w:pPr>
+              <w:shd w:val="clear" w:fill="2F5496"/>
+            </w:pPr>
+            <w:r>
+              <w:rPr>
+                <w:b/>
+                <w:color w:val="FFFFFF"/>
+              </w:rPr>
+              <w:t xml:space="preserve">Field</w:t>
+            </w:r>
+          </w:p>
+        </w:tc>
+        <w:tc>
+          <w:tcPr>
+            <w:shd w:val="clear" w:fill="2F5496"/>
+            <w:vAlign w:val="center"/>
+          </w:tcPr>
+          <w:p>
+            <w:pPr>
+              <w:shd w:val="clear" w:fill="2F5496"/>
+            </w:pPr>
+            <w:r>
+              <w:rPr>
+                <w:b/>
+                <w:color w:val="FFFFFF"/>
+              </w:rPr>
+              <w:t xml:space="preserve">Type</w:t>
+            </w:r>
+          </w:p>
+        </w:tc>
+        <w:tc>
+          <w:tcPr>
+            <w:shd w:val="clear" w:fill="2F5496"/>
+            <w:vAlign w:val="center"/>
+          </w:tcPr>
+          <w:p>
+            <w:pPr>
+              <w:shd w:val="clear" w:fill="2F5496"/>
+            </w:pPr>
+            <w:r>
+              <w:rPr>
+                <w:b/>
+                <w:color w:val="FFFFFF"/>
+              </w:rPr>
+              <w:t xml:space="preserve">Notes</w:t>
+            </w:r>
+          </w:p>
+        </w:tc>
+      </w:tr>
+      <w:tr>
+        <w:tc>
+          <w:tcPr>
+            <w:vAlign w:val="center"/>
+          </w:tcPr>
+          <w:p>
+            <w:pPr/>
+            <w:r>
+              <w:t xml:space="preserve">id / date / status / checkedInAt</w:t>
+            </w:r>
+          </w:p>
+        </w:tc>
+        <w:tc>
+          <w:tcPr>
+            <w:vAlign w:val="center"/>
+          </w:tcPr>
+          <w:p>
+            <w:pPr/>
+            <w:r>
+              <w:t xml:space="preserve"/>
+            </w:r>
+          </w:p>
+        </w:tc>
+        <w:tc>
+          <w:tcPr>
+            <w:vAlign w:val="center"/>
+          </w:tcPr>
+          <w:p>
+            <w:pPr/>
+            <w:r>
+              <w:t xml:space="preserve">status PRESENT when at the school; PENDING_CONFIRMATION for a student who isn't</w:t>
+            </w:r>
+          </w:p>
+        </w:tc>
+      </w:tr>
+      <w:tr>
+        <w:tc>
+          <w:tcPr>
+            <w:vAlign w:val="center"/>
+          </w:tcPr>
+          <w:p>
+            <w:pPr/>
+            <w:r>
+              <w:t xml:space="preserve">confirmationReason</w:t>
+            </w:r>
+          </w:p>
+        </w:tc>
+        <w:tc>
+          <w:tcPr>
+            <w:vAlign w:val="center"/>
+          </w:tcPr>
+          <w:p>
+            <w:pPr/>
+            <w:r>
+              <w:t xml:space="preserve">enum or absent</w:t>
+            </w:r>
+          </w:p>
+        </w:tc>
+        <w:tc>
+          <w:tcPr>
+            <w:vAlign w:val="center"/>
+          </w:tcPr>
+          <w:p>
+            <w:pPr/>
+            <w:r>
+              <w:t xml:space="preserve">why it needs confirming (see above)</w:t>
+            </w:r>
+          </w:p>
+        </w:tc>
+      </w:tr>
+      <w:tr>
+        <w:tc>
+          <w:tcPr>
+            <w:vAlign w:val="center"/>
+          </w:tcPr>
+          <w:p>
+            <w:pPr/>
+            <w:r>
+              <w:t xml:space="preserve">reviewedByName / reviewedAt</w:t>
+            </w:r>
+          </w:p>
+        </w:tc>
+        <w:tc>
+          <w:tcPr>
+            <w:vAlign w:val="center"/>
+          </w:tcPr>
+          <w:p>
+            <w:pPr/>
+            <w:r>
+              <w:t xml:space="preserve"/>
+            </w:r>
+          </w:p>
+        </w:tc>
+        <w:tc>
+          <w:tcPr>
+            <w:vAlign w:val="center"/>
+          </w:tcPr>
+          <w:p>
+            <w:pPr/>
+            <w:r>
+              <w:t xml:space="preserve">absent until staff take the day's roll call (see below)</w:t>
+            </w:r>
+          </w:p>
+        </w:tc>
+      </w:tr>
+      <w:tr>
+        <w:tc>
+          <w:tcPr>
+            <w:vAlign w:val="center"/>
+          </w:tcPr>
+          <w:p>
+            <w:pPr/>
+            <w:r>
+              <w:t xml:space="preserve">lessonType / topic</w:t>
+            </w:r>
+          </w:p>
+        </w:tc>
+        <w:tc>
+          <w:tcPr>
+            <w:vAlign w:val="center"/>
+          </w:tcPr>
+          <w:p>
+            <w:pPr/>
+            <w:r>
+              <w:t xml:space="preserve"/>
+            </w:r>
+          </w:p>
+        </w:tc>
+        <w:tc>
+          <w:tcPr>
+            <w:vAlign w:val="center"/>
+          </w:tcPr>
+          <w:p>
+            <w:pPr/>
+            <w:r>
+              <w:t xml:space="preserve">as sent</w:t>
+            </w:r>
+          </w:p>
+        </w:tc>
+      </w:tr>
+      <w:tr>
+        <w:tc>
+          <w:tcPr>
+            <w:vAlign w:val="center"/>
+          </w:tcPr>
+          <w:p>
+            <w:pPr/>
+            <w:r>
+              <w:t xml:space="preserve">distanceMeters / accuracyMeters</w:t>
+            </w:r>
+          </w:p>
+        </w:tc>
+        <w:tc>
+          <w:tcPr>
+            <w:vAlign w:val="center"/>
+          </w:tcPr>
+          <w:p>
+            <w:pPr/>
+            <w:r>
+              <w:t xml:space="preserve">number</w:t>
+            </w:r>
+          </w:p>
+        </w:tc>
+        <w:tc>
+          <w:tcPr>
+            <w:vAlign w:val="center"/>
+          </w:tcPr>
+          <w:p>
+            <w:pPr/>
+            <w:r>
+              <w:t xml:space="preserve">how far from the school (absent if the school has no location), and the fix's precision</w:t>
+            </w:r>
+          </w:p>
+        </w:tc>
+      </w:tr>
+    </w:tbl>
     <w:p/>
     <w:p>
-      <w:pPr>
-        <w:pStyle w:val="Heading2"/>
-      </w:pPr>
-      <w:r>
-        <w:t xml:space="preserve">Staff: lists, confirming, corrections</w:t>
-      </w:r>
-    </w:p>
+      <w:r>
+        <w:rPr>
+          <w:b/>
+        </w:rPr>
+        <w:t xml:space="preserve">Notes:</w:t>
+      </w:r>
+    </w:p>
+    <w:p>
+      <w:pPr>
+        <w:pStyle w:val="ListParagraph"/>
+        <w:numPr>
+          <w:ilvl w:val="0"/>
+          <w:numId w:val="1"/>
+        </w:numPr>
+      </w:pPr>
+      <w:r>
+        <w:t xml:space="preserve">Use getCurrentPosition with { enableHighAccuracy: true }; ask for location permission with a short explanation first.</w:t>
+      </w:r>
+    </w:p>
+    <w:p>
+      <w:pPr>
+        <w:pStyle w:val="ListParagraph"/>
+        <w:numPr>
+          <w:ilvl w:val="0"/>
+          <w:numId w:val="1"/>
+        </w:numPr>
+      </w:pPr>
+      <w:r>
+        <w:t xml:space="preserve">Student, status PRESENT: show "You're checked in". Status PENDING_CONFIRMATION: show "Checked in - an instructor needs to confirm it because you're about 420 m from school" (use confirmationReason and distanceMeters).</w:t>
+      </w:r>
+    </w:p>
+    <w:p>
+      <w:pPr>
+        <w:pStyle w:val="ListParagraph"/>
+        <w:numPr>
+          <w:ilvl w:val="0"/>
+          <w:numId w:val="1"/>
+        </w:numPr>
+      </w:pPr>
+      <w:r>
+        <w:t xml:space="preserve">Instructors are rejected instead: 400 with data { accuracyMeters, maxAccuracyMeters } if accuracy is worse than 100 m, 400 with data { distanceMeters, radiusMeters } if too far, 400 if the school has no location yet.</w:t>
+      </w:r>
+    </w:p>
+    <w:p>
+      <w:pPr>
+        <w:pStyle w:val="ListParagraph"/>
+        <w:numPr>
+          <w:ilvl w:val="0"/>
+          <w:numId w:val="1"/>
+        </w:numPr>
+      </w:pPr>
+      <w:r>
+        <w:t xml:space="preserve">400 "You've already checked in today" on a second try - show today's record (GET /attendance/me) instead of the button.</w:t>
+      </w:r>
+    </w:p>
+    <w:p/>
     <w:p>
       <w:r>
         <w:rPr>
@@ -30514,7 +30743,7 @@
           <w:sz w:val="18"/>
           <w:szCs w:val="18"/>
         </w:rPr>
-        <w:t xml:space="preserve">/attendance/school/{schoolId}</w:t>
+        <w:t xml:space="preserve">/attendance/me</w:t>
       </w:r>
     </w:p>
     <w:p>
@@ -30522,7 +30751,7 @@
         <w:rPr>
           <w:i/>
         </w:rPr>
-        <w:t xml:space="preserve">One day's attendance for everyone at the school.</w:t>
+        <w:t xml:space="preserve">My attendance history, newest first.</w:t>
       </w:r>
     </w:p>
     <w:p>
@@ -30533,7 +30762,7 @@
         <w:t xml:space="preserve">Access: </w:t>
       </w:r>
       <w:r>
-        <w:t xml:space="preserve">ADMIN (own school) or INSTRUCTOR of that school</w:t>
+        <w:t xml:space="preserve">STUDENT or INSTRUCTOR</w:t>
       </w:r>
     </w:p>
     <w:p>
@@ -30645,7 +30874,7 @@
           <w:p>
             <w:pPr/>
             <w:r>
-              <w:t xml:space="preserve">date</w:t>
+              <w:t xml:space="preserve">from / to</w:t>
             </w:r>
           </w:p>
         </w:tc>
@@ -30678,199 +30907,22 @@
           <w:p>
             <w:pPr/>
             <w:r>
-              <w:t xml:space="preserve">default today (school time)</w:t>
-            </w:r>
-          </w:p>
-        </w:tc>
-      </w:tr>
-      <w:tr>
-        <w:tc>
-          <w:tcPr>
-            <w:vAlign w:val="center"/>
-          </w:tcPr>
-          <w:p>
-            <w:pPr/>
-            <w:r>
-              <w:t xml:space="preserve">role</w:t>
-            </w:r>
-          </w:p>
-        </w:tc>
-        <w:tc>
-          <w:tcPr>
-            <w:vAlign w:val="center"/>
-          </w:tcPr>
-          <w:p>
-            <w:pPr/>
-            <w:r>
-              <w:t xml:space="preserve">STUDENT | INSTRUCTOR (query)</w:t>
-            </w:r>
-          </w:p>
-        </w:tc>
-        <w:tc>
-          <w:tcPr>
-            <w:vAlign w:val="center"/>
-          </w:tcPr>
-          <w:p>
-            <w:pPr/>
-            <w:r>
-              <w:t xml:space="preserve">no</w:t>
-            </w:r>
-          </w:p>
-        </w:tc>
-        <w:tc>
-          <w:tcPr>
-            <w:vAlign w:val="center"/>
-          </w:tcPr>
-          <w:p>
-            <w:pPr/>
-            <w:r>
-              <w:t xml:space="preserve">default STUDENT</w:t>
+              <w:t xml:space="preserve">default: the last 30 days; at most 62 days</w:t>
             </w:r>
           </w:p>
         </w:tc>
       </w:tr>
     </w:tbl>
     <w:p/>
-    <w:p>
-      <w:r>
-        <w:rPr>
-          <w:b/>
-        </w:rPr>
-        <w:t xml:space="preserve">Response (key fields):</w:t>
-      </w:r>
-    </w:p>
-    <w:tbl>
-      <w:tblPr>
-        <w:tblStyle w:val="TableGrid"/>
-        <w:tblW w:w="0" w:type="auto"/>
-        <w:tblBorders>
-          <w:top w:val="single" w:sz="4" w:color="BFBFBF"/>
-          <w:left w:val="single" w:sz="4" w:color="BFBFBF"/>
-          <w:bottom w:val="single" w:sz="4" w:color="BFBFBF"/>
-          <w:right w:val="single" w:sz="4" w:color="BFBFBF"/>
-          <w:insideH w:val="single" w:sz="4" w:color="BFBFBF"/>
-          <w:insideV w:val="single" w:sz="4" w:color="BFBFBF"/>
-        </w:tblBorders>
-      </w:tblPr>
-      <w:tblGrid>
-        <w:gridCol w:w="3000"/>
-        <w:gridCol w:w="3000"/>
-        <w:gridCol w:w="3000"/>
-      </w:tblGrid>
-      <w:tr>
-        <w:tc>
-          <w:tcPr>
-            <w:shd w:val="clear" w:fill="2F5496"/>
-            <w:vAlign w:val="center"/>
-          </w:tcPr>
-          <w:p>
-            <w:pPr>
-              <w:shd w:val="clear" w:fill="2F5496"/>
-            </w:pPr>
-            <w:r>
-              <w:rPr>
-                <w:b/>
-                <w:color w:val="FFFFFF"/>
-              </w:rPr>
-              <w:t xml:space="preserve">Field</w:t>
-            </w:r>
-          </w:p>
-        </w:tc>
-        <w:tc>
-          <w:tcPr>
-            <w:shd w:val="clear" w:fill="2F5496"/>
-            <w:vAlign w:val="center"/>
-          </w:tcPr>
-          <w:p>
-            <w:pPr>
-              <w:shd w:val="clear" w:fill="2F5496"/>
-            </w:pPr>
-            <w:r>
-              <w:rPr>
-                <w:b/>
-                <w:color w:val="FFFFFF"/>
-              </w:rPr>
-              <w:t xml:space="preserve">Type</w:t>
-            </w:r>
-          </w:p>
-        </w:tc>
-        <w:tc>
-          <w:tcPr>
-            <w:shd w:val="clear" w:fill="2F5496"/>
-            <w:vAlign w:val="center"/>
-          </w:tcPr>
-          <w:p>
-            <w:pPr>
-              <w:shd w:val="clear" w:fill="2F5496"/>
-            </w:pPr>
-            <w:r>
-              <w:rPr>
-                <w:b/>
-                <w:color w:val="FFFFFF"/>
-              </w:rPr>
-              <w:t xml:space="preserve">Notes</w:t>
-            </w:r>
-          </w:p>
-        </w:tc>
-      </w:tr>
-      <w:tr>
-        <w:tc>
-          <w:tcPr>
-            <w:vAlign w:val="center"/>
-          </w:tcPr>
-          <w:p>
-            <w:pPr/>
-            <w:r>
-              <w:t xml:space="preserve">[] of attendance entries</w:t>
-            </w:r>
-          </w:p>
-        </w:tc>
-        <w:tc>
-          <w:tcPr>
-            <w:vAlign w:val="center"/>
-          </w:tcPr>
-          <w:p>
-            <w:pPr/>
-            <w:r>
-              <w:t xml:space="preserve"/>
-            </w:r>
-          </w:p>
-        </w:tc>
-        <w:tc>
-          <w:tcPr>
-            <w:vAlign w:val="center"/>
-          </w:tcPr>
-          <w:p>
-            <w:pPr/>
-            <w:r>
-              <w:t xml:space="preserve">one per active student (or instructor), sorted by surname; someone with no record has no id and status NOT_CHECKED_IN / ABSENT</w:t>
-            </w:r>
-          </w:p>
-        </w:tc>
-      </w:tr>
-    </w:tbl>
     <w:p/>
     <w:p>
-      <w:r>
-        <w:rPr>
-          <w:b/>
-        </w:rPr>
-        <w:t xml:space="preserve">Notes:</w:t>
-      </w:r>
-    </w:p>
-    <w:p>
-      <w:pPr>
-        <w:pStyle w:val="ListParagraph"/>
-        <w:numPr>
-          <w:ilvl w:val="0"/>
-          <w:numId w:val="1"/>
-        </w:numPr>
-      </w:pPr>
-      <w:r>
-        <w:t xml:space="preserve">This is the "today's register" screen: a Confirm button on PENDING_CONFIRMATION rows, and a Mark late / absent / present action on every row (POST /attendance/manual).</w:t>
-      </w:r>
-    </w:p>
-    <w:p/>
+      <w:pPr>
+        <w:pStyle w:val="Heading2"/>
+      </w:pPr>
+      <w:r>
+        <w:t xml:space="preserve">Staff: lists, confirming, corrections</w:t>
+      </w:r>
+    </w:p>
     <w:p>
       <w:r>
         <w:rPr>
@@ -30879,7 +30931,7 @@
           <w:sz w:val="18"/>
           <w:szCs w:val="18"/>
         </w:rPr>
-        <w:t xml:space="preserve">PUT  </w:t>
+        <w:t xml:space="preserve">GET  </w:t>
       </w:r>
       <w:r>
         <w:rPr>
@@ -30887,7 +30939,7 @@
           <w:sz w:val="18"/>
           <w:szCs w:val="18"/>
         </w:rPr>
-        <w:t xml:space="preserve">/attendance/{attendanceId}/confirm</w:t>
+        <w:t xml:space="preserve">/attendance/school/{schoolId}</w:t>
       </w:r>
     </w:p>
     <w:p>
@@ -30895,7 +30947,7 @@
         <w:rPr>
           <w:i/>
         </w:rPr>
-        <w:t xml:space="preserve">Confirm a student's check-in.</w:t>
+        <w:t xml:space="preserve">One day's attendance for everyone at the school.</w:t>
       </w:r>
     </w:p>
     <w:p>
@@ -30914,66 +30966,7 @@
         <w:rPr>
           <w:b/>
         </w:rPr>
-        <w:t xml:space="preserve">Notes:</w:t>
-      </w:r>
-    </w:p>
-    <w:p>
-      <w:pPr>
-        <w:pStyle w:val="ListParagraph"/>
-        <w:numPr>
-          <w:ilvl w:val="0"/>
-          <w:numId w:val="1"/>
-        </w:numPr>
-      </w:pPr>
-      <w:r>
-        <w:t xml:space="preserve">Only for status PENDING_CONFIRMATION (400 otherwise); it becomes PRESENT with confirmedAt / confirmedByName.</w:t>
-      </w:r>
-    </w:p>
-    <w:p/>
-    <w:p>
-      <w:r>
-        <w:rPr>
-          <w:b/>
-          <w:rFonts w:ascii="Consolas" w:hAnsi="Consolas" w:cs="Consolas"/>
-          <w:sz w:val="18"/>
-          <w:szCs w:val="18"/>
-        </w:rPr>
-        <w:t xml:space="preserve">POST  </w:t>
-      </w:r>
-      <w:r>
-        <w:rPr>
-          <w:rFonts w:ascii="Consolas" w:hAnsi="Consolas" w:cs="Consolas"/>
-          <w:sz w:val="18"/>
-          <w:szCs w:val="18"/>
-        </w:rPr>
-        <w:t xml:space="preserve">/attendance/manual</w:t>
-      </w:r>
-    </w:p>
-    <w:p>
-      <w:r>
-        <w:rPr>
-          <w:i/>
-        </w:rPr>
-        <w:t xml:space="preserve">Record or correct someone's day.</w:t>
-      </w:r>
-    </w:p>
-    <w:p>
-      <w:r>
-        <w:rPr>
-          <w:b/>
-        </w:rPr>
-        <w:t xml:space="preserve">Access: </w:t>
-      </w:r>
-      <w:r>
-        <w:t xml:space="preserve">ADMIN (anyone at their school) or INSTRUCTOR (students of their school)</w:t>
-      </w:r>
-    </w:p>
-    <w:p>
-      <w:r>
-        <w:rPr>
-          <w:b/>
-        </w:rPr>
-        <w:t xml:space="preserve">Request body:</w:t>
+        <w:t xml:space="preserve">Query / path parameters:</w:t>
       </w:r>
     </w:p>
     <w:tbl>
@@ -31010,6 +31003,200 @@
                 <w:b/>
                 <w:color w:val="FFFFFF"/>
               </w:rPr>
+              <w:t xml:space="preserve">Name</w:t>
+            </w:r>
+          </w:p>
+        </w:tc>
+        <w:tc>
+          <w:tcPr>
+            <w:shd w:val="clear" w:fill="2F5496"/>
+            <w:vAlign w:val="center"/>
+          </w:tcPr>
+          <w:p>
+            <w:pPr>
+              <w:shd w:val="clear" w:fill="2F5496"/>
+            </w:pPr>
+            <w:r>
+              <w:rPr>
+                <w:b/>
+                <w:color w:val="FFFFFF"/>
+              </w:rPr>
+              <w:t xml:space="preserve">Type</w:t>
+            </w:r>
+          </w:p>
+        </w:tc>
+        <w:tc>
+          <w:tcPr>
+            <w:shd w:val="clear" w:fill="2F5496"/>
+            <w:vAlign w:val="center"/>
+          </w:tcPr>
+          <w:p>
+            <w:pPr>
+              <w:shd w:val="clear" w:fill="2F5496"/>
+            </w:pPr>
+            <w:r>
+              <w:rPr>
+                <w:b/>
+                <w:color w:val="FFFFFF"/>
+              </w:rPr>
+              <w:t xml:space="preserve">Required</w:t>
+            </w:r>
+          </w:p>
+        </w:tc>
+        <w:tc>
+          <w:tcPr>
+            <w:shd w:val="clear" w:fill="2F5496"/>
+            <w:vAlign w:val="center"/>
+          </w:tcPr>
+          <w:p>
+            <w:pPr>
+              <w:shd w:val="clear" w:fill="2F5496"/>
+            </w:pPr>
+            <w:r>
+              <w:rPr>
+                <w:b/>
+                <w:color w:val="FFFFFF"/>
+              </w:rPr>
+              <w:t xml:space="preserve">Notes</w:t>
+            </w:r>
+          </w:p>
+        </w:tc>
+      </w:tr>
+      <w:tr>
+        <w:tc>
+          <w:tcPr>
+            <w:vAlign w:val="center"/>
+          </w:tcPr>
+          <w:p>
+            <w:pPr/>
+            <w:r>
+              <w:t xml:space="preserve">date</w:t>
+            </w:r>
+          </w:p>
+        </w:tc>
+        <w:tc>
+          <w:tcPr>
+            <w:vAlign w:val="center"/>
+          </w:tcPr>
+          <w:p>
+            <w:pPr/>
+            <w:r>
+              <w:t xml:space="preserve">date (query)</w:t>
+            </w:r>
+          </w:p>
+        </w:tc>
+        <w:tc>
+          <w:tcPr>
+            <w:vAlign w:val="center"/>
+          </w:tcPr>
+          <w:p>
+            <w:pPr/>
+            <w:r>
+              <w:t xml:space="preserve">no</w:t>
+            </w:r>
+          </w:p>
+        </w:tc>
+        <w:tc>
+          <w:tcPr>
+            <w:vAlign w:val="center"/>
+          </w:tcPr>
+          <w:p>
+            <w:pPr/>
+            <w:r>
+              <w:t xml:space="preserve">default today (school time)</w:t>
+            </w:r>
+          </w:p>
+        </w:tc>
+      </w:tr>
+      <w:tr>
+        <w:tc>
+          <w:tcPr>
+            <w:vAlign w:val="center"/>
+          </w:tcPr>
+          <w:p>
+            <w:pPr/>
+            <w:r>
+              <w:t xml:space="preserve">role</w:t>
+            </w:r>
+          </w:p>
+        </w:tc>
+        <w:tc>
+          <w:tcPr>
+            <w:vAlign w:val="center"/>
+          </w:tcPr>
+          <w:p>
+            <w:pPr/>
+            <w:r>
+              <w:t xml:space="preserve">STUDENT | INSTRUCTOR (query)</w:t>
+            </w:r>
+          </w:p>
+        </w:tc>
+        <w:tc>
+          <w:tcPr>
+            <w:vAlign w:val="center"/>
+          </w:tcPr>
+          <w:p>
+            <w:pPr/>
+            <w:r>
+              <w:t xml:space="preserve">no</w:t>
+            </w:r>
+          </w:p>
+        </w:tc>
+        <w:tc>
+          <w:tcPr>
+            <w:vAlign w:val="center"/>
+          </w:tcPr>
+          <w:p>
+            <w:pPr/>
+            <w:r>
+              <w:t xml:space="preserve">default STUDENT</w:t>
+            </w:r>
+          </w:p>
+        </w:tc>
+      </w:tr>
+    </w:tbl>
+    <w:p/>
+    <w:p>
+      <w:r>
+        <w:rPr>
+          <w:b/>
+        </w:rPr>
+        <w:t xml:space="preserve">Response (key fields):</w:t>
+      </w:r>
+    </w:p>
+    <w:tbl>
+      <w:tblPr>
+        <w:tblStyle w:val="TableGrid"/>
+        <w:tblW w:w="0" w:type="auto"/>
+        <w:tblBorders>
+          <w:top w:val="single" w:sz="4" w:color="BFBFBF"/>
+          <w:left w:val="single" w:sz="4" w:color="BFBFBF"/>
+          <w:bottom w:val="single" w:sz="4" w:color="BFBFBF"/>
+          <w:right w:val="single" w:sz="4" w:color="BFBFBF"/>
+          <w:insideH w:val="single" w:sz="4" w:color="BFBFBF"/>
+          <w:insideV w:val="single" w:sz="4" w:color="BFBFBF"/>
+        </w:tblBorders>
+      </w:tblPr>
+      <w:tblGrid>
+        <w:gridCol w:w="3000"/>
+        <w:gridCol w:w="3000"/>
+        <w:gridCol w:w="3000"/>
+      </w:tblGrid>
+      <w:tr>
+        <w:tc>
+          <w:tcPr>
+            <w:shd w:val="clear" w:fill="2F5496"/>
+            <w:vAlign w:val="center"/>
+          </w:tcPr>
+          <w:p>
+            <w:pPr>
+              <w:shd w:val="clear" w:fill="2F5496"/>
+            </w:pPr>
+            <w:r>
+              <w:rPr>
+                <w:b/>
+                <w:color w:val="FFFFFF"/>
+              </w:rPr>
               <w:t xml:space="preserve">Field</w:t>
             </w:r>
           </w:p>
@@ -31046,24 +31233,6 @@
                 <w:b/>
                 <w:color w:val="FFFFFF"/>
               </w:rPr>
-              <w:t xml:space="preserve">Required</w:t>
-            </w:r>
-          </w:p>
-        </w:tc>
-        <w:tc>
-          <w:tcPr>
-            <w:shd w:val="clear" w:fill="2F5496"/>
-            <w:vAlign w:val="center"/>
-          </w:tcPr>
-          <w:p>
-            <w:pPr>
-              <w:shd w:val="clear" w:fill="2F5496"/>
-            </w:pPr>
-            <w:r>
-              <w:rPr>
-                <w:b/>
-                <w:color w:val="FFFFFF"/>
-              </w:rPr>
               <w:t xml:space="preserve">Notes</w:t>
             </w:r>
           </w:p>
@@ -31077,121 +31246,7 @@
           <w:p>
             <w:pPr/>
             <w:r>
-              <w:t xml:space="preserve">userId</w:t>
-            </w:r>
-          </w:p>
-        </w:tc>
-        <w:tc>
-          <w:tcPr>
-            <w:vAlign w:val="center"/>
-          </w:tcPr>
-          <w:p>
-            <w:pPr/>
-            <w:r>
-              <w:t xml:space="preserve">number</w:t>
-            </w:r>
-          </w:p>
-        </w:tc>
-        <w:tc>
-          <w:tcPr>
-            <w:vAlign w:val="center"/>
-          </w:tcPr>
-          <w:p>
-            <w:pPr/>
-            <w:r>
-              <w:t xml:space="preserve">yes</w:t>
-            </w:r>
-          </w:p>
-        </w:tc>
-        <w:tc>
-          <w:tcPr>
-            <w:vAlign w:val="center"/>
-          </w:tcPr>
-          <w:p>
-            <w:pPr/>
-            <w:r>
-              <w:t xml:space="preserve">the person's User.id (userId in the day list)</w:t>
-            </w:r>
-          </w:p>
-        </w:tc>
-      </w:tr>
-      <w:tr>
-        <w:tc>
-          <w:tcPr>
-            <w:vAlign w:val="center"/>
-          </w:tcPr>
-          <w:p>
-            <w:pPr/>
-            <w:r>
-              <w:t xml:space="preserve">date</w:t>
-            </w:r>
-          </w:p>
-        </w:tc>
-        <w:tc>
-          <w:tcPr>
-            <w:vAlign w:val="center"/>
-          </w:tcPr>
-          <w:p>
-            <w:pPr/>
-            <w:r>
-              <w:t xml:space="preserve">date</w:t>
-            </w:r>
-          </w:p>
-        </w:tc>
-        <w:tc>
-          <w:tcPr>
-            <w:vAlign w:val="center"/>
-          </w:tcPr>
-          <w:p>
-            <w:pPr/>
-            <w:r>
-              <w:t xml:space="preserve">yes</w:t>
-            </w:r>
-          </w:p>
-        </w:tc>
-        <w:tc>
-          <w:tcPr>
-            <w:vAlign w:val="center"/>
-          </w:tcPr>
-          <w:p>
-            <w:pPr/>
-            <w:r>
-              <w:t xml:space="preserve">today or earlier</w:t>
-            </w:r>
-          </w:p>
-        </w:tc>
-      </w:tr>
-      <w:tr>
-        <w:tc>
-          <w:tcPr>
-            <w:vAlign w:val="center"/>
-          </w:tcPr>
-          <w:p>
-            <w:pPr/>
-            <w:r>
-              <w:t xml:space="preserve">status</w:t>
-            </w:r>
-          </w:p>
-        </w:tc>
-        <w:tc>
-          <w:tcPr>
-            <w:vAlign w:val="center"/>
-          </w:tcPr>
-          <w:p>
-            <w:pPr/>
-            <w:r>
-              <w:t xml:space="preserve">PRESENT | LATE | ABSENT</w:t>
-            </w:r>
-          </w:p>
-        </w:tc>
-        <w:tc>
-          <w:tcPr>
-            <w:vAlign w:val="center"/>
-          </w:tcPr>
-          <w:p>
-            <w:pPr/>
-            <w:r>
-              <w:t xml:space="preserve">yes</w:t>
+              <w:t xml:space="preserve">[] of attendance entries</w:t>
             </w:r>
           </w:p>
         </w:tc>
@@ -31206,95 +31261,14 @@
             </w:r>
           </w:p>
         </w:tc>
-      </w:tr>
-      <w:tr>
-        <w:tc>
-          <w:tcPr>
-            <w:vAlign w:val="center"/>
-          </w:tcPr>
-          <w:p>
-            <w:pPr/>
-            <w:r>
-              <w:t xml:space="preserve">reason</w:t>
-            </w:r>
-          </w:p>
-        </w:tc>
-        <w:tc>
-          <w:tcPr>
-            <w:vAlign w:val="center"/>
-          </w:tcPr>
-          <w:p>
-            <w:pPr/>
-            <w:r>
-              <w:t xml:space="preserve">string</w:t>
-            </w:r>
-          </w:p>
-        </w:tc>
-        <w:tc>
-          <w:tcPr>
-            <w:vAlign w:val="center"/>
-          </w:tcPr>
-          <w:p>
-            <w:pPr/>
-            <w:r>
-              <w:t xml:space="preserve">no</w:t>
-            </w:r>
-          </w:p>
-        </w:tc>
-        <w:tc>
-          <w:tcPr>
-            <w:vAlign w:val="center"/>
-          </w:tcPr>
-          <w:p>
-            <w:pPr/>
-            <w:r>
-              <w:t xml:space="preserve">max 500, e.g. "Arrived 09:40" or "Sick note"</w:t>
-            </w:r>
-          </w:p>
-        </w:tc>
-      </w:tr>
-      <w:tr>
-        <w:tc>
-          <w:tcPr>
-            <w:vAlign w:val="center"/>
-          </w:tcPr>
-          <w:p>
-            <w:pPr/>
-            <w:r>
-              <w:t xml:space="preserve">lessonType / topic</w:t>
-            </w:r>
-          </w:p>
-        </w:tc>
-        <w:tc>
-          <w:tcPr>
-            <w:vAlign w:val="center"/>
-          </w:tcPr>
-          <w:p>
-            <w:pPr/>
-            <w:r>
-              <w:t xml:space="preserve">PRACTICAL | THEORY / string</w:t>
-            </w:r>
-          </w:p>
-        </w:tc>
-        <w:tc>
-          <w:tcPr>
-            <w:vAlign w:val="center"/>
-          </w:tcPr>
-          <w:p>
-            <w:pPr/>
-            <w:r>
-              <w:t xml:space="preserve">no</w:t>
-            </w:r>
-          </w:p>
-        </w:tc>
-        <w:tc>
-          <w:tcPr>
-            <w:vAlign w:val="center"/>
-          </w:tcPr>
-          <w:p>
-            <w:pPr/>
-            <w:r>
-              <w:t xml:space="preserve">kept from the check-in if left out</w:t>
+        <w:tc>
+          <w:tcPr>
+            <w:vAlign w:val="center"/>
+          </w:tcPr>
+          <w:p>
+            <w:pPr/>
+            <w:r>
+              <w:t xml:space="preserve">one per active student (or instructor), sorted by surname; someone with no record has no id and status NOT_CHECKED_IN / ABSENT</w:t>
             </w:r>
           </w:p>
         </w:tc>
@@ -31318,24 +31292,11 @@
         </w:numPr>
       </w:pPr>
       <w:r>
-        <w:t xml:space="preserve">Overwrites a check-in for that day if there is one (the location stays on record); source becomes MANUAL and recordedByName is set.</w:t>
+        <w:t xml:space="preserve">This is the "today's register" screen: a Confirm button on PENDING_CONFIRMATION rows, and a Mark late / absent / present action on every row (POST /attendance/manual).</w:t>
       </w:r>
     </w:p>
     <w:p/>
     <w:p>
-      <w:pPr>
-        <w:pStyle w:val="Heading2"/>
-      </w:pPr>
-      <w:r>
-        <w:t xml:space="preserve">Roll call: confirming who was really there</w:t>
-      </w:r>
-    </w:p>
-    <w:p>
-      <w:r>
-        <w:t xml:space="preserve">A check-in only proves someone came onto the premises - they could sign in and leave. So staff take a roll call: during or after the lesson they go through the day's list, keep the people who are really there and mark anyone who left as ABSENT, then save the whole list in one go. Every saved entry is stamped with who reviewed it and when (reviewedByName / reviewedAt), so an unreviewed day stands out.</w:t>
-      </w:r>
-    </w:p>
-    <w:p>
       <w:r>
         <w:rPr>
           <w:b/>
@@ -31351,7 +31312,7 @@
           <w:sz w:val="18"/>
           <w:szCs w:val="18"/>
         </w:rPr>
-        <w:t xml:space="preserve">/attendance/school/{schoolId}/roll-call</w:t>
+        <w:t xml:space="preserve">/attendance/{attendanceId}/confirm</w:t>
       </w:r>
     </w:p>
     <w:p>
@@ -31359,7 +31320,7 @@
         <w:rPr>
           <w:i/>
         </w:rPr>
-        <w:t xml:space="preserve">Save a day's roll call.</w:t>
+        <w:t xml:space="preserve">Confirm a student's check-in.</w:t>
       </w:r>
     </w:p>
     <w:p>
@@ -31370,7 +31331,66 @@
         <w:t xml:space="preserve">Access: </w:t>
       </w:r>
       <w:r>
-        <w:t xml:space="preserve">Students: an INSTRUCTOR of that school or its ADMIN. Instructors (role=INSTRUCTOR): the school's ADMIN only</w:t>
+        <w:t xml:space="preserve">ADMIN (own school) or INSTRUCTOR of that school</w:t>
+      </w:r>
+    </w:p>
+    <w:p>
+      <w:r>
+        <w:rPr>
+          <w:b/>
+        </w:rPr>
+        <w:t xml:space="preserve">Notes:</w:t>
+      </w:r>
+    </w:p>
+    <w:p>
+      <w:pPr>
+        <w:pStyle w:val="ListParagraph"/>
+        <w:numPr>
+          <w:ilvl w:val="0"/>
+          <w:numId w:val="1"/>
+        </w:numPr>
+      </w:pPr>
+      <w:r>
+        <w:t xml:space="preserve">Only for status PENDING_CONFIRMATION (400 otherwise); it becomes PRESENT with confirmedAt / confirmedByName.</w:t>
+      </w:r>
+    </w:p>
+    <w:p/>
+    <w:p>
+      <w:r>
+        <w:rPr>
+          <w:b/>
+          <w:rFonts w:ascii="Consolas" w:hAnsi="Consolas" w:cs="Consolas"/>
+          <w:sz w:val="18"/>
+          <w:szCs w:val="18"/>
+        </w:rPr>
+        <w:t xml:space="preserve">POST  </w:t>
+      </w:r>
+      <w:r>
+        <w:rPr>
+          <w:rFonts w:ascii="Consolas" w:hAnsi="Consolas" w:cs="Consolas"/>
+          <w:sz w:val="18"/>
+          <w:szCs w:val="18"/>
+        </w:rPr>
+        <w:t xml:space="preserve">/attendance/manual</w:t>
+      </w:r>
+    </w:p>
+    <w:p>
+      <w:r>
+        <w:rPr>
+          <w:i/>
+        </w:rPr>
+        <w:t xml:space="preserve">Record or correct someone's day.</w:t>
+      </w:r>
+    </w:p>
+    <w:p>
+      <w:r>
+        <w:rPr>
+          <w:b/>
+        </w:rPr>
+        <w:t xml:space="preserve">Access: </w:t>
+      </w:r>
+      <w:r>
+        <w:t xml:space="preserve">ADMIN (anyone at their school) or INSTRUCTOR (students of their school)</w:t>
       </w:r>
     </w:p>
     <w:p>
@@ -31482,6 +31502,52 @@
           <w:p>
             <w:pPr/>
             <w:r>
+              <w:t xml:space="preserve">userId</w:t>
+            </w:r>
+          </w:p>
+        </w:tc>
+        <w:tc>
+          <w:tcPr>
+            <w:vAlign w:val="center"/>
+          </w:tcPr>
+          <w:p>
+            <w:pPr/>
+            <w:r>
+              <w:t xml:space="preserve">number</w:t>
+            </w:r>
+          </w:p>
+        </w:tc>
+        <w:tc>
+          <w:tcPr>
+            <w:vAlign w:val="center"/>
+          </w:tcPr>
+          <w:p>
+            <w:pPr/>
+            <w:r>
+              <w:t xml:space="preserve">yes</w:t>
+            </w:r>
+          </w:p>
+        </w:tc>
+        <w:tc>
+          <w:tcPr>
+            <w:vAlign w:val="center"/>
+          </w:tcPr>
+          <w:p>
+            <w:pPr/>
+            <w:r>
+              <w:t xml:space="preserve">the person's User.id (userId in the day list)</w:t>
+            </w:r>
+          </w:p>
+        </w:tc>
+      </w:tr>
+      <w:tr>
+        <w:tc>
+          <w:tcPr>
+            <w:vAlign w:val="center"/>
+          </w:tcPr>
+          <w:p>
+            <w:pPr/>
+            <w:r>
               <w:t xml:space="preserve">date</w:t>
             </w:r>
           </w:p>
@@ -31528,18 +31594,64 @@
           <w:p>
             <w:pPr/>
             <w:r>
-              <w:t xml:space="preserve">role</w:t>
-            </w:r>
-          </w:p>
-        </w:tc>
-        <w:tc>
-          <w:tcPr>
-            <w:vAlign w:val="center"/>
-          </w:tcPr>
-          <w:p>
-            <w:pPr/>
-            <w:r>
-              <w:t xml:space="preserve">STUDENT | INSTRUCTOR</w:t>
+              <w:t xml:space="preserve">status</w:t>
+            </w:r>
+          </w:p>
+        </w:tc>
+        <w:tc>
+          <w:tcPr>
+            <w:vAlign w:val="center"/>
+          </w:tcPr>
+          <w:p>
+            <w:pPr/>
+            <w:r>
+              <w:t xml:space="preserve">PRESENT | LATE | ABSENT</w:t>
+            </w:r>
+          </w:p>
+        </w:tc>
+        <w:tc>
+          <w:tcPr>
+            <w:vAlign w:val="center"/>
+          </w:tcPr>
+          <w:p>
+            <w:pPr/>
+            <w:r>
+              <w:t xml:space="preserve">yes</w:t>
+            </w:r>
+          </w:p>
+        </w:tc>
+        <w:tc>
+          <w:tcPr>
+            <w:vAlign w:val="center"/>
+          </w:tcPr>
+          <w:p>
+            <w:pPr/>
+            <w:r>
+              <w:t xml:space="preserve"/>
+            </w:r>
+          </w:p>
+        </w:tc>
+      </w:tr>
+      <w:tr>
+        <w:tc>
+          <w:tcPr>
+            <w:vAlign w:val="center"/>
+          </w:tcPr>
+          <w:p>
+            <w:pPr/>
+            <w:r>
+              <w:t xml:space="preserve">reason</w:t>
+            </w:r>
+          </w:p>
+        </w:tc>
+        <w:tc>
+          <w:tcPr>
+            <w:vAlign w:val="center"/>
+          </w:tcPr>
+          <w:p>
+            <w:pPr/>
+            <w:r>
+              <w:t xml:space="preserve">string</w:t>
             </w:r>
           </w:p>
         </w:tc>
@@ -31561,169 +31673,31 @@
           <w:p>
             <w:pPr/>
             <w:r>
-              <w:t xml:space="preserve">default STUDENT</w:t>
-            </w:r>
-          </w:p>
-        </w:tc>
-      </w:tr>
-      <w:tr>
-        <w:tc>
-          <w:tcPr>
-            <w:vAlign w:val="center"/>
-          </w:tcPr>
-          <w:p>
-            <w:pPr/>
-            <w:r>
-              <w:t xml:space="preserve">entries</w:t>
-            </w:r>
-          </w:p>
-        </w:tc>
-        <w:tc>
-          <w:tcPr>
-            <w:vAlign w:val="center"/>
-          </w:tcPr>
-          <w:p>
-            <w:pPr/>
-            <w:r>
-              <w:t xml:space="preserve">array</w:t>
-            </w:r>
-          </w:p>
-        </w:tc>
-        <w:tc>
-          <w:tcPr>
-            <w:vAlign w:val="center"/>
-          </w:tcPr>
-          <w:p>
-            <w:pPr/>
-            <w:r>
-              <w:t xml:space="preserve">yes</w:t>
-            </w:r>
-          </w:p>
-        </w:tc>
-        <w:tc>
-          <w:tcPr>
-            <w:vAlign w:val="center"/>
-          </w:tcPr>
-          <w:p>
-            <w:pPr/>
-            <w:r>
-              <w:t xml:space="preserve">one per person you checked - typically the whole day list</w:t>
-            </w:r>
-          </w:p>
-        </w:tc>
-      </w:tr>
-      <w:tr>
-        <w:tc>
-          <w:tcPr>
-            <w:vAlign w:val="center"/>
-          </w:tcPr>
-          <w:p>
-            <w:pPr/>
-            <w:r>
-              <w:t xml:space="preserve">entries[].userId</w:t>
-            </w:r>
-          </w:p>
-        </w:tc>
-        <w:tc>
-          <w:tcPr>
-            <w:vAlign w:val="center"/>
-          </w:tcPr>
-          <w:p>
-            <w:pPr/>
-            <w:r>
-              <w:t xml:space="preserve">number</w:t>
-            </w:r>
-          </w:p>
-        </w:tc>
-        <w:tc>
-          <w:tcPr>
-            <w:vAlign w:val="center"/>
-          </w:tcPr>
-          <w:p>
-            <w:pPr/>
-            <w:r>
-              <w:t xml:space="preserve">yes</w:t>
-            </w:r>
-          </w:p>
-        </w:tc>
-        <w:tc>
-          <w:tcPr>
-            <w:vAlign w:val="center"/>
-          </w:tcPr>
-          <w:p>
-            <w:pPr/>
-            <w:r>
-              <w:t xml:space="preserve">userId from the day list</w:t>
-            </w:r>
-          </w:p>
-        </w:tc>
-      </w:tr>
-      <w:tr>
-        <w:tc>
-          <w:tcPr>
-            <w:vAlign w:val="center"/>
-          </w:tcPr>
-          <w:p>
-            <w:pPr/>
-            <w:r>
-              <w:t xml:space="preserve">entries[].status</w:t>
-            </w:r>
-          </w:p>
-        </w:tc>
-        <w:tc>
-          <w:tcPr>
-            <w:vAlign w:val="center"/>
-          </w:tcPr>
-          <w:p>
-            <w:pPr/>
-            <w:r>
-              <w:t xml:space="preserve">PRESENT | LATE | ABSENT</w:t>
-            </w:r>
-          </w:p>
-        </w:tc>
-        <w:tc>
-          <w:tcPr>
-            <w:vAlign w:val="center"/>
-          </w:tcPr>
-          <w:p>
-            <w:pPr/>
-            <w:r>
-              <w:t xml:space="preserve">yes</w:t>
-            </w:r>
-          </w:p>
-        </w:tc>
-        <w:tc>
-          <w:tcPr>
-            <w:vAlign w:val="center"/>
-          </w:tcPr>
-          <w:p>
-            <w:pPr/>
-            <w:r>
-              <w:t xml:space="preserve">what you saw</w:t>
-            </w:r>
-          </w:p>
-        </w:tc>
-      </w:tr>
-      <w:tr>
-        <w:tc>
-          <w:tcPr>
-            <w:vAlign w:val="center"/>
-          </w:tcPr>
-          <w:p>
-            <w:pPr/>
-            <w:r>
-              <w:t xml:space="preserve">entries[].reason</w:t>
-            </w:r>
-          </w:p>
-        </w:tc>
-        <w:tc>
-          <w:tcPr>
-            <w:vAlign w:val="center"/>
-          </w:tcPr>
-          <w:p>
-            <w:pPr/>
-            <w:r>
-              <w:t xml:space="preserve">string</w:t>
+              <w:t xml:space="preserve">max 500, e.g. "Arrived 09:40" or "Sick note"</w:t>
+            </w:r>
+          </w:p>
+        </w:tc>
+      </w:tr>
+      <w:tr>
+        <w:tc>
+          <w:tcPr>
+            <w:vAlign w:val="center"/>
+          </w:tcPr>
+          <w:p>
+            <w:pPr/>
+            <w:r>
+              <w:t xml:space="preserve">lessonType / topic</w:t>
+            </w:r>
+          </w:p>
+        </w:tc>
+        <w:tc>
+          <w:tcPr>
+            <w:vAlign w:val="center"/>
+          </w:tcPr>
+          <w:p>
+            <w:pPr/>
+            <w:r>
+              <w:t xml:space="preserve">PRACTICAL | THEORY / string</w:t>
             </w:r>
           </w:p>
         </w:tc>
@@ -31745,251 +31719,7 @@
           <w:p>
             <w:pPr/>
             <w:r>
-              <w:t xml:space="preserve">max 500, e.g. "Signed in and left"</w:t>
-            </w:r>
-          </w:p>
-        </w:tc>
-      </w:tr>
-    </w:tbl>
-    <w:p/>
-    <w:p>
-      <w:r>
-        <w:rPr>
-          <w:b/>
-        </w:rPr>
-        <w:t xml:space="preserve">Example request:</w:t>
-      </w:r>
-    </w:p>
-    <w:p>
-      <w:pPr>
-        <w:pStyle w:val="Code"/>
-        <w:shd w:val="clear" w:fill="F3F3F3"/>
-      </w:pPr>
-      <w:r>
-        <w:rPr>
-          <w:rFonts w:ascii="Consolas" w:hAnsi="Consolas"/>
-          <w:sz w:val="18"/>
-        </w:rPr>
-        <w:t xml:space="preserve">{</w:t>
-      </w:r>
-    </w:p>
-    <w:p>
-      <w:pPr>
-        <w:pStyle w:val="Code"/>
-        <w:shd w:val="clear" w:fill="F3F3F3"/>
-      </w:pPr>
-      <w:r>
-        <w:rPr>
-          <w:rFonts w:ascii="Consolas" w:hAnsi="Consolas"/>
-          <w:sz w:val="18"/>
-        </w:rPr>
-        <w:t xml:space="preserve">  "date": "2026-10-02",</w:t>
-      </w:r>
-    </w:p>
-    <w:p>
-      <w:pPr>
-        <w:pStyle w:val="Code"/>
-        <w:shd w:val="clear" w:fill="F3F3F3"/>
-      </w:pPr>
-      <w:r>
-        <w:rPr>
-          <w:rFonts w:ascii="Consolas" w:hAnsi="Consolas"/>
-          <w:sz w:val="18"/>
-        </w:rPr>
-        <w:t xml:space="preserve">  "role": "STUDENT",</w:t>
-      </w:r>
-    </w:p>
-    <w:p>
-      <w:pPr>
-        <w:pStyle w:val="Code"/>
-        <w:shd w:val="clear" w:fill="F3F3F3"/>
-      </w:pPr>
-      <w:r>
-        <w:rPr>
-          <w:rFonts w:ascii="Consolas" w:hAnsi="Consolas"/>
-          <w:sz w:val="18"/>
-        </w:rPr>
-        <w:t xml:space="preserve">  "entries": [</w:t>
-      </w:r>
-    </w:p>
-    <w:p>
-      <w:pPr>
-        <w:pStyle w:val="Code"/>
-        <w:shd w:val="clear" w:fill="F3F3F3"/>
-      </w:pPr>
-      <w:r>
-        <w:rPr>
-          <w:rFonts w:ascii="Consolas" w:hAnsi="Consolas"/>
-          <w:sz w:val="18"/>
-        </w:rPr>
-        <w:t xml:space="preserve">    { "userId": 31, "status": "PRESENT" },</w:t>
-      </w:r>
-    </w:p>
-    <w:p>
-      <w:pPr>
-        <w:pStyle w:val="Code"/>
-        <w:shd w:val="clear" w:fill="F3F3F3"/>
-      </w:pPr>
-      <w:r>
-        <w:rPr>
-          <w:rFonts w:ascii="Consolas" w:hAnsi="Consolas"/>
-          <w:sz w:val="18"/>
-        </w:rPr>
-        <w:t xml:space="preserve">    { "userId": 34, "status": "ABSENT", "reason": "Signed in and left" },</w:t>
-      </w:r>
-    </w:p>
-    <w:p>
-      <w:pPr>
-        <w:pStyle w:val="Code"/>
-        <w:shd w:val="clear" w:fill="F3F3F3"/>
-      </w:pPr>
-      <w:r>
-        <w:rPr>
-          <w:rFonts w:ascii="Consolas" w:hAnsi="Consolas"/>
-          <w:sz w:val="18"/>
-        </w:rPr>
-        <w:t xml:space="preserve">    { "userId": 35, "status": "LATE", "reason": "Arrived 09:40" }</w:t>
-      </w:r>
-    </w:p>
-    <w:p>
-      <w:pPr>
-        <w:pStyle w:val="Code"/>
-        <w:shd w:val="clear" w:fill="F3F3F3"/>
-      </w:pPr>
-      <w:r>
-        <w:rPr>
-          <w:rFonts w:ascii="Consolas" w:hAnsi="Consolas"/>
-          <w:sz w:val="18"/>
-        </w:rPr>
-        <w:t xml:space="preserve">  ]</w:t>
-      </w:r>
-    </w:p>
-    <w:p>
-      <w:pPr>
-        <w:pStyle w:val="Code"/>
-        <w:shd w:val="clear" w:fill="F3F3F3"/>
-      </w:pPr>
-      <w:r>
-        <w:rPr>
-          <w:rFonts w:ascii="Consolas" w:hAnsi="Consolas"/>
-          <w:sz w:val="18"/>
-        </w:rPr>
-        <w:t xml:space="preserve">}</w:t>
-      </w:r>
-    </w:p>
-    <w:p>
-      <w:r>
-        <w:rPr>
-          <w:b/>
-        </w:rPr>
-        <w:t xml:space="preserve">Response (key fields):</w:t>
-      </w:r>
-    </w:p>
-    <w:tbl>
-      <w:tblPr>
-        <w:tblStyle w:val="TableGrid"/>
-        <w:tblW w:w="0" w:type="auto"/>
-        <w:tblBorders>
-          <w:top w:val="single" w:sz="4" w:color="BFBFBF"/>
-          <w:left w:val="single" w:sz="4" w:color="BFBFBF"/>
-          <w:bottom w:val="single" w:sz="4" w:color="BFBFBF"/>
-          <w:right w:val="single" w:sz="4" w:color="BFBFBF"/>
-          <w:insideH w:val="single" w:sz="4" w:color="BFBFBF"/>
-          <w:insideV w:val="single" w:sz="4" w:color="BFBFBF"/>
-        </w:tblBorders>
-      </w:tblPr>
-      <w:tblGrid>
-        <w:gridCol w:w="3000"/>
-        <w:gridCol w:w="3000"/>
-        <w:gridCol w:w="3000"/>
-      </w:tblGrid>
-      <w:tr>
-        <w:tc>
-          <w:tcPr>
-            <w:shd w:val="clear" w:fill="2F5496"/>
-            <w:vAlign w:val="center"/>
-          </w:tcPr>
-          <w:p>
-            <w:pPr>
-              <w:shd w:val="clear" w:fill="2F5496"/>
-            </w:pPr>
-            <w:r>
-              <w:rPr>
-                <w:b/>
-                <w:color w:val="FFFFFF"/>
-              </w:rPr>
-              <w:t xml:space="preserve">Field</w:t>
-            </w:r>
-          </w:p>
-        </w:tc>
-        <w:tc>
-          <w:tcPr>
-            <w:shd w:val="clear" w:fill="2F5496"/>
-            <w:vAlign w:val="center"/>
-          </w:tcPr>
-          <w:p>
-            <w:pPr>
-              <w:shd w:val="clear" w:fill="2F5496"/>
-            </w:pPr>
-            <w:r>
-              <w:rPr>
-                <w:b/>
-                <w:color w:val="FFFFFF"/>
-              </w:rPr>
-              <w:t xml:space="preserve">Type</w:t>
-            </w:r>
-          </w:p>
-        </w:tc>
-        <w:tc>
-          <w:tcPr>
-            <w:shd w:val="clear" w:fill="2F5496"/>
-            <w:vAlign w:val="center"/>
-          </w:tcPr>
-          <w:p>
-            <w:pPr>
-              <w:shd w:val="clear" w:fill="2F5496"/>
-            </w:pPr>
-            <w:r>
-              <w:rPr>
-                <w:b/>
-                <w:color w:val="FFFFFF"/>
-              </w:rPr>
-              <w:t xml:space="preserve">Notes</w:t>
-            </w:r>
-          </w:p>
-        </w:tc>
-      </w:tr>
-      <w:tr>
-        <w:tc>
-          <w:tcPr>
-            <w:vAlign w:val="center"/>
-          </w:tcPr>
-          <w:p>
-            <w:pPr/>
-            <w:r>
-              <w:t xml:space="preserve">[] of attendance entries</w:t>
-            </w:r>
-          </w:p>
-        </w:tc>
-        <w:tc>
-          <w:tcPr>
-            <w:vAlign w:val="center"/>
-          </w:tcPr>
-          <w:p>
-            <w:pPr/>
-            <w:r>
-              <w:t xml:space="preserve"/>
-            </w:r>
-          </w:p>
-        </w:tc>
-        <w:tc>
-          <w:tcPr>
-            <w:vAlign w:val="center"/>
-          </w:tcPr>
-          <w:p>
-            <w:pPr/>
-            <w:r>
-              <w:t xml:space="preserve">the saved entries, each with reviewedByName / reviewedAt</w:t>
+              <w:t xml:space="preserve">kept from the check-in if left out</w:t>
             </w:r>
           </w:p>
         </w:tc>
@@ -32013,47 +31743,24 @@
         </w:numPr>
       </w:pPr>
       <w:r>
-        <w:t xml:space="preserve">A self check-in kept as PRESENT stays a check-in (location and time kept) and is simply marked reviewed; one changed to ABSENT/LATE becomes a staff correction (source MANUAL, recordedByName, reason).</w:t>
-      </w:r>
-    </w:p>
-    <w:p>
-      <w:pPr>
-        <w:pStyle w:val="ListParagraph"/>
-        <w:numPr>
-          <w:ilvl w:val="0"/>
-          <w:numId w:val="1"/>
-        </w:numPr>
-      </w:pPr>
-      <w:r>
-        <w:t xml:space="preserve">A PENDING_CONFIRMATION check-in saved as PRESENT is confirmed at the same time.</w:t>
-      </w:r>
-    </w:p>
-    <w:p>
-      <w:pPr>
-        <w:pStyle w:val="ListParagraph"/>
-        <w:numPr>
-          <w:ilvl w:val="0"/>
-          <w:numId w:val="1"/>
-        </w:numPr>
-      </w:pPr>
-      <w:r>
-        <w:t xml:space="preserve">Someone with no check-in can be included (e.g. ABSENT, or PRESENT if they forgot to check in).</w:t>
-      </w:r>
-    </w:p>
-    <w:p>
-      <w:pPr>
-        <w:pStyle w:val="ListParagraph"/>
-        <w:numPr>
-          <w:ilvl w:val="0"/>
-          <w:numId w:val="1"/>
-        </w:numPr>
-      </w:pPr>
-      <w:r>
-        <w:t xml:space="preserve">400 if an entry isn't an active student/instructor of the school, or the date is in the future.</w:t>
+        <w:t xml:space="preserve">Overwrites a check-in for that day if there is one (the location stays on record); source becomes MANUAL and recordedByName is set.</w:t>
       </w:r>
     </w:p>
     <w:p/>
     <w:p>
+      <w:pPr>
+        <w:pStyle w:val="Heading2"/>
+      </w:pPr>
+      <w:r>
+        <w:t xml:space="preserve">Roll call: confirming who was really there</w:t>
+      </w:r>
+    </w:p>
+    <w:p>
+      <w:r>
+        <w:t xml:space="preserve">A check-in only proves someone came onto the premises - they could sign in and leave. So staff take a roll call: during or after the lesson they go through the day's list, keep the people who are really there and mark anyone who left as ABSENT, then save the whole list in one go. Every saved entry is stamped with who reviewed it and when (reviewedByName / reviewedAt), so an unreviewed day stands out.</w:t>
+      </w:r>
+    </w:p>
+    <w:p>
       <w:r>
         <w:rPr>
           <w:b/>
@@ -32061,7 +31768,7 @@
           <w:sz w:val="18"/>
           <w:szCs w:val="18"/>
         </w:rPr>
-        <w:t xml:space="preserve">GET  </w:t>
+        <w:t xml:space="preserve">PUT  </w:t>
       </w:r>
       <w:r>
         <w:rPr>
@@ -32069,7 +31776,7 @@
           <w:sz w:val="18"/>
           <w:szCs w:val="18"/>
         </w:rPr>
-        <w:t xml:space="preserve">/attendance/users/{userId}</w:t>
+        <w:t xml:space="preserve">/attendance/school/{schoolId}/roll-call</w:t>
       </w:r>
     </w:p>
     <w:p>
@@ -32077,7 +31784,7 @@
         <w:rPr>
           <w:i/>
         </w:rPr>
-        <w:t xml:space="preserve">One person's history.</w:t>
+        <w:t xml:space="preserve">Save a day's roll call.</w:t>
       </w:r>
     </w:p>
     <w:p>
@@ -32088,15 +31795,15 @@
         <w:t xml:space="preserve">Access: </w:t>
       </w:r>
       <w:r>
-        <w:t xml:space="preserve">The person themselves; ADMIN of their school; INSTRUCTOR for students of their school</w:t>
-      </w:r>
-    </w:p>
-    <w:p>
-      <w:r>
-        <w:rPr>
-          <w:b/>
-        </w:rPr>
-        <w:t xml:space="preserve">Query / path parameters:</w:t>
+        <w:t xml:space="preserve">Students: an INSTRUCTOR of that school or its ADMIN. Instructors (role=INSTRUCTOR): the school's ADMIN only</w:t>
+      </w:r>
+    </w:p>
+    <w:p>
+      <w:r>
+        <w:rPr>
+          <w:b/>
+        </w:rPr>
+        <w:t xml:space="preserve">Request body:</w:t>
       </w:r>
     </w:p>
     <w:tbl>
@@ -32133,7 +31840,7 @@
                 <w:b/>
                 <w:color w:val="FFFFFF"/>
               </w:rPr>
-              <w:t xml:space="preserve">Name</w:t>
+              <w:t xml:space="preserve">Field</w:t>
             </w:r>
           </w:p>
         </w:tc>
@@ -32200,18 +31907,64 @@
           <w:p>
             <w:pPr/>
             <w:r>
-              <w:t xml:space="preserve">from / to</w:t>
-            </w:r>
-          </w:p>
-        </w:tc>
-        <w:tc>
-          <w:tcPr>
-            <w:vAlign w:val="center"/>
-          </w:tcPr>
-          <w:p>
-            <w:pPr/>
-            <w:r>
-              <w:t xml:space="preserve">date (query)</w:t>
+              <w:t xml:space="preserve">date</w:t>
+            </w:r>
+          </w:p>
+        </w:tc>
+        <w:tc>
+          <w:tcPr>
+            <w:vAlign w:val="center"/>
+          </w:tcPr>
+          <w:p>
+            <w:pPr/>
+            <w:r>
+              <w:t xml:space="preserve">date</w:t>
+            </w:r>
+          </w:p>
+        </w:tc>
+        <w:tc>
+          <w:tcPr>
+            <w:vAlign w:val="center"/>
+          </w:tcPr>
+          <w:p>
+            <w:pPr/>
+            <w:r>
+              <w:t xml:space="preserve">yes</w:t>
+            </w:r>
+          </w:p>
+        </w:tc>
+        <w:tc>
+          <w:tcPr>
+            <w:vAlign w:val="center"/>
+          </w:tcPr>
+          <w:p>
+            <w:pPr/>
+            <w:r>
+              <w:t xml:space="preserve">today or earlier</w:t>
+            </w:r>
+          </w:p>
+        </w:tc>
+      </w:tr>
+      <w:tr>
+        <w:tc>
+          <w:tcPr>
+            <w:vAlign w:val="center"/>
+          </w:tcPr>
+          <w:p>
+            <w:pPr/>
+            <w:r>
+              <w:t xml:space="preserve">role</w:t>
+            </w:r>
+          </w:p>
+        </w:tc>
+        <w:tc>
+          <w:tcPr>
+            <w:vAlign w:val="center"/>
+          </w:tcPr>
+          <w:p>
+            <w:pPr/>
+            <w:r>
+              <w:t xml:space="preserve">STUDENT | INSTRUCTOR</w:t>
             </w:r>
           </w:p>
         </w:tc>
@@ -32233,27 +31986,498 @@
           <w:p>
             <w:pPr/>
             <w:r>
-              <w:t xml:space="preserve">default: the last 30 days; at most 62 days</w:t>
+              <w:t xml:space="preserve">default STUDENT</w:t>
+            </w:r>
+          </w:p>
+        </w:tc>
+      </w:tr>
+      <w:tr>
+        <w:tc>
+          <w:tcPr>
+            <w:vAlign w:val="center"/>
+          </w:tcPr>
+          <w:p>
+            <w:pPr/>
+            <w:r>
+              <w:t xml:space="preserve">entries</w:t>
+            </w:r>
+          </w:p>
+        </w:tc>
+        <w:tc>
+          <w:tcPr>
+            <w:vAlign w:val="center"/>
+          </w:tcPr>
+          <w:p>
+            <w:pPr/>
+            <w:r>
+              <w:t xml:space="preserve">array</w:t>
+            </w:r>
+          </w:p>
+        </w:tc>
+        <w:tc>
+          <w:tcPr>
+            <w:vAlign w:val="center"/>
+          </w:tcPr>
+          <w:p>
+            <w:pPr/>
+            <w:r>
+              <w:t xml:space="preserve">yes</w:t>
+            </w:r>
+          </w:p>
+        </w:tc>
+        <w:tc>
+          <w:tcPr>
+            <w:vAlign w:val="center"/>
+          </w:tcPr>
+          <w:p>
+            <w:pPr/>
+            <w:r>
+              <w:t xml:space="preserve">one per person you checked - typically the whole day list</w:t>
+            </w:r>
+          </w:p>
+        </w:tc>
+      </w:tr>
+      <w:tr>
+        <w:tc>
+          <w:tcPr>
+            <w:vAlign w:val="center"/>
+          </w:tcPr>
+          <w:p>
+            <w:pPr/>
+            <w:r>
+              <w:t xml:space="preserve">entries[].userId</w:t>
+            </w:r>
+          </w:p>
+        </w:tc>
+        <w:tc>
+          <w:tcPr>
+            <w:vAlign w:val="center"/>
+          </w:tcPr>
+          <w:p>
+            <w:pPr/>
+            <w:r>
+              <w:t xml:space="preserve">number</w:t>
+            </w:r>
+          </w:p>
+        </w:tc>
+        <w:tc>
+          <w:tcPr>
+            <w:vAlign w:val="center"/>
+          </w:tcPr>
+          <w:p>
+            <w:pPr/>
+            <w:r>
+              <w:t xml:space="preserve">yes</w:t>
+            </w:r>
+          </w:p>
+        </w:tc>
+        <w:tc>
+          <w:tcPr>
+            <w:vAlign w:val="center"/>
+          </w:tcPr>
+          <w:p>
+            <w:pPr/>
+            <w:r>
+              <w:t xml:space="preserve">userId from the day list</w:t>
+            </w:r>
+          </w:p>
+        </w:tc>
+      </w:tr>
+      <w:tr>
+        <w:tc>
+          <w:tcPr>
+            <w:vAlign w:val="center"/>
+          </w:tcPr>
+          <w:p>
+            <w:pPr/>
+            <w:r>
+              <w:t xml:space="preserve">entries[].status</w:t>
+            </w:r>
+          </w:p>
+        </w:tc>
+        <w:tc>
+          <w:tcPr>
+            <w:vAlign w:val="center"/>
+          </w:tcPr>
+          <w:p>
+            <w:pPr/>
+            <w:r>
+              <w:t xml:space="preserve">PRESENT | LATE | ABSENT</w:t>
+            </w:r>
+          </w:p>
+        </w:tc>
+        <w:tc>
+          <w:tcPr>
+            <w:vAlign w:val="center"/>
+          </w:tcPr>
+          <w:p>
+            <w:pPr/>
+            <w:r>
+              <w:t xml:space="preserve">yes</w:t>
+            </w:r>
+          </w:p>
+        </w:tc>
+        <w:tc>
+          <w:tcPr>
+            <w:vAlign w:val="center"/>
+          </w:tcPr>
+          <w:p>
+            <w:pPr/>
+            <w:r>
+              <w:t xml:space="preserve">what you saw</w:t>
+            </w:r>
+          </w:p>
+        </w:tc>
+      </w:tr>
+      <w:tr>
+        <w:tc>
+          <w:tcPr>
+            <w:vAlign w:val="center"/>
+          </w:tcPr>
+          <w:p>
+            <w:pPr/>
+            <w:r>
+              <w:t xml:space="preserve">entries[].reason</w:t>
+            </w:r>
+          </w:p>
+        </w:tc>
+        <w:tc>
+          <w:tcPr>
+            <w:vAlign w:val="center"/>
+          </w:tcPr>
+          <w:p>
+            <w:pPr/>
+            <w:r>
+              <w:t xml:space="preserve">string</w:t>
+            </w:r>
+          </w:p>
+        </w:tc>
+        <w:tc>
+          <w:tcPr>
+            <w:vAlign w:val="center"/>
+          </w:tcPr>
+          <w:p>
+            <w:pPr/>
+            <w:r>
+              <w:t xml:space="preserve">no</w:t>
+            </w:r>
+          </w:p>
+        </w:tc>
+        <w:tc>
+          <w:tcPr>
+            <w:vAlign w:val="center"/>
+          </w:tcPr>
+          <w:p>
+            <w:pPr/>
+            <w:r>
+              <w:t xml:space="preserve">max 500, e.g. "Signed in and left"</w:t>
             </w:r>
           </w:p>
         </w:tc>
       </w:tr>
     </w:tbl>
     <w:p/>
+    <w:p>
+      <w:r>
+        <w:rPr>
+          <w:b/>
+        </w:rPr>
+        <w:t xml:space="preserve">Example request:</w:t>
+      </w:r>
+    </w:p>
+    <w:p>
+      <w:pPr>
+        <w:pStyle w:val="Code"/>
+        <w:shd w:val="clear" w:fill="F3F3F3"/>
+      </w:pPr>
+      <w:r>
+        <w:rPr>
+          <w:rFonts w:ascii="Consolas" w:hAnsi="Consolas"/>
+          <w:sz w:val="18"/>
+        </w:rPr>
+        <w:t xml:space="preserve">{</w:t>
+      </w:r>
+    </w:p>
+    <w:p>
+      <w:pPr>
+        <w:pStyle w:val="Code"/>
+        <w:shd w:val="clear" w:fill="F3F3F3"/>
+      </w:pPr>
+      <w:r>
+        <w:rPr>
+          <w:rFonts w:ascii="Consolas" w:hAnsi="Consolas"/>
+          <w:sz w:val="18"/>
+        </w:rPr>
+        <w:t xml:space="preserve">  "date": "2026-10-02",</w:t>
+      </w:r>
+    </w:p>
+    <w:p>
+      <w:pPr>
+        <w:pStyle w:val="Code"/>
+        <w:shd w:val="clear" w:fill="F3F3F3"/>
+      </w:pPr>
+      <w:r>
+        <w:rPr>
+          <w:rFonts w:ascii="Consolas" w:hAnsi="Consolas"/>
+          <w:sz w:val="18"/>
+        </w:rPr>
+        <w:t xml:space="preserve">  "role": "STUDENT",</w:t>
+      </w:r>
+    </w:p>
+    <w:p>
+      <w:pPr>
+        <w:pStyle w:val="Code"/>
+        <w:shd w:val="clear" w:fill="F3F3F3"/>
+      </w:pPr>
+      <w:r>
+        <w:rPr>
+          <w:rFonts w:ascii="Consolas" w:hAnsi="Consolas"/>
+          <w:sz w:val="18"/>
+        </w:rPr>
+        <w:t xml:space="preserve">  "entries": [</w:t>
+      </w:r>
+    </w:p>
+    <w:p>
+      <w:pPr>
+        <w:pStyle w:val="Code"/>
+        <w:shd w:val="clear" w:fill="F3F3F3"/>
+      </w:pPr>
+      <w:r>
+        <w:rPr>
+          <w:rFonts w:ascii="Consolas" w:hAnsi="Consolas"/>
+          <w:sz w:val="18"/>
+        </w:rPr>
+        <w:t xml:space="preserve">    { "userId": 31, "status": "PRESENT" },</w:t>
+      </w:r>
+    </w:p>
+    <w:p>
+      <w:pPr>
+        <w:pStyle w:val="Code"/>
+        <w:shd w:val="clear" w:fill="F3F3F3"/>
+      </w:pPr>
+      <w:r>
+        <w:rPr>
+          <w:rFonts w:ascii="Consolas" w:hAnsi="Consolas"/>
+          <w:sz w:val="18"/>
+        </w:rPr>
+        <w:t xml:space="preserve">    { "userId": 34, "status": "ABSENT", "reason": "Signed in and left" },</w:t>
+      </w:r>
+    </w:p>
+    <w:p>
+      <w:pPr>
+        <w:pStyle w:val="Code"/>
+        <w:shd w:val="clear" w:fill="F3F3F3"/>
+      </w:pPr>
+      <w:r>
+        <w:rPr>
+          <w:rFonts w:ascii="Consolas" w:hAnsi="Consolas"/>
+          <w:sz w:val="18"/>
+        </w:rPr>
+        <w:t xml:space="preserve">    { "userId": 35, "status": "LATE", "reason": "Arrived 09:40" }</w:t>
+      </w:r>
+    </w:p>
+    <w:p>
+      <w:pPr>
+        <w:pStyle w:val="Code"/>
+        <w:shd w:val="clear" w:fill="F3F3F3"/>
+      </w:pPr>
+      <w:r>
+        <w:rPr>
+          <w:rFonts w:ascii="Consolas" w:hAnsi="Consolas"/>
+          <w:sz w:val="18"/>
+        </w:rPr>
+        <w:t xml:space="preserve">  ]</w:t>
+      </w:r>
+    </w:p>
+    <w:p>
+      <w:pPr>
+        <w:pStyle w:val="Code"/>
+        <w:shd w:val="clear" w:fill="F3F3F3"/>
+      </w:pPr>
+      <w:r>
+        <w:rPr>
+          <w:rFonts w:ascii="Consolas" w:hAnsi="Consolas"/>
+          <w:sz w:val="18"/>
+        </w:rPr>
+        <w:t xml:space="preserve">}</w:t>
+      </w:r>
+    </w:p>
+    <w:p>
+      <w:r>
+        <w:rPr>
+          <w:b/>
+        </w:rPr>
+        <w:t xml:space="preserve">Response (key fields):</w:t>
+      </w:r>
+    </w:p>
+    <w:tbl>
+      <w:tblPr>
+        <w:tblStyle w:val="TableGrid"/>
+        <w:tblW w:w="0" w:type="auto"/>
+        <w:tblBorders>
+          <w:top w:val="single" w:sz="4" w:color="BFBFBF"/>
+          <w:left w:val="single" w:sz="4" w:color="BFBFBF"/>
+          <w:bottom w:val="single" w:sz="4" w:color="BFBFBF"/>
+          <w:right w:val="single" w:sz="4" w:color="BFBFBF"/>
+          <w:insideH w:val="single" w:sz="4" w:color="BFBFBF"/>
+          <w:insideV w:val="single" w:sz="4" w:color="BFBFBF"/>
+        </w:tblBorders>
+      </w:tblPr>
+      <w:tblGrid>
+        <w:gridCol w:w="3000"/>
+        <w:gridCol w:w="3000"/>
+        <w:gridCol w:w="3000"/>
+      </w:tblGrid>
+      <w:tr>
+        <w:tc>
+          <w:tcPr>
+            <w:shd w:val="clear" w:fill="2F5496"/>
+            <w:vAlign w:val="center"/>
+          </w:tcPr>
+          <w:p>
+            <w:pPr>
+              <w:shd w:val="clear" w:fill="2F5496"/>
+            </w:pPr>
+            <w:r>
+              <w:rPr>
+                <w:b/>
+                <w:color w:val="FFFFFF"/>
+              </w:rPr>
+              <w:t xml:space="preserve">Field</w:t>
+            </w:r>
+          </w:p>
+        </w:tc>
+        <w:tc>
+          <w:tcPr>
+            <w:shd w:val="clear" w:fill="2F5496"/>
+            <w:vAlign w:val="center"/>
+          </w:tcPr>
+          <w:p>
+            <w:pPr>
+              <w:shd w:val="clear" w:fill="2F5496"/>
+            </w:pPr>
+            <w:r>
+              <w:rPr>
+                <w:b/>
+                <w:color w:val="FFFFFF"/>
+              </w:rPr>
+              <w:t xml:space="preserve">Type</w:t>
+            </w:r>
+          </w:p>
+        </w:tc>
+        <w:tc>
+          <w:tcPr>
+            <w:shd w:val="clear" w:fill="2F5496"/>
+            <w:vAlign w:val="center"/>
+          </w:tcPr>
+          <w:p>
+            <w:pPr>
+              <w:shd w:val="clear" w:fill="2F5496"/>
+            </w:pPr>
+            <w:r>
+              <w:rPr>
+                <w:b/>
+                <w:color w:val="FFFFFF"/>
+              </w:rPr>
+              <w:t xml:space="preserve">Notes</w:t>
+            </w:r>
+          </w:p>
+        </w:tc>
+      </w:tr>
+      <w:tr>
+        <w:tc>
+          <w:tcPr>
+            <w:vAlign w:val="center"/>
+          </w:tcPr>
+          <w:p>
+            <w:pPr/>
+            <w:r>
+              <w:t xml:space="preserve">[] of attendance entries</w:t>
+            </w:r>
+          </w:p>
+        </w:tc>
+        <w:tc>
+          <w:tcPr>
+            <w:vAlign w:val="center"/>
+          </w:tcPr>
+          <w:p>
+            <w:pPr/>
+            <w:r>
+              <w:t xml:space="preserve"/>
+            </w:r>
+          </w:p>
+        </w:tc>
+        <w:tc>
+          <w:tcPr>
+            <w:vAlign w:val="center"/>
+          </w:tcPr>
+          <w:p>
+            <w:pPr/>
+            <w:r>
+              <w:t xml:space="preserve">the saved entries, each with reviewedByName / reviewedAt</w:t>
+            </w:r>
+          </w:p>
+        </w:tc>
+      </w:tr>
+    </w:tbl>
     <w:p/>
     <w:p>
-      <w:pPr>
-        <w:pStyle w:val="Heading2"/>
-      </w:pPr>
-      <w:r>
-        <w:t xml:space="preserve">Printable Excel sheets</w:t>
-      </w:r>
-    </w:p>
-    <w:p>
-      <w:r>
-        <w:t xml:space="preserve">Both return an .xlsx file (not JSON) - fetch with the access token, then save it (e.g. create a blob URL and click a download link). They're laid out to print: landscape, fitted to the page width, header repeated on every page, page numbers.</w:t>
-      </w:r>
-    </w:p>
+      <w:r>
+        <w:rPr>
+          <w:b/>
+        </w:rPr>
+        <w:t xml:space="preserve">Notes:</w:t>
+      </w:r>
+    </w:p>
+    <w:p>
+      <w:pPr>
+        <w:pStyle w:val="ListParagraph"/>
+        <w:numPr>
+          <w:ilvl w:val="0"/>
+          <w:numId w:val="1"/>
+        </w:numPr>
+      </w:pPr>
+      <w:r>
+        <w:t xml:space="preserve">A self check-in kept as PRESENT stays a check-in (location and time kept) and is simply marked reviewed; one changed to ABSENT/LATE becomes a staff correction (source MANUAL, recordedByName, reason).</w:t>
+      </w:r>
+    </w:p>
+    <w:p>
+      <w:pPr>
+        <w:pStyle w:val="ListParagraph"/>
+        <w:numPr>
+          <w:ilvl w:val="0"/>
+          <w:numId w:val="1"/>
+        </w:numPr>
+      </w:pPr>
+      <w:r>
+        <w:t xml:space="preserve">A PENDING_CONFIRMATION check-in saved as PRESENT is confirmed at the same time.</w:t>
+      </w:r>
+    </w:p>
+    <w:p>
+      <w:pPr>
+        <w:pStyle w:val="ListParagraph"/>
+        <w:numPr>
+          <w:ilvl w:val="0"/>
+          <w:numId w:val="1"/>
+        </w:numPr>
+      </w:pPr>
+      <w:r>
+        <w:t xml:space="preserve">Someone with no check-in can be included (e.g. ABSENT, or PRESENT if they forgot to check in).</w:t>
+      </w:r>
+    </w:p>
+    <w:p>
+      <w:pPr>
+        <w:pStyle w:val="ListParagraph"/>
+        <w:numPr>
+          <w:ilvl w:val="0"/>
+          <w:numId w:val="1"/>
+        </w:numPr>
+      </w:pPr>
+      <w:r>
+        <w:t xml:space="preserve">400 if an entry isn't an active student/instructor of the school, or the date is in the future.</w:t>
+      </w:r>
+    </w:p>
+    <w:p/>
     <w:p>
       <w:r>
         <w:rPr>
@@ -32270,7 +32494,7 @@
           <w:sz w:val="18"/>
           <w:szCs w:val="18"/>
         </w:rPr>
-        <w:t xml:space="preserve">/attendance/school/{schoolId}/export/register</w:t>
+        <w:t xml:space="preserve">/attendance/users/{userId}</w:t>
       </w:r>
     </w:p>
     <w:p>
@@ -32278,7 +32502,7 @@
         <w:rPr>
           <w:i/>
         </w:rPr>
-        <w:t xml:space="preserve">Register: people x days for a date range.</w:t>
+        <w:t xml:space="preserve">One person's history.</w:t>
       </w:r>
     </w:p>
     <w:p>
@@ -32289,7 +32513,7 @@
         <w:t xml:space="preserve">Access: </w:t>
       </w:r>
       <w:r>
-        <w:t xml:space="preserve">ADMIN (own school) or INSTRUCTOR of that school</w:t>
+        <w:t xml:space="preserve">The person themselves; ADMIN of their school; INSTRUCTOR for students of their school</w:t>
       </w:r>
     </w:p>
     <w:p>
@@ -32439,88 +32663,23 @@
           </w:p>
         </w:tc>
       </w:tr>
-      <w:tr>
-        <w:tc>
-          <w:tcPr>
-            <w:vAlign w:val="center"/>
-          </w:tcPr>
-          <w:p>
-            <w:pPr/>
-            <w:r>
-              <w:t xml:space="preserve">role</w:t>
-            </w:r>
-          </w:p>
-        </w:tc>
-        <w:tc>
-          <w:tcPr>
-            <w:vAlign w:val="center"/>
-          </w:tcPr>
-          <w:p>
-            <w:pPr/>
-            <w:r>
-              <w:t xml:space="preserve">STUDENT | INSTRUCTOR (query)</w:t>
-            </w:r>
-          </w:p>
-        </w:tc>
-        <w:tc>
-          <w:tcPr>
-            <w:vAlign w:val="center"/>
-          </w:tcPr>
-          <w:p>
-            <w:pPr/>
-            <w:r>
-              <w:t xml:space="preserve">no</w:t>
-            </w:r>
-          </w:p>
-        </w:tc>
-        <w:tc>
-          <w:tcPr>
-            <w:vAlign w:val="center"/>
-          </w:tcPr>
-          <w:p>
-            <w:pPr/>
-            <w:r>
-              <w:t xml:space="preserve">default STUDENT</w:t>
-            </w:r>
-          </w:p>
-        </w:tc>
-      </w:tr>
     </w:tbl>
     <w:p/>
-    <w:p>
-      <w:r>
-        <w:rPr>
-          <w:b/>
-        </w:rPr>
-        <w:t xml:space="preserve">Notes:</w:t>
-      </w:r>
-    </w:p>
-    <w:p>
-      <w:pPr>
-        <w:pStyle w:val="ListParagraph"/>
-        <w:numPr>
-          <w:ilvl w:val="0"/>
-          <w:numId w:val="1"/>
-        </w:numPr>
-      </w:pPr>
-      <w:r>
-        <w:t xml:space="preserve">One row per person, one column per day with P (present), L (late), A (absent), ? (awaiting confirmation) or blank (today/future with nothing yet), then totals.</w:t>
-      </w:r>
-    </w:p>
-    <w:p>
-      <w:pPr>
-        <w:pStyle w:val="ListParagraph"/>
-        <w:numPr>
-          <w:ilvl w:val="0"/>
-          <w:numId w:val="1"/>
-        </w:numPr>
-      </w:pPr>
-      <w:r>
-        <w:t xml:space="preserve">File name e.g. attendance-register-student-2026-09-01-to-2026-09-30.xlsx (from Content-Disposition).</w:t>
-      </w:r>
-    </w:p>
     <w:p/>
     <w:p>
+      <w:pPr>
+        <w:pStyle w:val="Heading2"/>
+      </w:pPr>
+      <w:r>
+        <w:t xml:space="preserve">Printable Excel sheets</w:t>
+      </w:r>
+    </w:p>
+    <w:p>
+      <w:r>
+        <w:t xml:space="preserve">Both return an .xlsx file (not JSON) - fetch with the access token, then save it (e.g. create a blob URL and click a download link). They're laid out to print: landscape, fitted to the page width, header repeated on every page, page numbers.</w:t>
+      </w:r>
+    </w:p>
+    <w:p>
       <w:r>
         <w:rPr>
           <w:b/>
@@ -32536,7 +32695,7 @@
           <w:sz w:val="18"/>
           <w:szCs w:val="18"/>
         </w:rPr>
-        <w:t xml:space="preserve">/attendance/school/{schoolId}/export/day</w:t>
+        <w:t xml:space="preserve">/attendance/school/{schoolId}/export/register</w:t>
       </w:r>
     </w:p>
     <w:p>
@@ -32544,7 +32703,7 @@
         <w:rPr>
           <w:i/>
         </w:rPr>
-        <w:t xml:space="preserve">One day's detailed list.</w:t>
+        <w:t xml:space="preserve">Register: people x days for a date range.</w:t>
       </w:r>
     </w:p>
     <w:p>
@@ -32667,7 +32826,7 @@
           <w:p>
             <w:pPr/>
             <w:r>
-              <w:t xml:space="preserve">date</w:t>
+              <w:t xml:space="preserve">from / to</w:t>
             </w:r>
           </w:p>
         </w:tc>
@@ -32700,7 +32859,7 @@
           <w:p>
             <w:pPr/>
             <w:r>
-              <w:t xml:space="preserve">default today</w:t>
+              <w:t xml:space="preserve">default: the last 30 days; at most 62 days</w:t>
             </w:r>
           </w:p>
         </w:tc>
@@ -32770,29 +32929,23 @@
         </w:numPr>
       </w:pPr>
       <w:r>
-        <w:t xml:space="preserve">Columns: name, status (with why, if awaiting confirmation), lesson (practical/theory), topic, check-in time (school time), distance, accuracy, confirmed by, recorded by, reason, roll call by - plus a count per status at the bottom.</w:t>
+        <w:t xml:space="preserve">One row per person, one column per day with P (present), L (late), A (absent), ? (awaiting confirmation) or blank (today/future with nothing yet), then totals.</w:t>
+      </w:r>
+    </w:p>
+    <w:p>
+      <w:pPr>
+        <w:pStyle w:val="ListParagraph"/>
+        <w:numPr>
+          <w:ilvl w:val="0"/>
+          <w:numId w:val="1"/>
+        </w:numPr>
+      </w:pPr>
+      <w:r>
+        <w:t xml:space="preserve">File name e.g. attendance-register-student-2026-09-01-to-2026-09-30.xlsx (from Content-Disposition).</w:t>
       </w:r>
     </w:p>
     <w:p/>
     <w:p>
-      <w:pPr>
-        <w:pStyle w:val="Heading1"/>
-      </w:pPr>
-      <w:r>
-        <w:t xml:space="preserve">Notifications</w:t>
-      </w:r>
-    </w:p>
-    <w:p>
-      <w:r>
-        <w:t xml:space="preserve">Two things happen here: the system automatically sends notifications for certain events, and admins/instructors can manually send an arbitrary notification via POST /send. Automatic IN_APP notifications currently fire on: a new account (welcome), a booking being created or cancelled (also by SMS when configured), a quiz being submitted (pass or fail), a new lesson note, a driving assessment being recorded, a new direct message, a school announcement (also by email), a lesson question being asked (to the instructor(s)) or answered (to the student), and school deletion requests (to the admins involved). A password change sends an EMAIL. All of these are side effects of the endpoints above - nothing needs to be called to trigger them.</w:t>
-      </w:r>
-    </w:p>
-    <w:p>
-      <w:r>
-        <w:t xml:space="preserve">They're created a moment AFTER the action succeeds, never as part of it: a notification that fails can't fail the booking/message/etc., and a booking that fails never notifies anyone. So don't re-fetch GET /notifications/me in the same breath as the action's response and expect the new item - update from the NOTIFICATION_CREATED WebSocket event instead (see "Realtime updates"), or refresh a bit later.</w:t>
-      </w:r>
-    </w:p>
-    <w:p>
       <w:r>
         <w:rPr>
           <w:b/>
@@ -32800,7 +32953,7 @@
           <w:sz w:val="18"/>
           <w:szCs w:val="18"/>
         </w:rPr>
-        <w:t xml:space="preserve">POST  </w:t>
+        <w:t xml:space="preserve">GET  </w:t>
       </w:r>
       <w:r>
         <w:rPr>
@@ -32808,7 +32961,7 @@
           <w:sz w:val="18"/>
           <w:szCs w:val="18"/>
         </w:rPr>
-        <w:t xml:space="preserve">/notifications/send</w:t>
+        <w:t xml:space="preserve">/attendance/school/{schoolId}/export/day</w:t>
       </w:r>
     </w:p>
     <w:p>
@@ -32816,7 +32969,7 @@
         <w:rPr>
           <w:i/>
         </w:rPr>
-        <w:t xml:space="preserve">Send a notification to a user.</w:t>
+        <w:t xml:space="preserve">One day's detailed list.</w:t>
       </w:r>
     </w:p>
     <w:p>
@@ -32827,15 +32980,15 @@
         <w:t xml:space="preserve">Access: </w:t>
       </w:r>
       <w:r>
-        <w:t xml:space="preserve">ADMIN or INSTRUCTOR</w:t>
-      </w:r>
-    </w:p>
-    <w:p>
-      <w:r>
-        <w:rPr>
-          <w:b/>
-        </w:rPr>
-        <w:t xml:space="preserve">Request body:</w:t>
+        <w:t xml:space="preserve">ADMIN (own school) or INSTRUCTOR of that school</w:t>
+      </w:r>
+    </w:p>
+    <w:p>
+      <w:r>
+        <w:rPr>
+          <w:b/>
+        </w:rPr>
+        <w:t xml:space="preserve">Query / path parameters:</w:t>
       </w:r>
     </w:p>
     <w:tbl>
@@ -32872,6 +33025,278 @@
                 <w:b/>
                 <w:color w:val="FFFFFF"/>
               </w:rPr>
+              <w:t xml:space="preserve">Name</w:t>
+            </w:r>
+          </w:p>
+        </w:tc>
+        <w:tc>
+          <w:tcPr>
+            <w:shd w:val="clear" w:fill="2F5496"/>
+            <w:vAlign w:val="center"/>
+          </w:tcPr>
+          <w:p>
+            <w:pPr>
+              <w:shd w:val="clear" w:fill="2F5496"/>
+            </w:pPr>
+            <w:r>
+              <w:rPr>
+                <w:b/>
+                <w:color w:val="FFFFFF"/>
+              </w:rPr>
+              <w:t xml:space="preserve">Type</w:t>
+            </w:r>
+          </w:p>
+        </w:tc>
+        <w:tc>
+          <w:tcPr>
+            <w:shd w:val="clear" w:fill="2F5496"/>
+            <w:vAlign w:val="center"/>
+          </w:tcPr>
+          <w:p>
+            <w:pPr>
+              <w:shd w:val="clear" w:fill="2F5496"/>
+            </w:pPr>
+            <w:r>
+              <w:rPr>
+                <w:b/>
+                <w:color w:val="FFFFFF"/>
+              </w:rPr>
+              <w:t xml:space="preserve">Required</w:t>
+            </w:r>
+          </w:p>
+        </w:tc>
+        <w:tc>
+          <w:tcPr>
+            <w:shd w:val="clear" w:fill="2F5496"/>
+            <w:vAlign w:val="center"/>
+          </w:tcPr>
+          <w:p>
+            <w:pPr>
+              <w:shd w:val="clear" w:fill="2F5496"/>
+            </w:pPr>
+            <w:r>
+              <w:rPr>
+                <w:b/>
+                <w:color w:val="FFFFFF"/>
+              </w:rPr>
+              <w:t xml:space="preserve">Notes</w:t>
+            </w:r>
+          </w:p>
+        </w:tc>
+      </w:tr>
+      <w:tr>
+        <w:tc>
+          <w:tcPr>
+            <w:vAlign w:val="center"/>
+          </w:tcPr>
+          <w:p>
+            <w:pPr/>
+            <w:r>
+              <w:t xml:space="preserve">date</w:t>
+            </w:r>
+          </w:p>
+        </w:tc>
+        <w:tc>
+          <w:tcPr>
+            <w:vAlign w:val="center"/>
+          </w:tcPr>
+          <w:p>
+            <w:pPr/>
+            <w:r>
+              <w:t xml:space="preserve">date (query)</w:t>
+            </w:r>
+          </w:p>
+        </w:tc>
+        <w:tc>
+          <w:tcPr>
+            <w:vAlign w:val="center"/>
+          </w:tcPr>
+          <w:p>
+            <w:pPr/>
+            <w:r>
+              <w:t xml:space="preserve">no</w:t>
+            </w:r>
+          </w:p>
+        </w:tc>
+        <w:tc>
+          <w:tcPr>
+            <w:vAlign w:val="center"/>
+          </w:tcPr>
+          <w:p>
+            <w:pPr/>
+            <w:r>
+              <w:t xml:space="preserve">default today</w:t>
+            </w:r>
+          </w:p>
+        </w:tc>
+      </w:tr>
+      <w:tr>
+        <w:tc>
+          <w:tcPr>
+            <w:vAlign w:val="center"/>
+          </w:tcPr>
+          <w:p>
+            <w:pPr/>
+            <w:r>
+              <w:t xml:space="preserve">role</w:t>
+            </w:r>
+          </w:p>
+        </w:tc>
+        <w:tc>
+          <w:tcPr>
+            <w:vAlign w:val="center"/>
+          </w:tcPr>
+          <w:p>
+            <w:pPr/>
+            <w:r>
+              <w:t xml:space="preserve">STUDENT | INSTRUCTOR (query)</w:t>
+            </w:r>
+          </w:p>
+        </w:tc>
+        <w:tc>
+          <w:tcPr>
+            <w:vAlign w:val="center"/>
+          </w:tcPr>
+          <w:p>
+            <w:pPr/>
+            <w:r>
+              <w:t xml:space="preserve">no</w:t>
+            </w:r>
+          </w:p>
+        </w:tc>
+        <w:tc>
+          <w:tcPr>
+            <w:vAlign w:val="center"/>
+          </w:tcPr>
+          <w:p>
+            <w:pPr/>
+            <w:r>
+              <w:t xml:space="preserve">default STUDENT</w:t>
+            </w:r>
+          </w:p>
+        </w:tc>
+      </w:tr>
+    </w:tbl>
+    <w:p/>
+    <w:p>
+      <w:r>
+        <w:rPr>
+          <w:b/>
+        </w:rPr>
+        <w:t xml:space="preserve">Notes:</w:t>
+      </w:r>
+    </w:p>
+    <w:p>
+      <w:pPr>
+        <w:pStyle w:val="ListParagraph"/>
+        <w:numPr>
+          <w:ilvl w:val="0"/>
+          <w:numId w:val="1"/>
+        </w:numPr>
+      </w:pPr>
+      <w:r>
+        <w:t xml:space="preserve">Columns: name, status (with why, if awaiting confirmation), lesson (practical/theory), topic, check-in time (school time), distance, accuracy, confirmed by, recorded by, reason, roll call by - plus a count per status at the bottom.</w:t>
+      </w:r>
+    </w:p>
+    <w:p/>
+    <w:p>
+      <w:pPr>
+        <w:pStyle w:val="Heading1"/>
+      </w:pPr>
+      <w:r>
+        <w:t xml:space="preserve">Notifications</w:t>
+      </w:r>
+    </w:p>
+    <w:p>
+      <w:r>
+        <w:t xml:space="preserve">Two things happen here: the system automatically sends notifications for certain events, and admins/instructors can manually send an arbitrary notification via POST /send. Automatic IN_APP notifications currently fire on: a new account (welcome), a booking being created or cancelled (also by SMS when configured), a quiz being submitted (pass or fail), a new lesson note, a driving assessment being recorded, a new direct message, a school announcement (also by email), a lesson question being asked (to the instructor(s)) or answered (to the student), and school deletion requests (to the admins involved). A password change sends an EMAIL. All of these are side effects of the endpoints above - nothing needs to be called to trigger them.</w:t>
+      </w:r>
+    </w:p>
+    <w:p>
+      <w:r>
+        <w:t xml:space="preserve">They're created a moment AFTER the action succeeds, never as part of it: a notification that fails can't fail the booking/message/etc., and a booking that fails never notifies anyone. So don't re-fetch GET /notifications/me in the same breath as the action's response and expect the new item - update from the NOTIFICATION_CREATED WebSocket event instead (see "Realtime updates"), or refresh a bit later.</w:t>
+      </w:r>
+    </w:p>
+    <w:p>
+      <w:r>
+        <w:rPr>
+          <w:b/>
+          <w:rFonts w:ascii="Consolas" w:hAnsi="Consolas" w:cs="Consolas"/>
+          <w:sz w:val="18"/>
+          <w:szCs w:val="18"/>
+        </w:rPr>
+        <w:t xml:space="preserve">POST  </w:t>
+      </w:r>
+      <w:r>
+        <w:rPr>
+          <w:rFonts w:ascii="Consolas" w:hAnsi="Consolas" w:cs="Consolas"/>
+          <w:sz w:val="18"/>
+          <w:szCs w:val="18"/>
+        </w:rPr>
+        <w:t xml:space="preserve">/notifications/send</w:t>
+      </w:r>
+    </w:p>
+    <w:p>
+      <w:r>
+        <w:rPr>
+          <w:i/>
+        </w:rPr>
+        <w:t xml:space="preserve">Send a notification to a user.</w:t>
+      </w:r>
+    </w:p>
+    <w:p>
+      <w:r>
+        <w:rPr>
+          <w:b/>
+        </w:rPr>
+        <w:t xml:space="preserve">Access: </w:t>
+      </w:r>
+      <w:r>
+        <w:t xml:space="preserve">ADMIN or INSTRUCTOR</w:t>
+      </w:r>
+    </w:p>
+    <w:p>
+      <w:r>
+        <w:rPr>
+          <w:b/>
+        </w:rPr>
+        <w:t xml:space="preserve">Request body:</w:t>
+      </w:r>
+    </w:p>
+    <w:tbl>
+      <w:tblPr>
+        <w:tblStyle w:val="TableGrid"/>
+        <w:tblW w:w="0" w:type="auto"/>
+        <w:tblBorders>
+          <w:top w:val="single" w:sz="4" w:color="BFBFBF"/>
+          <w:left w:val="single" w:sz="4" w:color="BFBFBF"/>
+          <w:bottom w:val="single" w:sz="4" w:color="BFBFBF"/>
+          <w:right w:val="single" w:sz="4" w:color="BFBFBF"/>
+          <w:insideH w:val="single" w:sz="4" w:color="BFBFBF"/>
+          <w:insideV w:val="single" w:sz="4" w:color="BFBFBF"/>
+        </w:tblBorders>
+      </w:tblPr>
+      <w:tblGrid>
+        <w:gridCol w:w="2250"/>
+        <w:gridCol w:w="2250"/>
+        <w:gridCol w:w="2250"/>
+        <w:gridCol w:w="2250"/>
+      </w:tblGrid>
+      <w:tr>
+        <w:tc>
+          <w:tcPr>
+            <w:shd w:val="clear" w:fill="2F5496"/>
+            <w:vAlign w:val="center"/>
+          </w:tcPr>
+          <w:p>
+            <w:pPr>
+              <w:shd w:val="clear" w:fill="2F5496"/>
+            </w:pPr>
+            <w:r>
+              <w:rPr>
+                <w:b/>
+                <w:color w:val="FFFFFF"/>
+              </w:rPr>
               <w:t xml:space="preserve">Field</w:t>
             </w:r>
           </w:p>
@@ -35183,6 +35608,38 @@
       </w:pPr>
       <w:r>
         <w:t xml:space="preserve">Verification may be switched off on the backend for now (login then just returns tokens). Build and keep this flow anyway - it turns on without a frontend release.</w:t>
+      </w:r>
+    </w:p>
+    <w:p>
+      <w:pPr>
+        <w:pStyle w:val="Heading2"/>
+      </w:pPr>
+      <w:r>
+        <w:t xml:space="preserve">17. School logo</w:t>
+      </w:r>
+    </w:p>
+    <w:p>
+      <w:pPr>
+        <w:pStyle w:val="ListParagraph"/>
+        <w:numPr>
+          <w:ilvl w:val="0"/>
+          <w:numId w:val="1"/>
+        </w:numPr>
+      </w:pPr>
+      <w:r>
+        <w:t xml:space="preserve">Admin settings: an "Upload logo" control (device or cloud file picker) posting to POST /schools/me/logo, with Remove.</w:t>
+      </w:r>
+    </w:p>
+    <w:p>
+      <w:pPr>
+        <w:pStyle w:val="ListParagraph"/>
+        <w:numPr>
+          <w:ilvl w:val="0"/>
+          <w:numId w:val="1"/>
+        </w:numPr>
+      </w:pPr>
+      <w:r>
+        <w:t xml:space="preserve">Everywhere: show schoolLogoUrl (from GET /auth/me) and schoolName in the header; fall back to the name alone.</w:t>
       </w:r>
     </w:p>
     <w:p>

</xml_diff>